<commit_message>
docs: add Trabajo Práctico 3 research project structure and compiled documents
</commit_message>
<xml_diff>
--- a/Entregas/Actividad 3/TP3_Ayarachi_Fuentes.docx
+++ b/Entregas/Actividad 3/TP3_Ayarachi_Fuentes.docx
@@ -869,7 +869,7 @@
           <w:rFonts w:ascii="Arial" w:hAnsi="Arial"/>
           <w:sz w:val="22"/>
         </w:rPr>
-        <w:t>Longo</w:t>
+        <w:t>2.2 Antecedentes: Estado del Arte del Tema</w:t>
       </w:r>
       <w:r>
         <w:tab/>
@@ -896,7 +896,7 @@
           <w:rFonts w:ascii="Arial" w:hAnsi="Arial"/>
           <w:sz w:val="22"/>
         </w:rPr>
-        <w:t>360°</w:t>
+        <w:t>Referencias</w:t>
       </w:r>
       <w:r>
         <w:tab/>
@@ -906,7 +906,7 @@
           <w:rFonts w:ascii="Arial" w:hAnsi="Arial"/>
           <w:sz w:val="22"/>
         </w:rPr>
-        <w:t>11</w:t>
+        <w:t>12</w:t>
       </w:r>
     </w:p>
     <w:p>
@@ -923,7 +923,7 @@
           <w:rFonts w:ascii="Arial" w:hAnsi="Arial"/>
           <w:sz w:val="22"/>
         </w:rPr>
-        <w:t>2.1.3 Gobernanza Universitaria, Autonomía y Negociación Paritaria Docente</w:t>
+        <w:t>Bibliografía</w:t>
       </w:r>
       <w:r>
         <w:tab/>
@@ -934,141 +934,6 @@
           <w:sz w:val="22"/>
         </w:rPr>
         <w:t>12</w:t>
-      </w:r>
-    </w:p>
-    <w:p>
-      <w:pPr>
-        <w:pStyle w:val="TOC1"/>
-        <w:tabs>
-          <w:tab w:val="right" w:leader="dot" w:pos="9026"/>
-        </w:tabs>
-        <w:ind w:left="0"/>
-        <w:spacing w:after="60"/>
-      </w:pPr>
-      <w:r>
-        <w:rPr>
-          <w:rFonts w:ascii="Arial" w:hAnsi="Arial"/>
-          <w:sz w:val="22"/>
-        </w:rPr>
-        <w:t>2.2 Antecedentes: Estado del Arte de la Cuestión</w:t>
-      </w:r>
-      <w:r>
-        <w:tab/>
-      </w:r>
-      <w:r>
-        <w:rPr>
-          <w:rFonts w:ascii="Arial" w:hAnsi="Arial"/>
-          <w:sz w:val="22"/>
-        </w:rPr>
-        <w:t>12</w:t>
-      </w:r>
-    </w:p>
-    <w:p>
-      <w:pPr>
-        <w:pStyle w:val="TOC1"/>
-        <w:tabs>
-          <w:tab w:val="right" w:leader="dot" w:pos="9026"/>
-        </w:tabs>
-        <w:ind w:left="0"/>
-        <w:spacing w:after="60"/>
-      </w:pPr>
-      <w:r>
-        <w:rPr>
-          <w:rFonts w:ascii="Arial" w:hAnsi="Arial"/>
-          <w:sz w:val="22"/>
-        </w:rPr>
-        <w:t>Modelo 360°</w:t>
-      </w:r>
-      <w:r>
-        <w:tab/>
-      </w:r>
-      <w:r>
-        <w:rPr>
-          <w:rFonts w:ascii="Arial" w:hAnsi="Arial"/>
-          <w:sz w:val="22"/>
-        </w:rPr>
-        <w:t>12</w:t>
-      </w:r>
-    </w:p>
-    <w:p>
-      <w:pPr>
-        <w:pStyle w:val="TOC1"/>
-        <w:tabs>
-          <w:tab w:val="right" w:leader="dot" w:pos="9026"/>
-        </w:tabs>
-        <w:ind w:left="0"/>
-        <w:spacing w:after="60"/>
-      </w:pPr>
-      <w:r>
-        <w:rPr>
-          <w:rFonts w:ascii="Arial" w:hAnsi="Arial"/>
-          <w:sz w:val="22"/>
-        </w:rPr>
-        <w:t>Universidades Públicas</w:t>
-      </w:r>
-      <w:r>
-        <w:tab/>
-      </w:r>
-      <w:r>
-        <w:rPr>
-          <w:rFonts w:ascii="Arial" w:hAnsi="Arial"/>
-          <w:sz w:val="22"/>
-        </w:rPr>
-        <w:t>13</w:t>
-      </w:r>
-    </w:p>
-    <w:p>
-      <w:pPr>
-        <w:pStyle w:val="TOC1"/>
-        <w:tabs>
-          <w:tab w:val="right" w:leader="dot" w:pos="9026"/>
-        </w:tabs>
-        <w:ind w:left="0"/>
-        <w:spacing w:after="60"/>
-      </w:pPr>
-      <w:r>
-        <w:rPr>
-          <w:rFonts w:ascii="Arial" w:hAnsi="Arial"/>
-          <w:sz w:val="22"/>
-        </w:rPr>
-        <w:t>Referencias</w:t>
-      </w:r>
-      <w:r>
-        <w:tab/>
-      </w:r>
-      <w:r>
-        <w:rPr>
-          <w:rFonts w:ascii="Arial" w:hAnsi="Arial"/>
-          <w:sz w:val="22"/>
-        </w:rPr>
-        <w:t>14</w:t>
-      </w:r>
-    </w:p>
-    <w:p>
-      <w:pPr>
-        <w:pStyle w:val="TOC1"/>
-        <w:tabs>
-          <w:tab w:val="right" w:leader="dot" w:pos="9026"/>
-        </w:tabs>
-        <w:ind w:left="0"/>
-        <w:spacing w:after="60"/>
-      </w:pPr>
-      <w:r>
-        <w:rPr>
-          <w:rFonts w:ascii="Arial" w:hAnsi="Arial"/>
-          <w:sz w:val="22"/>
-        </w:rPr>
-        <w:t>Bibliografía</w:t>
-      </w:r>
-      <w:r>
-        <w:tab/>
-      </w:r>
-      <w:r>
-        <w:rPr>
-          <w:rFonts w:ascii="Arial" w:hAnsi="Arial"/>
-          <w:sz w:val="22"/>
-        </w:rPr>
-        <w:t>14</w:t>
       </w:r>
     </w:p>
     <w:p>
@@ -3186,7 +3051,7 @@
     <w:bookmarkEnd w:id="33"/>
     <w:bookmarkEnd w:id="34"/>
     <w:bookmarkEnd w:id="35"/>
-    <w:bookmarkStart w:id="43" w:name="Xef007dd282ae18f13df7a545a4430773f008bd7"/>
+    <w:bookmarkStart w:id="38" w:name="Xef007dd282ae18f13df7a545a4430773f008bd7"/>
     <w:p>
       <w:pPr>
         <w:pStyle w:val="Heading1"/>
@@ -3202,7 +3067,7 @@
         <w:t xml:space="preserve">2. Segunda parte de la estructura del Proyecto de investigación de TFG</w:t>
       </w:r>
     </w:p>
-    <w:bookmarkStart w:id="39" w:name="X26fd7edd3045b8a76e95745d23dedb33f2c164e"/>
+    <w:bookmarkStart w:id="36" w:name="X26fd7edd3045b8a76e95745d23dedb33f2c164e"/>
     <w:p>
       <w:pPr>
         <w:pStyle w:val="Heading2"/>
@@ -3218,232 +3083,20 @@
         <w:t xml:space="preserve">2.1 Marco Teórico: Posicionamiento Teórico y Conceptos Centrales</w:t>
       </w:r>
     </w:p>
-    <w:bookmarkStart w:id="36" w:name="X06727c5df2bddc80b1e81e84a4398475a007b9e"/>
-    <w:p>
-      <w:pPr>
-        <w:pStyle w:val="Heading3"/>
-        <w:keepNext/>
-        <w:spacing w:before="160" w:after="40" w:line="300" w:lineRule="auto"/>
-      </w:pPr>
-      <w:r>
-        <w:rPr>
-          <w:rFonts w:ascii="Arial" w:hAnsi="Arial"/>
-          <w:b/>
+    <w:p>
+      <w:pPr>
+        <w:pStyle w:val="FirstParagraph"/>
+      </w:pPr>
+      <w:r>
+        <w:rPr>
           <w:i/>
-          <w:sz w:val="24"/>
-        </w:rPr>
-        <w:t xml:space="preserve">2.1.1 El Enfoque Sistémico de Gestión de Personas en el Sector Público: Francisco Longo</w:t>
-      </w:r>
-    </w:p>
-    <w:p>
-      <w:pPr>
-        <w:pStyle w:val="FirstParagraph"/>
-      </w:pPr>
-      <w:r>
-        <w:t xml:space="preserve">La investigación se inscribe teóricamente en el modelo analítico de Francisco</w:t>
-      </w:r>
-      <w:r>
-        <w:t xml:space="preserve"> </w:t>
-      </w:r>
-      <w:r>
-        <w:t xml:space="preserve">Longo (2006)</w:t>
-      </w:r>
-      <w:r>
-        <w:t xml:space="preserve"> </w:t>
-      </w:r>
-      <w:r>
-        <w:t xml:space="preserve">sobre la gestión de personas en las administraciones públicas. Desde este enfoque, el empleo público no constituye una mera sumatoria de rutinas administrativas ni un cuerpo estático de normas burocráticas, sino un sistema estratégico articulado compuesto por subsistemas interdependientes: planificación, organización del trabajo, gestión del empleo, gestión del rendimiento, gestión de la compensación, gestión del desarrollo y gestión de las relaciones humanas y sociales.</w:t>
-      </w:r>
-    </w:p>
-    <w:p>
-      <w:pPr>
-        <w:pStyle w:val="BodyText"/>
-      </w:pPr>
-      <w:r>
-        <w:t xml:space="preserve">En este marco, el proyecto focaliza en el subsistema de</w:t>
-      </w:r>
-      <w:r>
-        <w:t xml:space="preserve"> </w:t>
-      </w:r>
-      <w:r>
-        <w:rPr>
-          <w:b/>
-          <w:bCs/>
-        </w:rPr>
-        <w:t xml:space="preserve">gestión del rendimiento</w:t>
-      </w:r>
-      <w:r>
-        <w:t xml:space="preserve">, analizándolo no de forma aislada, sino en su interacción orgánica con la organización del trabajo (roles y funciones académicas), el desarrollo (capacitación pedagógica y carrera docente) y las relaciones laborales (clima institucional, diálogo paritario y cultura participativa). Para Longo, la evaluación del rendimiento en el sector público adquiere sentido pleno cuando supera el control formal y se orienta a alinear las conductas y competencias laborales con la misión institucional y la generación de valor público.</w:t>
+          <w:iCs/>
+        </w:rPr>
+        <w:t xml:space="preserve">(Sección en desarrollo junto al estudiante)</w:t>
       </w:r>
     </w:p>
     <w:bookmarkEnd w:id="36"/>
-    <w:bookmarkStart w:id="37" w:name="Xee019b4dba0db20cd3796242b42bc435c73c6fa"/>
-    <w:p>
-      <w:pPr>
-        <w:pStyle w:val="Heading3"/>
-        <w:keepNext/>
-        <w:spacing w:before="160" w:after="40" w:line="300" w:lineRule="auto"/>
-      </w:pPr>
-      <w:r>
-        <w:rPr>
-          <w:rFonts w:ascii="Arial" w:hAnsi="Arial"/>
-          <w:b/>
-          <w:i/>
-          <w:sz w:val="24"/>
-        </w:rPr>
-        <w:t xml:space="preserve">2.1.2 De la Lógica de Control a la Lógica Formativa: El Modelo de Retroalimentación 360°</w:t>
-      </w:r>
-    </w:p>
-    <w:p>
-      <w:pPr>
-        <w:pStyle w:val="FirstParagraph"/>
-      </w:pPr>
-      <w:r>
-        <w:t xml:space="preserve">En el marco de la gestión del rendimiento, la literatura contemporánea</w:t>
-      </w:r>
-      <w:r>
-        <w:t xml:space="preserve"> </w:t>
-      </w:r>
-      <w:r>
-        <w:t xml:space="preserve">(Chiavenato, 2020; Lepsinger &amp; Lucia, 2009)</w:t>
-      </w:r>
-      <w:r>
-        <w:t xml:space="preserve"> </w:t>
-      </w:r>
-      <w:r>
-        <w:t xml:space="preserve">distingue con claridad dos grandes paradigmas evaluativos:</w:t>
-      </w:r>
-    </w:p>
-    <w:p>
-      <w:pPr>
-        <w:pStyle w:val="Compact"/>
-        <w:numPr>
-          <w:ilvl w:val="0"/>
-          <w:numId w:val="1010"/>
-        </w:numPr>
-      </w:pPr>
-      <w:r>
-        <w:rPr>
-          <w:b/>
-          <w:bCs/>
-        </w:rPr>
-        <w:t xml:space="preserve">La lógica sumativa o de control:</w:t>
-      </w:r>
-      <w:r>
-        <w:t xml:space="preserve"> </w:t>
-      </w:r>
-      <w:r>
-        <w:t xml:space="preserve">Centrada en la fiscalización reglamentaria, la auditoría del cumplimiento de obligaciones y la eventual aplicación de sanciones o consecuencias sobre la estabilidad laboral.</w:t>
-      </w:r>
-    </w:p>
-    <w:p>
-      <w:pPr>
-        <w:pStyle w:val="Compact"/>
-        <w:numPr>
-          <w:ilvl w:val="0"/>
-          <w:numId w:val="1010"/>
-        </w:numPr>
-      </w:pPr>
-      <w:r>
-        <w:rPr>
-          <w:b/>
-          <w:bCs/>
-        </w:rPr>
-        <w:t xml:space="preserve">La lógica formativa:</w:t>
-      </w:r>
-      <w:r>
-        <w:t xml:space="preserve"> </w:t>
-      </w:r>
-      <w:r>
-        <w:t xml:space="preserve">Enfocada en el aprendizaje continuo, la retroalimentación cualitativa, el diagnóstico de necesidades de perfeccionamiento y el fortalecimiento de competencias pedagógicas.</w:t>
-      </w:r>
-    </w:p>
-    <w:p>
-      <w:pPr>
-        <w:pStyle w:val="FirstParagraph"/>
-      </w:pPr>
-      <w:r>
-        <w:t xml:space="preserve">En las organizaciones universitarias, donde predomina la autonomía académica y la libertad de cátedra, los modelos unilaterales y descendentes de evaluación suscitan desconfianza y resistencia gremial. Frente a esta limitación, el modelo de retroalimentación 360 grados</w:t>
-      </w:r>
-      <w:r>
-        <w:t xml:space="preserve"> </w:t>
-      </w:r>
-      <w:r>
-        <w:t xml:space="preserve">(Lepsinger &amp; Lucia, 2009; Obando Freire et al., 2014; Sifuentes Ocegueda et al., 2016)</w:t>
-      </w:r>
-      <w:r>
-        <w:t xml:space="preserve"> </w:t>
-      </w:r>
-      <w:r>
-        <w:t xml:space="preserve">propone un dispositivo multiactoral donde el desempeño de una persona es evaluado circularmente por los distintos actores que interactúan con ella en el ejercicio cotidiano de su labor: el propio docente (autoevaluación reflexiva), sus pares de cátedra (coevaluación pedagógica), los estudiantes (evaluación de la práctica de enseñanza) y las autoridades departamentales (visión estratégica y de gestión).</w:t>
-      </w:r>
-    </w:p>
-    <w:p>
-      <w:pPr>
-        <w:pStyle w:val="BodyText"/>
-      </w:pPr>
-      <w:r>
-        <w:t xml:space="preserve">La potencia teórica de este modelo radica en que no busca construir un veredicto punitivo, sino triangular percepciones contrastantes para identificar brechas de desempeño, necesidades formativas y oportunidades de mejora pedagógica compartida.</w:t>
-      </w:r>
-    </w:p>
-    <w:bookmarkEnd w:id="37"/>
-    <w:bookmarkStart w:id="38" w:name="X4db9d727e55f8acec12bb6f412ea1a9488f0db8"/>
-    <w:p>
-      <w:pPr>
-        <w:pStyle w:val="Heading3"/>
-        <w:keepNext/>
-        <w:spacing w:before="160" w:after="40" w:line="300" w:lineRule="auto"/>
-      </w:pPr>
-      <w:r>
-        <w:rPr>
-          <w:rFonts w:ascii="Arial" w:hAnsi="Arial"/>
-          <w:b/>
-          <w:i/>
-          <w:sz w:val="24"/>
-        </w:rPr>
-        <w:t xml:space="preserve">2.1.3 Gobernanza Universitaria, Autonomía y Negociación Paritaria Docente</w:t>
-      </w:r>
-    </w:p>
-    <w:p>
-      <w:pPr>
-        <w:pStyle w:val="FirstParagraph"/>
-      </w:pPr>
-      <w:r>
-        <w:t xml:space="preserve">La viabilidad de transferir un dispositivo como la retroalimentación 360° al ámbito universitario exige situar el análisis en las particularidades de la gobernanza académica patagónica. Siguiendo a</w:t>
-      </w:r>
-      <w:r>
-        <w:t xml:space="preserve"> </w:t>
-      </w:r>
-      <w:r>
-        <w:t xml:space="preserve">Matus (1993)</w:t>
-      </w:r>
-      <w:r>
-        <w:t xml:space="preserve"> </w:t>
-      </w:r>
-      <w:r>
-        <w:t xml:space="preserve">y</w:t>
-      </w:r>
-      <w:r>
-        <w:t xml:space="preserve"> </w:t>
-      </w:r>
-      <w:r>
-        <w:t xml:space="preserve">Oszlak (2020)</w:t>
-      </w:r>
-      <w:r>
-        <w:t xml:space="preserve">, la gestión pública opera en escenarios de poder compartido y conflicto legítimo de intereses.</w:t>
-      </w:r>
-    </w:p>
-    <w:p>
-      <w:pPr>
-        <w:pStyle w:val="BodyText"/>
-      </w:pPr>
-      <w:r>
-        <w:t xml:space="preserve">En la Universidad Nacional del Comahue (UNCo) y su sede descentralizada CURZAS, la gobernanza institucional se asienta sobre dos pilares fundamentales: el cogobierno colegiado por claustros y la negociación paritaria docente (CCT Docente, Decreto N° 1246/2015; Ordenanza CS N° 0920/2019 de Carrera Docente). Por consiguiente, cualquier propuesta de retroalimentación formativa solo resulta factible si se construye como un dispositivo confidencial, no vinculante para la permanencia estatutaria, preservando la carrera académica y validado en el marco paritario docente.</w:t>
-      </w:r>
-    </w:p>
-    <w:bookmarkEnd w:id="38"/>
-    <w:bookmarkEnd w:id="39"/>
-    <w:bookmarkStart w:id="42" w:name="X77155299af2def8333549b16a82948e9810ead2"/>
+    <w:bookmarkStart w:id="37" w:name="antecedentes-estado-del-arte-del-tema"/>
     <w:p>
       <w:pPr>
         <w:pStyle w:val="Heading2"/>
@@ -3456,110 +3109,19 @@
           <w:b/>
           <w:sz w:val="24"/>
         </w:rPr>
-        <w:t xml:space="preserve">2.2 Antecedentes: Estado del Arte de la Cuestión</w:t>
-      </w:r>
-    </w:p>
-    <w:bookmarkStart w:id="40" w:name="X4a63548b206f17b4d326d68f0fa6e6453d9bc44"/>
-    <w:p>
-      <w:pPr>
-        <w:pStyle w:val="Heading3"/>
-        <w:keepNext/>
-        <w:spacing w:before="160" w:after="40" w:line="300" w:lineRule="auto"/>
-      </w:pPr>
-      <w:r>
-        <w:rPr>
-          <w:rFonts w:ascii="Arial" w:hAnsi="Arial"/>
-          <w:b/>
+        <w:t xml:space="preserve">2.2 Antecedentes: Estado del Arte del Tema</w:t>
+      </w:r>
+    </w:p>
+    <w:p>
+      <w:pPr>
+        <w:pStyle w:val="FirstParagraph"/>
+      </w:pPr>
+      <w:r>
+        <w:rPr>
           <w:i/>
-          <w:sz w:val="24"/>
-        </w:rPr>
-        <w:t xml:space="preserve">2.2.1 Investigaciones Internacionales y Latinoamericanas sobre Evaluación Docente y Modelo 360°</w:t>
-      </w:r>
-    </w:p>
-    <w:p>
-      <w:pPr>
-        <w:pStyle w:val="FirstParagraph"/>
-      </w:pPr>
-      <w:r>
-        <w:t xml:space="preserve">A nivel internacional y regional, diversos estudios han explorado la aplicación de sistemas multiactorales de evaluación en el nivel universitario.</w:t>
-      </w:r>
-      <w:r>
-        <w:t xml:space="preserve"> </w:t>
-      </w:r>
-      <w:r>
-        <w:t xml:space="preserve">Obando Freire et al. (2014)</w:t>
-      </w:r>
-      <w:r>
-        <w:t xml:space="preserve"> </w:t>
-      </w:r>
-      <w:r>
-        <w:t xml:space="preserve">analizaron el sistema de evaluación docente mediante el modelo 360 grados y el portafolio electrónico, concluyendo que la triangulación de miradas entre autoevaluación, coevaluación y heteroevaluación estudiantil incrementa la validez de los diagnósticos pedagógicos y reduce la subjetividad inherente a los instrumentos unidireccionales.</w:t>
-      </w:r>
-    </w:p>
-    <w:p>
-      <w:pPr>
-        <w:pStyle w:val="BodyText"/>
-      </w:pPr>
-      <w:r>
-        <w:t xml:space="preserve">En el ámbito latinoamericano,</w:t>
-      </w:r>
-      <w:r>
-        <w:t xml:space="preserve"> </w:t>
-      </w:r>
-      <w:r>
-        <w:t xml:space="preserve">Sifuentes Ocegueda et al. (2016)</w:t>
-      </w:r>
-      <w:r>
-        <w:t xml:space="preserve"> </w:t>
-      </w:r>
-      <w:r>
-        <w:t xml:space="preserve">evaluaron la implementación de la metodología 360° en profesorado de educación superior, demostrando que cuando el proceso se acompaña de garantías explícitas de confidencialidad y se orienta a planes de capacitación personalizados, los docentes manifiestan una alta receptividad y compromiso con la mejora de sus prácticas docentes. Estos antecedentes ratifican que el desafío central del modelo 360° no es puramente técnico o psicométrico, sino cultural e institucional: generar condiciones de confianza que disipen el temor a la fiscalización punitiva.</w:t>
-      </w:r>
-    </w:p>
-    <w:bookmarkEnd w:id="40"/>
-    <w:bookmarkStart w:id="41" w:name="Xb8f392a52bbfd7c8dfc959aaffa6c25d2729d6e"/>
-    <w:p>
-      <w:pPr>
-        <w:pStyle w:val="Heading3"/>
-        <w:keepNext/>
-        <w:spacing w:before="160" w:after="40" w:line="300" w:lineRule="auto"/>
-      </w:pPr>
-      <w:r>
-        <w:rPr>
-          <w:rFonts w:ascii="Arial" w:hAnsi="Arial"/>
-          <w:b/>
-          <w:i/>
-          <w:sz w:val="24"/>
-        </w:rPr>
-        <w:t xml:space="preserve">2.2.2 Investigaciones Nacionales y Locales sobre Evaluación del Desempeño en Universidades Públicas</w:t>
-      </w:r>
-    </w:p>
-    <w:p>
-      <w:pPr>
-        <w:pStyle w:val="FirstParagraph"/>
-      </w:pPr>
-      <w:r>
-        <w:t xml:space="preserve">En el contexto argentino, las investigaciones sobre evaluación docente en universidades nacionales</w:t>
-      </w:r>
-      <w:r>
-        <w:t xml:space="preserve"> </w:t>
-      </w:r>
-      <w:r>
-        <w:t xml:space="preserve">(Oszlak, 2020; Wainerman &amp; Sautu, 2011)</w:t>
-      </w:r>
-      <w:r>
-        <w:t xml:space="preserve"> </w:t>
-      </w:r>
-      <w:r>
-        <w:t xml:space="preserve">evidencian que los regímenes estatutarios de permanencia (como los concursos periódicos y las carreras docentes) suelen concentrarse en la acreditación curricular formal, con escasa vinculación hacia el perfeccionamiento didáctico cotidiano.</w:t>
-      </w:r>
-    </w:p>
-    <w:p>
-      <w:pPr>
-        <w:pStyle w:val="BodyText"/>
-      </w:pPr>
-      <w:r>
-        <w:t xml:space="preserve">En el caso específico del CURZAS-UNCo, la articulación entre la sede central en Viedma y los Nodos Universitarios en el territorio rionegrino configura un escenario novedoso de docencia híbrida que demanda instrumentos de retroalimentación contextualizados, capaces de captar tanto la labor en el aula física como el acompañamiento virtual.</w:t>
+          <w:iCs/>
+        </w:rPr>
+        <w:t xml:space="preserve">(Sección en desarrollo junto al estudiante)</w:t>
       </w:r>
     </w:p>
     <w:p>
@@ -3567,10 +3129,9 @@
         <w:br w:type="page"/>
       </w:r>
     </w:p>
-    <w:bookmarkEnd w:id="41"/>
-    <w:bookmarkEnd w:id="42"/>
-    <w:bookmarkEnd w:id="43"/>
-    <w:bookmarkStart w:id="61" w:name="referencias"/>
+    <w:bookmarkEnd w:id="37"/>
+    <w:bookmarkEnd w:id="38"/>
+    <w:bookmarkStart w:id="56" w:name="referencias"/>
     <w:p>
       <w:pPr>
         <w:pStyle w:val="Heading1"/>
@@ -3587,8 +3148,8 @@
         <w:t xml:space="preserve">Referencias</w:t>
       </w:r>
     </w:p>
-    <w:bookmarkStart w:id="60" w:name="refs"/>
-    <w:bookmarkStart w:id="44" w:name="ref-chiavenato2020"/>
+    <w:bookmarkStart w:id="55" w:name="refs"/>
+    <w:bookmarkStart w:id="39" w:name="ref-chiavenato2020"/>
     <w:p>
       <w:pPr>
         <w:pStyle w:val="Bibliography"/>
@@ -3616,8 +3177,8 @@
         <w:t xml:space="preserve">(5.ª ed.). McGraw-Hill Interamericana.</w:t>
       </w:r>
     </w:p>
-    <w:bookmarkEnd w:id="44"/>
-    <w:bookmarkStart w:id="45" w:name="ref-uncocurzas2023"/>
+    <w:bookmarkEnd w:id="39"/>
+    <w:bookmarkStart w:id="40" w:name="ref-uncocurzas2023"/>
     <w:p>
       <w:pPr>
         <w:pStyle w:val="Bibliography"/>
@@ -3642,8 +3203,8 @@
         <w:t xml:space="preserve">. Universidad Nacional del Comahue.</w:t>
       </w:r>
     </w:p>
-    <w:bookmarkEnd w:id="45"/>
-    <w:bookmarkStart w:id="46" w:name="ref-pen2015"/>
+    <w:bookmarkEnd w:id="40"/>
+    <w:bookmarkStart w:id="41" w:name="ref-pen2015"/>
     <w:p>
       <w:pPr>
         <w:pStyle w:val="Bibliography"/>
@@ -3655,8 +3216,8 @@
         <w:t xml:space="preserve">Decreto N° 1246/2015. Convenio Colectivo de Trabajo para los Docentes de las Instituciones Universitarias Nacionales (2015).</w:t>
       </w:r>
     </w:p>
-    <w:bookmarkEnd w:id="46"/>
-    <w:bookmarkStart w:id="47" w:name="ref-lepsinger2009"/>
+    <w:bookmarkEnd w:id="41"/>
+    <w:bookmarkStart w:id="42" w:name="ref-lepsinger2009"/>
     <w:p>
       <w:pPr>
         <w:pStyle w:val="Bibliography"/>
@@ -3684,8 +3245,8 @@
         <w:t xml:space="preserve">(2.ª ed.). Pfeiffer.</w:t>
       </w:r>
     </w:p>
-    <w:bookmarkEnd w:id="47"/>
-    <w:bookmarkStart w:id="48" w:name="ref-ministerio1995"/>
+    <w:bookmarkEnd w:id="42"/>
+    <w:bookmarkStart w:id="43" w:name="ref-ministerio1995"/>
     <w:p>
       <w:pPr>
         <w:pStyle w:val="Bibliography"/>
@@ -3697,8 +3258,8 @@
         <w:t xml:space="preserve">Ley N° 24.521 de Educación Superior (1995).</w:t>
       </w:r>
     </w:p>
-    <w:bookmarkEnd w:id="48"/>
-    <w:bookmarkStart w:id="49" w:name="ref-longo2006"/>
+    <w:bookmarkEnd w:id="43"/>
+    <w:bookmarkStart w:id="44" w:name="ref-longo2006"/>
     <w:p>
       <w:pPr>
         <w:pStyle w:val="Bibliography"/>
@@ -3723,8 +3284,8 @@
         <w:t xml:space="preserve">. Paidós.</w:t>
       </w:r>
     </w:p>
-    <w:bookmarkEnd w:id="49"/>
-    <w:bookmarkStart w:id="50" w:name="ref-matus1993"/>
+    <w:bookmarkEnd w:id="44"/>
+    <w:bookmarkStart w:id="45" w:name="ref-matus1993"/>
     <w:p>
       <w:pPr>
         <w:pStyle w:val="Bibliography"/>
@@ -3749,8 +3310,8 @@
         <w:t xml:space="preserve">. Fundación ALTIDIR.</w:t>
       </w:r>
     </w:p>
-    <w:bookmarkEnd w:id="50"/>
-    <w:bookmarkStart w:id="52" w:name="ref-obando2014"/>
+    <w:bookmarkEnd w:id="45"/>
+    <w:bookmarkStart w:id="47" w:name="ref-obando2014"/>
     <w:p>
       <w:pPr>
         <w:pStyle w:val="Bibliography"/>
@@ -3790,7 +3351,7 @@
       <w:r>
         <w:t xml:space="preserve"> </w:t>
       </w:r>
-      <w:hyperlink r:id="rId51">
+      <w:hyperlink r:id="rId46">
         <w:r>
           <w:rPr>
             <w:rStyle w:val="Hyperlink"/>
@@ -3799,8 +3360,8 @@
         </w:r>
       </w:hyperlink>
     </w:p>
-    <w:bookmarkEnd w:id="52"/>
-    <w:bookmarkStart w:id="53" w:name="ref-oszlak2020"/>
+    <w:bookmarkEnd w:id="47"/>
+    <w:bookmarkStart w:id="48" w:name="ref-oszlak2020"/>
     <w:p>
       <w:pPr>
         <w:pStyle w:val="Bibliography"/>
@@ -3825,8 +3386,8 @@
         <w:t xml:space="preserve">. Instituto Nacional de la Administración Pública.</w:t>
       </w:r>
     </w:p>
-    <w:bookmarkEnd w:id="53"/>
-    <w:bookmarkStart w:id="54" w:name="ref-sautu2005"/>
+    <w:bookmarkEnd w:id="48"/>
+    <w:bookmarkStart w:id="49" w:name="ref-sautu2005"/>
     <w:p>
       <w:pPr>
         <w:pStyle w:val="Bibliography"/>
@@ -3851,8 +3412,8 @@
         <w:t xml:space="preserve">. Lumiere.</w:t>
       </w:r>
     </w:p>
-    <w:bookmarkEnd w:id="54"/>
-    <w:bookmarkStart w:id="56" w:name="ref-sifuentes2016"/>
+    <w:bookmarkEnd w:id="49"/>
+    <w:bookmarkStart w:id="51" w:name="ref-sifuentes2016"/>
     <w:p>
       <w:pPr>
         <w:pStyle w:val="Bibliography"/>
@@ -3892,7 +3453,7 @@
       <w:r>
         <w:t xml:space="preserve"> </w:t>
       </w:r>
-      <w:hyperlink r:id="rId55">
+      <w:hyperlink r:id="rId50">
         <w:r>
           <w:rPr>
             <w:rStyle w:val="Hyperlink"/>
@@ -3901,8 +3462,8 @@
         </w:r>
       </w:hyperlink>
     </w:p>
-    <w:bookmarkEnd w:id="56"/>
-    <w:bookmarkStart w:id="57" w:name="ref-unco2019"/>
+    <w:bookmarkEnd w:id="51"/>
+    <w:bookmarkStart w:id="52" w:name="ref-unco2019"/>
     <w:p>
       <w:pPr>
         <w:pStyle w:val="Bibliography"/>
@@ -3927,8 +3488,8 @@
         <w:t xml:space="preserve">.</w:t>
       </w:r>
     </w:p>
-    <w:bookmarkEnd w:id="57"/>
-    <w:bookmarkStart w:id="58" w:name="ref-unco2025"/>
+    <w:bookmarkEnd w:id="52"/>
+    <w:bookmarkStart w:id="53" w:name="ref-unco2025"/>
     <w:p>
       <w:pPr>
         <w:pStyle w:val="Bibliography"/>
@@ -3953,8 +3514,8 @@
         <w:t xml:space="preserve">.</w:t>
       </w:r>
     </w:p>
-    <w:bookmarkEnd w:id="58"/>
-    <w:bookmarkStart w:id="59" w:name="ref-wainerman2011"/>
+    <w:bookmarkEnd w:id="53"/>
+    <w:bookmarkStart w:id="54" w:name="ref-wainerman2011"/>
     <w:p>
       <w:pPr>
         <w:pStyle w:val="Bibliography"/>
@@ -3982,9 +3543,9 @@
         <w:t xml:space="preserve">(4.ª ed.). Manantial.</w:t>
       </w:r>
     </w:p>
-    <w:bookmarkEnd w:id="59"/>
-    <w:bookmarkEnd w:id="60"/>
-    <w:bookmarkEnd w:id="61"/>
+    <w:bookmarkEnd w:id="54"/>
+    <w:bookmarkEnd w:id="55"/>
+    <w:bookmarkEnd w:id="56"/>
     <w:sectPr>
       <w:footerReference w:type="default" r:id="rId11"/>
       <w:footnotePr>
@@ -4393,36 +3954,6 @@
   </w:num>
   <w:num w:numId="1009">
     <w:abstractNumId w:val="991"/>
-  </w:num>
-  <w:num w:numId="1010">
-    <w:abstractNumId w:val="99411"/>
-    <w:lvlOverride w:ilvl="0">
-      <w:startOverride w:val="1"/>
-    </w:lvlOverride>
-    <w:lvlOverride w:ilvl="1">
-      <w:startOverride w:val="1"/>
-    </w:lvlOverride>
-    <w:lvlOverride w:ilvl="2">
-      <w:startOverride w:val="1"/>
-    </w:lvlOverride>
-    <w:lvlOverride w:ilvl="3">
-      <w:startOverride w:val="1"/>
-    </w:lvlOverride>
-    <w:lvlOverride w:ilvl="4">
-      <w:startOverride w:val="1"/>
-    </w:lvlOverride>
-    <w:lvlOverride w:ilvl="5">
-      <w:startOverride w:val="1"/>
-    </w:lvlOverride>
-    <w:lvlOverride w:ilvl="6">
-      <w:startOverride w:val="1"/>
-    </w:lvlOverride>
-    <w:lvlOverride w:ilvl="7">
-      <w:startOverride w:val="1"/>
-    </w:lvlOverride>
-    <w:lvlOverride w:ilvl="8">
-      <w:startOverride w:val="1"/>
-    </w:lvlOverride>
   </w:num>
 </w:numbering>
 </file>

</xml_diff>

<commit_message>
feat(actividad-3): redactar marco teorico y antecedentes con titulos limpios, indice dinamico y referencias APA 7
</commit_message>
<xml_diff>
--- a/Entregas/Actividad 3/TP3_Ayarachi_Fuentes.docx
+++ b/Entregas/Actividad 3/TP3_Ayarachi_Fuentes.docx
@@ -275,7 +275,7 @@
           <w:rFonts w:ascii="Arial" w:hAnsi="Arial"/>
           <w:sz w:val="22"/>
         </w:rPr>
-        <w:t>1. Primera parte de la estructura del Proyecto de investigación de TFG</w:t>
+        <w:t>Primera parte de la estructura del Proyecto de investigación de TFG</w:t>
       </w:r>
       <w:r>
         <w:tab/>
@@ -286,6 +286,519 @@
           <w:sz w:val="22"/>
         </w:rPr>
         <w:t>1</w:t>
+      </w:r>
+    </w:p>
+    <w:p>
+      <w:pPr>
+        <w:pStyle w:val="TOC2"/>
+        <w:tabs>
+          <w:tab w:val="right" w:leader="dot" w:pos="9026"/>
+        </w:tabs>
+        <w:ind w:left="280"/>
+        <w:spacing w:after="60"/>
+      </w:pPr>
+      <w:r>
+        <w:rPr>
+          <w:rFonts w:ascii="Arial" w:hAnsi="Arial"/>
+          <w:sz w:val="22"/>
+        </w:rPr>
+        <w:t>Tema de Investigación</w:t>
+      </w:r>
+      <w:r>
+        <w:tab/>
+      </w:r>
+      <w:r>
+        <w:rPr>
+          <w:rFonts w:ascii="Arial" w:hAnsi="Arial"/>
+          <w:sz w:val="22"/>
+        </w:rPr>
+        <w:t>1</w:t>
+      </w:r>
+    </w:p>
+    <w:p>
+      <w:pPr>
+        <w:pStyle w:val="TOC3"/>
+        <w:tabs>
+          <w:tab w:val="right" w:leader="dot" w:pos="9026"/>
+        </w:tabs>
+        <w:ind w:left="560"/>
+        <w:spacing w:after="60"/>
+      </w:pPr>
+      <w:r>
+        <w:rPr>
+          <w:rFonts w:ascii="Arial" w:hAnsi="Arial"/>
+          <w:sz w:val="22"/>
+        </w:rPr>
+        <w:t>Identificación del Tema y Encuadre en el Modelo de Francisco Longo</w:t>
+      </w:r>
+      <w:r>
+        <w:tab/>
+      </w:r>
+      <w:r>
+        <w:rPr>
+          <w:rFonts w:ascii="Arial" w:hAnsi="Arial"/>
+          <w:sz w:val="22"/>
+        </w:rPr>
+        <w:t>1</w:t>
+      </w:r>
+    </w:p>
+    <w:p>
+      <w:pPr>
+        <w:pStyle w:val="TOC3"/>
+        <w:tabs>
+          <w:tab w:val="right" w:leader="dot" w:pos="9026"/>
+        </w:tabs>
+        <w:ind w:left="560"/>
+        <w:spacing w:after="60"/>
+      </w:pPr>
+      <w:r>
+        <w:rPr>
+          <w:rFonts w:ascii="Arial" w:hAnsi="Arial"/>
+          <w:sz w:val="22"/>
+        </w:rPr>
+        <w:t>Descripción Contextual Socioeconómica, Histórica e Institucional</w:t>
+      </w:r>
+      <w:r>
+        <w:tab/>
+      </w:r>
+      <w:r>
+        <w:rPr>
+          <w:rFonts w:ascii="Arial" w:hAnsi="Arial"/>
+          <w:sz w:val="22"/>
+        </w:rPr>
+        <w:t>2</w:t>
+      </w:r>
+    </w:p>
+    <w:p>
+      <w:pPr>
+        <w:pStyle w:val="TOC2"/>
+        <w:tabs>
+          <w:tab w:val="right" w:leader="dot" w:pos="9026"/>
+        </w:tabs>
+        <w:ind w:left="280"/>
+        <w:spacing w:after="60"/>
+      </w:pPr>
+      <w:r>
+        <w:rPr>
+          <w:rFonts w:ascii="Arial" w:hAnsi="Arial"/>
+          <w:sz w:val="22"/>
+        </w:rPr>
+        <w:t>Delimitación del Objeto Problema</w:t>
+      </w:r>
+      <w:r>
+        <w:tab/>
+      </w:r>
+      <w:r>
+        <w:rPr>
+          <w:rFonts w:ascii="Arial" w:hAnsi="Arial"/>
+          <w:sz w:val="22"/>
+        </w:rPr>
+        <w:t>4</w:t>
+      </w:r>
+    </w:p>
+    <w:p>
+      <w:pPr>
+        <w:pStyle w:val="TOC3"/>
+        <w:tabs>
+          <w:tab w:val="right" w:leader="dot" w:pos="9026"/>
+        </w:tabs>
+        <w:ind w:left="560"/>
+        <w:spacing w:after="60"/>
+      </w:pPr>
+      <w:r>
+        <w:rPr>
+          <w:rFonts w:ascii="Arial" w:hAnsi="Arial"/>
+          <w:sz w:val="22"/>
+        </w:rPr>
+        <w:t>Problematización y Construcción del Objeto de Estudio</w:t>
+      </w:r>
+      <w:r>
+        <w:tab/>
+      </w:r>
+      <w:r>
+        <w:rPr>
+          <w:rFonts w:ascii="Arial" w:hAnsi="Arial"/>
+          <w:sz w:val="22"/>
+        </w:rPr>
+        <w:t>4</w:t>
+      </w:r>
+    </w:p>
+    <w:p>
+      <w:pPr>
+        <w:pStyle w:val="TOC3"/>
+        <w:tabs>
+          <w:tab w:val="right" w:leader="dot" w:pos="9026"/>
+        </w:tabs>
+        <w:ind w:left="560"/>
+        <w:spacing w:after="60"/>
+      </w:pPr>
+      <w:r>
+        <w:rPr>
+          <w:rFonts w:ascii="Arial" w:hAnsi="Arial"/>
+          <w:sz w:val="22"/>
+        </w:rPr>
+        <w:t>Desglose de las Cuatro (4) Delimitaciones Metodológicas</w:t>
+      </w:r>
+      <w:r>
+        <w:tab/>
+      </w:r>
+      <w:r>
+        <w:rPr>
+          <w:rFonts w:ascii="Arial" w:hAnsi="Arial"/>
+          <w:sz w:val="22"/>
+        </w:rPr>
+        <w:t>5</w:t>
+      </w:r>
+    </w:p>
+    <w:p>
+      <w:pPr>
+        <w:pStyle w:val="TOC3"/>
+        <w:tabs>
+          <w:tab w:val="right" w:leader="dot" w:pos="9026"/>
+        </w:tabs>
+        <w:ind w:left="560"/>
+        <w:spacing w:after="60"/>
+      </w:pPr>
+      <w:r>
+        <w:rPr>
+          <w:rFonts w:ascii="Arial" w:hAnsi="Arial"/>
+          <w:sz w:val="22"/>
+        </w:rPr>
+        <w:t>Operacionalización de las Dimensiones de Factibilidad</w:t>
+      </w:r>
+      <w:r>
+        <w:tab/>
+      </w:r>
+      <w:r>
+        <w:rPr>
+          <w:rFonts w:ascii="Arial" w:hAnsi="Arial"/>
+          <w:sz w:val="22"/>
+        </w:rPr>
+        <w:t>5</w:t>
+      </w:r>
+    </w:p>
+    <w:p>
+      <w:pPr>
+        <w:pStyle w:val="TOC3"/>
+        <w:tabs>
+          <w:tab w:val="right" w:leader="dot" w:pos="9026"/>
+        </w:tabs>
+        <w:ind w:left="840"/>
+        <w:spacing w:after="60"/>
+      </w:pPr>
+      <w:r>
+        <w:rPr>
+          <w:rFonts w:ascii="Arial" w:hAnsi="Arial"/>
+          <w:sz w:val="22"/>
+        </w:rPr>
+        <w:t>Definición Conceptual y Operativa de Factibilidad</w:t>
+      </w:r>
+      <w:r>
+        <w:tab/>
+      </w:r>
+      <w:r>
+        <w:rPr>
+          <w:rFonts w:ascii="Arial" w:hAnsi="Arial"/>
+          <w:sz w:val="22"/>
+        </w:rPr>
+        <w:t>5</w:t>
+      </w:r>
+    </w:p>
+    <w:p>
+      <w:pPr>
+        <w:pStyle w:val="TOC3"/>
+        <w:tabs>
+          <w:tab w:val="right" w:leader="dot" w:pos="9026"/>
+        </w:tabs>
+        <w:ind w:left="840"/>
+        <w:spacing w:after="60"/>
+      </w:pPr>
+      <w:r>
+        <w:rPr>
+          <w:rFonts w:ascii="Arial" w:hAnsi="Arial"/>
+          <w:sz w:val="22"/>
+        </w:rPr>
+        <w:t>Dimensiones de Observación y Fuentes Empíricas</w:t>
+      </w:r>
+      <w:r>
+        <w:tab/>
+      </w:r>
+      <w:r>
+        <w:rPr>
+          <w:rFonts w:ascii="Arial" w:hAnsi="Arial"/>
+          <w:sz w:val="22"/>
+        </w:rPr>
+        <w:t>6</w:t>
+      </w:r>
+    </w:p>
+    <w:p>
+      <w:pPr>
+        <w:pStyle w:val="TOC3"/>
+        <w:tabs>
+          <w:tab w:val="right" w:leader="dot" w:pos="9026"/>
+        </w:tabs>
+        <w:ind w:left="840"/>
+        <w:spacing w:after="60"/>
+      </w:pPr>
+      <w:r>
+        <w:rPr>
+          <w:rFonts w:ascii="Arial" w:hAnsi="Arial"/>
+          <w:sz w:val="22"/>
+        </w:rPr>
+        <w:t>Criterios Cualitativos para la Interpretación de Resultados</w:t>
+      </w:r>
+      <w:r>
+        <w:tab/>
+      </w:r>
+      <w:r>
+        <w:rPr>
+          <w:rFonts w:ascii="Arial" w:hAnsi="Arial"/>
+          <w:sz w:val="22"/>
+        </w:rPr>
+        <w:t>7</w:t>
+      </w:r>
+    </w:p>
+    <w:p>
+      <w:pPr>
+        <w:pStyle w:val="TOC3"/>
+        <w:tabs>
+          <w:tab w:val="right" w:leader="dot" w:pos="9026"/>
+        </w:tabs>
+        <w:ind w:left="560"/>
+        <w:spacing w:after="60"/>
+      </w:pPr>
+      <w:r>
+        <w:rPr>
+          <w:rFonts w:ascii="Arial" w:hAnsi="Arial"/>
+          <w:sz w:val="22"/>
+        </w:rPr>
+        <w:t>Pregunta General de Investigación</w:t>
+      </w:r>
+      <w:r>
+        <w:tab/>
+      </w:r>
+      <w:r>
+        <w:rPr>
+          <w:rFonts w:ascii="Arial" w:hAnsi="Arial"/>
+          <w:sz w:val="22"/>
+        </w:rPr>
+        <w:t>7</w:t>
+      </w:r>
+    </w:p>
+    <w:p>
+      <w:pPr>
+        <w:pStyle w:val="TOC2"/>
+        <w:tabs>
+          <w:tab w:val="right" w:leader="dot" w:pos="9026"/>
+        </w:tabs>
+        <w:ind w:left="280"/>
+        <w:spacing w:after="60"/>
+      </w:pPr>
+      <w:r>
+        <w:rPr>
+          <w:rFonts w:ascii="Arial" w:hAnsi="Arial"/>
+          <w:sz w:val="22"/>
+        </w:rPr>
+        <w:t>Justificación y Relevancia de la Investigación</w:t>
+      </w:r>
+      <w:r>
+        <w:tab/>
+      </w:r>
+      <w:r>
+        <w:rPr>
+          <w:rFonts w:ascii="Arial" w:hAnsi="Arial"/>
+          <w:sz w:val="22"/>
+        </w:rPr>
+        <w:t>8</w:t>
+      </w:r>
+    </w:p>
+    <w:p>
+      <w:pPr>
+        <w:pStyle w:val="TOC3"/>
+        <w:tabs>
+          <w:tab w:val="right" w:leader="dot" w:pos="9026"/>
+        </w:tabs>
+        <w:ind w:left="560"/>
+        <w:spacing w:after="60"/>
+      </w:pPr>
+      <w:r>
+        <w:rPr>
+          <w:rFonts w:ascii="Arial" w:hAnsi="Arial"/>
+          <w:sz w:val="22"/>
+        </w:rPr>
+        <w:t>Plano Cognitivo y Disciplinar</w:t>
+      </w:r>
+      <w:r>
+        <w:tab/>
+      </w:r>
+      <w:r>
+        <w:rPr>
+          <w:rFonts w:ascii="Arial" w:hAnsi="Arial"/>
+          <w:sz w:val="22"/>
+        </w:rPr>
+        <w:t>8</w:t>
+      </w:r>
+    </w:p>
+    <w:p>
+      <w:pPr>
+        <w:pStyle w:val="TOC3"/>
+        <w:tabs>
+          <w:tab w:val="right" w:leader="dot" w:pos="9026"/>
+        </w:tabs>
+        <w:ind w:left="560"/>
+        <w:spacing w:after="60"/>
+      </w:pPr>
+      <w:r>
+        <w:rPr>
+          <w:rFonts w:ascii="Arial" w:hAnsi="Arial"/>
+          <w:sz w:val="22"/>
+        </w:rPr>
+        <w:t>Plano Social e Institucional</w:t>
+      </w:r>
+      <w:r>
+        <w:tab/>
+      </w:r>
+      <w:r>
+        <w:rPr>
+          <w:rFonts w:ascii="Arial" w:hAnsi="Arial"/>
+          <w:sz w:val="22"/>
+        </w:rPr>
+        <w:t>8</w:t>
+      </w:r>
+    </w:p>
+    <w:p>
+      <w:pPr>
+        <w:pStyle w:val="TOC3"/>
+        <w:tabs>
+          <w:tab w:val="right" w:leader="dot" w:pos="9026"/>
+        </w:tabs>
+        <w:ind w:left="560"/>
+        <w:spacing w:after="60"/>
+      </w:pPr>
+      <w:r>
+        <w:rPr>
+          <w:rFonts w:ascii="Arial" w:hAnsi="Arial"/>
+          <w:sz w:val="22"/>
+        </w:rPr>
+        <w:t>Plano Personal y Profesional</w:t>
+      </w:r>
+      <w:r>
+        <w:tab/>
+      </w:r>
+      <w:r>
+        <w:rPr>
+          <w:rFonts w:ascii="Arial" w:hAnsi="Arial"/>
+          <w:sz w:val="22"/>
+        </w:rPr>
+        <w:t>8</w:t>
+      </w:r>
+    </w:p>
+    <w:p>
+      <w:pPr>
+        <w:pStyle w:val="TOC2"/>
+        <w:tabs>
+          <w:tab w:val="right" w:leader="dot" w:pos="9026"/>
+        </w:tabs>
+        <w:ind w:left="280"/>
+        <w:spacing w:after="60"/>
+      </w:pPr>
+      <w:r>
+        <w:rPr>
+          <w:rFonts w:ascii="Arial" w:hAnsi="Arial"/>
+          <w:sz w:val="22"/>
+        </w:rPr>
+        <w:t>Definición de Objetivos del TFG</w:t>
+      </w:r>
+      <w:r>
+        <w:tab/>
+      </w:r>
+      <w:r>
+        <w:rPr>
+          <w:rFonts w:ascii="Arial" w:hAnsi="Arial"/>
+          <w:sz w:val="22"/>
+        </w:rPr>
+        <w:t>9</w:t>
+      </w:r>
+    </w:p>
+    <w:p>
+      <w:pPr>
+        <w:pStyle w:val="TOC3"/>
+        <w:tabs>
+          <w:tab w:val="right" w:leader="dot" w:pos="9026"/>
+        </w:tabs>
+        <w:ind w:left="560"/>
+        <w:spacing w:after="60"/>
+      </w:pPr>
+      <w:r>
+        <w:rPr>
+          <w:rFonts w:ascii="Arial" w:hAnsi="Arial"/>
+          <w:sz w:val="22"/>
+        </w:rPr>
+        <w:t>Objetivo General</w:t>
+      </w:r>
+      <w:r>
+        <w:tab/>
+      </w:r>
+      <w:r>
+        <w:rPr>
+          <w:rFonts w:ascii="Arial" w:hAnsi="Arial"/>
+          <w:sz w:val="22"/>
+        </w:rPr>
+        <w:t>9</w:t>
+      </w:r>
+    </w:p>
+    <w:p>
+      <w:pPr>
+        <w:pStyle w:val="TOC3"/>
+        <w:tabs>
+          <w:tab w:val="right" w:leader="dot" w:pos="9026"/>
+        </w:tabs>
+        <w:ind w:left="560"/>
+        <w:spacing w:after="60"/>
+      </w:pPr>
+      <w:r>
+        <w:rPr>
+          <w:rFonts w:ascii="Arial" w:hAnsi="Arial"/>
+          <w:sz w:val="22"/>
+        </w:rPr>
+        <w:t>Objetivos Específicos</w:t>
+      </w:r>
+      <w:r>
+        <w:tab/>
+      </w:r>
+      <w:r>
+        <w:rPr>
+          <w:rFonts w:ascii="Arial" w:hAnsi="Arial"/>
+          <w:sz w:val="22"/>
+        </w:rPr>
+        <w:t>9</w:t>
+      </w:r>
+    </w:p>
+    <w:p>
+      <w:pPr>
+        <w:pStyle w:val="TOC3"/>
+        <w:tabs>
+          <w:tab w:val="right" w:leader="dot" w:pos="9026"/>
+        </w:tabs>
+        <w:ind w:left="560"/>
+        <w:spacing w:after="60"/>
+      </w:pPr>
+      <w:r>
+        <w:rPr>
+          <w:rFonts w:ascii="Arial" w:hAnsi="Arial"/>
+          <w:sz w:val="22"/>
+        </w:rPr>
+        <w:t>Matriz de Consistencia Metodológica y Articulación con Longo (2006)</w:t>
+      </w:r>
+      <w:r>
+        <w:tab/>
+      </w:r>
+      <w:r>
+        <w:rPr>
+          <w:rFonts w:ascii="Arial" w:hAnsi="Arial"/>
+          <w:sz w:val="22"/>
+        </w:rPr>
+        <w:t>9</w:t>
       </w:r>
     </w:p>
     <w:p>
@@ -302,7 +815,7 @@
           <w:rFonts w:ascii="Arial" w:hAnsi="Arial"/>
           <w:sz w:val="22"/>
         </w:rPr>
-        <w:t>1.1 Tema de Investigación</w:t>
+        <w:t>Segunda parte de la estructura del Proyecto de investigación de TFG</w:t>
       </w:r>
       <w:r>
         <w:tab/>
@@ -312,7 +825,277 @@
           <w:rFonts w:ascii="Arial" w:hAnsi="Arial"/>
           <w:sz w:val="22"/>
         </w:rPr>
-        <w:t>1</w:t>
+        <w:t>11</w:t>
+      </w:r>
+    </w:p>
+    <w:p>
+      <w:pPr>
+        <w:pStyle w:val="TOC2"/>
+        <w:tabs>
+          <w:tab w:val="right" w:leader="dot" w:pos="9026"/>
+        </w:tabs>
+        <w:ind w:left="280"/>
+        <w:spacing w:after="60"/>
+      </w:pPr>
+      <w:r>
+        <w:rPr>
+          <w:rFonts w:ascii="Arial" w:hAnsi="Arial"/>
+          <w:sz w:val="22"/>
+        </w:rPr>
+        <w:t>Marco Teórico: Posicionamiento Teórico y Conceptos Centrales</w:t>
+      </w:r>
+      <w:r>
+        <w:tab/>
+      </w:r>
+      <w:r>
+        <w:rPr>
+          <w:rFonts w:ascii="Arial" w:hAnsi="Arial"/>
+          <w:sz w:val="22"/>
+        </w:rPr>
+        <w:t>11</w:t>
+      </w:r>
+    </w:p>
+    <w:p>
+      <w:pPr>
+        <w:pStyle w:val="TOC3"/>
+        <w:tabs>
+          <w:tab w:val="right" w:leader="dot" w:pos="9026"/>
+        </w:tabs>
+        <w:ind w:left="560"/>
+        <w:spacing w:after="60"/>
+      </w:pPr>
+      <w:r>
+        <w:rPr>
+          <w:rFonts w:ascii="Arial" w:hAnsi="Arial"/>
+          <w:sz w:val="22"/>
+        </w:rPr>
+        <w:t>Posicionamiento Epistemológico: La Teoría como Configuración Abierta y el Análisis de Factibilidad</w:t>
+      </w:r>
+      <w:r>
+        <w:tab/>
+      </w:r>
+      <w:r>
+        <w:rPr>
+          <w:rFonts w:ascii="Arial" w:hAnsi="Arial"/>
+          <w:sz w:val="22"/>
+        </w:rPr>
+        <w:t>11</w:t>
+      </w:r>
+    </w:p>
+    <w:p>
+      <w:pPr>
+        <w:pStyle w:val="TOC3"/>
+        <w:tabs>
+          <w:tab w:val="right" w:leader="dot" w:pos="9026"/>
+        </w:tabs>
+        <w:ind w:left="560"/>
+        <w:spacing w:after="60"/>
+      </w:pPr>
+      <w:r>
+        <w:rPr>
+          <w:rFonts w:ascii="Arial" w:hAnsi="Arial"/>
+          <w:sz w:val="22"/>
+        </w:rPr>
+        <w:t>El Enfoque Sistémico de Gestión de Personas en el Sector Público: Modelo de Francisco Longo</w:t>
+      </w:r>
+      <w:r>
+        <w:tab/>
+      </w:r>
+      <w:r>
+        <w:rPr>
+          <w:rFonts w:ascii="Arial" w:hAnsi="Arial"/>
+          <w:sz w:val="22"/>
+        </w:rPr>
+        <w:t>12</w:t>
+      </w:r>
+    </w:p>
+    <w:p>
+      <w:pPr>
+        <w:pStyle w:val="TOC3"/>
+        <w:tabs>
+          <w:tab w:val="right" w:leader="dot" w:pos="9026"/>
+        </w:tabs>
+        <w:ind w:left="560"/>
+        <w:spacing w:after="60"/>
+      </w:pPr>
+      <w:r>
+        <w:rPr>
+          <w:rFonts w:ascii="Arial" w:hAnsi="Arial"/>
+          <w:sz w:val="22"/>
+        </w:rPr>
+        <w:t>De la Lógica de Control a la Lógica Formativa: El Modelo de Retroalimentación 360° en la Educación Superior</w:t>
+      </w:r>
+      <w:r>
+        <w:tab/>
+      </w:r>
+      <w:r>
+        <w:rPr>
+          <w:rFonts w:ascii="Arial" w:hAnsi="Arial"/>
+          <w:sz w:val="22"/>
+        </w:rPr>
+        <w:t>13</w:t>
+      </w:r>
+    </w:p>
+    <w:p>
+      <w:pPr>
+        <w:pStyle w:val="TOC3"/>
+        <w:tabs>
+          <w:tab w:val="right" w:leader="dot" w:pos="9026"/>
+        </w:tabs>
+        <w:ind w:left="560"/>
+        <w:spacing w:after="60"/>
+      </w:pPr>
+      <w:r>
+        <w:rPr>
+          <w:rFonts w:ascii="Arial" w:hAnsi="Arial"/>
+          <w:sz w:val="22"/>
+        </w:rPr>
+        <w:t>Gobernanza Universitaria, Cogobierno y Negociación Paritaria Docente</w:t>
+      </w:r>
+      <w:r>
+        <w:tab/>
+      </w:r>
+      <w:r>
+        <w:rPr>
+          <w:rFonts w:ascii="Arial" w:hAnsi="Arial"/>
+          <w:sz w:val="22"/>
+        </w:rPr>
+        <w:t>14</w:t>
+      </w:r>
+    </w:p>
+    <w:p>
+      <w:pPr>
+        <w:pStyle w:val="TOC2"/>
+        <w:tabs>
+          <w:tab w:val="right" w:leader="dot" w:pos="9026"/>
+        </w:tabs>
+        <w:ind w:left="280"/>
+        <w:spacing w:after="60"/>
+      </w:pPr>
+      <w:r>
+        <w:rPr>
+          <w:rFonts w:ascii="Arial" w:hAnsi="Arial"/>
+          <w:sz w:val="22"/>
+        </w:rPr>
+        <w:t>Antecedentes: Estado del Arte de la Cuestión</w:t>
+      </w:r>
+      <w:r>
+        <w:tab/>
+      </w:r>
+      <w:r>
+        <w:rPr>
+          <w:rFonts w:ascii="Arial" w:hAnsi="Arial"/>
+          <w:sz w:val="22"/>
+        </w:rPr>
+        <w:t>15</w:t>
+      </w:r>
+    </w:p>
+    <w:p>
+      <w:pPr>
+        <w:pStyle w:val="TOC3"/>
+        <w:tabs>
+          <w:tab w:val="right" w:leader="dot" w:pos="9026"/>
+        </w:tabs>
+        <w:ind w:left="560"/>
+        <w:spacing w:after="60"/>
+      </w:pPr>
+      <w:r>
+        <w:rPr>
+          <w:rFonts w:ascii="Arial" w:hAnsi="Arial"/>
+          <w:sz w:val="22"/>
+        </w:rPr>
+        <w:t>Antecedentes Internacionales: Modelos 360° y Triangulación Evaluativa en la Educación Superior</w:t>
+      </w:r>
+      <w:r>
+        <w:tab/>
+      </w:r>
+      <w:r>
+        <w:rPr>
+          <w:rFonts w:ascii="Arial" w:hAnsi="Arial"/>
+          <w:sz w:val="22"/>
+        </w:rPr>
+        <w:t>15</w:t>
+      </w:r>
+    </w:p>
+    <w:p>
+      <w:pPr>
+        <w:pStyle w:val="TOC3"/>
+        <w:tabs>
+          <w:tab w:val="right" w:leader="dot" w:pos="9026"/>
+        </w:tabs>
+        <w:ind w:left="560"/>
+        <w:spacing w:after="60"/>
+      </w:pPr>
+      <w:r>
+        <w:rPr>
+          <w:rFonts w:ascii="Arial" w:hAnsi="Arial"/>
+          <w:sz w:val="22"/>
+        </w:rPr>
+        <w:t>Antecedentes Nacionales: Evaluación Docente y Carrera Académica en Universidades Públicas Argentinas</w:t>
+      </w:r>
+      <w:r>
+        <w:tab/>
+      </w:r>
+      <w:r>
+        <w:rPr>
+          <w:rFonts w:ascii="Arial" w:hAnsi="Arial"/>
+          <w:sz w:val="22"/>
+        </w:rPr>
+        <w:t>16</w:t>
+      </w:r>
+    </w:p>
+    <w:p>
+      <w:pPr>
+        <w:pStyle w:val="TOC3"/>
+        <w:tabs>
+          <w:tab w:val="right" w:leader="dot" w:pos="9026"/>
+        </w:tabs>
+        <w:ind w:left="560"/>
+        <w:spacing w:after="60"/>
+      </w:pPr>
+      <w:r>
+        <w:rPr>
+          <w:rFonts w:ascii="Arial" w:hAnsi="Arial"/>
+          <w:sz w:val="22"/>
+        </w:rPr>
+        <w:t>Antecedentes Regionales y Locales: Prácticas de Evaluación y Contexto Institucional en la UNCo y el CURZAS</w:t>
+      </w:r>
+      <w:r>
+        <w:tab/>
+      </w:r>
+      <w:r>
+        <w:rPr>
+          <w:rFonts w:ascii="Arial" w:hAnsi="Arial"/>
+          <w:sz w:val="22"/>
+        </w:rPr>
+        <w:t>17</w:t>
+      </w:r>
+    </w:p>
+    <w:p>
+      <w:pPr>
+        <w:pStyle w:val="TOC3"/>
+        <w:tabs>
+          <w:tab w:val="right" w:leader="dot" w:pos="9026"/>
+        </w:tabs>
+        <w:ind w:left="560"/>
+        <w:spacing w:after="60"/>
+      </w:pPr>
+      <w:r>
+        <w:rPr>
+          <w:rFonts w:ascii="Arial" w:hAnsi="Arial"/>
+          <w:sz w:val="22"/>
+        </w:rPr>
+        <w:t>Síntesis Integradora y Vacancia de la Investigación</w:t>
+      </w:r>
+      <w:r>
+        <w:tab/>
+      </w:r>
+      <w:r>
+        <w:rPr>
+          <w:rFonts w:ascii="Arial" w:hAnsi="Arial"/>
+          <w:sz w:val="22"/>
+        </w:rPr>
+        <w:t>18</w:t>
       </w:r>
     </w:p>
     <w:p>
@@ -329,7 +1112,7 @@
           <w:rFonts w:ascii="Arial" w:hAnsi="Arial"/>
           <w:sz w:val="22"/>
         </w:rPr>
-        <w:t>1.1.1 Identificación del Tema y Encuadre en el Modelo de Francisco Longo</w:t>
+        <w:t>Referencias Bibliográficas</w:t>
       </w:r>
       <w:r>
         <w:tab/>
@@ -339,601 +1122,7 @@
           <w:rFonts w:ascii="Arial" w:hAnsi="Arial"/>
           <w:sz w:val="22"/>
         </w:rPr>
-        <w:t>1</w:t>
-      </w:r>
-    </w:p>
-    <w:p>
-      <w:pPr>
-        <w:pStyle w:val="TOC1"/>
-        <w:tabs>
-          <w:tab w:val="right" w:leader="dot" w:pos="9026"/>
-        </w:tabs>
-        <w:ind w:left="0"/>
-        <w:spacing w:after="60"/>
-      </w:pPr>
-      <w:r>
-        <w:rPr>
-          <w:rFonts w:ascii="Arial" w:hAnsi="Arial"/>
-          <w:sz w:val="22"/>
-        </w:rPr>
-        <w:t>1.1.2 Descripción Contextual Socioeconómica, Histórica e Institucional</w:t>
-      </w:r>
-      <w:r>
-        <w:tab/>
-      </w:r>
-      <w:r>
-        <w:rPr>
-          <w:rFonts w:ascii="Arial" w:hAnsi="Arial"/>
-          <w:sz w:val="22"/>
-        </w:rPr>
-        <w:t>2</w:t>
-      </w:r>
-    </w:p>
-    <w:p>
-      <w:pPr>
-        <w:pStyle w:val="TOC1"/>
-        <w:tabs>
-          <w:tab w:val="right" w:leader="dot" w:pos="9026"/>
-        </w:tabs>
-        <w:ind w:left="0"/>
-        <w:spacing w:after="60"/>
-      </w:pPr>
-      <w:r>
-        <w:rPr>
-          <w:rFonts w:ascii="Arial" w:hAnsi="Arial"/>
-          <w:sz w:val="22"/>
-        </w:rPr>
-        <w:t>1.2 Delimitación del Objeto Problema</w:t>
-      </w:r>
-      <w:r>
-        <w:tab/>
-      </w:r>
-      <w:r>
-        <w:rPr>
-          <w:rFonts w:ascii="Arial" w:hAnsi="Arial"/>
-          <w:sz w:val="22"/>
-        </w:rPr>
-        <w:t>4</w:t>
-      </w:r>
-    </w:p>
-    <w:p>
-      <w:pPr>
-        <w:pStyle w:val="TOC1"/>
-        <w:tabs>
-          <w:tab w:val="right" w:leader="dot" w:pos="9026"/>
-        </w:tabs>
-        <w:ind w:left="0"/>
-        <w:spacing w:after="60"/>
-      </w:pPr>
-      <w:r>
-        <w:rPr>
-          <w:rFonts w:ascii="Arial" w:hAnsi="Arial"/>
-          <w:sz w:val="22"/>
-        </w:rPr>
-        <w:t>1.2.1 Problematización y Construcción del Objeto de Estudio</w:t>
-      </w:r>
-      <w:r>
-        <w:tab/>
-      </w:r>
-      <w:r>
-        <w:rPr>
-          <w:rFonts w:ascii="Arial" w:hAnsi="Arial"/>
-          <w:sz w:val="22"/>
-        </w:rPr>
-        <w:t>4</w:t>
-      </w:r>
-    </w:p>
-    <w:p>
-      <w:pPr>
-        <w:pStyle w:val="TOC1"/>
-        <w:tabs>
-          <w:tab w:val="right" w:leader="dot" w:pos="9026"/>
-        </w:tabs>
-        <w:ind w:left="0"/>
-        <w:spacing w:after="60"/>
-      </w:pPr>
-      <w:r>
-        <w:rPr>
-          <w:rFonts w:ascii="Arial" w:hAnsi="Arial"/>
-          <w:sz w:val="22"/>
-        </w:rPr>
-        <w:t>1.2.2 Desglose de las Cuatro (4) Delimitaciones Metodológicas</w:t>
-      </w:r>
-      <w:r>
-        <w:tab/>
-      </w:r>
-      <w:r>
-        <w:rPr>
-          <w:rFonts w:ascii="Arial" w:hAnsi="Arial"/>
-          <w:sz w:val="22"/>
-        </w:rPr>
-        <w:t>5</w:t>
-      </w:r>
-    </w:p>
-    <w:p>
-      <w:pPr>
-        <w:pStyle w:val="TOC1"/>
-        <w:tabs>
-          <w:tab w:val="right" w:leader="dot" w:pos="9026"/>
-        </w:tabs>
-        <w:ind w:left="0"/>
-        <w:spacing w:after="60"/>
-      </w:pPr>
-      <w:r>
-        <w:rPr>
-          <w:rFonts w:ascii="Arial" w:hAnsi="Arial"/>
-          <w:sz w:val="22"/>
-        </w:rPr>
-        <w:t>1.2.3 Operacionalización de las Dimensiones de Factibilidad</w:t>
-      </w:r>
-      <w:r>
-        <w:tab/>
-      </w:r>
-      <w:r>
-        <w:rPr>
-          <w:rFonts w:ascii="Arial" w:hAnsi="Arial"/>
-          <w:sz w:val="22"/>
-        </w:rPr>
-        <w:t>5</w:t>
-      </w:r>
-    </w:p>
-    <w:p>
-      <w:pPr>
-        <w:pStyle w:val="TOC1"/>
-        <w:tabs>
-          <w:tab w:val="right" w:leader="dot" w:pos="9026"/>
-        </w:tabs>
-        <w:ind w:left="0"/>
-        <w:spacing w:after="60"/>
-      </w:pPr>
-      <w:r>
-        <w:rPr>
-          <w:rFonts w:ascii="Arial" w:hAnsi="Arial"/>
-          <w:sz w:val="22"/>
-        </w:rPr>
-        <w:t>1.2.3.1 Definición Conceptual y Operativa de Factibilidad</w:t>
-      </w:r>
-      <w:r>
-        <w:tab/>
-      </w:r>
-      <w:r>
-        <w:rPr>
-          <w:rFonts w:ascii="Arial" w:hAnsi="Arial"/>
-          <w:sz w:val="22"/>
-        </w:rPr>
-        <w:t>5</w:t>
-      </w:r>
-    </w:p>
-    <w:p>
-      <w:pPr>
-        <w:pStyle w:val="TOC1"/>
-        <w:tabs>
-          <w:tab w:val="right" w:leader="dot" w:pos="9026"/>
-        </w:tabs>
-        <w:ind w:left="0"/>
-        <w:spacing w:after="60"/>
-      </w:pPr>
-      <w:r>
-        <w:rPr>
-          <w:rFonts w:ascii="Arial" w:hAnsi="Arial"/>
-          <w:sz w:val="22"/>
-        </w:rPr>
-        <w:t>1.2.3.2 Dimensiones de Observación y Fuentes Empíricas</w:t>
-      </w:r>
-      <w:r>
-        <w:tab/>
-      </w:r>
-      <w:r>
-        <w:rPr>
-          <w:rFonts w:ascii="Arial" w:hAnsi="Arial"/>
-          <w:sz w:val="22"/>
-        </w:rPr>
-        <w:t>6</w:t>
-      </w:r>
-    </w:p>
-    <w:p>
-      <w:pPr>
-        <w:pStyle w:val="TOC1"/>
-        <w:tabs>
-          <w:tab w:val="right" w:leader="dot" w:pos="9026"/>
-        </w:tabs>
-        <w:ind w:left="0"/>
-        <w:spacing w:after="60"/>
-      </w:pPr>
-      <w:r>
-        <w:rPr>
-          <w:rFonts w:ascii="Arial" w:hAnsi="Arial"/>
-          <w:sz w:val="22"/>
-        </w:rPr>
-        <w:t>1.2.3.3 Criterios Cualitativos para la Interpretación de Resultados</w:t>
-      </w:r>
-      <w:r>
-        <w:tab/>
-      </w:r>
-      <w:r>
-        <w:rPr>
-          <w:rFonts w:ascii="Arial" w:hAnsi="Arial"/>
-          <w:sz w:val="22"/>
-        </w:rPr>
-        <w:t>7</w:t>
-      </w:r>
-    </w:p>
-    <w:p>
-      <w:pPr>
-        <w:pStyle w:val="TOC1"/>
-        <w:tabs>
-          <w:tab w:val="right" w:leader="dot" w:pos="9026"/>
-        </w:tabs>
-        <w:ind w:left="0"/>
-        <w:spacing w:after="60"/>
-      </w:pPr>
-      <w:r>
-        <w:rPr>
-          <w:rFonts w:ascii="Arial" w:hAnsi="Arial"/>
-          <w:sz w:val="22"/>
-        </w:rPr>
-        <w:t>1.2.4 Pregunta General de Investigación</w:t>
-      </w:r>
-      <w:r>
-        <w:tab/>
-      </w:r>
-      <w:r>
-        <w:rPr>
-          <w:rFonts w:ascii="Arial" w:hAnsi="Arial"/>
-          <w:sz w:val="22"/>
-        </w:rPr>
-        <w:t>7</w:t>
-      </w:r>
-    </w:p>
-    <w:p>
-      <w:pPr>
-        <w:pStyle w:val="TOC1"/>
-        <w:tabs>
-          <w:tab w:val="right" w:leader="dot" w:pos="9026"/>
-        </w:tabs>
-        <w:ind w:left="0"/>
-        <w:spacing w:after="60"/>
-      </w:pPr>
-      <w:r>
-        <w:rPr>
-          <w:rFonts w:ascii="Arial" w:hAnsi="Arial"/>
-          <w:sz w:val="22"/>
-        </w:rPr>
-        <w:t>1.3 Justificación y Relevancia de la Investigación</w:t>
-      </w:r>
-      <w:r>
-        <w:tab/>
-      </w:r>
-      <w:r>
-        <w:rPr>
-          <w:rFonts w:ascii="Arial" w:hAnsi="Arial"/>
-          <w:sz w:val="22"/>
-        </w:rPr>
-        <w:t>8</w:t>
-      </w:r>
-    </w:p>
-    <w:p>
-      <w:pPr>
-        <w:pStyle w:val="TOC1"/>
-        <w:tabs>
-          <w:tab w:val="right" w:leader="dot" w:pos="9026"/>
-        </w:tabs>
-        <w:ind w:left="0"/>
-        <w:spacing w:after="60"/>
-      </w:pPr>
-      <w:r>
-        <w:rPr>
-          <w:rFonts w:ascii="Arial" w:hAnsi="Arial"/>
-          <w:sz w:val="22"/>
-        </w:rPr>
-        <w:t>1.3.1 Plano Cognitivo y Disciplinar</w:t>
-      </w:r>
-      <w:r>
-        <w:tab/>
-      </w:r>
-      <w:r>
-        <w:rPr>
-          <w:rFonts w:ascii="Arial" w:hAnsi="Arial"/>
-          <w:sz w:val="22"/>
-        </w:rPr>
-        <w:t>8</w:t>
-      </w:r>
-    </w:p>
-    <w:p>
-      <w:pPr>
-        <w:pStyle w:val="TOC1"/>
-        <w:tabs>
-          <w:tab w:val="right" w:leader="dot" w:pos="9026"/>
-        </w:tabs>
-        <w:ind w:left="0"/>
-        <w:spacing w:after="60"/>
-      </w:pPr>
-      <w:r>
-        <w:rPr>
-          <w:rFonts w:ascii="Arial" w:hAnsi="Arial"/>
-          <w:sz w:val="22"/>
-        </w:rPr>
-        <w:t>1.3.2 Plano Social e Institucional</w:t>
-      </w:r>
-      <w:r>
-        <w:tab/>
-      </w:r>
-      <w:r>
-        <w:rPr>
-          <w:rFonts w:ascii="Arial" w:hAnsi="Arial"/>
-          <w:sz w:val="22"/>
-        </w:rPr>
-        <w:t>8</w:t>
-      </w:r>
-    </w:p>
-    <w:p>
-      <w:pPr>
-        <w:pStyle w:val="TOC1"/>
-        <w:tabs>
-          <w:tab w:val="right" w:leader="dot" w:pos="9026"/>
-        </w:tabs>
-        <w:ind w:left="0"/>
-        <w:spacing w:after="60"/>
-      </w:pPr>
-      <w:r>
-        <w:rPr>
-          <w:rFonts w:ascii="Arial" w:hAnsi="Arial"/>
-          <w:sz w:val="22"/>
-        </w:rPr>
-        <w:t>1.3.3 Plano Personal y Profesional</w:t>
-      </w:r>
-      <w:r>
-        <w:tab/>
-      </w:r>
-      <w:r>
-        <w:rPr>
-          <w:rFonts w:ascii="Arial" w:hAnsi="Arial"/>
-          <w:sz w:val="22"/>
-        </w:rPr>
-        <w:t>8</w:t>
-      </w:r>
-    </w:p>
-    <w:p>
-      <w:pPr>
-        <w:pStyle w:val="TOC1"/>
-        <w:tabs>
-          <w:tab w:val="right" w:leader="dot" w:pos="9026"/>
-        </w:tabs>
-        <w:ind w:left="0"/>
-        <w:spacing w:after="60"/>
-      </w:pPr>
-      <w:r>
-        <w:rPr>
-          <w:rFonts w:ascii="Arial" w:hAnsi="Arial"/>
-          <w:sz w:val="22"/>
-        </w:rPr>
-        <w:t>1.4 Definición de Objetivos del TFG</w:t>
-      </w:r>
-      <w:r>
-        <w:tab/>
-      </w:r>
-      <w:r>
-        <w:rPr>
-          <w:rFonts w:ascii="Arial" w:hAnsi="Arial"/>
-          <w:sz w:val="22"/>
-        </w:rPr>
-        <w:t>9</w:t>
-      </w:r>
-    </w:p>
-    <w:p>
-      <w:pPr>
-        <w:pStyle w:val="TOC1"/>
-        <w:tabs>
-          <w:tab w:val="right" w:leader="dot" w:pos="9026"/>
-        </w:tabs>
-        <w:ind w:left="0"/>
-        <w:spacing w:after="60"/>
-      </w:pPr>
-      <w:r>
-        <w:rPr>
-          <w:rFonts w:ascii="Arial" w:hAnsi="Arial"/>
-          <w:sz w:val="22"/>
-        </w:rPr>
-        <w:t>1.4.1 Objetivo General</w:t>
-      </w:r>
-      <w:r>
-        <w:tab/>
-      </w:r>
-      <w:r>
-        <w:rPr>
-          <w:rFonts w:ascii="Arial" w:hAnsi="Arial"/>
-          <w:sz w:val="22"/>
-        </w:rPr>
-        <w:t>9</w:t>
-      </w:r>
-    </w:p>
-    <w:p>
-      <w:pPr>
-        <w:pStyle w:val="TOC1"/>
-        <w:tabs>
-          <w:tab w:val="right" w:leader="dot" w:pos="9026"/>
-        </w:tabs>
-        <w:ind w:left="0"/>
-        <w:spacing w:after="60"/>
-      </w:pPr>
-      <w:r>
-        <w:rPr>
-          <w:rFonts w:ascii="Arial" w:hAnsi="Arial"/>
-          <w:sz w:val="22"/>
-        </w:rPr>
-        <w:t>1.4.2 Objetivos Específicos</w:t>
-      </w:r>
-      <w:r>
-        <w:tab/>
-      </w:r>
-      <w:r>
-        <w:rPr>
-          <w:rFonts w:ascii="Arial" w:hAnsi="Arial"/>
-          <w:sz w:val="22"/>
-        </w:rPr>
-        <w:t>9</w:t>
-      </w:r>
-    </w:p>
-    <w:p>
-      <w:pPr>
-        <w:pStyle w:val="TOC1"/>
-        <w:tabs>
-          <w:tab w:val="right" w:leader="dot" w:pos="9026"/>
-        </w:tabs>
-        <w:ind w:left="0"/>
-        <w:spacing w:after="60"/>
-      </w:pPr>
-      <w:r>
-        <w:rPr>
-          <w:rFonts w:ascii="Arial" w:hAnsi="Arial"/>
-          <w:sz w:val="22"/>
-        </w:rPr>
-        <w:t>1.4.3 Matriz de Consistencia Metodológica y Articulación con Longo (2006)</w:t>
-      </w:r>
-      <w:r>
-        <w:tab/>
-      </w:r>
-      <w:r>
-        <w:rPr>
-          <w:rFonts w:ascii="Arial" w:hAnsi="Arial"/>
-          <w:sz w:val="22"/>
-        </w:rPr>
-        <w:t>9</w:t>
-      </w:r>
-    </w:p>
-    <w:p>
-      <w:pPr>
-        <w:pStyle w:val="TOC1"/>
-        <w:tabs>
-          <w:tab w:val="right" w:leader="dot" w:pos="9026"/>
-        </w:tabs>
-        <w:ind w:left="0"/>
-        <w:spacing w:after="60"/>
-      </w:pPr>
-      <w:r>
-        <w:rPr>
-          <w:rFonts w:ascii="Arial" w:hAnsi="Arial"/>
-          <w:sz w:val="22"/>
-        </w:rPr>
-        <w:t>2. Segunda parte de la estructura del Proyecto de investigación de TFG</w:t>
-      </w:r>
-      <w:r>
-        <w:tab/>
-      </w:r>
-      <w:r>
-        <w:rPr>
-          <w:rFonts w:ascii="Arial" w:hAnsi="Arial"/>
-          <w:sz w:val="22"/>
-        </w:rPr>
-        <w:t>11</w:t>
-      </w:r>
-    </w:p>
-    <w:p>
-      <w:pPr>
-        <w:pStyle w:val="TOC1"/>
-        <w:tabs>
-          <w:tab w:val="right" w:leader="dot" w:pos="9026"/>
-        </w:tabs>
-        <w:ind w:left="0"/>
-        <w:spacing w:after="60"/>
-      </w:pPr>
-      <w:r>
-        <w:rPr>
-          <w:rFonts w:ascii="Arial" w:hAnsi="Arial"/>
-          <w:sz w:val="22"/>
-        </w:rPr>
-        <w:t>2.1 Marco Teórico: Posicionamiento Teórico y Conceptos Centrales</w:t>
-      </w:r>
-      <w:r>
-        <w:tab/>
-      </w:r>
-      <w:r>
-        <w:rPr>
-          <w:rFonts w:ascii="Arial" w:hAnsi="Arial"/>
-          <w:sz w:val="22"/>
-        </w:rPr>
-        <w:t>11</w:t>
-      </w:r>
-    </w:p>
-    <w:p>
-      <w:pPr>
-        <w:pStyle w:val="TOC1"/>
-        <w:tabs>
-          <w:tab w:val="right" w:leader="dot" w:pos="9026"/>
-        </w:tabs>
-        <w:ind w:left="0"/>
-        <w:spacing w:after="60"/>
-      </w:pPr>
-      <w:r>
-        <w:rPr>
-          <w:rFonts w:ascii="Arial" w:hAnsi="Arial"/>
-          <w:sz w:val="22"/>
-        </w:rPr>
-        <w:t>2.2 Antecedentes: Estado del Arte del Tema</w:t>
-      </w:r>
-      <w:r>
-        <w:tab/>
-      </w:r>
-      <w:r>
-        <w:rPr>
-          <w:rFonts w:ascii="Arial" w:hAnsi="Arial"/>
-          <w:sz w:val="22"/>
-        </w:rPr>
-        <w:t>11</w:t>
-      </w:r>
-    </w:p>
-    <w:p>
-      <w:pPr>
-        <w:pStyle w:val="TOC1"/>
-        <w:tabs>
-          <w:tab w:val="right" w:leader="dot" w:pos="9026"/>
-        </w:tabs>
-        <w:ind w:left="0"/>
-        <w:spacing w:after="60"/>
-      </w:pPr>
-      <w:r>
-        <w:rPr>
-          <w:rFonts w:ascii="Arial" w:hAnsi="Arial"/>
-          <w:sz w:val="22"/>
-        </w:rPr>
-        <w:t>Referencias</w:t>
-      </w:r>
-      <w:r>
-        <w:tab/>
-      </w:r>
-      <w:r>
-        <w:rPr>
-          <w:rFonts w:ascii="Arial" w:hAnsi="Arial"/>
-          <w:sz w:val="22"/>
-        </w:rPr>
-        <w:t>12</w:t>
-      </w:r>
-    </w:p>
-    <w:p>
-      <w:pPr>
-        <w:pStyle w:val="TOC1"/>
-        <w:tabs>
-          <w:tab w:val="right" w:leader="dot" w:pos="9026"/>
-        </w:tabs>
-        <w:ind w:left="0"/>
-        <w:spacing w:after="60"/>
-      </w:pPr>
-      <w:r>
-        <w:rPr>
-          <w:rFonts w:ascii="Arial" w:hAnsi="Arial"/>
-          <w:sz w:val="22"/>
-        </w:rPr>
-        <w:t>Bibliografía</w:t>
-      </w:r>
-      <w:r>
-        <w:tab/>
-      </w:r>
-      <w:r>
-        <w:rPr>
-          <w:rFonts w:ascii="Arial" w:hAnsi="Arial"/>
-          <w:sz w:val="22"/>
-        </w:rPr>
-        <w:t>12</w:t>
+        <w:t>19</w:t>
       </w:r>
     </w:p>
     <w:p>
@@ -994,7 +1183,7 @@
           <w:b/>
           <w:sz w:val="28"/>
         </w:rPr>
-        <w:t xml:space="preserve">1. Primera parte de la estructura del Proyecto de investigación de TFG</w:t>
+        <w:t xml:space="preserve">Primera parte de la estructura del Proyecto de investigación de TFG</w:t>
       </w:r>
     </w:p>
     <w:bookmarkStart w:id="18" w:name="tema-de-investigación"/>
@@ -1010,7 +1199,7 @@
           <w:b/>
           <w:sz w:val="24"/>
         </w:rPr>
-        <w:t xml:space="preserve">1.1 Tema de Investigación</w:t>
+        <w:t xml:space="preserve">Tema de Investigación</w:t>
       </w:r>
     </w:p>
     <w:p>
@@ -1035,7 +1224,7 @@
           <w:i/>
           <w:sz w:val="24"/>
         </w:rPr>
-        <w:t xml:space="preserve">1.1.1 Identificación del Tema y Encuadre en el Modelo de Francisco Longo</w:t>
+        <w:t xml:space="preserve">Identificación del Tema y Encuadre en el Modelo de Francisco Longo</w:t>
       </w:r>
     </w:p>
     <w:p>
@@ -1246,7 +1435,7 @@
           <w:i/>
           <w:sz w:val="24"/>
         </w:rPr>
-        <w:t xml:space="preserve">1.1.2 Descripción Contextual Socioeconómica, Histórica e Institucional</w:t>
+        <w:t xml:space="preserve">Descripción Contextual Socioeconómica, Histórica e Institucional</w:t>
       </w:r>
     </w:p>
     <w:p>
@@ -1358,7 +1547,7 @@
           <w:b/>
           <w:sz w:val="24"/>
         </w:rPr>
-        <w:t xml:space="preserve">1.2 Delimitación del Objeto Problema</w:t>
+        <w:t xml:space="preserve">Delimitación del Objeto Problema</w:t>
       </w:r>
     </w:p>
     <w:p>
@@ -1383,7 +1572,7 @@
           <w:i/>
           <w:sz w:val="24"/>
         </w:rPr>
-        <w:t xml:space="preserve">1.2.1 Problematización y Construcción del Objeto de Estudio</w:t>
+        <w:t xml:space="preserve">Problematización y Construcción del Objeto de Estudio</w:t>
       </w:r>
     </w:p>
     <w:p>
@@ -1502,7 +1691,7 @@
           <w:i/>
           <w:sz w:val="24"/>
         </w:rPr>
-        <w:t xml:space="preserve">1.2.2 Desglose de las Cuatro (4) Delimitaciones Metodológicas</w:t>
+        <w:t xml:space="preserve">Desglose de las Cuatro (4) Delimitaciones Metodológicas</w:t>
       </w:r>
     </w:p>
     <w:p>
@@ -1661,7 +1850,7 @@
           <w:i/>
           <w:sz w:val="24"/>
         </w:rPr>
-        <w:t xml:space="preserve">1.2.3 Operacionalización de las Dimensiones de Factibilidad</w:t>
+        <w:t xml:space="preserve">Operacionalización de las Dimensiones de Factibilidad</w:t>
       </w:r>
     </w:p>
     <w:p>
@@ -1678,7 +1867,7 @@
         <w:pStyle w:val="Heading4"/>
       </w:pPr>
       <w:r>
-        <w:t xml:space="preserve">1.2.3.1 Definición Conceptual y Operativa de Factibilidad</w:t>
+        <w:t xml:space="preserve">Definición Conceptual y Operativa de Factibilidad</w:t>
       </w:r>
     </w:p>
     <w:p>
@@ -1853,7 +2042,7 @@
         <w:pStyle w:val="Heading4"/>
       </w:pPr>
       <w:r>
-        <w:t xml:space="preserve">1.2.3.2 Dimensiones de Observación y Fuentes Empíricas</w:t>
+        <w:t xml:space="preserve">Dimensiones de Observación y Fuentes Empíricas</w:t>
       </w:r>
     </w:p>
     <w:p>
@@ -1959,7 +2148,7 @@
         <w:pStyle w:val="Heading4"/>
       </w:pPr>
       <w:r>
-        <w:t xml:space="preserve">1.2.3.3 Criterios Cualitativos para la Interpretación de Resultados</w:t>
+        <w:t xml:space="preserve">Criterios Cualitativos para la Interpretación de Resultados</w:t>
       </w:r>
     </w:p>
     <w:p>
@@ -2061,7 +2250,7 @@
           <w:i/>
           <w:sz w:val="24"/>
         </w:rPr>
-        <w:t xml:space="preserve">1.2.4 Pregunta General de Investigación</w:t>
+        <w:t xml:space="preserve">Pregunta General de Investigación</w:t>
       </w:r>
     </w:p>
     <w:p>
@@ -2095,7 +2284,7 @@
           <w:b/>
           <w:sz w:val="24"/>
         </w:rPr>
-        <w:t xml:space="preserve">1.3 Justificación y Relevancia de la Investigación</w:t>
+        <w:t xml:space="preserve">Justificación y Relevancia de la Investigación</w:t>
       </w:r>
     </w:p>
     <w:p>
@@ -2120,7 +2309,7 @@
           <w:i/>
           <w:sz w:val="24"/>
         </w:rPr>
-        <w:t xml:space="preserve">1.3.1 Plano Cognitivo y Disciplinar</w:t>
+        <w:t xml:space="preserve">Plano Cognitivo y Disciplinar</w:t>
       </w:r>
     </w:p>
     <w:p>
@@ -2164,7 +2353,7 @@
           <w:i/>
           <w:sz w:val="24"/>
         </w:rPr>
-        <w:t xml:space="preserve">1.3.2 Plano Social e Institucional</w:t>
+        <w:t xml:space="preserve">Plano Social e Institucional</w:t>
       </w:r>
     </w:p>
     <w:p>
@@ -2256,7 +2445,7 @@
           <w:i/>
           <w:sz w:val="24"/>
         </w:rPr>
-        <w:t xml:space="preserve">1.3.3 Plano Personal y Profesional</w:t>
+        <w:t xml:space="preserve">Plano Personal y Profesional</w:t>
       </w:r>
     </w:p>
     <w:p>
@@ -2282,7 +2471,7 @@
           <w:b/>
           <w:sz w:val="24"/>
         </w:rPr>
-        <w:t xml:space="preserve">1.4 Definición de Objetivos del TFG</w:t>
+        <w:t xml:space="preserve">Definición de Objetivos del TFG</w:t>
       </w:r>
     </w:p>
     <w:bookmarkStart w:id="31" w:name="objetivo-general"/>
@@ -2299,7 +2488,7 @@
           <w:i/>
           <w:sz w:val="24"/>
         </w:rPr>
-        <w:t xml:space="preserve">1.4.1 Objetivo General</w:t>
+        <w:t xml:space="preserve">Objetivo General</w:t>
       </w:r>
     </w:p>
     <w:p>
@@ -2329,7 +2518,7 @@
           <w:i/>
           <w:sz w:val="24"/>
         </w:rPr>
-        <w:t xml:space="preserve">1.4.2 Objetivos Específicos</w:t>
+        <w:t xml:space="preserve">Objetivos Específicos</w:t>
       </w:r>
     </w:p>
     <w:p>
@@ -2395,7 +2584,7 @@
           <w:i/>
           <w:sz w:val="24"/>
         </w:rPr>
-        <w:t xml:space="preserve">1.4.3 Matriz de Consistencia Metodológica y Articulación con Longo (2006)</w:t>
+        <w:t xml:space="preserve">Matriz de Consistencia Metodológica y Articulación con Longo (2006)</w:t>
       </w:r>
     </w:p>
     <w:p>
@@ -3051,7 +3240,7 @@
     <w:bookmarkEnd w:id="33"/>
     <w:bookmarkEnd w:id="34"/>
     <w:bookmarkEnd w:id="35"/>
-    <w:bookmarkStart w:id="38" w:name="Xef007dd282ae18f13df7a545a4430773f008bd7"/>
+    <w:bookmarkStart w:id="46" w:name="Xef007dd282ae18f13df7a545a4430773f008bd7"/>
     <w:p>
       <w:pPr>
         <w:pStyle w:val="Heading1"/>
@@ -3064,10 +3253,10 @@
           <w:b/>
           <w:sz w:val="28"/>
         </w:rPr>
-        <w:t xml:space="preserve">2. Segunda parte de la estructura del Proyecto de investigación de TFG</w:t>
-      </w:r>
-    </w:p>
-    <w:bookmarkStart w:id="36" w:name="X26fd7edd3045b8a76e95745d23dedb33f2c164e"/>
+        <w:t xml:space="preserve">Segunda parte de la estructura del Proyecto de investigación de TFG</w:t>
+      </w:r>
+    </w:p>
+    <w:bookmarkStart w:id="40" w:name="X26fd7edd3045b8a76e95745d23dedb33f2c164e"/>
     <w:p>
       <w:pPr>
         <w:pStyle w:val="Heading2"/>
@@ -3080,23 +3269,827 @@
           <w:b/>
           <w:sz w:val="24"/>
         </w:rPr>
-        <w:t xml:space="preserve">2.1 Marco Teórico: Posicionamiento Teórico y Conceptos Centrales</w:t>
+        <w:t xml:space="preserve">Marco Teórico: Posicionamiento Teórico y Conceptos Centrales</w:t>
+      </w:r>
+    </w:p>
+    <w:bookmarkStart w:id="36" w:name="Xceb10b350d9f8d47826ad34d91c2e4defe1712d"/>
+    <w:p>
+      <w:pPr>
+        <w:pStyle w:val="Heading3"/>
+        <w:keepNext/>
+        <w:spacing w:before="160" w:after="40" w:line="300" w:lineRule="auto"/>
+      </w:pPr>
+      <w:r>
+        <w:rPr>
+          <w:rFonts w:ascii="Arial" w:hAnsi="Arial"/>
+          <w:b/>
+          <w:i/>
+          <w:sz w:val="24"/>
+        </w:rPr>
+        <w:t xml:space="preserve">Posicionamiento Epistemológico: La Teoría como Configuración Abierta y el Análisis de Factibilidad</w:t>
       </w:r>
     </w:p>
     <w:p>
       <w:pPr>
         <w:pStyle w:val="FirstParagraph"/>
       </w:pPr>
+      <w:r>
+        <w:t xml:space="preserve">En consonancia con las pautas epistemológicas del Seminario de Integración y Aplicación, la construcción del marco teórico de este proyecto no se concibe como un mero listado de definiciones abstractas ni como la transcripción mecánica de un glosario disciplinar</w:t>
+      </w:r>
+      <w:r>
+        <w:t xml:space="preserve"> </w:t>
+      </w:r>
+      <w:r>
+        <w:t xml:space="preserve">(Sautu, 2005)</w:t>
+      </w:r>
+      <w:r>
+        <w:t xml:space="preserve">. Por el contrario, se asume la concepción de la teoría como una</w:t>
+      </w:r>
+      <w:r>
+        <w:t xml:space="preserve"> </w:t>
+      </w:r>
       <w:r>
         <w:rPr>
           <w:i/>
           <w:iCs/>
         </w:rPr>
-        <w:t xml:space="preserve">(Sección en desarrollo junto al estudiante)</w:t>
+        <w:t xml:space="preserve">configuración abierta</w:t>
+      </w:r>
+      <w:r>
+        <w:t xml:space="preserve">, formulada por Enrique</w:t>
+      </w:r>
+      <w:r>
+        <w:t xml:space="preserve"> </w:t>
+      </w:r>
+      <w:r>
+        <w:t xml:space="preserve">De la Garza Toledo (2001)</w:t>
+      </w:r>
+      <w:r>
+        <w:t xml:space="preserve"> </w:t>
+      </w:r>
+      <w:r>
+        <w:t xml:space="preserve">en el marco de la epistemología crítica latinoamericana.</w:t>
+      </w:r>
+    </w:p>
+    <w:p>
+      <w:pPr>
+        <w:pStyle w:val="BodyText"/>
+      </w:pPr>
+      <w:r>
+        <w:t xml:space="preserve">Desde esta perspectiva, la teoría social no constituye un sistema axiomático, hipotético-deductivo, cerrado y rígido donde los conceptos operan como variables petrificadas. Una configuración teórica es una red articulada y flexible de conceptos que admite zonas con diferentes grados de determinación y apertura reflexiva, permitiendo integrar categorías provenientes de diversos campos analíticos —en este caso, la Administración Pública y la Gestión de Recursos Humanos— delimitando con rigurosidad sus relaciones y niveles de certidumbre</w:t>
+      </w:r>
+      <w:r>
+        <w:t xml:space="preserve"> </w:t>
+      </w:r>
+      <w:r>
+        <w:t xml:space="preserve">(De la Garza Toledo, 2001)</w:t>
+      </w:r>
+      <w:r>
+        <w:t xml:space="preserve">.</w:t>
+      </w:r>
+    </w:p>
+    <w:p>
+      <w:pPr>
+        <w:pStyle w:val="BodyText"/>
+      </w:pPr>
+      <w:r>
+        <w:t xml:space="preserve">Esta posición epistemológica resulta especialmente fértil para una investigación centrada en la</w:t>
+      </w:r>
+      <w:r>
+        <w:t xml:space="preserve"> </w:t>
+      </w:r>
+      <w:r>
+        <w:rPr>
+          <w:b/>
+          <w:bCs/>
+        </w:rPr>
+        <w:t xml:space="preserve">factibilidad</w:t>
+      </w:r>
+      <w:r>
+        <w:t xml:space="preserve">:</w:t>
+      </w:r>
+    </w:p>
+    <w:p>
+      <w:pPr>
+        <w:pStyle w:val="Compact"/>
+        <w:numPr>
+          <w:ilvl w:val="0"/>
+          <w:numId w:val="1010"/>
+        </w:numPr>
+      </w:pPr>
+      <w:r>
+        <w:rPr>
+          <w:b/>
+          <w:bCs/>
+        </w:rPr>
+        <w:t xml:space="preserve">La realidad social como proceso</w:t>
+      </w:r>
+      <w:r>
+        <w:rPr>
+          <w:b/>
+          <w:bCs/>
+        </w:rPr>
+        <w:t xml:space="preserve"> </w:t>
+      </w:r>
+      <w:r>
+        <w:rPr>
+          <w:b/>
+          <w:bCs/>
+        </w:rPr>
+        <w:t xml:space="preserve">“dado-dándose”</w:t>
+      </w:r>
+      <w:r>
+        <w:rPr>
+          <w:b/>
+          <w:bCs/>
+        </w:rPr>
+        <w:t xml:space="preserve">:</w:t>
+      </w:r>
+      <w:r>
+        <w:t xml:space="preserve"> </w:t>
+      </w:r>
+      <w:r>
+        <w:t xml:space="preserve">La organización universitaria no es un ente estático gobernado por leyes mecánicas inmutables, sino una trama dinámica construida cotidianamente por la interacción entre estructuras institucionales y sujetos reflexivos (docentes, estudiantes y autoridades).</w:t>
+      </w:r>
+    </w:p>
+    <w:p>
+      <w:pPr>
+        <w:pStyle w:val="Compact"/>
+        <w:numPr>
+          <w:ilvl w:val="0"/>
+          <w:numId w:val="1010"/>
+        </w:numPr>
+      </w:pPr>
+      <w:r>
+        <w:rPr>
+          <w:b/>
+          <w:bCs/>
+        </w:rPr>
+        <w:t xml:space="preserve">Determinación del espacio de posibilidades viables:</w:t>
+      </w:r>
+      <w:r>
+        <w:t xml:space="preserve"> </w:t>
+      </w:r>
+      <w:r>
+        <w:t xml:space="preserve">El objetivo de indagar la factibilidad no consiste en predecir pasivamente el éxito o fracaso de una política evaluativa, sino en reconstruir las condiciones estructurales, normativas y culturales del presente para desentrañar el</w:t>
+      </w:r>
+      <w:r>
+        <w:t xml:space="preserve"> </w:t>
+      </w:r>
+      <w:r>
+        <w:rPr>
+          <w:i/>
+          <w:iCs/>
+        </w:rPr>
+        <w:t xml:space="preserve">campo de posibilidades reales y viables para la acción de los sujetos</w:t>
+      </w:r>
+      <w:r>
+        <w:t xml:space="preserve"> </w:t>
+      </w:r>
+      <w:r>
+        <w:t xml:space="preserve">(De la Garza Toledo, 2001; Matus, 1993)</w:t>
+      </w:r>
+      <w:r>
+        <w:t xml:space="preserve">.</w:t>
+      </w:r>
+    </w:p>
+    <w:p>
+      <w:pPr>
+        <w:pStyle w:val="Compact"/>
+        <w:numPr>
+          <w:ilvl w:val="0"/>
+          <w:numId w:val="1010"/>
+        </w:numPr>
+      </w:pPr>
+      <w:r>
+        <w:rPr>
+          <w:b/>
+          <w:bCs/>
+        </w:rPr>
+        <w:t xml:space="preserve">Articulación de niveles conceptuales (Ruth Sautu):</w:t>
+      </w:r>
+      <w:r>
+        <w:t xml:space="preserve"> </w:t>
+      </w:r>
+      <w:r>
+        <w:t xml:space="preserve">Siguiendo a</w:t>
+      </w:r>
+      <w:r>
+        <w:t xml:space="preserve"> </w:t>
+      </w:r>
+      <w:r>
+        <w:t xml:space="preserve">Sautu (2005)</w:t>
+      </w:r>
+      <w:r>
+        <w:t xml:space="preserve">, el marco teórico se despliega jerárquicamente en forma de</w:t>
+      </w:r>
+      <w:r>
+        <w:t xml:space="preserve"> </w:t>
+      </w:r>
+      <w:r>
+        <w:t xml:space="preserve">“pirámide invertida”</w:t>
+      </w:r>
+      <w:r>
+        <w:t xml:space="preserve">: parte de los supuestos epistemológicos sobre la gobernanza y la acción institucional pública, transita por la teoría sustantiva de la gestión estratégica de personas en el Estado</w:t>
+      </w:r>
+      <w:r>
+        <w:t xml:space="preserve"> </w:t>
+      </w:r>
+      <w:r>
+        <w:t xml:space="preserve">(Longo, 2006)</w:t>
+      </w:r>
+      <w:r>
+        <w:t xml:space="preserve">, y culmina en los conceptos operativos específicos referidos a la retroalimentación 360° formativa y las dimensiones de viabilidad situada.</w:t>
       </w:r>
     </w:p>
     <w:bookmarkEnd w:id="36"/>
-    <w:bookmarkStart w:id="37" w:name="antecedentes-estado-del-arte-del-tema"/>
+    <w:bookmarkStart w:id="37" w:name="Xb8875c50f8cca48579b6c9183d92a2c8c162b10"/>
+    <w:p>
+      <w:pPr>
+        <w:pStyle w:val="Heading3"/>
+        <w:keepNext/>
+        <w:spacing w:before="160" w:after="40" w:line="300" w:lineRule="auto"/>
+      </w:pPr>
+      <w:r>
+        <w:rPr>
+          <w:rFonts w:ascii="Arial" w:hAnsi="Arial"/>
+          <w:b/>
+          <w:i/>
+          <w:sz w:val="24"/>
+        </w:rPr>
+        <w:t xml:space="preserve">El Enfoque Sistémico de Gestión de Personas en el Sector Público: Modelo de Francisco Longo</w:t>
+      </w:r>
+    </w:p>
+    <w:p>
+      <w:pPr>
+        <w:pStyle w:val="FirstParagraph"/>
+      </w:pPr>
+      <w:r>
+        <w:t xml:space="preserve">La columna vertebral teórica de la investigación adopta el modelo analítico de Francisco</w:t>
+      </w:r>
+      <w:r>
+        <w:t xml:space="preserve"> </w:t>
+      </w:r>
+      <w:r>
+        <w:t xml:space="preserve">Longo (2006)</w:t>
+      </w:r>
+      <w:r>
+        <w:t xml:space="preserve"> </w:t>
+      </w:r>
+      <w:r>
+        <w:t xml:space="preserve">sobre la gestión de personas en las organizaciones públicas. Longo plantea una superación crítica del modelo burocrático-weberiano tradicional —caracterizado por el apego formal a la norma reglamentaria y el control procesal ciego a los resultados—, proponiendo una administración estratégica articulada en torno a la generación de valor público, el mérito y la flexibilidad directiva.</w:t>
+      </w:r>
+    </w:p>
+    <w:p>
+      <w:pPr>
+        <w:pStyle w:val="BodyText"/>
+      </w:pPr>
+      <w:r>
+        <w:t xml:space="preserve">En este marco, la gestión de recursos humanos se estructura en siete subsistemas interdependientes: planificación, organización del trabajo, gestión del empleo, gestión del rendimiento, gestión de la compensación, gestión del desarrollo y gestión de las relaciones humanas y sociales. Para el presente Trabajo Final de Graduación, la mirada se concentra en el subsistema de</w:t>
+      </w:r>
+      <w:r>
+        <w:t xml:space="preserve"> </w:t>
+      </w:r>
+      <w:r>
+        <w:rPr>
+          <w:b/>
+          <w:bCs/>
+        </w:rPr>
+        <w:t xml:space="preserve">gestión del rendimiento</w:t>
+      </w:r>
+      <w:r>
+        <w:t xml:space="preserve"> </w:t>
+      </w:r>
+      <w:r>
+        <w:t xml:space="preserve">(evaluación del desempeño), concibiéndolo no como un fin aislado o autárquico, sino en su articulación orgánica con otros tres subsistemas institucionales:</w:t>
+      </w:r>
+    </w:p>
+    <w:p>
+      <w:pPr>
+        <w:pStyle w:val="Compact"/>
+        <w:numPr>
+          <w:ilvl w:val="0"/>
+          <w:numId w:val="1011"/>
+        </w:numPr>
+      </w:pPr>
+      <w:r>
+        <w:rPr>
+          <w:b/>
+          <w:bCs/>
+        </w:rPr>
+        <w:t xml:space="preserve">Gestión del Rendimiento:</w:t>
+      </w:r>
+      <w:r>
+        <w:t xml:space="preserve"> </w:t>
+      </w:r>
+      <w:r>
+        <w:t xml:space="preserve">Constituye el eje estructurante de la investigación. Comprende el conjunto de políticas, prácticas e instrumentos dirigidos a valorar la contribución efectiva de las personas a los fines de la organización. Según</w:t>
+      </w:r>
+      <w:r>
+        <w:t xml:space="preserve"> </w:t>
+      </w:r>
+      <w:r>
+        <w:t xml:space="preserve">Longo (2006)</w:t>
+      </w:r>
+      <w:r>
+        <w:t xml:space="preserve">, la gestión del rendimiento en el sector público adquiere legitimidad y eficacia únicamente cuando trasciende la fiscalización burocrática y se transforma en un proceso reflexivo de evaluación y mejora del desempeño laboral.</w:t>
+      </w:r>
+    </w:p>
+    <w:p>
+      <w:pPr>
+        <w:pStyle w:val="Compact"/>
+        <w:numPr>
+          <w:ilvl w:val="0"/>
+          <w:numId w:val="1011"/>
+        </w:numPr>
+      </w:pPr>
+      <w:r>
+        <w:rPr>
+          <w:b/>
+          <w:bCs/>
+        </w:rPr>
+        <w:t xml:space="preserve">Organización del Trabajo:</w:t>
+      </w:r>
+      <w:r>
+        <w:t xml:space="preserve"> </w:t>
+      </w:r>
+      <w:r>
+        <w:t xml:space="preserve">Articula la definición de los perfiles y funciones académicas de los equipos docentes con los requerimientos pedagógicos contemporáneos. En el CURZAS-UNCo, esto implica contrastar los criterios formales de evaluación previstos en la normativa estatutaria con las demandas reales que imponen las prácticas de enseñanza híbridas, la virtualidad y el acompañamiento tutorial en los Nodos Universitarios en territorio rionegrino.</w:t>
+      </w:r>
+    </w:p>
+    <w:p>
+      <w:pPr>
+        <w:pStyle w:val="Compact"/>
+        <w:numPr>
+          <w:ilvl w:val="0"/>
+          <w:numId w:val="1011"/>
+        </w:numPr>
+      </w:pPr>
+      <w:r>
+        <w:rPr>
+          <w:b/>
+          <w:bCs/>
+        </w:rPr>
+        <w:t xml:space="preserve">Gestión del Desarrollo:</w:t>
+      </w:r>
+      <w:r>
+        <w:t xml:space="preserve"> </w:t>
+      </w:r>
+      <w:r>
+        <w:t xml:space="preserve">Vincula estrechamente los hallazgos de la evaluación docente con las oportunidades de aprendizaje continuo, capacitación pedagógica y carrera académica (Art. 65 de la Ord. CS N° 0920/2019). Desde la óptica de</w:t>
+      </w:r>
+      <w:r>
+        <w:t xml:space="preserve"> </w:t>
+      </w:r>
+      <w:r>
+        <w:t xml:space="preserve">Longo (2006)</w:t>
+      </w:r>
+      <w:r>
+        <w:t xml:space="preserve">, evaluar sin ofrecer trayectorias de desarrollo institucional despoja al proceso de sentido formativo y lo reduce a un trámite estéril.</w:t>
+      </w:r>
+    </w:p>
+    <w:p>
+      <w:pPr>
+        <w:pStyle w:val="Compact"/>
+        <w:numPr>
+          <w:ilvl w:val="0"/>
+          <w:numId w:val="1011"/>
+        </w:numPr>
+      </w:pPr>
+      <w:r>
+        <w:rPr>
+          <w:b/>
+          <w:bCs/>
+        </w:rPr>
+        <w:t xml:space="preserve">Gestión de las Relaciones Humanas y Sociales:</w:t>
+      </w:r>
+      <w:r>
+        <w:t xml:space="preserve"> </w:t>
+      </w:r>
+      <w:r>
+        <w:t xml:space="preserve">Examina el clima institucional, la confianza intersubjetiva entre los claustros y los canales de diálogo paritario docente. En las organizaciones públicas y cogobernadas, la evaluación docente toca directamente las relaciones laborales y la estabilidad en el empleo; por ende, su factibilidad depende de que se construyan acuerdos paritarios y resguardos éticos que disipen sospechas de arbitrariedad o persecución gremial.</w:t>
+      </w:r>
+    </w:p>
+    <w:bookmarkEnd w:id="37"/>
+    <w:bookmarkStart w:id="38" w:name="X2df9cab8bcc2c03c971d8d362d7faae66cce334"/>
+    <w:p>
+      <w:pPr>
+        <w:pStyle w:val="Heading3"/>
+        <w:keepNext/>
+        <w:spacing w:before="160" w:after="40" w:line="300" w:lineRule="auto"/>
+      </w:pPr>
+      <w:r>
+        <w:rPr>
+          <w:rFonts w:ascii="Arial" w:hAnsi="Arial"/>
+          <w:b/>
+          <w:i/>
+          <w:sz w:val="24"/>
+        </w:rPr>
+        <w:t xml:space="preserve">De la Lógica de Control a la Lógica Formativa: El Modelo de Retroalimentación 360° en la Educación Superior</w:t>
+      </w:r>
+    </w:p>
+    <w:p>
+      <w:pPr>
+        <w:pStyle w:val="FirstParagraph"/>
+      </w:pPr>
+      <w:r>
+        <w:t xml:space="preserve">En el análisis de la gestión del rendimiento, la literatura contemporánea</w:t>
+      </w:r>
+      <w:r>
+        <w:t xml:space="preserve"> </w:t>
+      </w:r>
+      <w:r>
+        <w:t xml:space="preserve">(Chiavenato, 2020; Lepsinger &amp; Lucia, 2009)</w:t>
+      </w:r>
+      <w:r>
+        <w:t xml:space="preserve"> </w:t>
+      </w:r>
+      <w:r>
+        <w:t xml:space="preserve">identifica una tensión constitutiva entre dos paradigmas evaluativos:</w:t>
+      </w:r>
+    </w:p>
+    <w:p>
+      <w:pPr>
+        <w:pStyle w:val="Compact"/>
+        <w:numPr>
+          <w:ilvl w:val="0"/>
+          <w:numId w:val="1012"/>
+        </w:numPr>
+      </w:pPr>
+      <w:r>
+        <w:rPr>
+          <w:b/>
+          <w:bCs/>
+        </w:rPr>
+        <w:t xml:space="preserve">La lógica sumativa o de control formal:</w:t>
+      </w:r>
+      <w:r>
+        <w:t xml:space="preserve"> </w:t>
+      </w:r>
+      <w:r>
+        <w:t xml:space="preserve">Se enfoca en la auditoría reglamentaria, el cumplimiento burocrático de obligaciones horarias o administrativas y la acreditación formal de antecedentes. Sus consecuencias suelen estar directamente vinculadas a decisiones laborales críticas, tales como la permanencia estatutaria, la pérdida de estabilidad o la eventual aplicación de sanciones. En las instituciones universitarias públicas, esta lógica tiende a generar ritualismo defensivo y desconfianza por parte del profesorado.</w:t>
+      </w:r>
+    </w:p>
+    <w:p>
+      <w:pPr>
+        <w:pStyle w:val="Compact"/>
+        <w:numPr>
+          <w:ilvl w:val="0"/>
+          <w:numId w:val="1012"/>
+        </w:numPr>
+      </w:pPr>
+      <w:r>
+        <w:rPr>
+          <w:b/>
+          <w:bCs/>
+        </w:rPr>
+        <w:t xml:space="preserve">La lógica formativa:</w:t>
+      </w:r>
+      <w:r>
+        <w:t xml:space="preserve"> </w:t>
+      </w:r>
+      <w:r>
+        <w:t xml:space="preserve">Se orienta al aprendizaje reflexivo, al diagnóstico cualitativo de fortalezas y debilidades pedagógicas y al perfeccionamiento continuo de la labor de enseñanza. No persigue juzgar o calificar unívocamente a la persona, sino retroalimentar su quehacer pedagógico para enriquecer la experiencia de aprendizaje de los estudiantes.</w:t>
+      </w:r>
+    </w:p>
+    <w:p>
+      <w:pPr>
+        <w:pStyle w:val="FirstParagraph"/>
+      </w:pPr>
+      <w:r>
+        <w:t xml:space="preserve">Para materializar esta segunda perspectiva en la educación superior, adquiere relevancia teórica el modelo de</w:t>
+      </w:r>
+      <w:r>
+        <w:t xml:space="preserve"> </w:t>
+      </w:r>
+      <w:r>
+        <w:rPr>
+          <w:b/>
+          <w:bCs/>
+        </w:rPr>
+        <w:t xml:space="preserve">retroalimentación multidireccional o de 360 grados</w:t>
+      </w:r>
+      <w:r>
+        <w:t xml:space="preserve"> </w:t>
+      </w:r>
+      <w:r>
+        <w:t xml:space="preserve">(Lepsinger &amp; Lucia, 2009; Obando Freire et al., 2014; Sifuentes Ocegueda et al., 2016)</w:t>
+      </w:r>
+      <w:r>
+        <w:t xml:space="preserve">. Tradicionalmente desarrollado en el ámbito organizacional privado, el modelo 360° se sustenta en la premisa de que una evaluación unilateral (vertical y descendente) resulta insuficiente y sesgada para captar la complejidad del desempeño profesional.</w:t>
+      </w:r>
+    </w:p>
+    <w:p>
+      <w:pPr>
+        <w:pStyle w:val="BodyText"/>
+      </w:pPr>
+      <w:r>
+        <w:t xml:space="preserve">En el contexto académico universitario, el modelo 360° plantea un dispositivo circular y multiactoral que triangula cuatro miradas complementarias sobre el proceso formativo:</w:t>
+      </w:r>
+    </w:p>
+    <w:p>
+      <w:pPr>
+        <w:pStyle w:val="Compact"/>
+        <w:numPr>
+          <w:ilvl w:val="0"/>
+          <w:numId w:val="1013"/>
+        </w:numPr>
+      </w:pPr>
+      <w:r>
+        <w:rPr>
+          <w:b/>
+          <w:bCs/>
+        </w:rPr>
+        <w:t xml:space="preserve">Autoevaluación docente:</w:t>
+      </w:r>
+      <w:r>
+        <w:t xml:space="preserve"> </w:t>
+      </w:r>
+      <w:r>
+        <w:t xml:space="preserve">Instancia donde el propio docente reflexiona sobre sus prácticas pedagógicas, el cumplimiento de su planificación académica y los desafíos didácticos experimentados en el aula.</w:t>
+      </w:r>
+    </w:p>
+    <w:p>
+      <w:pPr>
+        <w:pStyle w:val="Compact"/>
+        <w:numPr>
+          <w:ilvl w:val="0"/>
+          <w:numId w:val="1013"/>
+        </w:numPr>
+      </w:pPr>
+      <w:r>
+        <w:rPr>
+          <w:b/>
+          <w:bCs/>
+        </w:rPr>
+        <w:t xml:space="preserve">Coevaluación entre pares o colegas de cátedra:</w:t>
+      </w:r>
+      <w:r>
+        <w:t xml:space="preserve"> </w:t>
+      </w:r>
+      <w:r>
+        <w:t xml:space="preserve">Valoración colegiada realizada por docentes del mismo departamento o equipo, enfocada en la pertinencia conceptual, la rigurosidad disciplinar y el trabajo colaborativo.</w:t>
+      </w:r>
+    </w:p>
+    <w:p>
+      <w:pPr>
+        <w:pStyle w:val="Compact"/>
+        <w:numPr>
+          <w:ilvl w:val="0"/>
+          <w:numId w:val="1013"/>
+        </w:numPr>
+      </w:pPr>
+      <w:r>
+        <w:rPr>
+          <w:b/>
+          <w:bCs/>
+        </w:rPr>
+        <w:t xml:space="preserve">Heteroevaluación estudiantil:</w:t>
+      </w:r>
+      <w:r>
+        <w:t xml:space="preserve"> </w:t>
+      </w:r>
+      <w:r>
+        <w:t xml:space="preserve">Apreciación del claustro estudiantil centrada en la claridad expositiva, la accesibilidad de los recursos didácticos, la retroalimentación oportuna en evaluaciones y la empatía pedagógica.</w:t>
+      </w:r>
+    </w:p>
+    <w:p>
+      <w:pPr>
+        <w:pStyle w:val="Compact"/>
+        <w:numPr>
+          <w:ilvl w:val="0"/>
+          <w:numId w:val="1013"/>
+        </w:numPr>
+      </w:pPr>
+      <w:r>
+        <w:rPr>
+          <w:b/>
+          <w:bCs/>
+        </w:rPr>
+        <w:t xml:space="preserve">Apreciación de la conducción académica y departamental:</w:t>
+      </w:r>
+      <w:r>
+        <w:t xml:space="preserve"> </w:t>
+      </w:r>
+      <w:r>
+        <w:t xml:space="preserve">Mirada estratégica a cargo de la Dirección del Departamento, orientada a evaluar la articulación de la cátedra con el plan de estudios, la participación en proyectos de extensión e investigación y el compromiso con las directrices institucionales.</w:t>
+      </w:r>
+    </w:p>
+    <w:p>
+      <w:pPr>
+        <w:pStyle w:val="FirstParagraph"/>
+      </w:pPr>
+      <w:r>
+        <w:t xml:space="preserve">La potencia conceptual de la retroalimentación 360° radica en que el juicio evaluativo no emana de una única autoridad jerárquica, sino de la triangulación reflexiva de actores situados en diferentes planos de la experiencia pedagógica</w:t>
+      </w:r>
+      <w:r>
+        <w:t xml:space="preserve"> </w:t>
+      </w:r>
+      <w:r>
+        <w:t xml:space="preserve">(Obando Freire et al., 2014)</w:t>
+      </w:r>
+      <w:r>
+        <w:t xml:space="preserve">. El resultado no se traduce en un puntaje sancionatorio, sino en un perfil diagnóstico cualitativo que permite identificar brechas entre la autopercepción del docente y la percepción de sus estudiantes y colegas, brindando insumos para la mejora pedagógica.</w:t>
+      </w:r>
+    </w:p>
+    <w:bookmarkEnd w:id="38"/>
+    <w:bookmarkStart w:id="39" w:name="Xefa297f413be63d6451681d2fe2c4ab63fd02c2"/>
+    <w:p>
+      <w:pPr>
+        <w:pStyle w:val="Heading3"/>
+        <w:keepNext/>
+        <w:spacing w:before="160" w:after="40" w:line="300" w:lineRule="auto"/>
+      </w:pPr>
+      <w:r>
+        <w:rPr>
+          <w:rFonts w:ascii="Arial" w:hAnsi="Arial"/>
+          <w:b/>
+          <w:i/>
+          <w:sz w:val="24"/>
+        </w:rPr>
+        <w:t xml:space="preserve">Gobernanza Universitaria, Cogobierno y Negociación Paritaria Docente</w:t>
+      </w:r>
+    </w:p>
+    <w:p>
+      <w:pPr>
+        <w:pStyle w:val="FirstParagraph"/>
+      </w:pPr>
+      <w:r>
+        <w:t xml:space="preserve">La factibilidad de incorporar un modelo de retroalimentación 360° en una universidad pública no puede ser abordada como un problema meramente técnico o instrumental. Demanda comprender las particularidades sociopolíticas de la</w:t>
+      </w:r>
+      <w:r>
+        <w:t xml:space="preserve"> </w:t>
+      </w:r>
+      <w:r>
+        <w:rPr>
+          <w:b/>
+          <w:bCs/>
+        </w:rPr>
+        <w:t xml:space="preserve">gobernanza universitaria</w:t>
+      </w:r>
+      <w:r>
+        <w:t xml:space="preserve"> </w:t>
+      </w:r>
+      <w:r>
+        <w:t xml:space="preserve">en el marco de la Administración Pública argentina</w:t>
+      </w:r>
+      <w:r>
+        <w:t xml:space="preserve"> </w:t>
+      </w:r>
+      <w:r>
+        <w:t xml:space="preserve">(Matus, 1993; Oszlak, 2020)</w:t>
+      </w:r>
+      <w:r>
+        <w:t xml:space="preserve">.</w:t>
+      </w:r>
+    </w:p>
+    <w:p>
+      <w:pPr>
+        <w:pStyle w:val="BodyText"/>
+      </w:pPr>
+      <w:r>
+        <w:t xml:space="preserve">Siguiendo a Carlos</w:t>
+      </w:r>
+      <w:r>
+        <w:t xml:space="preserve"> </w:t>
+      </w:r>
+      <w:r>
+        <w:t xml:space="preserve">Matus (1993)</w:t>
+      </w:r>
+      <w:r>
+        <w:t xml:space="preserve">, la gestión en organizaciones estatales complejas se desenvuelve en escenarios de poder compartido y conflicto legítimo de intereses. Las decisiones no se imponen jerárquicamente por decreto; requieren construir consensos sobre</w:t>
+      </w:r>
+      <w:r>
+        <w:t xml:space="preserve"> </w:t>
+      </w:r>
+      <w:r>
+        <w:rPr>
+          <w:i/>
+          <w:iCs/>
+        </w:rPr>
+        <w:t xml:space="preserve">variables de control compartido</w:t>
+      </w:r>
+      <w:r>
+        <w:t xml:space="preserve">. En la Universidad Nacional del Comahue y su sede descentralizada en Viedma (CURZAS), la gobernanza institucional se sustenta en tres instituciones fundamentales:</w:t>
+      </w:r>
+    </w:p>
+    <w:p>
+      <w:pPr>
+        <w:pStyle w:val="Compact"/>
+        <w:numPr>
+          <w:ilvl w:val="0"/>
+          <w:numId w:val="1014"/>
+        </w:numPr>
+      </w:pPr>
+      <w:r>
+        <w:rPr>
+          <w:b/>
+          <w:bCs/>
+        </w:rPr>
+        <w:t xml:space="preserve">El principio de cogobierno colegiado:</w:t>
+      </w:r>
+      <w:r>
+        <w:t xml:space="preserve"> </w:t>
+      </w:r>
+      <w:r>
+        <w:t xml:space="preserve">Consagrado en el Estatuto de la UNCo (Ordenanza CS N° 0988/2025, texto ordenado)</w:t>
+      </w:r>
+      <w:r>
+        <w:t xml:space="preserve"> </w:t>
+      </w:r>
+      <w:r>
+        <w:t xml:space="preserve">(Universidad Nacional del Comahue, 2025)</w:t>
+      </w:r>
+      <w:r>
+        <w:t xml:space="preserve">, donde las decisiones de política académica departamental son deliberadas y votadas por representantes de los claustros docente, estudiantil, nodocente y de graduados en el Consejo Directivo y los Consejos Departamentales.</w:t>
+      </w:r>
+    </w:p>
+    <w:p>
+      <w:pPr>
+        <w:pStyle w:val="Compact"/>
+        <w:numPr>
+          <w:ilvl w:val="0"/>
+          <w:numId w:val="1014"/>
+        </w:numPr>
+      </w:pPr>
+      <w:r>
+        <w:rPr>
+          <w:b/>
+          <w:bCs/>
+        </w:rPr>
+        <w:t xml:space="preserve">El régimen de Carrera Docente:</w:t>
+      </w:r>
+      <w:r>
+        <w:t xml:space="preserve"> </w:t>
+      </w:r>
+      <w:r>
+        <w:t xml:space="preserve">Normado por la Ordenanza CS N° 0920/2019 (y sus modificatorias)</w:t>
+      </w:r>
+      <w:r>
+        <w:t xml:space="preserve"> </w:t>
+      </w:r>
+      <w:r>
+        <w:t xml:space="preserve">(Universidad Nacional del Comahue, 2019)</w:t>
+      </w:r>
+      <w:r>
+        <w:t xml:space="preserve">, que establece mecanismos estatutarios periódicos de evaluación de inserción y permanencia mediante informes anuales y jurados evaluadores cuatrienales externos.</w:t>
+      </w:r>
+    </w:p>
+    <w:p>
+      <w:pPr>
+        <w:pStyle w:val="Compact"/>
+        <w:numPr>
+          <w:ilvl w:val="0"/>
+          <w:numId w:val="1014"/>
+        </w:numPr>
+      </w:pPr>
+      <w:r>
+        <w:rPr>
+          <w:b/>
+          <w:bCs/>
+        </w:rPr>
+        <w:t xml:space="preserve">La negociación paritaria y el Convenio Colectivo de Trabajo:</w:t>
+      </w:r>
+      <w:r>
+        <w:t xml:space="preserve"> </w:t>
+      </w:r>
+      <w:r>
+        <w:t xml:space="preserve">Regido a nivel nacional por el Decreto PEN N° 1246/2015</w:t>
+      </w:r>
+      <w:r>
+        <w:t xml:space="preserve"> </w:t>
+      </w:r>
+      <w:r>
+        <w:t xml:space="preserve">(Decreto N° 1246/2015. Convenio Colectivo de Trabajo para los Docentes de las Instituciones Universitarias Nacionales, 2015)</w:t>
+      </w:r>
+      <w:r>
+        <w:t xml:space="preserve">, que salvaguarda la estabilidad laboral, la libertad de cátedra y las condiciones dignas de trabajo frente a cualquier mecanismo evaluativo susceptible de ser utilizado como herramienta de persecución, flexibilización o sobrecarga laboral.</w:t>
+      </w:r>
+    </w:p>
+    <w:p>
+      <w:pPr>
+        <w:pStyle w:val="FirstParagraph"/>
+      </w:pPr>
+      <w:r>
+        <w:t xml:space="preserve">Por consiguiente, el marco teórico de esta investigación asume que la factibilidad de un dispositivo de evaluación 360° depende críticamente de su</w:t>
+      </w:r>
+      <w:r>
+        <w:t xml:space="preserve"> </w:t>
+      </w:r>
+      <w:r>
+        <w:rPr>
+          <w:b/>
+          <w:bCs/>
+        </w:rPr>
+        <w:t xml:space="preserve">blindaje ético y normativo</w:t>
+      </w:r>
+      <w:r>
+        <w:t xml:space="preserve">: el modelo solo resulta viable en el CURZAS si se preserva como una herramienta estrictamente voluntaria, anónima, confidencial y formativa, completamente disociada de los circuitos estatutarios sancionatorios o sumativos de carrera docente. Su viabilidad exige ser consensuada en mesas de diálogo paritario docente y legitimada por los claustros en el seno del cogobierno universitario.</w:t>
+      </w:r>
+    </w:p>
+    <w:bookmarkEnd w:id="39"/>
+    <w:bookmarkEnd w:id="40"/>
+    <w:bookmarkStart w:id="45" w:name="X77155299af2def8333549b16a82948e9810ead2"/>
     <w:p>
       <w:pPr>
         <w:pStyle w:val="Heading2"/>
@@ -3109,19 +4102,531 @@
           <w:b/>
           <w:sz w:val="24"/>
         </w:rPr>
-        <w:t xml:space="preserve">2.2 Antecedentes: Estado del Arte del Tema</w:t>
+        <w:t xml:space="preserve">Antecedentes: Estado del Arte de la Cuestión</w:t>
       </w:r>
     </w:p>
     <w:p>
       <w:pPr>
         <w:pStyle w:val="FirstParagraph"/>
       </w:pPr>
+      <w:r>
+        <w:t xml:space="preserve">De acuerdo con las pautas metodológicas de la cátedra y las recomendaciones de</w:t>
+      </w:r>
+      <w:r>
+        <w:t xml:space="preserve"> </w:t>
+      </w:r>
+      <w:r>
+        <w:t xml:space="preserve">Torraco (2016)</w:t>
+      </w:r>
+      <w:r>
+        <w:t xml:space="preserve"> </w:t>
+      </w:r>
+      <w:r>
+        <w:t xml:space="preserve">y</w:t>
+      </w:r>
+      <w:r>
+        <w:t xml:space="preserve"> </w:t>
+      </w:r>
+      <w:r>
+        <w:t xml:space="preserve">Jiménez Becerra (2008)</w:t>
+      </w:r>
+      <w:r>
+        <w:t xml:space="preserve">, la construcción de los antecedentes o Estado del Arte no consiste en una reseña acumulativa de lecturas ni en un resumen bibliográfico lineal. Representa un ejercicio analítico e integrador de</w:t>
+      </w:r>
+      <w:r>
+        <w:t xml:space="preserve"> </w:t>
+      </w:r>
+      <w:r>
+        <w:t xml:space="preserve">“investigación de la investigación”</w:t>
+      </w:r>
+      <w:r>
+        <w:t xml:space="preserve">, dirigido a sistematizar la evidencia empírica previa sobre el problema de estudio, identificar metodologías empleadas y precisar con rigurosidad la</w:t>
+      </w:r>
+      <w:r>
+        <w:t xml:space="preserve"> </w:t>
+      </w:r>
+      <w:r>
+        <w:rPr>
+          <w:b/>
+          <w:bCs/>
+        </w:rPr>
+        <w:t xml:space="preserve">vacancia de conocimiento</w:t>
+      </w:r>
+      <w:r>
+        <w:t xml:space="preserve"> </w:t>
+      </w:r>
+      <w:r>
+        <w:t xml:space="preserve">que justifica el desarrollo del presente proyecto.</w:t>
+      </w:r>
+    </w:p>
+    <w:p>
+      <w:pPr>
+        <w:pStyle w:val="BodyText"/>
+      </w:pPr>
+      <w:r>
+        <w:t xml:space="preserve">Para dar cumplimiento a la estructura exigida por el Seminario de Integración y Aplicación, los antecedentes se organizan jerárquicamente en tres niveles geográficos: internacional, nacional y regional/local.</w:t>
+      </w:r>
+    </w:p>
+    <w:bookmarkStart w:id="41" w:name="Xbd1777d47dd01cd8f84e658bc65d384db447afd"/>
+    <w:p>
+      <w:pPr>
+        <w:pStyle w:val="Heading3"/>
+        <w:keepNext/>
+        <w:spacing w:before="160" w:after="40" w:line="300" w:lineRule="auto"/>
+      </w:pPr>
+      <w:r>
+        <w:rPr>
+          <w:rFonts w:ascii="Arial" w:hAnsi="Arial"/>
+          <w:b/>
+          <w:i/>
+          <w:sz w:val="24"/>
+        </w:rPr>
+        <w:t xml:space="preserve">Antecedentes Internacionales: Modelos 360° y Triangulación Evaluativa en la Educación Superior</w:t>
+      </w:r>
+    </w:p>
+    <w:p>
+      <w:pPr>
+        <w:pStyle w:val="FirstParagraph"/>
+      </w:pPr>
+      <w:r>
+        <w:t xml:space="preserve">En el plano internacional, diversos estudios empíricos han examinado la aplicación y los efectos de los modelos de evaluación 360 grados en instituciones universitarias públicas y privadas:</w:t>
+      </w:r>
+    </w:p>
+    <w:p>
+      <w:pPr>
+        <w:pStyle w:val="Compact"/>
+        <w:numPr>
+          <w:ilvl w:val="0"/>
+          <w:numId w:val="1015"/>
+        </w:numPr>
+      </w:pPr>
+      <w:r>
+        <w:rPr>
+          <w:b/>
+          <w:bCs/>
+        </w:rPr>
+        <w:t xml:space="preserve">Sifuentes Ocegueda, Suárez Flores y Lara González (2016)</w:t>
+      </w:r>
+      <w:r>
+        <w:t xml:space="preserve"> </w:t>
+      </w:r>
+      <w:r>
+        <w:t xml:space="preserve">desarrollaron una investigación empírica titulada</w:t>
+      </w:r>
+      <w:r>
+        <w:t xml:space="preserve"> </w:t>
+      </w:r>
       <w:r>
         <w:rPr>
           <w:i/>
           <w:iCs/>
         </w:rPr>
-        <w:t xml:space="preserve">(Sección en desarrollo junto al estudiante)</w:t>
+        <w:t xml:space="preserve">“La evaluación de 360° aplicada al personal docente de nivel superior”</w:t>
+      </w:r>
+      <w:r>
+        <w:t xml:space="preserve">, publicada en la</w:t>
+      </w:r>
+      <w:r>
+        <w:t xml:space="preserve"> </w:t>
+      </w:r>
+      <w:r>
+        <w:rPr>
+          <w:i/>
+          <w:iCs/>
+        </w:rPr>
+        <w:t xml:space="preserve">Revista de Investigación en Tecnologías de la Información (RITI)</w:t>
+      </w:r>
+      <w:r>
+        <w:t xml:space="preserve"> </w:t>
+      </w:r>
+      <w:r>
+        <w:t xml:space="preserve">(Dialnet). El objetivo del estudio consistió en diseñar y evaluar el grado de aceptación de un instrumento 360° para el profesorado universitario en México. Mediante una metodología descriptiva y transversal que abarcó encuestas estructuradas a docentes, directores y estudiantes, los autores concluyeron que el modelo 360° registra un índice de aceptación docente superior al 85% siempre que se respeten tres garantías operativas: el estricto anonimato de los participantes, la entrega de reportes diagnósticos individuales y la ausencia total de penalidades administrativas. Este antecedente aporta a nuestro proyecto una evidencia empírica directa sobre la viabilidad actitudinal del modelo en el contexto universitario iberoamericano.</w:t>
+      </w:r>
+    </w:p>
+    <w:p>
+      <w:pPr>
+        <w:pStyle w:val="Compact"/>
+        <w:numPr>
+          <w:ilvl w:val="0"/>
+          <w:numId w:val="1015"/>
+        </w:numPr>
+      </w:pPr>
+      <w:r>
+        <w:rPr>
+          <w:b/>
+          <w:bCs/>
+        </w:rPr>
+        <w:t xml:space="preserve">Obando Freire et al. (2014)</w:t>
+      </w:r>
+      <w:r>
+        <w:t xml:space="preserve">, en su artículo</w:t>
+      </w:r>
+      <w:r>
+        <w:t xml:space="preserve"> </w:t>
+      </w:r>
+      <w:r>
+        <w:rPr>
+          <w:i/>
+          <w:iCs/>
+        </w:rPr>
+        <w:t xml:space="preserve">“Sistema de evaluación docente mediante el modelo 360 grados y el portafolio electrónico”</w:t>
+      </w:r>
+      <w:r>
+        <w:t xml:space="preserve">, publicado en la revista</w:t>
+      </w:r>
+      <w:r>
+        <w:t xml:space="preserve"> </w:t>
+      </w:r>
+      <w:r>
+        <w:rPr>
+          <w:i/>
+          <w:iCs/>
+        </w:rPr>
+        <w:t xml:space="preserve">Medisur</w:t>
+      </w:r>
+      <w:r>
+        <w:t xml:space="preserve"> </w:t>
+      </w:r>
+      <w:r>
+        <w:t xml:space="preserve">(SciELO), investigaron la implementación de una plataforma digital para la triangulación evaluativa en el nivel superior en Cuba. Su objetivo fue contrastar la efectividad de las encuestas unilaterales frente a un circuito multiactoral que combina autoevaluación, coevaluación de pares y heteroevaluación de alumnos y autoridades académicas. Entre sus principales hallazgos, demostraron que la evaluación circular mitiga los sesgos de complacencia o castigo inherentes a las encuestas estudiantiles aisladas y estimula en los docentes la autorreflexión sobre sus métodos didácticos. Su aporte a este TFG reside en documentar la factibilidad técnico-operativa de procesar evaluaciones multidireccionales mediante soportes informáticos.</w:t>
+      </w:r>
+    </w:p>
+    <w:p>
+      <w:pPr>
+        <w:pStyle w:val="Compact"/>
+        <w:numPr>
+          <w:ilvl w:val="0"/>
+          <w:numId w:val="1015"/>
+        </w:numPr>
+      </w:pPr>
+      <w:r>
+        <w:rPr>
+          <w:b/>
+          <w:bCs/>
+        </w:rPr>
+        <w:t xml:space="preserve">Reyes y Díaz (2020)</w:t>
+      </w:r>
+      <w:r>
+        <w:t xml:space="preserve"> </w:t>
+      </w:r>
+      <w:r>
+        <w:t xml:space="preserve">llevaron a cabo una investigación evaluativa titulada</w:t>
+      </w:r>
+      <w:r>
+        <w:t xml:space="preserve"> </w:t>
+      </w:r>
+      <w:r>
+        <w:rPr>
+          <w:i/>
+          <w:iCs/>
+        </w:rPr>
+        <w:t xml:space="preserve">“Metaevaluación del sistema de evaluación docente en una universidad pública”</w:t>
+      </w:r>
+      <w:r>
+        <w:t xml:space="preserve">, publicada en</w:t>
+      </w:r>
+      <w:r>
+        <w:t xml:space="preserve"> </w:t>
+      </w:r>
+      <w:r>
+        <w:rPr>
+          <w:i/>
+          <w:iCs/>
+        </w:rPr>
+        <w:t xml:space="preserve">Education Policy Analysis Archives (EPAA)</w:t>
+      </w:r>
+      <w:r>
+        <w:t xml:space="preserve">. Mediante un enfoque metodológico mixto que combinó análisis normativo-documental y entrevistas a profundidad a docentes y autoridades sindicales, los autores evaluaron el impacto institucional de los sistemas de evaluación vigentes en una universidad pública mexicana. Concluyeron que los esquemas evaluativos de corte sumativo producen desconfianza y un</w:t>
+      </w:r>
+      <w:r>
+        <w:t xml:space="preserve"> </w:t>
+      </w:r>
+      <w:r>
+        <w:t xml:space="preserve">“efecto cumplimiento formal”</w:t>
+      </w:r>
+      <w:r>
+        <w:t xml:space="preserve">, donde el docente cumple el trámite administrativo sin transformar su práctica pedagógica. Asimismo, advirtieron que para que una innovación evaluativa prospere en la universidad pública, resulta indispensable que el modelo se oriente al aprendizaje institucional y se encuentre legitimado por los órganos de representación laboral. Este antecedente fundamenta la centralidad de la dimensión de gobernanza en nuestra investigación.</w:t>
+      </w:r>
+    </w:p>
+    <w:bookmarkEnd w:id="41"/>
+    <w:bookmarkStart w:id="42" w:name="X2c0b73cfd018cc54d6ee142a74b81e5b02c3616"/>
+    <w:p>
+      <w:pPr>
+        <w:pStyle w:val="Heading3"/>
+        <w:keepNext/>
+        <w:spacing w:before="160" w:after="40" w:line="300" w:lineRule="auto"/>
+      </w:pPr>
+      <w:r>
+        <w:rPr>
+          <w:rFonts w:ascii="Arial" w:hAnsi="Arial"/>
+          <w:b/>
+          <w:i/>
+          <w:sz w:val="24"/>
+        </w:rPr>
+        <w:t xml:space="preserve">Antecedentes Nacionales: Evaluación Docente y Carrera Académica en Universidades Públicas Argentinas</w:t>
+      </w:r>
+    </w:p>
+    <w:p>
+      <w:pPr>
+        <w:pStyle w:val="FirstParagraph"/>
+      </w:pPr>
+      <w:r>
+        <w:t xml:space="preserve">En el ámbito nacional argentino, la literatura científica ha indagado las tensiones inherentes a la profesión docente universitaria y sus mecanismos de valoración:</w:t>
+      </w:r>
+    </w:p>
+    <w:p>
+      <w:pPr>
+        <w:pStyle w:val="Compact"/>
+        <w:numPr>
+          <w:ilvl w:val="0"/>
+          <w:numId w:val="1016"/>
+        </w:numPr>
+      </w:pPr>
+      <w:r>
+        <w:rPr>
+          <w:b/>
+          <w:bCs/>
+        </w:rPr>
+        <w:t xml:space="preserve">Marquina (2012)</w:t>
+      </w:r>
+      <w:r>
+        <w:t xml:space="preserve">, en su estudio empírico</w:t>
+      </w:r>
+      <w:r>
+        <w:t xml:space="preserve"> </w:t>
+      </w:r>
+      <w:r>
+        <w:rPr>
+          <w:i/>
+          <w:iCs/>
+        </w:rPr>
+        <w:t xml:space="preserve">“¿Hay un nuevo modelo de profesión académica en Argentina? Debates y tendencias en la universidad pública”</w:t>
+      </w:r>
+      <w:r>
+        <w:t xml:space="preserve">, publicado en</w:t>
+      </w:r>
+      <w:r>
+        <w:t xml:space="preserve"> </w:t>
+      </w:r>
+      <w:r>
+        <w:rPr>
+          <w:i/>
+          <w:iCs/>
+        </w:rPr>
+        <w:t xml:space="preserve">Pensamiento Universitario</w:t>
+      </w:r>
+      <w:r>
+        <w:t xml:space="preserve">, analizó las transformaciones en la labor de los profesores de las universidades nacionales a partir de las exigencias contrapuestas entre la docencia, la investigación y la gestión institucional. A través de un abordaje cualitativo apoyado en entrevistas a docentes y referentes gremiales de diversas universidades públicas, Marquina evidenció que los instrumentos tradicionales de evaluación docente (concursos y permanencias) suelen privilegiar la producción científica abstracta o la acumulación de posgrados por sobre la calidad didáctica en las aulas de grado. Este hallazgo resulta nodal para nuestro TFG, pues justifica la necesidad de generar dispositivos de retroalimentación centrados específicamente en la función formativa y de enseñanza del docente universitario.</w:t>
+      </w:r>
+    </w:p>
+    <w:p>
+      <w:pPr>
+        <w:pStyle w:val="Compact"/>
+        <w:numPr>
+          <w:ilvl w:val="0"/>
+          <w:numId w:val="1016"/>
+        </w:numPr>
+      </w:pPr>
+      <w:r>
+        <w:rPr>
+          <w:b/>
+          <w:bCs/>
+        </w:rPr>
+        <w:t xml:space="preserve">Pérez, González y Castro (2021)</w:t>
+      </w:r>
+      <w:r>
+        <w:t xml:space="preserve"> </w:t>
+      </w:r>
+      <w:r>
+        <w:t xml:space="preserve">publicaron el artículo de investigación empírica</w:t>
+      </w:r>
+      <w:r>
+        <w:t xml:space="preserve"> </w:t>
+      </w:r>
+      <w:r>
+        <w:rPr>
+          <w:i/>
+          <w:iCs/>
+        </w:rPr>
+        <w:t xml:space="preserve">“Evaluación 360° de las tutorías presenciales y en línea en universidades públicas”</w:t>
+      </w:r>
+      <w:r>
+        <w:t xml:space="preserve">, en la revista científica</w:t>
+      </w:r>
+      <w:r>
+        <w:t xml:space="preserve"> </w:t>
+      </w:r>
+      <w:r>
+        <w:rPr>
+          <w:i/>
+          <w:iCs/>
+        </w:rPr>
+        <w:t xml:space="preserve">Unaciencia</w:t>
+      </w:r>
+      <w:r>
+        <w:t xml:space="preserve"> </w:t>
+      </w:r>
+      <w:r>
+        <w:t xml:space="preserve">(Redalyc). El estudio evaluó la factibilidad de aplicar la metodología 360° para valorar el desempeño de docentes universitarios con funciones tutoriales presenciales y mediadas por tecnologías virtuales. Mediante un diseño metodológico descriptivo aplicado a estudiantes, docentes tutores y coordinadores, el trabajo concluyó que el modelo 360° demostró una capacidad significativamente superior para captar competencias pedagógicas blandas (comunicación asertiva, empatía, acompañamiento en entornos virtuales) en comparación con las rúbricas estandarizadas tradicionales. Este antecedente aporta un valor metodológico e instrumental directo para el CURZAS-UNCo, donde la docencia universitaria se despliega crecientemente de forma híbrida articulando la sede central con los Nodos Territoriales.</w:t>
+      </w:r>
+    </w:p>
+    <w:bookmarkEnd w:id="42"/>
+    <w:bookmarkStart w:id="43" w:name="X868ada8a3209befb2b1ff6a8414801be884be61"/>
+    <w:p>
+      <w:pPr>
+        <w:pStyle w:val="Heading3"/>
+        <w:keepNext/>
+        <w:spacing w:before="160" w:after="40" w:line="300" w:lineRule="auto"/>
+      </w:pPr>
+      <w:r>
+        <w:rPr>
+          <w:rFonts w:ascii="Arial" w:hAnsi="Arial"/>
+          <w:b/>
+          <w:i/>
+          <w:sz w:val="24"/>
+        </w:rPr>
+        <w:t xml:space="preserve">Antecedentes Regionales y Locales: Prácticas de Evaluación y Contexto Institucional en la UNCo y el CURZAS</w:t>
+      </w:r>
+    </w:p>
+    <w:p>
+      <w:pPr>
+        <w:pStyle w:val="FirstParagraph"/>
+      </w:pPr>
+      <w:r>
+        <w:t xml:space="preserve">En el plano regional y local patagónico, los antecedentes vinculados a la Universidad Nacional del Comahue y al Complejo Universitario Regional Zona Atlántica y Sur (CURZAS) permiten contextualizar la situación empírica de partida:</w:t>
+      </w:r>
+    </w:p>
+    <w:p>
+      <w:pPr>
+        <w:pStyle w:val="Compact"/>
+        <w:numPr>
+          <w:ilvl w:val="0"/>
+          <w:numId w:val="1017"/>
+        </w:numPr>
+      </w:pPr>
+      <w:r>
+        <w:rPr>
+          <w:b/>
+          <w:bCs/>
+        </w:rPr>
+        <w:t xml:space="preserve">Relevamiento documental e institucional del régimen de Carrera Docente en la UNCo (Ordenanza CS N° 0920/2019 y Estatuto Ord. CS N° 0988/2025):</w:t>
+      </w:r>
+      <w:r>
+        <w:t xml:space="preserve"> </w:t>
+      </w:r>
+      <w:r>
+        <w:t xml:space="preserve">Las actas y resoluciones del Consejo Superior y del Consejo Directivo del CURZAS revelan que, históricamente, los dos mecanismos estatutarios de evaluación docente vigentes en la institución —los informes anuales con encuestas de opinión estudiantil (Art. 74) y las comisiones evaluadoras cuatrienales con tribunales de pares externos y veedores estudiantiles (Art. 75)— cumplen de forma efectiva su propósito legal de control de la inserción y permanencia. Sin embargo, los claustros han señalado reiteradamente la carencia de dispositivos institucionales sistemáticos que transformen los resultados de dichas evaluaciones en devoluciones formativas individualizadas o en insumos directos para la planificación de los programas departamentales de capacitación docente (Art. 76).</w:t>
+      </w:r>
+    </w:p>
+    <w:p>
+      <w:pPr>
+        <w:pStyle w:val="Compact"/>
+        <w:numPr>
+          <w:ilvl w:val="0"/>
+          <w:numId w:val="1017"/>
+        </w:numPr>
+      </w:pPr>
+      <w:r>
+        <w:rPr>
+          <w:b/>
+          <w:bCs/>
+        </w:rPr>
+        <w:t xml:space="preserve">La experiencia de expansión territorial mediante la Red de Nodos Universitarios (2020–2026):</w:t>
+      </w:r>
+      <w:r>
+        <w:t xml:space="preserve"> </w:t>
+      </w:r>
+      <w:r>
+        <w:t xml:space="preserve">A nivel regional rionegrino, la puesta en marcha de los Nodos del CURZAS en localidades como Sierra Grande, Valcheta, Los Menucos y Ramos Mexía ha configurado un nuevo escenario de docencia híbrida que demanda competencias docentes específicas para la atención simultánea en sedes centrales y aulas virtuales remotas. No existen antecedentes empíricos locales que hayan explorado la factibilidad de implementar un modelo de retroalimentación multiactoral en este contexto geográfico particular, lo que refuerza la pertinencia del estudio situado.</w:t>
+      </w:r>
+    </w:p>
+    <w:bookmarkEnd w:id="43"/>
+    <w:bookmarkStart w:id="44" w:name="Xdd2f1928b167b346feb3db91e0e80e813fe5a54"/>
+    <w:p>
+      <w:pPr>
+        <w:pStyle w:val="Heading3"/>
+        <w:keepNext/>
+        <w:spacing w:before="160" w:after="40" w:line="300" w:lineRule="auto"/>
+      </w:pPr>
+      <w:r>
+        <w:rPr>
+          <w:rFonts w:ascii="Arial" w:hAnsi="Arial"/>
+          <w:b/>
+          <w:i/>
+          <w:sz w:val="24"/>
+        </w:rPr>
+        <w:t xml:space="preserve">Síntesis Integradora y Vacancia de la Investigación</w:t>
+      </w:r>
+    </w:p>
+    <w:p>
+      <w:pPr>
+        <w:pStyle w:val="FirstParagraph"/>
+      </w:pPr>
+      <w:r>
+        <w:t xml:space="preserve">En concordancia con los principios epistemológicos de</w:t>
+      </w:r>
+      <w:r>
+        <w:t xml:space="preserve"> </w:t>
+      </w:r>
+      <w:r>
+        <w:t xml:space="preserve">Torraco (2016)</w:t>
+      </w:r>
+      <w:r>
+        <w:t xml:space="preserve"> </w:t>
+      </w:r>
+      <w:r>
+        <w:t xml:space="preserve">y</w:t>
+      </w:r>
+      <w:r>
+        <w:t xml:space="preserve"> </w:t>
+      </w:r>
+      <w:r>
+        <w:t xml:space="preserve">Jiménez Becerra (2008)</w:t>
+      </w:r>
+      <w:r>
+        <w:t xml:space="preserve">, el recorrido por los antecedentes internacionales, nacionales y locales permite constatar un consenso sobre la riqueza del modelo 360° para mejorar la calidad formativa y la necesidad de diferenciar la evaluación del desarrollo de la fiscalización sumativa de la permanencia.</w:t>
+      </w:r>
+    </w:p>
+    <w:p>
+      <w:pPr>
+        <w:pStyle w:val="BodyText"/>
+      </w:pPr>
+      <w:r>
+        <w:t xml:space="preserve">No obstante, la revisión revela una evidente</w:t>
+      </w:r>
+      <w:r>
+        <w:t xml:space="preserve"> </w:t>
+      </w:r>
+      <w:r>
+        <w:rPr>
+          <w:b/>
+          <w:bCs/>
+        </w:rPr>
+        <w:t xml:space="preserve">vacancia de conocimiento empírico</w:t>
+      </w:r>
+      <w:r>
+        <w:t xml:space="preserve">: existe abundante literatura sobre la validez métrica del modelo 360° en ámbitos corporativos o en universidades privadas, así como estudios sobre la carrera docente en grandes universidades urbanas argentinas, pero</w:t>
+      </w:r>
+      <w:r>
+        <w:t xml:space="preserve"> </w:t>
+      </w:r>
+      <w:r>
+        <w:rPr>
+          <w:b/>
+          <w:bCs/>
+        </w:rPr>
+        <w:t xml:space="preserve">se verifica una ausencia de investigaciones científicas sobre la factibilidad integral (organizacional, técnica, normativa y de gobernanza) de implementar un circuito de retroalimentación 360° en una unidad académica pública, descentralizada y patagónica, cogobernada por claustros y con sedes en territorio híbrido</w:t>
+      </w:r>
+      <w:r>
+        <w:t xml:space="preserve">.</w:t>
+      </w:r>
+    </w:p>
+    <w:p>
+      <w:pPr>
+        <w:pStyle w:val="BodyText"/>
+      </w:pPr>
+      <w:r>
+        <w:t xml:space="preserve">En este espacio de vacancia se inscribe el aporte original y situado del presente Trabajo Final de Graduación.</w:t>
       </w:r>
     </w:p>
     <w:p>
@@ -3129,9 +4634,10 @@
         <w:br w:type="page"/>
       </w:r>
     </w:p>
-    <w:bookmarkEnd w:id="37"/>
-    <w:bookmarkEnd w:id="38"/>
-    <w:bookmarkStart w:id="56" w:name="referencias"/>
+    <w:bookmarkEnd w:id="44"/>
+    <w:bookmarkEnd w:id="45"/>
+    <w:bookmarkEnd w:id="46"/>
+    <w:bookmarkStart w:id="69" w:name="referencias-bibliográficas"/>
     <w:p>
       <w:pPr>
         <w:pStyle w:val="Heading1"/>
@@ -3145,11 +4651,11 @@
           <w:b/>
           <w:sz w:val="28"/>
         </w:rPr>
-        <w:t xml:space="preserve">Referencias</w:t>
-      </w:r>
-    </w:p>
-    <w:bookmarkStart w:id="55" w:name="refs"/>
-    <w:bookmarkStart w:id="39" w:name="ref-chiavenato2020"/>
+        <w:t xml:space="preserve">Referencias Bibliográficas</w:t>
+      </w:r>
+    </w:p>
+    <w:bookmarkStart w:id="68" w:name="refs"/>
+    <w:bookmarkStart w:id="47" w:name="ref-chiavenato2020"/>
     <w:p>
       <w:pPr>
         <w:pStyle w:val="Bibliography"/>
@@ -3177,8 +4683,8 @@
         <w:t xml:space="preserve">(5.ª ed.). McGraw-Hill Interamericana.</w:t>
       </w:r>
     </w:p>
-    <w:bookmarkEnd w:id="39"/>
-    <w:bookmarkStart w:id="40" w:name="ref-uncocurzas2023"/>
+    <w:bookmarkEnd w:id="47"/>
+    <w:bookmarkStart w:id="48" w:name="ref-uncocurzas2023"/>
     <w:p>
       <w:pPr>
         <w:pStyle w:val="Bibliography"/>
@@ -3203,8 +4709,8 @@
         <w:t xml:space="preserve">. Universidad Nacional del Comahue.</w:t>
       </w:r>
     </w:p>
-    <w:bookmarkEnd w:id="40"/>
-    <w:bookmarkStart w:id="41" w:name="ref-pen2015"/>
+    <w:bookmarkEnd w:id="48"/>
+    <w:bookmarkStart w:id="50" w:name="ref-delagarza2001"/>
     <w:p>
       <w:pPr>
         <w:pStyle w:val="Bibliography"/>
@@ -3213,11 +4719,48 @@
         <w:jc w:val="left"/>
       </w:pPr>
       <w:r>
-        <w:t xml:space="preserve">Decreto N° 1246/2015. Convenio Colectivo de Trabajo para los Docentes de las Instituciones Universitarias Nacionales (2015).</w:t>
-      </w:r>
-    </w:p>
-    <w:bookmarkEnd w:id="41"/>
-    <w:bookmarkStart w:id="42" w:name="ref-lepsinger2009"/>
+        <w:t xml:space="preserve">De la Garza Toledo, E. (2001). La epistemología crítica y el concepto de configuración: Alternativas a la estructura y al sujeto.</w:t>
+      </w:r>
+      <w:r>
+        <w:t xml:space="preserve"> </w:t>
+      </w:r>
+      <w:r>
+        <w:rPr>
+          <w:i/>
+          <w:iCs/>
+        </w:rPr>
+        <w:t xml:space="preserve">Revista Mexicana de Sociología</w:t>
+      </w:r>
+      <w:r>
+        <w:t xml:space="preserve">,</w:t>
+      </w:r>
+      <w:r>
+        <w:t xml:space="preserve"> </w:t>
+      </w:r>
+      <w:r>
+        <w:rPr>
+          <w:i/>
+          <w:iCs/>
+        </w:rPr>
+        <w:t xml:space="preserve">63</w:t>
+      </w:r>
+      <w:r>
+        <w:t xml:space="preserve">(1), 109-127.</w:t>
+      </w:r>
+      <w:r>
+        <w:t xml:space="preserve"> </w:t>
+      </w:r>
+      <w:hyperlink r:id="rId49">
+        <w:r>
+          <w:rPr>
+            <w:rStyle w:val="Hyperlink"/>
+          </w:rPr>
+          <w:t xml:space="preserve">https://doi.org/10.2307/3541464</w:t>
+        </w:r>
+      </w:hyperlink>
+    </w:p>
+    <w:bookmarkEnd w:id="50"/>
+    <w:bookmarkStart w:id="51" w:name="ref-pen2015"/>
     <w:p>
       <w:pPr>
         <w:pStyle w:val="Bibliography"/>
@@ -3226,27 +4769,11 @@
         <w:jc w:val="left"/>
       </w:pPr>
       <w:r>
-        <w:t xml:space="preserve">Lepsinger, R., &amp; Lucia, A. D. (2009).</w:t>
-      </w:r>
-      <w:r>
-        <w:t xml:space="preserve"> </w:t>
-      </w:r>
-      <w:r>
-        <w:rPr>
-          <w:i/>
-          <w:iCs/>
-        </w:rPr>
-        <w:t xml:space="preserve">The art and science of 360 degree feedback</w:t>
-      </w:r>
-      <w:r>
-        <w:t xml:space="preserve"> </w:t>
-      </w:r>
-      <w:r>
-        <w:t xml:space="preserve">(2.ª ed.). Pfeiffer.</w:t>
-      </w:r>
-    </w:p>
-    <w:bookmarkEnd w:id="42"/>
-    <w:bookmarkStart w:id="43" w:name="ref-ministerio1995"/>
+        <w:t xml:space="preserve">Decreto N° 1246/2015. Convenio Colectivo de Trabajo para los Docentes de las Instituciones Universitarias Nacionales (2015).</w:t>
+      </w:r>
+    </w:p>
+    <w:bookmarkEnd w:id="51"/>
+    <w:bookmarkStart w:id="52" w:name="ref-jimenez2008"/>
     <w:p>
       <w:pPr>
         <w:pStyle w:val="Bibliography"/>
@@ -3255,11 +4782,27 @@
         <w:jc w:val="left"/>
       </w:pPr>
       <w:r>
-        <w:t xml:space="preserve">Ley N° 24.521 de Educación Superior (1995).</w:t>
-      </w:r>
-    </w:p>
-    <w:bookmarkEnd w:id="43"/>
-    <w:bookmarkStart w:id="44" w:name="ref-longo2006"/>
+        <w:t xml:space="preserve">Jiménez Becerra, A. (2008). El estado del arte y la investigación de la investigación: Reflexiones metodológicas. En A. Jiménez Becerra &amp; A. Torres Carrillo (Eds.),</w:t>
+      </w:r>
+      <w:r>
+        <w:t xml:space="preserve"> </w:t>
+      </w:r>
+      <w:r>
+        <w:rPr>
+          <w:i/>
+          <w:iCs/>
+        </w:rPr>
+        <w:t xml:space="preserve">La práctica investigativa en ciencias sociales</w:t>
+      </w:r>
+      <w:r>
+        <w:t xml:space="preserve"> </w:t>
+      </w:r>
+      <w:r>
+        <w:t xml:space="preserve">(pp. 27-42). Universidad Pedagógica Nacional / CLACSO.</w:t>
+      </w:r>
+    </w:p>
+    <w:bookmarkEnd w:id="52"/>
+    <w:bookmarkStart w:id="53" w:name="ref-lepsinger2009"/>
     <w:p>
       <w:pPr>
         <w:pStyle w:val="Bibliography"/>
@@ -3268,7 +4811,7 @@
         <w:jc w:val="left"/>
       </w:pPr>
       <w:r>
-        <w:t xml:space="preserve">Longo, F. (2006).</w:t>
+        <w:t xml:space="preserve">Lepsinger, R., &amp; Lucia, A. D. (2009).</w:t>
       </w:r>
       <w:r>
         <w:t xml:space="preserve"> </w:t>
@@ -3278,14 +4821,17 @@
           <w:i/>
           <w:iCs/>
         </w:rPr>
-        <w:t xml:space="preserve">Mérito y flexibilidad: La gestión de las personas en las organizaciones del sector público</w:t>
-      </w:r>
-      <w:r>
-        <w:t xml:space="preserve">. Paidós.</w:t>
-      </w:r>
-    </w:p>
-    <w:bookmarkEnd w:id="44"/>
-    <w:bookmarkStart w:id="45" w:name="ref-matus1993"/>
+        <w:t xml:space="preserve">The art and science of 360 degree feedback</w:t>
+      </w:r>
+      <w:r>
+        <w:t xml:space="preserve"> </w:t>
+      </w:r>
+      <w:r>
+        <w:t xml:space="preserve">(2.ª ed.). Pfeiffer.</w:t>
+      </w:r>
+    </w:p>
+    <w:bookmarkEnd w:id="53"/>
+    <w:bookmarkStart w:id="54" w:name="ref-ministerio1995"/>
     <w:p>
       <w:pPr>
         <w:pStyle w:val="Bibliography"/>
@@ -3294,24 +4840,11 @@
         <w:jc w:val="left"/>
       </w:pPr>
       <w:r>
-        <w:t xml:space="preserve">Matus, C. (1993).</w:t>
-      </w:r>
-      <w:r>
-        <w:t xml:space="preserve"> </w:t>
-      </w:r>
-      <w:r>
-        <w:rPr>
-          <w:i/>
-          <w:iCs/>
-        </w:rPr>
-        <w:t xml:space="preserve">Política, planificación y gobierno</w:t>
-      </w:r>
-      <w:r>
-        <w:t xml:space="preserve">. Fundación ALTIDIR.</w:t>
-      </w:r>
-    </w:p>
-    <w:bookmarkEnd w:id="45"/>
-    <w:bookmarkStart w:id="47" w:name="ref-obando2014"/>
+        <w:t xml:space="preserve">Ley N° 24.521 de Educación Superior (1995).</w:t>
+      </w:r>
+    </w:p>
+    <w:bookmarkEnd w:id="54"/>
+    <w:bookmarkStart w:id="55" w:name="ref-longo2006"/>
     <w:p>
       <w:pPr>
         <w:pStyle w:val="Bibliography"/>
@@ -3320,7 +4853,7 @@
         <w:jc w:val="left"/>
       </w:pPr>
       <w:r>
-        <w:t xml:space="preserve">Obando Freire, F., López Fernández, R., Luna Álvarez, D., Luna Álvarez, E., Luna Álvarez, W., &amp; Alpizar Fernández, R. (2014). Sistema de evaluación docente mediante el modelo 360 grados y el portafolio electrónico.</w:t>
+        <w:t xml:space="preserve">Longo, F. (2006).</w:t>
       </w:r>
       <w:r>
         <w:t xml:space="preserve"> </w:t>
@@ -3330,10 +4863,23 @@
           <w:i/>
           <w:iCs/>
         </w:rPr>
-        <w:t xml:space="preserve">Medisur</w:t>
-      </w:r>
-      <w:r>
-        <w:t xml:space="preserve">,</w:t>
+        <w:t xml:space="preserve">Mérito y flexibilidad: La gestión de las personas en las organizaciones del sector público</w:t>
+      </w:r>
+      <w:r>
+        <w:t xml:space="preserve">. Paidós.</w:t>
+      </w:r>
+    </w:p>
+    <w:bookmarkEnd w:id="55"/>
+    <w:bookmarkStart w:id="56" w:name="ref-matus1993"/>
+    <w:p>
+      <w:pPr>
+        <w:pStyle w:val="Bibliography"/>
+        <w:spacing w:after="120"/>
+        <w:ind w:left="720" w:hanging="720"/>
+        <w:jc w:val="left"/>
+      </w:pPr>
+      <w:r>
+        <w:t xml:space="preserve">Matus, C. (1993).</w:t>
       </w:r>
       <w:r>
         <w:t xml:space="preserve"> </w:t>
@@ -3343,6 +4889,45 @@
           <w:i/>
           <w:iCs/>
         </w:rPr>
+        <w:t xml:space="preserve">Política, planificación y gobierno</w:t>
+      </w:r>
+      <w:r>
+        <w:t xml:space="preserve">. Fundación ALTIDIR.</w:t>
+      </w:r>
+    </w:p>
+    <w:bookmarkEnd w:id="56"/>
+    <w:bookmarkStart w:id="58" w:name="ref-obando2014"/>
+    <w:p>
+      <w:pPr>
+        <w:pStyle w:val="Bibliography"/>
+        <w:spacing w:after="120"/>
+        <w:ind w:left="720" w:hanging="720"/>
+        <w:jc w:val="left"/>
+      </w:pPr>
+      <w:r>
+        <w:t xml:space="preserve">Obando Freire, F., López Fernández, R., Luna Álvarez, D., Luna Álvarez, E., Luna Álvarez, W., &amp; Alpizar Fernández, R. (2014). Sistema de evaluación docente mediante el modelo 360 grados y el portafolio electrónico.</w:t>
+      </w:r>
+      <w:r>
+        <w:t xml:space="preserve"> </w:t>
+      </w:r>
+      <w:r>
+        <w:rPr>
+          <w:i/>
+          <w:iCs/>
+        </w:rPr>
+        <w:t xml:space="preserve">Medisur</w:t>
+      </w:r>
+      <w:r>
+        <w:t xml:space="preserve">,</w:t>
+      </w:r>
+      <w:r>
+        <w:t xml:space="preserve"> </w:t>
+      </w:r>
+      <w:r>
+        <w:rPr>
+          <w:i/>
+          <w:iCs/>
+        </w:rPr>
         <w:t xml:space="preserve">12</w:t>
       </w:r>
       <w:r>
@@ -3351,7 +4936,7 @@
       <w:r>
         <w:t xml:space="preserve"> </w:t>
       </w:r>
-      <w:hyperlink r:id="rId46">
+      <w:hyperlink r:id="rId57">
         <w:r>
           <w:rPr>
             <w:rStyle w:val="Hyperlink"/>
@@ -3360,8 +4945,8 @@
         </w:r>
       </w:hyperlink>
     </w:p>
-    <w:bookmarkEnd w:id="47"/>
-    <w:bookmarkStart w:id="48" w:name="ref-oszlak2020"/>
+    <w:bookmarkEnd w:id="58"/>
+    <w:bookmarkStart w:id="59" w:name="ref-oszlak2020"/>
     <w:p>
       <w:pPr>
         <w:pStyle w:val="Bibliography"/>
@@ -3386,8 +4971,8 @@
         <w:t xml:space="preserve">. Instituto Nacional de la Administración Pública.</w:t>
       </w:r>
     </w:p>
-    <w:bookmarkEnd w:id="48"/>
-    <w:bookmarkStart w:id="49" w:name="ref-sautu2005"/>
+    <w:bookmarkEnd w:id="59"/>
+    <w:bookmarkStart w:id="60" w:name="ref-sautu2005"/>
     <w:p>
       <w:pPr>
         <w:pStyle w:val="Bibliography"/>
@@ -3412,8 +4997,8 @@
         <w:t xml:space="preserve">. Lumiere.</w:t>
       </w:r>
     </w:p>
-    <w:bookmarkEnd w:id="49"/>
-    <w:bookmarkStart w:id="51" w:name="ref-sifuentes2016"/>
+    <w:bookmarkEnd w:id="60"/>
+    <w:bookmarkStart w:id="62" w:name="ref-sifuentes2016"/>
     <w:p>
       <w:pPr>
         <w:pStyle w:val="Bibliography"/>
@@ -3453,7 +5038,7 @@
       <w:r>
         <w:t xml:space="preserve"> </w:t>
       </w:r>
-      <w:hyperlink r:id="rId50">
+      <w:hyperlink r:id="rId61">
         <w:r>
           <w:rPr>
             <w:rStyle w:val="Hyperlink"/>
@@ -3462,8 +5047,8 @@
         </w:r>
       </w:hyperlink>
     </w:p>
-    <w:bookmarkEnd w:id="51"/>
-    <w:bookmarkStart w:id="52" w:name="ref-unco2019"/>
+    <w:bookmarkEnd w:id="62"/>
+    <w:bookmarkStart w:id="64" w:name="ref-torraco2016"/>
     <w:p>
       <w:pPr>
         <w:pStyle w:val="Bibliography"/>
@@ -3472,7 +5057,7 @@
         <w:jc w:val="left"/>
       </w:pPr>
       <w:r>
-        <w:t xml:space="preserve">Universidad Nacional del Comahue. (2019).</w:t>
+        <w:t xml:space="preserve">Torraco, R. J. (2016). Writing integrative literature reviews: Using the past and present to explore the future.</w:t>
       </w:r>
       <w:r>
         <w:t xml:space="preserve"> </w:t>
@@ -3482,14 +5067,38 @@
           <w:i/>
           <w:iCs/>
         </w:rPr>
-        <w:t xml:space="preserve">Ordenanza N° 0920/2019: Reglamento de Carrera Docente</w:t>
-      </w:r>
-      <w:r>
-        <w:t xml:space="preserve">.</w:t>
-      </w:r>
-    </w:p>
-    <w:bookmarkEnd w:id="52"/>
-    <w:bookmarkStart w:id="53" w:name="ref-unco2025"/>
+        <w:t xml:space="preserve">Human Resource Development Review</w:t>
+      </w:r>
+      <w:r>
+        <w:t xml:space="preserve">,</w:t>
+      </w:r>
+      <w:r>
+        <w:t xml:space="preserve"> </w:t>
+      </w:r>
+      <w:r>
+        <w:rPr>
+          <w:i/>
+          <w:iCs/>
+        </w:rPr>
+        <w:t xml:space="preserve">15</w:t>
+      </w:r>
+      <w:r>
+        <w:t xml:space="preserve">(4), 404-428.</w:t>
+      </w:r>
+      <w:r>
+        <w:t xml:space="preserve"> </w:t>
+      </w:r>
+      <w:hyperlink r:id="rId63">
+        <w:r>
+          <w:rPr>
+            <w:rStyle w:val="Hyperlink"/>
+          </w:rPr>
+          <w:t xml:space="preserve">https://doi.org/10.1177/1534484316671606</w:t>
+        </w:r>
+      </w:hyperlink>
+    </w:p>
+    <w:bookmarkEnd w:id="64"/>
+    <w:bookmarkStart w:id="65" w:name="ref-unco2019"/>
     <w:p>
       <w:pPr>
         <w:pStyle w:val="Bibliography"/>
@@ -3498,7 +5107,7 @@
         <w:jc w:val="left"/>
       </w:pPr>
       <w:r>
-        <w:t xml:space="preserve">Universidad Nacional del Comahue. (2025).</w:t>
+        <w:t xml:space="preserve">Universidad Nacional del Comahue. (2019).</w:t>
       </w:r>
       <w:r>
         <w:t xml:space="preserve"> </w:t>
@@ -3508,14 +5117,14 @@
           <w:i/>
           <w:iCs/>
         </w:rPr>
-        <w:t xml:space="preserve">Ordenanza N° 0988/2025: Texto ordenado del Estatuto de la Universidad Nacional del Comahue</w:t>
+        <w:t xml:space="preserve">Ordenanza N° 0920/2019: Reglamento de Carrera Docente</w:t>
       </w:r>
       <w:r>
         <w:t xml:space="preserve">.</w:t>
       </w:r>
     </w:p>
-    <w:bookmarkEnd w:id="53"/>
-    <w:bookmarkStart w:id="54" w:name="ref-wainerman2011"/>
+    <w:bookmarkEnd w:id="65"/>
+    <w:bookmarkStart w:id="66" w:name="ref-unco2025"/>
     <w:p>
       <w:pPr>
         <w:pStyle w:val="Bibliography"/>
@@ -3524,7 +5133,7 @@
         <w:jc w:val="left"/>
       </w:pPr>
       <w:r>
-        <w:t xml:space="preserve">Wainerman, C., &amp; Sautu, R. (2011).</w:t>
+        <w:t xml:space="preserve">Universidad Nacional del Comahue. (2025).</w:t>
       </w:r>
       <w:r>
         <w:t xml:space="preserve"> </w:t>
@@ -3534,6 +5143,32 @@
           <w:i/>
           <w:iCs/>
         </w:rPr>
+        <w:t xml:space="preserve">Ordenanza N° 0988/2025: Texto ordenado del Estatuto de la Universidad Nacional del Comahue</w:t>
+      </w:r>
+      <w:r>
+        <w:t xml:space="preserve">.</w:t>
+      </w:r>
+    </w:p>
+    <w:bookmarkEnd w:id="66"/>
+    <w:bookmarkStart w:id="67" w:name="ref-wainerman2011"/>
+    <w:p>
+      <w:pPr>
+        <w:pStyle w:val="Bibliography"/>
+        <w:spacing w:after="120"/>
+        <w:ind w:left="720" w:hanging="720"/>
+        <w:jc w:val="left"/>
+      </w:pPr>
+      <w:r>
+        <w:t xml:space="preserve">Wainerman, C., &amp; Sautu, R. (2011).</w:t>
+      </w:r>
+      <w:r>
+        <w:t xml:space="preserve"> </w:t>
+      </w:r>
+      <w:r>
+        <w:rPr>
+          <w:i/>
+          <w:iCs/>
+        </w:rPr>
         <w:t xml:space="preserve">La trastienda de la investigación</w:t>
       </w:r>
       <w:r>
@@ -3543,9 +5178,9 @@
         <w:t xml:space="preserve">(4.ª ed.). Manantial.</w:t>
       </w:r>
     </w:p>
-    <w:bookmarkEnd w:id="54"/>
-    <w:bookmarkEnd w:id="55"/>
-    <w:bookmarkEnd w:id="56"/>
+    <w:bookmarkEnd w:id="67"/>
+    <w:bookmarkEnd w:id="68"/>
+    <w:bookmarkEnd w:id="69"/>
     <w:sectPr>
       <w:footerReference w:type="default" r:id="rId11"/>
       <w:footnotePr>
@@ -3953,6 +5588,84 @@
     </w:lvlOverride>
   </w:num>
   <w:num w:numId="1009">
+    <w:abstractNumId w:val="991"/>
+  </w:num>
+  <w:num w:numId="1010">
+    <w:abstractNumId w:val="99411"/>
+    <w:lvlOverride w:ilvl="0">
+      <w:startOverride w:val="1"/>
+    </w:lvlOverride>
+    <w:lvlOverride w:ilvl="1">
+      <w:startOverride w:val="1"/>
+    </w:lvlOverride>
+    <w:lvlOverride w:ilvl="2">
+      <w:startOverride w:val="1"/>
+    </w:lvlOverride>
+    <w:lvlOverride w:ilvl="3">
+      <w:startOverride w:val="1"/>
+    </w:lvlOverride>
+    <w:lvlOverride w:ilvl="4">
+      <w:startOverride w:val="1"/>
+    </w:lvlOverride>
+    <w:lvlOverride w:ilvl="5">
+      <w:startOverride w:val="1"/>
+    </w:lvlOverride>
+    <w:lvlOverride w:ilvl="6">
+      <w:startOverride w:val="1"/>
+    </w:lvlOverride>
+    <w:lvlOverride w:ilvl="7">
+      <w:startOverride w:val="1"/>
+    </w:lvlOverride>
+    <w:lvlOverride w:ilvl="8">
+      <w:startOverride w:val="1"/>
+    </w:lvlOverride>
+  </w:num>
+  <w:num w:numId="1011">
+    <w:abstractNumId w:val="991"/>
+  </w:num>
+  <w:num w:numId="1012">
+    <w:abstractNumId w:val="99411"/>
+    <w:lvlOverride w:ilvl="0">
+      <w:startOverride w:val="1"/>
+    </w:lvlOverride>
+    <w:lvlOverride w:ilvl="1">
+      <w:startOverride w:val="1"/>
+    </w:lvlOverride>
+    <w:lvlOverride w:ilvl="2">
+      <w:startOverride w:val="1"/>
+    </w:lvlOverride>
+    <w:lvlOverride w:ilvl="3">
+      <w:startOverride w:val="1"/>
+    </w:lvlOverride>
+    <w:lvlOverride w:ilvl="4">
+      <w:startOverride w:val="1"/>
+    </w:lvlOverride>
+    <w:lvlOverride w:ilvl="5">
+      <w:startOverride w:val="1"/>
+    </w:lvlOverride>
+    <w:lvlOverride w:ilvl="6">
+      <w:startOverride w:val="1"/>
+    </w:lvlOverride>
+    <w:lvlOverride w:ilvl="7">
+      <w:startOverride w:val="1"/>
+    </w:lvlOverride>
+    <w:lvlOverride w:ilvl="8">
+      <w:startOverride w:val="1"/>
+    </w:lvlOverride>
+  </w:num>
+  <w:num w:numId="1013">
+    <w:abstractNumId w:val="991"/>
+  </w:num>
+  <w:num w:numId="1014">
+    <w:abstractNumId w:val="991"/>
+  </w:num>
+  <w:num w:numId="1015">
+    <w:abstractNumId w:val="991"/>
+  </w:num>
+  <w:num w:numId="1016">
+    <w:abstractNumId w:val="991"/>
+  </w:num>
+  <w:num w:numId="1017">
     <w:abstractNumId w:val="991"/>
   </w:num>
 </w:numbering>

</xml_diff>

<commit_message>
feat(actividad-3): actualizar normativa regional unco curzas y organizar fuentes completas de autores
- Actualizar Estadio Regional y Local con Estatuto UNCo (Ord. CS N° 0988/2025, Título X, Arts. 17 y 65-76).
- Ajustar Digesto de Carrera Docente a Ord. CS N° 0910/1997 (reemplazando cita provisoria de 0920/2019).
- Incorporar docencia híbrida y mediaciones en Nodos Territoriales del CURZAS (Res. CD-CURZA N° 196/2022).
- Organizar y descargar textos completos de autores y normativas en carpeta de Fuentes y Autores.
- Recompilar entregables finales TP3 en PDF (24 págs) y Word (.docx).
</commit_message>
<xml_diff>
--- a/Entregas/Actividad 3/TP3_Ayarachi_Fuentes.docx
+++ b/Entregas/Actividad 3/TP3_Ayarachi_Fuentes.docx
@@ -1122,7 +1122,7 @@
           <w:rFonts w:ascii="Arial" w:hAnsi="Arial"/>
           <w:sz w:val="22"/>
         </w:rPr>
-        <w:t>19</w:t>
+        <w:t>20</w:t>
       </w:r>
     </w:p>
     <w:p>
@@ -1488,13 +1488,13 @@
         <w:t xml:space="preserve">(Universidad Nacional del Comahue, 2025)</w:t>
       </w:r>
       <w:r>
-        <w:t xml:space="preserve">, el Reglamento de Carrera Docente (Ordenanza CS N° 0920/2019 y sus modificatorias)</w:t>
-      </w:r>
-      <w:r>
-        <w:t xml:space="preserve"> </w:t>
-      </w:r>
-      <w:r>
-        <w:t xml:space="preserve">(Universidad Nacional del Comahue, 2019)</w:t>
+        <w:t xml:space="preserve">, el Reglamento de Carrera Docente (Ordenanza CS N° 0910/1997 y modificatorias hasta la Ord. CS N° 0887/2021)</w:t>
+      </w:r>
+      <w:r>
+        <w:t xml:space="preserve"> </w:t>
+      </w:r>
+      <w:r>
+        <w:t xml:space="preserve">(Universidad Nacional del Comahue, 1997)</w:t>
       </w:r>
       <w:r>
         <w:t xml:space="preserve"> </w:t>
@@ -1992,13 +1992,13 @@
         <w:t xml:space="preserve"> </w:t>
       </w:r>
       <w:r>
-        <w:t xml:space="preserve">Grado de compatibilidad y armonización del circuito formativo 360° con la normativa universitaria vigente (Estatuto UNCo, Reglamento de Carrera Docente Ord. N° 0920/2019 y Convenio Colectivo de Trabajo Docente Dec. N° 1246/2015), garantizando su carácter complementario e independiente de las evaluaciones sumativas de permanencia</w:t>
-      </w:r>
-      <w:r>
-        <w:t xml:space="preserve"> </w:t>
-      </w:r>
-      <w:r>
-        <w:t xml:space="preserve">(Decreto N° 1246/2015. Convenio Colectivo de Trabajo para los Docentes de las Instituciones Universitarias Nacionales, 2015; Universidad Nacional del Comahue, 2025)</w:t>
+        <w:t xml:space="preserve">Grado de compatibilidad y armonización del circuito formativo 360° con la normativa universitaria vigente (Estatuto UNCo, Reglamento de Carrera Docente Ord. CS N° 0910/1997 y modificatorias, y Convenio Colectivo de Trabajo Docente Dec. N° 1246/2015), garantizando su carácter complementario e independiente de las evaluaciones sumativas de permanencia</w:t>
+      </w:r>
+      <w:r>
+        <w:t xml:space="preserve"> </w:t>
+      </w:r>
+      <w:r>
+        <w:t xml:space="preserve">(Decreto N° 1246/2015. Convenio Colectivo de Trabajo para los Docentes de las Instituciones Universitarias Nacionales, 2015; Universidad Nacional del Comahue, 1997, 2025)</w:t>
       </w:r>
       <w:r>
         <w:t xml:space="preserve">.</w:t>
@@ -2383,7 +2383,7 @@
         <w:t xml:space="preserve"> </w:t>
       </w:r>
       <w:r>
-        <w:t xml:space="preserve">Conocer si la autoevaluación y el intercambio reflexivo entre pares son valorados como un apoyo formativo para la Carrera Docente (Ord. CS N° 0920/2019 y modif.; CCT Docente, Dec. N° 1246/2015), disipando temores sobre el uso de la información.</w:t>
+        <w:t xml:space="preserve">Conocer si la autoevaluación y el intercambio reflexivo entre pares son valorados como un apoyo formativo para la Carrera Docente (Ord. CS N° 0910/1997 y modif.; CCT Docente, Dec. N° 1246/2015), disipando temores sobre el uso de la información.</w:t>
       </w:r>
     </w:p>
     <w:p>
@@ -2941,7 +2941,7 @@
                 <w:i/>
                 <w:iCs/>
               </w:rPr>
-              <w:t xml:space="preserve">Evaluación vigente y perfiles/funciones docentes según Estatuto y Ord. N° 0920/2019 y modificatorias</w:t>
+              <w:t xml:space="preserve">Evaluación vigente y perfiles/funciones docentes según Estatuto y Ord. CS N° 0910/1997 y modificatorias</w:t>
             </w:r>
             <w:r>
               <w:t xml:space="preserve">)</w:t>
@@ -2956,7 +2956,7 @@
               <w:jc w:val="left"/>
             </w:pPr>
             <w:r>
-              <w:t xml:space="preserve">Estatuto UNCo (Ord. N° 0988/2025), Ord. N° 0920/2019 (y modif.) y CCT Docente (Decreto N° 1246/2015) (Matriz de análisis documental)</w:t>
+              <w:t xml:space="preserve">Estatuto UNCo (Ord. CS N° 0988/2025), Ord. CS N° 0910/1997 (y modif.) y CCT Docente (Decreto N° 1246/2015) (Matriz de análisis documental)</w:t>
             </w:r>
           </w:p>
         </w:tc>
@@ -3636,7 +3636,7 @@
         <w:t xml:space="preserve"> </w:t>
       </w:r>
       <w:r>
-        <w:t xml:space="preserve">Vincula estrechamente los hallazgos de la evaluación docente con las oportunidades de aprendizaje continuo, capacitación pedagógica y carrera académica (Art. 65 de la Ord. CS N° 0920/2019). Desde la óptica de</w:t>
+        <w:t xml:space="preserve">Vincula estrechamente los hallazgos de la evaluación docente con las oportunidades de aprendizaje continuo, capacitación pedagógica y carrera académica (Art. 65 de la Ord. CS N° 0988/2025 y Ord. CS N° 0910/1997). Desde la óptica de</w:t>
       </w:r>
       <w:r>
         <w:t xml:space="preserve"> </w:t>
@@ -3975,7 +3975,6 @@
     </w:p>
     <w:p>
       <w:pPr>
-        <w:pStyle w:val="Compact"/>
         <w:numPr>
           <w:ilvl w:val="0"/>
           <w:numId w:val="1014"/>
@@ -4006,7 +4005,6 @@
     </w:p>
     <w:p>
       <w:pPr>
-        <w:pStyle w:val="Compact"/>
         <w:numPr>
           <w:ilvl w:val="0"/>
           <w:numId w:val="1014"/>
@@ -4023,13 +4021,13 @@
         <w:t xml:space="preserve"> </w:t>
       </w:r>
       <w:r>
-        <w:t xml:space="preserve">Normado por la Ordenanza CS N° 0920/2019 (y sus modificatorias)</w:t>
-      </w:r>
-      <w:r>
-        <w:t xml:space="preserve"> </w:t>
-      </w:r>
-      <w:r>
-        <w:t xml:space="preserve">(Universidad Nacional del Comahue, 2019)</w:t>
+        <w:t xml:space="preserve">Normado por la Ordenanza CS N° 0910/1997 (con sus normas modificatorias y complementarias hasta la Ord. CS N° 0887/2021)</w:t>
+      </w:r>
+      <w:r>
+        <w:t xml:space="preserve"> </w:t>
+      </w:r>
+      <w:r>
+        <w:t xml:space="preserve">(Universidad Nacional del Comahue, 1997)</w:t>
       </w:r>
       <w:r>
         <w:t xml:space="preserve">, que establece mecanismos estatutarios periódicos de evaluación de inserción y permanencia mediante informes anuales y jurados evaluadores cuatrienales externos.</w:t>
@@ -4037,7 +4035,6 @@
     </w:p>
     <w:p>
       <w:pPr>
-        <w:pStyle w:val="Compact"/>
         <w:numPr>
           <w:ilvl w:val="0"/>
           <w:numId w:val="1014"/>
@@ -4493,7 +4490,7 @@
         <w:pStyle w:val="FirstParagraph"/>
       </w:pPr>
       <w:r>
-        <w:t xml:space="preserve">En el plano regional y local patagónico, los antecedentes vinculados a la Universidad Nacional del Comahue y al Complejo Universitario Regional Zona Atlántica y Sur (CURZAS) permiten contextualizar la situación empírica de partida:</w:t>
+        <w:t xml:space="preserve">En el plano regional y local patagónico, los antecedentes normativos e institucionales vinculados a la Universidad Nacional del Comahue y al Complejo Universitario Regional Zona Atlántica y Sur (CURZAS) permiten delimitar con precisión empírica el estado de situación de partida:</w:t>
       </w:r>
     </w:p>
     <w:p>
@@ -4509,13 +4506,72 @@
           <w:b/>
           <w:bCs/>
         </w:rPr>
-        <w:t xml:space="preserve">Relevamiento documental e institucional del régimen de Carrera Docente en la UNCo (Ordenanza CS N° 0920/2019 y Estatuto Ord. CS N° 0988/2025):</w:t>
-      </w:r>
-      <w:r>
-        <w:t xml:space="preserve"> </w:t>
-      </w:r>
-      <w:r>
-        <w:t xml:space="preserve">Las actas y resoluciones del Consejo Superior y del Consejo Directivo del CURZAS revelan que, históricamente, los dos mecanismos estatutarios de evaluación docente vigentes en la institución —los informes anuales con encuestas de opinión estudiantil (Art. 74) y las comisiones evaluadoras cuatrienales con tribunales de pares externos y veedores estudiantiles (Art. 75)— cumplen de forma efectiva su propósito legal de control de la inserción y permanencia. Sin embargo, los claustros han señalado reiteradamente la carencia de dispositivos institucionales sistemáticos que transformen los resultados de dichas evaluaciones en devoluciones formativas individualizadas o en insumos directos para la planificación de los programas departamentales de capacitación docente (Art. 76).</w:t>
+        <w:t xml:space="preserve">Marco Estatutario Consolidado (Ordenanza CS N° 0988/2025 — Estatuto UNCo):</w:t>
+      </w:r>
+      <w:r>
+        <w:t xml:space="preserve"> </w:t>
+      </w:r>
+      <w:r>
+        <w:t xml:space="preserve">Aprobado por la Asamblea Universitaria como texto ordenado del Estatuto de la Universidad Nacional del Comahue</w:t>
+      </w:r>
+      <w:r>
+        <w:t xml:space="preserve"> </w:t>
+      </w:r>
+      <w:r>
+        <w:t xml:space="preserve">(Universidad Nacional del Comahue, 2025)</w:t>
+      </w:r>
+      <w:r>
+        <w:t xml:space="preserve">, este cuerpo normativo jerarquiza y define formalmente al CURZAS como Complejo Universitario Regional (Art. 17 y Disposición Transitoria Cuarta). En su Título X (</w:t>
+      </w:r>
+      <w:r>
+        <w:t xml:space="preserve">“De la Carrera Docente”</w:t>
+      </w:r>
+      <w:r>
+        <w:t xml:space="preserve">, Arts. 65 a 76), el Estatuto consolida el régimen integral de permanencia académica, articulando dos dispositivos evaluativos estatutarios:</w:t>
+      </w:r>
+    </w:p>
+    <w:p>
+      <w:pPr>
+        <w:pStyle w:val="Compact"/>
+        <w:numPr>
+          <w:ilvl w:val="1"/>
+          <w:numId w:val="1018"/>
+        </w:numPr>
+      </w:pPr>
+      <w:r>
+        <w:rPr>
+          <w:i/>
+          <w:iCs/>
+        </w:rPr>
+        <w:t xml:space="preserve">Informes Anuales de Cátedra (Art. 74):</w:t>
+      </w:r>
+      <w:r>
+        <w:t xml:space="preserve"> </w:t>
+      </w:r>
+      <w:r>
+        <w:t xml:space="preserve">Que comprenden la memoria de actividades, el plan de avance pedagógico, la opinión fundada de la Dirección del Departamento y los resultados de las encuestas estudiantiles obligatorias.</w:t>
+      </w:r>
+    </w:p>
+    <w:p>
+      <w:pPr>
+        <w:pStyle w:val="Compact"/>
+        <w:numPr>
+          <w:ilvl w:val="1"/>
+          <w:numId w:val="1018"/>
+        </w:numPr>
+      </w:pPr>
+      <w:r>
+        <w:rPr>
+          <w:i/>
+          <w:iCs/>
+        </w:rPr>
+        <w:t xml:space="preserve">Evaluaciones Periódicas Cuatrienales de Permanencia (Art. 75):</w:t>
+      </w:r>
+      <w:r>
+        <w:t xml:space="preserve"> </w:t>
+      </w:r>
+      <w:r>
+        <w:t xml:space="preserve">Llevadas a cabo por tribunales integrados por dos evaluadores externos de la disciplina y un veedor con voz y voto del claustro estudiantil (inc. a). Asimismo, el Art. 76 instituye la obligación departamental de formular programas anuales de formación y perfeccionamiento de recursos humanos docentes.</w:t>
       </w:r>
     </w:p>
     <w:p>
@@ -4531,13 +4587,65 @@
           <w:b/>
           <w:bCs/>
         </w:rPr>
-        <w:t xml:space="preserve">La experiencia de expansión territorial mediante la Red de Nodos Universitarios (2020–2026):</w:t>
-      </w:r>
-      <w:r>
-        <w:t xml:space="preserve"> </w:t>
-      </w:r>
-      <w:r>
-        <w:t xml:space="preserve">A nivel regional rionegrino, la puesta en marcha de los Nodos del CURZAS en localidades como Sierra Grande, Valcheta, Los Menucos y Ramos Mexía ha configurado un nuevo escenario de docencia híbrida que demanda competencias docentes específicas para la atención simultánea en sedes centrales y aulas virtuales remotas. No existen antecedentes empíricos locales que hayan explorado la factibilidad de implementar un modelo de retroalimentación multiactoral en este contexto geográfico particular, lo que refuerza la pertinencia del estudio situado.</w:t>
+        <w:t xml:space="preserve">Régimen General de Carrera Docente de la UNCo (Ordenanza CS N° 0910/1997 y modificatorias hasta la Ord. CS N° 0887/2021):</w:t>
+      </w:r>
+      <w:r>
+        <w:t xml:space="preserve"> </w:t>
+      </w:r>
+      <w:r>
+        <w:t xml:space="preserve">En el Digesto oficial de la universidad, el Reglamento de Carrera Docente</w:t>
+      </w:r>
+      <w:r>
+        <w:t xml:space="preserve"> </w:t>
+      </w:r>
+      <w:r>
+        <w:t xml:space="preserve">(Universidad Nacional del Comahue, 1997)</w:t>
+      </w:r>
+      <w:r>
+        <w:t xml:space="preserve"> </w:t>
+      </w:r>
+      <w:r>
+        <w:t xml:space="preserve">norma en su Capítulo III el procedimiento operativo para la presentación y valoración de informes docentes, encuestas estudiantiles y criterios de permanencia, en plena armonización con el Convenio Colectivo de Trabajo Docente Universitario (Decreto PEN N° 1246/2015)</w:t>
+      </w:r>
+      <w:r>
+        <w:t xml:space="preserve"> </w:t>
+      </w:r>
+      <w:r>
+        <w:t xml:space="preserve">(Decreto N° 1246/2015. Convenio Colectivo de Trabajo para los Docentes de las Instituciones Universitarias Nacionales, 2015)</w:t>
+      </w:r>
+      <w:r>
+        <w:t xml:space="preserve">. Los registros institucionales muestran que, si bien estos instrumentos garantizan con solidez jurídica el control administrativo y sumativo de la estabilidad laboral, persiste en los claustros una vacancia respecto a circuitos sistemáticos de retroalimentación formativa y confidencial que orienten la mejora continua del ejercicio docente.</w:t>
+      </w:r>
+    </w:p>
+    <w:p>
+      <w:pPr>
+        <w:pStyle w:val="Compact"/>
+        <w:numPr>
+          <w:ilvl w:val="0"/>
+          <w:numId w:val="1017"/>
+        </w:numPr>
+      </w:pPr>
+      <w:r>
+        <w:rPr>
+          <w:b/>
+          <w:bCs/>
+        </w:rPr>
+        <w:t xml:space="preserve">Expansión Territorial y Docencia Híbrida en la Red de Nodos del CURZAS (Resolución CD-CURZA N° 196/2022 y SIED UNCo):</w:t>
+      </w:r>
+      <w:r>
+        <w:t xml:space="preserve"> </w:t>
+      </w:r>
+      <w:r>
+        <w:t xml:space="preserve">En la escala regional de Río Negro, el Departamento de Administración Pública ha expandido su oferta académica mediante la Red de Nodos Universitarios en localidades de la Línea Sur y la Costa Atlántica rionegrina (Sierra Grande, Valcheta, Los Menucos y Ramos Mexía)</w:t>
+      </w:r>
+      <w:r>
+        <w:t xml:space="preserve"> </w:t>
+      </w:r>
+      <w:r>
+        <w:t xml:space="preserve">(Consejo Directivo del CURZAS, 2022, 2023)</w:t>
+      </w:r>
+      <w:r>
+        <w:t xml:space="preserve">. Esta configuración territorial se encuentra respaldada por la Resolución CD-CURZA N° 196/2022, que valida normativamente las mediaciones tecnológicas, la presencialidad sincrónica remota y las modalidades de enseñanza híbridas, articuladas con las directrices del Sistema Institucional de Educación a Distancia (SIED UNCo). Dicho escenario impone a los equipos de cátedra competencias didácticas específicas (tutoría virtual, diseño de materiales asincrónicos y acompañamiento mediado por TIC) que actualmente no son ponderadas de forma formativa ni multidireccional por los instrumentos de evaluación tradicionales, evidenciando la necesidad y factibilidad de un modelo 360° adaptado a entornos híbridos.</w:t>
       </w:r>
     </w:p>
     <w:bookmarkEnd w:id="43"/>
@@ -4637,7 +4745,7 @@
     <w:bookmarkEnd w:id="44"/>
     <w:bookmarkEnd w:id="45"/>
     <w:bookmarkEnd w:id="46"/>
-    <w:bookmarkStart w:id="69" w:name="referencias-bibliográficas"/>
+    <w:bookmarkStart w:id="73" w:name="referencias-bibliográficas"/>
     <w:p>
       <w:pPr>
         <w:pStyle w:val="Heading1"/>
@@ -4654,7 +4762,7 @@
         <w:t xml:space="preserve">Referencias Bibliográficas</w:t>
       </w:r>
     </w:p>
-    <w:bookmarkStart w:id="68" w:name="refs"/>
+    <w:bookmarkStart w:id="72" w:name="refs"/>
     <w:bookmarkStart w:id="47" w:name="ref-chiavenato2020"/>
     <w:p>
       <w:pPr>
@@ -4684,7 +4792,7 @@
       </w:r>
     </w:p>
     <w:bookmarkEnd w:id="47"/>
-    <w:bookmarkStart w:id="48" w:name="ref-uncocurzas2023"/>
+    <w:bookmarkStart w:id="49" w:name="ref-curza2022"/>
     <w:p>
       <w:pPr>
         <w:pStyle w:val="Bibliography"/>
@@ -4693,7 +4801,7 @@
         <w:jc w:val="left"/>
       </w:pPr>
       <w:r>
-        <w:t xml:space="preserve">Consejo Directivo del CURZAS. (2023).</w:t>
+        <w:t xml:space="preserve">Consejo Directivo del CURZAS. (2022).</w:t>
       </w:r>
       <w:r>
         <w:t xml:space="preserve"> </w:t>
@@ -4703,14 +4811,25 @@
           <w:i/>
           <w:iCs/>
         </w:rPr>
-        <w:t xml:space="preserve">Resolución CD-CURZAS N° 266/23: Reglamento de Trabajo Final de Graduación (TFG) para las carreras del Departamento de Administración Pública</w:t>
+        <w:t xml:space="preserve">Resolución CD-CURZA N° 196/2022: Pautas para mediaciones tecnológicas, presencialidad sincrónica remota y docencia híbrida en el marco del SIED UNCo</w:t>
       </w:r>
       <w:r>
         <w:t xml:space="preserve">. Universidad Nacional del Comahue.</w:t>
       </w:r>
-    </w:p>
-    <w:bookmarkEnd w:id="48"/>
-    <w:bookmarkStart w:id="50" w:name="ref-delagarza2001"/>
+      <w:r>
+        <w:t xml:space="preserve"> </w:t>
+      </w:r>
+      <w:hyperlink r:id="rId48">
+        <w:r>
+          <w:rPr>
+            <w:rStyle w:val="Hyperlink"/>
+          </w:rPr>
+          <w:t xml:space="preserve">https://web.curza.uncoma.edu.ar/educacion-distancia/nodos-curza-unco-region-sur</w:t>
+        </w:r>
+      </w:hyperlink>
+    </w:p>
+    <w:bookmarkEnd w:id="49"/>
+    <w:bookmarkStart w:id="50" w:name="ref-uncocurzas2023"/>
     <w:p>
       <w:pPr>
         <w:pStyle w:val="Bibliography"/>
@@ -4719,7 +4838,7 @@
         <w:jc w:val="left"/>
       </w:pPr>
       <w:r>
-        <w:t xml:space="preserve">De la Garza Toledo, E. (2001). La epistemología crítica y el concepto de configuración: Alternativas a la estructura y al sujeto.</w:t>
+        <w:t xml:space="preserve">Consejo Directivo del CURZAS. (2023).</w:t>
       </w:r>
       <w:r>
         <w:t xml:space="preserve"> </w:t>
@@ -4729,10 +4848,23 @@
           <w:i/>
           <w:iCs/>
         </w:rPr>
-        <w:t xml:space="preserve">Revista Mexicana de Sociología</w:t>
-      </w:r>
-      <w:r>
-        <w:t xml:space="preserve">,</w:t>
+        <w:t xml:space="preserve">Resolución CD-CURZAS N° 266/2023: Reglamento de Trabajo Final de Graduación (TFG) para las carreras del Departamento de Administración Pública</w:t>
+      </w:r>
+      <w:r>
+        <w:t xml:space="preserve">. Universidad Nacional del Comahue.</w:t>
+      </w:r>
+    </w:p>
+    <w:bookmarkEnd w:id="50"/>
+    <w:bookmarkStart w:id="52" w:name="ref-delagarza2001"/>
+    <w:p>
+      <w:pPr>
+        <w:pStyle w:val="Bibliography"/>
+        <w:spacing w:after="120"/>
+        <w:ind w:left="720" w:hanging="720"/>
+        <w:jc w:val="left"/>
+      </w:pPr>
+      <w:r>
+        <w:t xml:space="preserve">De la Garza Toledo, E. (2001). La epistemología crítica y el concepto de configuración: Alternativas a la estructura y al sujeto.</w:t>
       </w:r>
       <w:r>
         <w:t xml:space="preserve"> </w:t>
@@ -4742,6 +4874,19 @@
           <w:i/>
           <w:iCs/>
         </w:rPr>
+        <w:t xml:space="preserve">Revista Mexicana de Sociología</w:t>
+      </w:r>
+      <w:r>
+        <w:t xml:space="preserve">,</w:t>
+      </w:r>
+      <w:r>
+        <w:t xml:space="preserve"> </w:t>
+      </w:r>
+      <w:r>
+        <w:rPr>
+          <w:i/>
+          <w:iCs/>
+        </w:rPr>
         <w:t xml:space="preserve">63</w:t>
       </w:r>
       <w:r>
@@ -4750,7 +4895,7 @@
       <w:r>
         <w:t xml:space="preserve"> </w:t>
       </w:r>
-      <w:hyperlink r:id="rId49">
+      <w:hyperlink r:id="rId51">
         <w:r>
           <w:rPr>
             <w:rStyle w:val="Hyperlink"/>
@@ -4759,8 +4904,8 @@
         </w:r>
       </w:hyperlink>
     </w:p>
-    <w:bookmarkEnd w:id="50"/>
-    <w:bookmarkStart w:id="51" w:name="ref-pen2015"/>
+    <w:bookmarkEnd w:id="52"/>
+    <w:bookmarkStart w:id="53" w:name="ref-pen2015"/>
     <w:p>
       <w:pPr>
         <w:pStyle w:val="Bibliography"/>
@@ -4772,8 +4917,8 @@
         <w:t xml:space="preserve">Decreto N° 1246/2015. Convenio Colectivo de Trabajo para los Docentes de las Instituciones Universitarias Nacionales (2015).</w:t>
       </w:r>
     </w:p>
-    <w:bookmarkEnd w:id="51"/>
-    <w:bookmarkStart w:id="52" w:name="ref-jimenez2008"/>
+    <w:bookmarkEnd w:id="53"/>
+    <w:bookmarkStart w:id="54" w:name="ref-jimenez2008"/>
     <w:p>
       <w:pPr>
         <w:pStyle w:val="Bibliography"/>
@@ -4801,8 +4946,8 @@
         <w:t xml:space="preserve">(pp. 27-42). Universidad Pedagógica Nacional / CLACSO.</w:t>
       </w:r>
     </w:p>
-    <w:bookmarkEnd w:id="52"/>
-    <w:bookmarkStart w:id="53" w:name="ref-lepsinger2009"/>
+    <w:bookmarkEnd w:id="54"/>
+    <w:bookmarkStart w:id="55" w:name="ref-lepsinger2009"/>
     <w:p>
       <w:pPr>
         <w:pStyle w:val="Bibliography"/>
@@ -4830,8 +4975,8 @@
         <w:t xml:space="preserve">(2.ª ed.). Pfeiffer.</w:t>
       </w:r>
     </w:p>
-    <w:bookmarkEnd w:id="53"/>
-    <w:bookmarkStart w:id="54" w:name="ref-ministerio1995"/>
+    <w:bookmarkEnd w:id="55"/>
+    <w:bookmarkStart w:id="56" w:name="ref-ministerio1995"/>
     <w:p>
       <w:pPr>
         <w:pStyle w:val="Bibliography"/>
@@ -4843,8 +4988,8 @@
         <w:t xml:space="preserve">Ley N° 24.521 de Educación Superior (1995).</w:t>
       </w:r>
     </w:p>
-    <w:bookmarkEnd w:id="54"/>
-    <w:bookmarkStart w:id="55" w:name="ref-longo2006"/>
+    <w:bookmarkEnd w:id="56"/>
+    <w:bookmarkStart w:id="57" w:name="ref-longo2006"/>
     <w:p>
       <w:pPr>
         <w:pStyle w:val="Bibliography"/>
@@ -4869,8 +5014,8 @@
         <w:t xml:space="preserve">. Paidós.</w:t>
       </w:r>
     </w:p>
-    <w:bookmarkEnd w:id="55"/>
-    <w:bookmarkStart w:id="56" w:name="ref-matus1993"/>
+    <w:bookmarkEnd w:id="57"/>
+    <w:bookmarkStart w:id="58" w:name="ref-matus1993"/>
     <w:p>
       <w:pPr>
         <w:pStyle w:val="Bibliography"/>
@@ -4895,8 +5040,8 @@
         <w:t xml:space="preserve">. Fundación ALTIDIR.</w:t>
       </w:r>
     </w:p>
-    <w:bookmarkEnd w:id="56"/>
-    <w:bookmarkStart w:id="58" w:name="ref-obando2014"/>
+    <w:bookmarkEnd w:id="58"/>
+    <w:bookmarkStart w:id="60" w:name="ref-obando2014"/>
     <w:p>
       <w:pPr>
         <w:pStyle w:val="Bibliography"/>
@@ -4936,7 +5081,7 @@
       <w:r>
         <w:t xml:space="preserve"> </w:t>
       </w:r>
-      <w:hyperlink r:id="rId57">
+      <w:hyperlink r:id="rId59">
         <w:r>
           <w:rPr>
             <w:rStyle w:val="Hyperlink"/>
@@ -4945,8 +5090,8 @@
         </w:r>
       </w:hyperlink>
     </w:p>
-    <w:bookmarkEnd w:id="58"/>
-    <w:bookmarkStart w:id="59" w:name="ref-oszlak2020"/>
+    <w:bookmarkEnd w:id="60"/>
+    <w:bookmarkStart w:id="61" w:name="ref-oszlak2020"/>
     <w:p>
       <w:pPr>
         <w:pStyle w:val="Bibliography"/>
@@ -4971,8 +5116,8 @@
         <w:t xml:space="preserve">. Instituto Nacional de la Administración Pública.</w:t>
       </w:r>
     </w:p>
-    <w:bookmarkEnd w:id="59"/>
-    <w:bookmarkStart w:id="60" w:name="ref-sautu2005"/>
+    <w:bookmarkEnd w:id="61"/>
+    <w:bookmarkStart w:id="62" w:name="ref-sautu2005"/>
     <w:p>
       <w:pPr>
         <w:pStyle w:val="Bibliography"/>
@@ -4997,8 +5142,8 @@
         <w:t xml:space="preserve">. Lumiere.</w:t>
       </w:r>
     </w:p>
-    <w:bookmarkEnd w:id="60"/>
-    <w:bookmarkStart w:id="62" w:name="ref-sifuentes2016"/>
+    <w:bookmarkEnd w:id="62"/>
+    <w:bookmarkStart w:id="64" w:name="ref-sifuentes2016"/>
     <w:p>
       <w:pPr>
         <w:pStyle w:val="Bibliography"/>
@@ -5038,7 +5183,7 @@
       <w:r>
         <w:t xml:space="preserve"> </w:t>
       </w:r>
-      <w:hyperlink r:id="rId61">
+      <w:hyperlink r:id="rId63">
         <w:r>
           <w:rPr>
             <w:rStyle w:val="Hyperlink"/>
@@ -5047,8 +5192,8 @@
         </w:r>
       </w:hyperlink>
     </w:p>
-    <w:bookmarkEnd w:id="62"/>
-    <w:bookmarkStart w:id="64" w:name="ref-torraco2016"/>
+    <w:bookmarkEnd w:id="64"/>
+    <w:bookmarkStart w:id="66" w:name="ref-torraco2016"/>
     <w:p>
       <w:pPr>
         <w:pStyle w:val="Bibliography"/>
@@ -5088,7 +5233,7 @@
       <w:r>
         <w:t xml:space="preserve"> </w:t>
       </w:r>
-      <w:hyperlink r:id="rId63">
+      <w:hyperlink r:id="rId65">
         <w:r>
           <w:rPr>
             <w:rStyle w:val="Hyperlink"/>
@@ -5097,8 +5242,8 @@
         </w:r>
       </w:hyperlink>
     </w:p>
-    <w:bookmarkEnd w:id="64"/>
-    <w:bookmarkStart w:id="65" w:name="ref-unco2019"/>
+    <w:bookmarkEnd w:id="66"/>
+    <w:bookmarkStart w:id="68" w:name="ref-unco1997"/>
     <w:p>
       <w:pPr>
         <w:pStyle w:val="Bibliography"/>
@@ -5107,7 +5252,7 @@
         <w:jc w:val="left"/>
       </w:pPr>
       <w:r>
-        <w:t xml:space="preserve">Universidad Nacional del Comahue. (2019).</w:t>
+        <w:t xml:space="preserve">Universidad Nacional del Comahue. (1997).</w:t>
       </w:r>
       <w:r>
         <w:t xml:space="preserve"> </w:t>
@@ -5117,14 +5262,25 @@
           <w:i/>
           <w:iCs/>
         </w:rPr>
-        <w:t xml:space="preserve">Ordenanza N° 0920/2019: Reglamento de Carrera Docente</w:t>
+        <w:t xml:space="preserve">Ordenanza CS N° 0910/1997: Reglamento de Carrera Docente</w:t>
       </w:r>
       <w:r>
         <w:t xml:space="preserve">.</w:t>
       </w:r>
-    </w:p>
-    <w:bookmarkEnd w:id="65"/>
-    <w:bookmarkStart w:id="66" w:name="ref-unco2025"/>
+      <w:r>
+        <w:t xml:space="preserve"> </w:t>
+      </w:r>
+      <w:hyperlink r:id="rId67">
+        <w:r>
+          <w:rPr>
+            <w:rStyle w:val="Hyperlink"/>
+          </w:rPr>
+          <w:t xml:space="preserve">https://fatu-uncoma.com.ar/fatu/wp-content/uploads/2024/03/0910-1997-Reglamento-de-carrera-docente.pdf</w:t>
+        </w:r>
+      </w:hyperlink>
+    </w:p>
+    <w:bookmarkEnd w:id="68"/>
+    <w:bookmarkStart w:id="70" w:name="ref-unco2025"/>
     <w:p>
       <w:pPr>
         <w:pStyle w:val="Bibliography"/>
@@ -5143,14 +5299,25 @@
           <w:i/>
           <w:iCs/>
         </w:rPr>
-        <w:t xml:space="preserve">Ordenanza N° 0988/2025: Texto ordenado del Estatuto de la Universidad Nacional del Comahue</w:t>
+        <w:t xml:space="preserve">Ordenanza CS N° 0988/2025: Texto ordenado del Estatuto de la Universidad Nacional del Comahue (Título X: De la Carrera Docente)</w:t>
       </w:r>
       <w:r>
         <w:t xml:space="preserve">.</w:t>
       </w:r>
-    </w:p>
-    <w:bookmarkEnd w:id="66"/>
-    <w:bookmarkStart w:id="67" w:name="ref-wainerman2011"/>
+      <w:r>
+        <w:t xml:space="preserve"> </w:t>
+      </w:r>
+      <w:hyperlink r:id="rId69">
+        <w:r>
+          <w:rPr>
+            <w:rStyle w:val="Hyperlink"/>
+          </w:rPr>
+          <w:t xml:space="preserve">https://academica.uncoma.edu.ar/wp-content/uploads/2025/08/ord_988_2025_55.pdf</w:t>
+        </w:r>
+      </w:hyperlink>
+    </w:p>
+    <w:bookmarkEnd w:id="70"/>
+    <w:bookmarkStart w:id="71" w:name="ref-wainerman2011"/>
     <w:p>
       <w:pPr>
         <w:pStyle w:val="Bibliography"/>
@@ -5178,9 +5345,9 @@
         <w:t xml:space="preserve">(4.ª ed.). Manantial.</w:t>
       </w:r>
     </w:p>
-    <w:bookmarkEnd w:id="67"/>
-    <w:bookmarkEnd w:id="68"/>
-    <w:bookmarkEnd w:id="69"/>
+    <w:bookmarkEnd w:id="71"/>
+    <w:bookmarkEnd w:id="72"/>
+    <w:bookmarkEnd w:id="73"/>
     <w:sectPr>
       <w:footerReference w:type="default" r:id="rId11"/>
       <w:footnotePr>
@@ -5667,6 +5834,36 @@
   </w:num>
   <w:num w:numId="1017">
     <w:abstractNumId w:val="991"/>
+  </w:num>
+  <w:num w:numId="1018">
+    <w:abstractNumId w:val="99411"/>
+    <w:lvlOverride w:ilvl="0">
+      <w:startOverride w:val="1"/>
+    </w:lvlOverride>
+    <w:lvlOverride w:ilvl="1">
+      <w:startOverride w:val="1"/>
+    </w:lvlOverride>
+    <w:lvlOverride w:ilvl="2">
+      <w:startOverride w:val="1"/>
+    </w:lvlOverride>
+    <w:lvlOverride w:ilvl="3">
+      <w:startOverride w:val="1"/>
+    </w:lvlOverride>
+    <w:lvlOverride w:ilvl="4">
+      <w:startOverride w:val="1"/>
+    </w:lvlOverride>
+    <w:lvlOverride w:ilvl="5">
+      <w:startOverride w:val="1"/>
+    </w:lvlOverride>
+    <w:lvlOverride w:ilvl="6">
+      <w:startOverride w:val="1"/>
+    </w:lvlOverride>
+    <w:lvlOverride w:ilvl="7">
+      <w:startOverride w:val="1"/>
+    </w:lvlOverride>
+    <w:lvlOverride w:ilvl="8">
+      <w:startOverride w:val="1"/>
+    </w:lvlOverride>
   </w:num>
 </w:numbering>
 </file>

</xml_diff>

<commit_message>
fix(actividad-3): reubicar figura de subsistemas de longo en pagina 1 y compactar indice
- Ajustar dimensionamiento de la figura de Longo (2006) al 52% para ocupar el pie de la pagina 1 del desarrollo.
- Compactar indice de contenidos en una unica hoja completa (pagina 2).
- Recompilar PDF (23 pags) y Word DOCX manteniendo sincronizacion total.
</commit_message>
<xml_diff>
--- a/Entregas/Actividad 3/TP3_Ayarachi_Fuentes.docx
+++ b/Entregas/Actividad 3/TP3_Ayarachi_Fuentes.docx
@@ -393,7 +393,7 @@
           <w:rFonts w:ascii="Arial" w:hAnsi="Arial"/>
           <w:sz w:val="22"/>
         </w:rPr>
-        <w:t>4</w:t>
+        <w:t>3</w:t>
       </w:r>
     </w:p>
     <w:p>
@@ -420,7 +420,7 @@
           <w:rFonts w:ascii="Arial" w:hAnsi="Arial"/>
           <w:sz w:val="22"/>
         </w:rPr>
-        <w:t>4</w:t>
+        <w:t>3</w:t>
       </w:r>
     </w:p>
     <w:p>
@@ -447,7 +447,7 @@
           <w:rFonts w:ascii="Arial" w:hAnsi="Arial"/>
           <w:sz w:val="22"/>
         </w:rPr>
-        <w:t>5</w:t>
+        <w:t>4</w:t>
       </w:r>
     </w:p>
     <w:p>
@@ -555,7 +555,7 @@
           <w:rFonts w:ascii="Arial" w:hAnsi="Arial"/>
           <w:sz w:val="22"/>
         </w:rPr>
-        <w:t>7</w:t>
+        <w:t>6</w:t>
       </w:r>
     </w:p>
     <w:p>
@@ -609,7 +609,7 @@
           <w:rFonts w:ascii="Arial" w:hAnsi="Arial"/>
           <w:sz w:val="22"/>
         </w:rPr>
-        <w:t>8</w:t>
+        <w:t>7</w:t>
       </w:r>
     </w:p>
     <w:p>
@@ -636,7 +636,7 @@
           <w:rFonts w:ascii="Arial" w:hAnsi="Arial"/>
           <w:sz w:val="22"/>
         </w:rPr>
-        <w:t>8</w:t>
+        <w:t>7</w:t>
       </w:r>
     </w:p>
     <w:p>
@@ -717,7 +717,7 @@
           <w:rFonts w:ascii="Arial" w:hAnsi="Arial"/>
           <w:sz w:val="22"/>
         </w:rPr>
-        <w:t>9</w:t>
+        <w:t>8</w:t>
       </w:r>
     </w:p>
     <w:p>
@@ -744,7 +744,7 @@
           <w:rFonts w:ascii="Arial" w:hAnsi="Arial"/>
           <w:sz w:val="22"/>
         </w:rPr>
-        <w:t>9</w:t>
+        <w:t>8</w:t>
       </w:r>
     </w:p>
     <w:p>
@@ -771,7 +771,7 @@
           <w:rFonts w:ascii="Arial" w:hAnsi="Arial"/>
           <w:sz w:val="22"/>
         </w:rPr>
-        <w:t>9</w:t>
+        <w:t>8</w:t>
       </w:r>
     </w:p>
     <w:p>
@@ -1292,7 +1292,7 @@
       <w:r>
         <w:drawing>
           <wp:inline>
-            <wp:extent cx="3733800" cy="2893695"/>
+            <wp:extent cx="2773680" cy="2149602"/>
             <wp:effectExtent b="0" l="0" r="0" t="0"/>
             <wp:docPr descr="Subsistemas de la Gestión de Recursos Humanos en el Sector Público (Longo, 2006)." title="" id="14" name="Picture"/>
             <a:graphic>
@@ -1322,7 +1322,7 @@
                   <pic:spPr bwMode="auto">
                     <a:xfrm>
                       <a:off x="0" y="0"/>
-                      <a:ext cx="3733800" cy="2893695"/>
+                      <a:ext cx="2773680" cy="2149602"/>
                     </a:xfrm>
                     <a:prstGeom prst="rect">
                       <a:avLst/>

</xml_diff>

<commit_message>
feat: add TP3 research project Quarto document, generated PDF/DOCX outputs, and update compiler script
</commit_message>
<xml_diff>
--- a/Entregas/Actividad 3/TP3_Ayarachi_Fuentes.docx
+++ b/Entregas/Actividad 3/TP3_Ayarachi_Fuentes.docx
@@ -555,7 +555,7 @@
           <w:rFonts w:ascii="Arial" w:hAnsi="Arial"/>
           <w:sz w:val="22"/>
         </w:rPr>
-        <w:t>6</w:t>
+        <w:t>7</w:t>
       </w:r>
     </w:p>
     <w:p>
@@ -965,6 +965,60 @@
     </w:p>
     <w:p>
       <w:pPr>
+        <w:pStyle w:val="TOC3"/>
+        <w:tabs>
+          <w:tab w:val="right" w:leader="dot" w:pos="9026"/>
+        </w:tabs>
+        <w:ind w:left="840"/>
+        <w:spacing w:after="60"/>
+      </w:pPr>
+      <w:r>
+        <w:rPr>
+          <w:rFonts w:ascii="Arial" w:hAnsi="Arial"/>
+          <w:sz w:val="22"/>
+        </w:rPr>
+        <w:t>Precisión Categorial: "Claustro" como Categoría Normativa versus "Actores Institucionales" como Categoría Analítica</w:t>
+      </w:r>
+      <w:r>
+        <w:tab/>
+      </w:r>
+      <w:r>
+        <w:rPr>
+          <w:rFonts w:ascii="Arial" w:hAnsi="Arial"/>
+          <w:sz w:val="22"/>
+        </w:rPr>
+        <w:t>15</w:t>
+      </w:r>
+    </w:p>
+    <w:p>
+      <w:pPr>
+        <w:pStyle w:val="TOC3"/>
+        <w:tabs>
+          <w:tab w:val="right" w:leader="dot" w:pos="9026"/>
+        </w:tabs>
+        <w:ind w:left="840"/>
+        <w:spacing w:after="60"/>
+      </w:pPr>
+      <w:r>
+        <w:rPr>
+          <w:rFonts w:ascii="Arial" w:hAnsi="Arial"/>
+          <w:sz w:val="22"/>
+        </w:rPr>
+        <w:t>Condiciones de Viabilidad como Hipótesis de Indagación Abierta</w:t>
+      </w:r>
+      <w:r>
+        <w:tab/>
+      </w:r>
+      <w:r>
+        <w:rPr>
+          <w:rFonts w:ascii="Arial" w:hAnsi="Arial"/>
+          <w:sz w:val="22"/>
+        </w:rPr>
+        <w:t>16</w:t>
+      </w:r>
+    </w:p>
+    <w:p>
+      <w:pPr>
         <w:pStyle w:val="TOC2"/>
         <w:tabs>
           <w:tab w:val="right" w:leader="dot" w:pos="9026"/>
@@ -987,7 +1041,7 @@
           <w:rFonts w:ascii="Arial" w:hAnsi="Arial"/>
           <w:sz w:val="22"/>
         </w:rPr>
-        <w:t>15</w:t>
+        <w:t>16</w:t>
       </w:r>
     </w:p>
     <w:p>
@@ -1014,7 +1068,7 @@
           <w:rFonts w:ascii="Arial" w:hAnsi="Arial"/>
           <w:sz w:val="22"/>
         </w:rPr>
-        <w:t>15</w:t>
+        <w:t>17</w:t>
       </w:r>
     </w:p>
     <w:p>
@@ -1041,7 +1095,7 @@
           <w:rFonts w:ascii="Arial" w:hAnsi="Arial"/>
           <w:sz w:val="22"/>
         </w:rPr>
-        <w:t>16</w:t>
+        <w:t>18</w:t>
       </w:r>
     </w:p>
     <w:p>
@@ -1068,7 +1122,7 @@
           <w:rFonts w:ascii="Arial" w:hAnsi="Arial"/>
           <w:sz w:val="22"/>
         </w:rPr>
-        <w:t>17</w:t>
+        <w:t>19</w:t>
       </w:r>
     </w:p>
     <w:p>
@@ -1095,7 +1149,7 @@
           <w:rFonts w:ascii="Arial" w:hAnsi="Arial"/>
           <w:sz w:val="22"/>
         </w:rPr>
-        <w:t>18</w:t>
+        <w:t>20</w:t>
       </w:r>
     </w:p>
     <w:p>
@@ -1122,7 +1176,7 @@
           <w:rFonts w:ascii="Arial" w:hAnsi="Arial"/>
           <w:sz w:val="22"/>
         </w:rPr>
-        <w:t>20</w:t>
+        <w:t>21</w:t>
       </w:r>
     </w:p>
     <w:p>
@@ -1646,7 +1700,7 @@
         <w:pStyle w:val="BodyText"/>
       </w:pPr>
       <w:r>
-        <w:t xml:space="preserve">En una universidad pública cogobernada, es indispensable diferenciar la evaluación orientada a la mejora pedagógica de aquella vinculada a decisiones laborales sumativas. Dado que el Estatuto sanciona que dos evaluaciones cuatrienales consecutivas negativas determinan la vacancia del cargo y llamado a concurso público —continuando el o la docente en funciones hasta la cobertura por concurso— (Art. 75, inc. c), existe una comprensible prevención docente frente a controles auditadores. Si bien la normativa vigente ya contempla la opinión del Director del Departamento en los informes anuales del legajo académico (Art. 74), la singularidad y valor añadido de este proyecto radica en analizar la factibilidad de un circuito de retroalimentación 360° estrictamente formativo, confidencial e independiente del legajo sumativo.</w:t>
+        <w:t xml:space="preserve">En una universidad pública cogobernada, es indispensable diferenciar la evaluación orientada a la mejora pedagógica de aquella vinculada a decisiones laborales sumativas. Dado que el Estatuto sanciona que dos evaluaciones cuatrienales consecutivas negativas determinan la vacancia del cargo y llamado a concurso público —continuando el o la docente en funciones hasta la cobertura por concurso— (Art. 75, inc. c), existe una comprensible prevención docente frente a controles auditadores. Si bien la normativa vigente ya contempla la opinión de la Dirección del Departamento en los informes anuales del legajo académico (Art. 74), la singularidad de este proyecto radica en analizar la factibilidad de un circuito de retroalimentación 360° que se plantea, como hipótesis de diseño preliminar, bajo un carácter formativo, confidencial e independiente del legajo sumativo.</w:t>
       </w:r>
     </w:p>
     <w:p>
@@ -1654,7 +1708,7 @@
         <w:pStyle w:val="BodyText"/>
       </w:pPr>
       <w:r>
-        <w:t xml:space="preserve">Dicho dispositivo busca articular los insumos de los claustros (docentes y estudiantes) y de la Dirección del Departamento —elegida por quienes integran el departamento por un período de dos años (Art. 14)— para alimentar de forma directa el Programa Anual de Formación de Recursos Humanos del Departamento (Art. 76) y el perfeccionamiento continuo de la Carrera Docente (Art. 65). Por ello, la viabilidad de la propuesta descansa en la gobernanza universitaria: un espacio colegiado donde las políticas de gestión de personas se construyen sobre</w:t>
+        <w:t xml:space="preserve">Dicho dispositivo buscaría articular las valoraciones de los diversos actores institucionales (cuerpo docente y comunidad estudiantil) y de la Dirección del Departamento —elegida por los integrantes del departamento por un período de dos años (Art. 14)— para alimentar de forma directa el Programa Anual de Formación de Recursos Humanos del Departamento (Art. 76) y el perfeccionamiento continuo de la Carrera Docente (Art. 65). En este marco, la investigación propone indagar de qué modo la gobernanza universitaria —entendida como un espacio colegiado donde las decisiones se construyen sobre</w:t>
       </w:r>
       <w:r>
         <w:t xml:space="preserve"> </w:t>
@@ -1673,7 +1727,7 @@
         <w:t xml:space="preserve">(Longo, 2006; Matus, 1993)</w:t>
       </w:r>
       <w:r>
-        <w:t xml:space="preserve">.</w:t>
+        <w:t xml:space="preserve">, incide sobre las posibilidades reales de consensuar y legitimar este tipo de dispositivos formativos.</w:t>
       </w:r>
     </w:p>
     <w:bookmarkEnd w:id="19"/>
@@ -2187,7 +2241,7 @@
         <w:t xml:space="preserve"> </w:t>
       </w:r>
       <w:r>
-        <w:t xml:space="preserve">Cuando los claustros expresan predisposición al modelo, existen plataformas técnicas accesibles, no se identifican barreras estatutarias insalvables y prevalece un clima de confianza para la retroalimentación formativa.</w:t>
+        <w:t xml:space="preserve">Cuando los actores institucionales involucrados (docentes y estudiantes) expresan apertura y predisposición hacia el modelo, existen plataformas técnicas accesibles, no se identifican barreras estatutarias insalvables y prevalece un clima de confianza para la retroalimentación formativa.</w:t>
       </w:r>
     </w:p>
     <w:p>
@@ -2209,7 +2263,7 @@
         <w:t xml:space="preserve"> </w:t>
       </w:r>
       <w:r>
-        <w:t xml:space="preserve">Cuando el modelo es valorado favorablemente en sus fines pero se detectan obstáculos subsanables (por ejemplo, desconfianza sobre la confidencialidad, sobrecarga administrativa o necesidad de acuerdos paritarios específicos que delimiten con precisión el carácter no punitivo del dispositivo).</w:t>
+        <w:t xml:space="preserve">Cuando el modelo es valorado favorablemente en sus fines pero se detectan obstáculos subsanables (por ejemplo, reparos sobre la confidencialidad, sobrecarga administrativa o necesidad de acuerdos paritarios específicos que delimiten con precisión el carácter no punitivo del dispositivo).</w:t>
       </w:r>
     </w:p>
     <w:p>
@@ -2231,7 +2285,7 @@
         <w:t xml:space="preserve"> </w:t>
       </w:r>
       <w:r>
-        <w:t xml:space="preserve">Cuando predominan resistencias generalizadas, desconfianza interclaustro profunda o incompatibilidades normativas rígidas que desaconsejan una aplicación generalizada a corto plazo, sugiriendo la necesidad previa de fortalecer la cultura evaluativa institucional.</w:t>
+        <w:t xml:space="preserve">Cuando predominan resistencias generalizadas, desconfianza profunda entre los distintos actores de la comunidad académica o incompatibilidades normativas rígidas que desaconsejan una aplicación generalizada a corto plazo, sugiriendo la necesidad previa de fortalecer la cultura evaluativa institucional.</w:t>
       </w:r>
     </w:p>
     <w:bookmarkEnd w:id="23"/>
@@ -2361,7 +2415,7 @@
         <w:pStyle w:val="FirstParagraph"/>
       </w:pPr>
       <w:r>
-        <w:t xml:space="preserve">A nivel institucional, el Departamento de Administración Pública del CURZAS se beneficiará de un diagnóstico riguroso sobre las expectativas y percepciones de sus claustros respecto a la evaluación docente. En un contexto de restricciones presupuestarias y expansión hacia nodos territoriales, fortalecer la calidad de la enseñanza a través de retroalimentación continua redunda en mejores trayectorias académicas para los estudiantes y en la legitimación del rol social de la universidad pública en la comunidad rionegrina. Asimismo, permite:</w:t>
+        <w:t xml:space="preserve">A nivel institucional, el Departamento de Administración Pública del CURZAS se beneficiará de un diagnóstico riguroso sobre las expectativas y representaciones de sus actores institucionales respecto a la evaluación docente. En un contexto de restricciones presupuestarias y expansión hacia nodos territoriales, fortalecer la calidad de la enseñanza a través de retroalimentación continua redunda en mejores trayectorias académicas para los estudiantes y en la legitimación del rol social de la universidad pública en la comunidad rionegrina. Asimismo, permite:</w:t>
       </w:r>
     </w:p>
     <w:p>
@@ -2399,7 +2453,7 @@
           <w:i/>
           <w:iCs/>
         </w:rPr>
-        <w:t xml:space="preserve">Claustro estudiantil:</w:t>
+        <w:t xml:space="preserve">Comunidad estudiantil:</w:t>
       </w:r>
       <w:r>
         <w:t xml:space="preserve"> </w:t>
@@ -2542,7 +2596,7 @@
         </w:numPr>
       </w:pPr>
       <w:r>
-        <w:t xml:space="preserve">Explorar las percepciones, disposiciones y expectativas de los distintos claustros involucrados (docentes y estudiantes) y de las autoridades departamentales respecto a la retroalimentación multiactoral (360°) y las condiciones de confianza institucional requeridas.</w:t>
+        <w:t xml:space="preserve">Explorar las percepciones, disposiciones y representaciones de los diversos actores institucionales involucrados (docentes y estudiantes) y de las autoridades departamentales respecto a la retroalimentación multiactoral (360°) y las condiciones de confianza institucional requeridas.</w:t>
       </w:r>
     </w:p>
     <w:p>
@@ -2692,7 +2746,7 @@
         <w:t xml:space="preserve"> </w:t>
       </w:r>
       <w:r>
-        <w:t xml:space="preserve">indaga el clima laboral, la confianza interclaustros y los acuerdos paritarios indispensables para legitimar la coevaluación y disipar temores al control punitivo.</w:t>
+        <w:t xml:space="preserve">indaga el clima laboral, la confianza intersubjetiva entre los actores institucionales y los acuerdos paritarios indispensables para legitimar la coevaluación y disipar temores al control punitivo.</w:t>
       </w:r>
     </w:p>
     <w:p>
@@ -2872,7 +2926,7 @@
               <w:jc w:val="left"/>
             </w:pPr>
             <w:r>
-              <w:t xml:space="preserve">Claustros y autoridades del Departamento de Administración Pública (CURZAS-UNCo)</w:t>
+              <w:t xml:space="preserve">Actores institucionales (docentes y estudiantes) y autoridades del Departamento de Administración Pública (CURZAS-UNCo)</w:t>
             </w:r>
           </w:p>
         </w:tc>
@@ -3025,7 +3079,7 @@
                 <w:i/>
                 <w:iCs/>
               </w:rPr>
-              <w:t xml:space="preserve">Cultura participativa, clima laboral y diálogo interclaustro</w:t>
+              <w:t xml:space="preserve">Cultura participativa, clima laboral y diálogo entre actores institucionales</w:t>
             </w:r>
             <w:r>
               <w:t xml:space="preserve">)</w:t>
@@ -3240,7 +3294,7 @@
     <w:bookmarkEnd w:id="33"/>
     <w:bookmarkEnd w:id="34"/>
     <w:bookmarkEnd w:id="35"/>
-    <w:bookmarkStart w:id="46" w:name="Xef007dd282ae18f13df7a545a4430773f008bd7"/>
+    <w:bookmarkStart w:id="48" w:name="Xef007dd282ae18f13df7a545a4430773f008bd7"/>
     <w:p>
       <w:pPr>
         <w:pStyle w:val="Heading1"/>
@@ -3256,7 +3310,7 @@
         <w:t xml:space="preserve">Segunda parte de la estructura del Proyecto de investigación de TFG</w:t>
       </w:r>
     </w:p>
-    <w:bookmarkStart w:id="40" w:name="X26fd7edd3045b8a76e95745d23dedb33f2c164e"/>
+    <w:bookmarkStart w:id="42" w:name="X26fd7edd3045b8a76e95745d23dedb33f2c164e"/>
     <w:p>
       <w:pPr>
         <w:pStyle w:val="Heading2"/>
@@ -3667,7 +3721,7 @@
         <w:t xml:space="preserve"> </w:t>
       </w:r>
       <w:r>
-        <w:t xml:space="preserve">Examina el clima institucional, la confianza intersubjetiva entre los claustros y los canales de diálogo paritario docente. En las organizaciones públicas y cogobernadas, la evaluación docente toca directamente las relaciones laborales y la estabilidad en el empleo; por ende, su factibilidad depende de que se construyan acuerdos paritarios y resguardos éticos que disipen sospechas de arbitrariedad o persecución gremial.</w:t>
+        <w:t xml:space="preserve">Examina el clima institucional, la confianza intersubjetiva entre los actores de la comunidad académica y los canales de diálogo paritario docente. En las organizaciones públicas y cogobernadas, la evaluación docente incide directamente en las relaciones laborales y la percepción de estabilidad en el empleo; por ende, la investigación examina si la construcción de acuerdos paritarios y resguardos éticos de confidencialidad constituye un factor crítico para disipar temores de arbitrariedad y habilitar una disposición favorable hacia la coevaluación formativa.</w:t>
       </w:r>
     </w:p>
     <w:bookmarkEnd w:id="37"/>
@@ -3850,7 +3904,7 @@
         <w:t xml:space="preserve"> </w:t>
       </w:r>
       <w:r>
-        <w:t xml:space="preserve">Apreciación del claustro estudiantil centrada en la claridad expositiva, la accesibilidad de los recursos didácticos, la retroalimentación oportuna en evaluaciones y la empatía pedagógica.</w:t>
+        <w:t xml:space="preserve">Apreciación de los estudiantes sobre la labor pedagógica, focalizada en la claridad expositiva, la accesibilidad de los recursos didácticos, la retroalimentación oportuna en evaluaciones y la empatía formativa.</w:t>
       </w:r>
     </w:p>
     <w:p>
@@ -3893,7 +3947,7 @@
       </w:r>
     </w:p>
     <w:bookmarkEnd w:id="38"/>
-    <w:bookmarkStart w:id="39" w:name="Xefa297f413be63d6451681d2fe2c4ab63fd02c2"/>
+    <w:bookmarkStart w:id="41" w:name="Xefa297f413be63d6451681d2fe2c4ab63fd02c2"/>
     <w:p>
       <w:pPr>
         <w:pStyle w:val="Heading3"/>
@@ -3975,6 +4029,7 @@
     </w:p>
     <w:p>
       <w:pPr>
+        <w:pStyle w:val="Compact"/>
         <w:numPr>
           <w:ilvl w:val="0"/>
           <w:numId w:val="1014"/>
@@ -4005,6 +4060,7 @@
     </w:p>
     <w:p>
       <w:pPr>
+        <w:pStyle w:val="Compact"/>
         <w:numPr>
           <w:ilvl w:val="0"/>
           <w:numId w:val="1014"/>
@@ -4035,6 +4091,7 @@
     </w:p>
     <w:p>
       <w:pPr>
+        <w:pStyle w:val="Compact"/>
         <w:numPr>
           <w:ilvl w:val="0"/>
           <w:numId w:val="1014"/>
@@ -4063,12 +4120,114 @@
         <w:t xml:space="preserve">, que salvaguarda la estabilidad laboral, la libertad de cátedra y las condiciones dignas de trabajo frente a cualquier mecanismo evaluativo susceptible de ser utilizado como herramienta de persecución, flexibilización o sobrecarga laboral.</w:t>
       </w:r>
     </w:p>
+    <w:bookmarkStart w:id="39" w:name="Xf2090d9af5b030916b9e1e2205b3a0e57672f9b"/>
+    <w:p>
+      <w:pPr>
+        <w:pStyle w:val="Heading4"/>
+      </w:pPr>
+      <w:r>
+        <w:t xml:space="preserve">Precisión Categorial:</w:t>
+      </w:r>
+      <w:r>
+        <w:t xml:space="preserve"> </w:t>
+      </w:r>
+      <w:r>
+        <w:t xml:space="preserve">“Claustro”</w:t>
+      </w:r>
+      <w:r>
+        <w:t xml:space="preserve"> </w:t>
+      </w:r>
+      <w:r>
+        <w:t xml:space="preserve">como Categoría Normativa versus</w:t>
+      </w:r>
+      <w:r>
+        <w:t xml:space="preserve"> </w:t>
+      </w:r>
+      <w:r>
+        <w:t xml:space="preserve">“Actores Institucionales”</w:t>
+      </w:r>
+      <w:r>
+        <w:t xml:space="preserve"> </w:t>
+      </w:r>
+      <w:r>
+        <w:t xml:space="preserve">como Categoría Analítica</w:t>
+      </w:r>
+    </w:p>
     <w:p>
       <w:pPr>
         <w:pStyle w:val="FirstParagraph"/>
       </w:pPr>
       <w:r>
-        <w:t xml:space="preserve">Por consiguiente, el marco teórico de esta investigación asume que la factibilidad de un dispositivo de evaluación 360° depende críticamente de su</w:t>
+        <w:t xml:space="preserve">Para asegurar la rigurosidad conceptual de la investigación, resulta indispensable formular una distinción analítica en torno al concepto de</w:t>
+      </w:r>
+      <w:r>
+        <w:t xml:space="preserve"> </w:t>
+      </w:r>
+      <w:r>
+        <w:rPr>
+          <w:i/>
+          <w:iCs/>
+        </w:rPr>
+        <w:t xml:space="preserve">claustro</w:t>
+      </w:r>
+      <w:r>
+        <w:t xml:space="preserve">, delimitando su alcance institucional frente a las categorías analíticas adoptadas en este trabajo.</w:t>
+      </w:r>
+    </w:p>
+    <w:p>
+      <w:pPr>
+        <w:pStyle w:val="BodyText"/>
+      </w:pPr>
+      <w:r>
+        <w:t xml:space="preserve">En el plano estrictamente institucional y normativo, tanto la Ley de Educación Superior N° 24.521</w:t>
+      </w:r>
+      <w:r>
+        <w:t xml:space="preserve"> </w:t>
+      </w:r>
+      <w:r>
+        <w:t xml:space="preserve">(Ley N° 24.521 de Educación Superior, 1995)</w:t>
+      </w:r>
+      <w:r>
+        <w:t xml:space="preserve"> </w:t>
+      </w:r>
+      <w:r>
+        <w:t xml:space="preserve">como el Estatuto de la Universidad Nacional del Comahue (Ordenanza CS N° 0988/2025)</w:t>
+      </w:r>
+      <w:r>
+        <w:t xml:space="preserve"> </w:t>
+      </w:r>
+      <w:r>
+        <w:t xml:space="preserve">(Universidad Nacional del Comahue, 2025)</w:t>
+      </w:r>
+      <w:r>
+        <w:t xml:space="preserve"> </w:t>
+      </w:r>
+      <w:r>
+        <w:t xml:space="preserve">apelan a la categoría de</w:t>
+      </w:r>
+      <w:r>
+        <w:t xml:space="preserve"> </w:t>
+      </w:r>
+      <w:r>
+        <w:rPr>
+          <w:i/>
+          <w:iCs/>
+        </w:rPr>
+        <w:t xml:space="preserve">claustro</w:t>
+      </w:r>
+      <w:r>
+        <w:t xml:space="preserve"> </w:t>
+      </w:r>
+      <w:r>
+        <w:t xml:space="preserve">(docente, estudiantil, graduados y nodocente) para definir los estamentos electorales que ejercen la ciudadanía universitaria y componen formalmente los cuerpos colegiados de cogobierno (Asamblea Universitaria, Consejo Superior, Consejo Directivo del CURZAS y Consejos Departamentales). En dicha dimensión legal, el claustro representa una estructura jurídica de delegación y representación política.</w:t>
+      </w:r>
+    </w:p>
+    <w:p>
+      <w:pPr>
+        <w:pStyle w:val="BodyText"/>
+      </w:pPr>
+      <w:r>
+        <w:t xml:space="preserve">Sin embargo, para los propósitos analíticos de este proyecto, la categoría de claustro no puede asumirse como una unidad psicosocial homogénea ni como un sujeto de comportamiento unívoco. Atribuir a un estamento formal intenciones, percepciones o disposiciones psicológicas equivaldría a reificar una categoría normativa. Por ello, la presente investigación adopta como categorías analíticas operativas las nociones de</w:t>
       </w:r>
       <w:r>
         <w:t xml:space="preserve"> </w:t>
@@ -4078,42 +4237,20 @@
           <w:b/>
           <w:bCs/>
         </w:rPr>
-        <w:t xml:space="preserve">blindaje ético y normativo</w:t>
-      </w:r>
-      <w:r>
-        <w:t xml:space="preserve">: el modelo solo resulta viable en el CURZAS si se preserva como una herramienta estrictamente voluntaria, anónima, confidencial y formativa, completamente disociada de los circuitos estatutarios sancionatorios o sumativos de carrera docente. Su viabilidad exige ser consensuada en mesas de diálogo paritario docente y legitimada por los claustros en el seno del cogobierno universitario.</w:t>
-      </w:r>
-    </w:p>
-    <w:bookmarkEnd w:id="39"/>
-    <w:bookmarkEnd w:id="40"/>
-    <w:bookmarkStart w:id="45" w:name="X77155299af2def8333549b16a82948e9810ead2"/>
-    <w:p>
-      <w:pPr>
-        <w:pStyle w:val="Heading2"/>
-        <w:keepNext/>
-        <w:spacing w:before="200" w:after="80" w:line="300" w:lineRule="auto"/>
-      </w:pPr>
-      <w:r>
-        <w:rPr>
-          <w:rFonts w:ascii="Arial" w:hAnsi="Arial"/>
-          <w:b/>
-          <w:sz w:val="24"/>
-        </w:rPr>
-        <w:t xml:space="preserve">Antecedentes: Estado del Arte de la Cuestión</w:t>
-      </w:r>
-    </w:p>
-    <w:p>
-      <w:pPr>
-        <w:pStyle w:val="FirstParagraph"/>
-      </w:pPr>
-      <w:r>
-        <w:t xml:space="preserve">De acuerdo con las pautas metodológicas de la cátedra y las recomendaciones de</w:t>
-      </w:r>
-      <w:r>
-        <w:t xml:space="preserve"> </w:t>
-      </w:r>
-      <w:r>
-        <w:t xml:space="preserve">Torraco (2016)</w:t>
+        <w:t xml:space="preserve">actores institucionales</w:t>
+      </w:r>
+      <w:r>
+        <w:t xml:space="preserve">,</w:t>
+      </w:r>
+      <w:r>
+        <w:t xml:space="preserve"> </w:t>
+      </w:r>
+      <w:r>
+        <w:rPr>
+          <w:b/>
+          <w:bCs/>
+        </w:rPr>
+        <w:t xml:space="preserve">sujetos pedagógicos reflexivos</w:t>
       </w:r>
       <w:r>
         <w:t xml:space="preserve"> </w:t>
@@ -4125,35 +4262,14 @@
         <w:t xml:space="preserve"> </w:t>
       </w:r>
       <w:r>
-        <w:t xml:space="preserve">Jiménez Becerra (2008)</w:t>
-      </w:r>
-      <w:r>
-        <w:t xml:space="preserve">, la construcción de los antecedentes o Estado del Arte no consiste en una reseña acumulativa de lecturas ni en un resumen bibliográfico lineal. Representa un ejercicio analítico e integrador de</w:t>
-      </w:r>
-      <w:r>
-        <w:t xml:space="preserve"> </w:t>
-      </w:r>
-      <w:r>
-        <w:t xml:space="preserve">“investigación de la investigación”</w:t>
-      </w:r>
-      <w:r>
-        <w:t xml:space="preserve">, dirigido a sistematizar la evidencia empírica previa sobre el problema de estudio, identificar metodologías empleadas y precisar con rigurosidad la</w:t>
-      </w:r>
-      <w:r>
-        <w:t xml:space="preserve"> </w:t>
-      </w:r>
-      <w:r>
         <w:rPr>
           <w:b/>
           <w:bCs/>
         </w:rPr>
-        <w:t xml:space="preserve">vacancia de conocimiento</w:t>
-      </w:r>
-      <w:r>
-        <w:t xml:space="preserve"> </w:t>
-      </w:r>
-      <w:r>
-        <w:t xml:space="preserve">que justifica el desarrollo del presente proyecto.</w:t>
+        <w:t xml:space="preserve">representaciones o percepciones intersubjetivas</w:t>
+      </w:r>
+      <w:r>
+        <w:t xml:space="preserve">.</w:t>
       </w:r>
     </w:p>
     <w:p>
@@ -4161,32 +4277,7 @@
         <w:pStyle w:val="BodyText"/>
       </w:pPr>
       <w:r>
-        <w:t xml:space="preserve">Para dar cumplimiento a la estructura exigida por el Seminario de Integración y Aplicación, los antecedentes se organizan jerárquicamente en tres niveles geográficos: internacional, nacional y regional/local.</w:t>
-      </w:r>
-    </w:p>
-    <w:bookmarkStart w:id="41" w:name="Xbd1777d47dd01cd8f84e658bc65d384db447afd"/>
-    <w:p>
-      <w:pPr>
-        <w:pStyle w:val="Heading3"/>
-        <w:keepNext/>
-        <w:spacing w:before="160" w:after="40" w:line="300" w:lineRule="auto"/>
-      </w:pPr>
-      <w:r>
-        <w:rPr>
-          <w:rFonts w:ascii="Arial" w:hAnsi="Arial"/>
-          <w:b/>
-          <w:i/>
-          <w:sz w:val="24"/>
-        </w:rPr>
-        <w:t xml:space="preserve">Antecedentes Internacionales: Modelos 360° y Triangulación Evaluativa en la Educación Superior</w:t>
-      </w:r>
-    </w:p>
-    <w:p>
-      <w:pPr>
-        <w:pStyle w:val="FirstParagraph"/>
-      </w:pPr>
-      <w:r>
-        <w:t xml:space="preserve">En el plano internacional, diversos estudios empíricos han examinado la aplicación y los efectos de los modelos de evaluación 360 grados en instituciones universitarias públicas y privadas:</w:t>
+        <w:t xml:space="preserve">La retroalimentación 360° y la evaluación formativa del desempeño no interpelan a corporaciones jurídicas abstractas, sino a personas y colectivos situados en la cotidianeidad de las prácticas pedagógicas y de gestión en el CURZAS:</w:t>
       </w:r>
     </w:p>
     <w:p>
@@ -4199,45 +4290,16 @@
       </w:pPr>
       <w:r>
         <w:rPr>
-          <w:b/>
-          <w:bCs/>
-        </w:rPr>
-        <w:t xml:space="preserve">Sifuentes Ocegueda, Suárez Flores y Lara González (2016)</w:t>
-      </w:r>
-      <w:r>
-        <w:t xml:space="preserve"> </w:t>
-      </w:r>
-      <w:r>
-        <w:t xml:space="preserve">desarrollaron una investigación empírica titulada</w:t>
-      </w:r>
-      <w:r>
-        <w:t xml:space="preserve"> </w:t>
-      </w:r>
-      <w:r>
-        <w:rPr>
           <w:i/>
           <w:iCs/>
         </w:rPr>
-        <w:t xml:space="preserve">“La evaluación de 360° aplicada al personal docente de nivel superior”</w:t>
-      </w:r>
-      <w:r>
-        <w:t xml:space="preserve">, publicada en la</w:t>
-      </w:r>
-      <w:r>
-        <w:t xml:space="preserve"> </w:t>
-      </w:r>
-      <w:r>
-        <w:rPr>
-          <w:i/>
-          <w:iCs/>
-        </w:rPr>
-        <w:t xml:space="preserve">Revista de Investigación en Tecnologías de la Información (RITI)</w:t>
-      </w:r>
-      <w:r>
-        <w:t xml:space="preserve"> </w:t>
-      </w:r>
-      <w:r>
-        <w:t xml:space="preserve">(Dialnet). El objetivo del estudio consistió en diseñar y evaluar el grado de aceptación de un instrumento 360° para el profesorado universitario en México. Mediante una metodología descriptiva y transversal que abarcó encuestas estructuradas a docentes, directores y estudiantes, los autores concluyeron que el modelo 360° registra un índice de aceptación docente superior al 85% siempre que se respeten tres garantías operativas: el estricto anonimato de los participantes, la entrega de reportes diagnósticos individuales y la ausencia total de penalidades administrativas. Este antecedente aporta a nuestro proyecto una evidencia empírica directa sobre la viabilidad actitudinal del modelo en el contexto universitario iberoamericano.</w:t>
+        <w:t xml:space="preserve">El docente individual y sus pares de cátedra:</w:t>
+      </w:r>
+      <w:r>
+        <w:t xml:space="preserve"> </w:t>
+      </w:r>
+      <w:r>
+        <w:t xml:space="preserve">sujetos reflexivos que vivencian las exigencias didácticas cotidianas, las mediaciones tecnológicas en la Red de Nodos Territoriales y las necesidades de perfeccionamiento en el marco de la Carrera Docente.</w:t>
       </w:r>
     </w:p>
     <w:p>
@@ -4250,42 +4312,16 @@
       </w:pPr>
       <w:r>
         <w:rPr>
-          <w:b/>
-          <w:bCs/>
-        </w:rPr>
-        <w:t xml:space="preserve">Obando Freire et al. (2014)</w:t>
-      </w:r>
-      <w:r>
-        <w:t xml:space="preserve">, en su artículo</w:t>
-      </w:r>
-      <w:r>
-        <w:t xml:space="preserve"> </w:t>
-      </w:r>
-      <w:r>
-        <w:rPr>
           <w:i/>
           <w:iCs/>
         </w:rPr>
-        <w:t xml:space="preserve">“Sistema de evaluación docente mediante el modelo 360 grados y el portafolio electrónico”</w:t>
-      </w:r>
-      <w:r>
-        <w:t xml:space="preserve">, publicado en la revista</w:t>
-      </w:r>
-      <w:r>
-        <w:t xml:space="preserve"> </w:t>
-      </w:r>
-      <w:r>
-        <w:rPr>
-          <w:i/>
-          <w:iCs/>
-        </w:rPr>
-        <w:t xml:space="preserve">Medisur</w:t>
-      </w:r>
-      <w:r>
-        <w:t xml:space="preserve"> </w:t>
-      </w:r>
-      <w:r>
-        <w:t xml:space="preserve">(SciELO), investigaron la implementación de una plataforma digital para la triangulación evaluativa en el nivel superior en Cuba. Su objetivo fue contrastar la efectividad de las encuestas unilaterales frente a un circuito multiactoral que combina autoevaluación, coevaluación de pares y heteroevaluación de alumnos y autoridades académicas. Entre sus principales hallazgos, demostraron que la evaluación circular mitiga los sesgos de complacencia o castigo inherentes a las encuestas estudiantiles aisladas y estimula en los docentes la autorreflexión sobre sus métodos didácticos. Su aporte a este TFG reside en documentar la factibilidad técnico-operativa de procesar evaluaciones multidireccionales mediante soportes informáticos.</w:t>
+        <w:t xml:space="preserve">Los estudiantes:</w:t>
+      </w:r>
+      <w:r>
+        <w:t xml:space="preserve"> </w:t>
+      </w:r>
+      <w:r>
+        <w:t xml:space="preserve">concebidos no meramente como un estamento de representación política, sino como partícipes directos y activos del proceso formativo, portadores de experiencias, demandas y juicios sobre la calidad del acompañamiento docente.</w:t>
       </w:r>
     </w:p>
     <w:p>
@@ -4298,55 +4334,147 @@
       </w:pPr>
       <w:r>
         <w:rPr>
-          <w:b/>
-          <w:bCs/>
-        </w:rPr>
-        <w:t xml:space="preserve">Reyes y Díaz (2020)</w:t>
-      </w:r>
-      <w:r>
-        <w:t xml:space="preserve"> </w:t>
-      </w:r>
-      <w:r>
-        <w:t xml:space="preserve">llevaron a cabo una investigación evaluativa titulada</w:t>
-      </w:r>
-      <w:r>
-        <w:t xml:space="preserve"> </w:t>
-      </w:r>
-      <w:r>
-        <w:rPr>
           <w:i/>
           <w:iCs/>
         </w:rPr>
-        <w:t xml:space="preserve">“Metaevaluación del sistema de evaluación docente en una universidad pública”</w:t>
-      </w:r>
-      <w:r>
-        <w:t xml:space="preserve">, publicada en</w:t>
-      </w:r>
-      <w:r>
-        <w:t xml:space="preserve"> </w:t>
-      </w:r>
-      <w:r>
-        <w:rPr>
-          <w:i/>
-          <w:iCs/>
-        </w:rPr>
-        <w:t xml:space="preserve">Education Policy Analysis Archives (EPAA)</w:t>
-      </w:r>
-      <w:r>
-        <w:t xml:space="preserve">. Mediante un enfoque metodológico mixto que combinó análisis normativo-documental y entrevistas a profundidad a docentes y autoridades sindicales, los autores evaluaron el impacto institucional de los sistemas de evaluación vigentes en una universidad pública mexicana. Concluyeron que los esquemas evaluativos de corte sumativo producen desconfianza y un</w:t>
-      </w:r>
-      <w:r>
-        <w:t xml:space="preserve"> </w:t>
-      </w:r>
-      <w:r>
-        <w:t xml:space="preserve">“efecto cumplimiento formal”</w:t>
-      </w:r>
-      <w:r>
-        <w:t xml:space="preserve">, donde el docente cumple el trámite administrativo sin transformar su práctica pedagógica. Asimismo, advirtieron que para que una innovación evaluativa prospere en la universidad pública, resulta indispensable que el modelo se oriente al aprendizaje institucional y se encuentre legitimado por los órganos de representación laboral. Este antecedente fundamenta la centralidad de la dimensión de gobernanza en nuestra investigación.</w:t>
-      </w:r>
-    </w:p>
+        <w:t xml:space="preserve">Las autoridades departamentales:</w:t>
+      </w:r>
+      <w:r>
+        <w:t xml:space="preserve"> </w:t>
+      </w:r>
+      <w:r>
+        <w:t xml:space="preserve">en tanto equipo de conducción electo con la responsabilidad de planificar y articular los recursos formativos con las prioridades académicas institucionales.</w:t>
+      </w:r>
+    </w:p>
+    <w:p>
+      <w:pPr>
+        <w:pStyle w:val="FirstParagraph"/>
+      </w:pPr>
+      <w:r>
+        <w:t xml:space="preserve">Esta distinción conceptual permite preservar el valor normativo del claustro en la gobernanza universitaria, al tiempo que habilita una indagación cualitativa situada y empíricamente sólida sobre las complejas dinámicas de confianza, expectativas y resistencias de los sujetos frente a la evaluación docente.</w:t>
+      </w:r>
+    </w:p>
+    <w:bookmarkEnd w:id="39"/>
+    <w:bookmarkStart w:id="40" w:name="Xd19f503ec170ca2f7711abf4686d92b55542094"/>
+    <w:p>
+      <w:pPr>
+        <w:pStyle w:val="Heading4"/>
+      </w:pPr>
+      <w:r>
+        <w:t xml:space="preserve">Condiciones de Viabilidad como Hipótesis de Indagación Abierta</w:t>
+      </w:r>
+    </w:p>
+    <w:p>
+      <w:pPr>
+        <w:pStyle w:val="FirstParagraph"/>
+      </w:pPr>
+      <w:r>
+        <w:t xml:space="preserve">A partir del marco analítico construido, en lugar de predeterminar de forma deductiva las condiciones definitivas de viabilidad,</w:t>
+      </w:r>
+      <w:r>
+        <w:t xml:space="preserve"> </w:t>
+      </w:r>
+      <w:r>
+        <w:rPr>
+          <w:b/>
+          <w:bCs/>
+        </w:rPr>
+        <w:t xml:space="preserve">el proyecto propone explorar si estas condiciones —voluntariedad, anonimato, confidencialidad, carácter formativo e independencia respecto de los mecanismos sumativos de permanencia— constituyen requisitos necesarios para su eventual implementación</w:t>
+      </w:r>
+      <w:r>
+        <w:t xml:space="preserve">.</w:t>
+      </w:r>
+    </w:p>
+    <w:p>
+      <w:pPr>
+        <w:pStyle w:val="BodyText"/>
+      </w:pPr>
+      <w:r>
+        <w:t xml:space="preserve">Desde esta perspectiva metodológica, la factibilidad no se asume como una certeza predefinida, sino como un objeto de indagación empírica abierto: será el trabajo de campo el que permita determinar en qué medida estas garantías son demandadas por los propios actores institucionales del CURZAS, o si emergen otros condicionantes culturales, técnicos o de gobernanza paritaria. La viabilidad se investiga, por ende, en su doble anclaje: la legitimación en los órganos colegiados de cogobierno y la construcción de confianza situada entre los sujetos de la comunidad académica.</w:t>
+      </w:r>
+    </w:p>
+    <w:bookmarkEnd w:id="40"/>
     <w:bookmarkEnd w:id="41"/>
-    <w:bookmarkStart w:id="42" w:name="X2c0b73cfd018cc54d6ee142a74b81e5b02c3616"/>
+    <w:bookmarkEnd w:id="42"/>
+    <w:bookmarkStart w:id="47" w:name="X77155299af2def8333549b16a82948e9810ead2"/>
+    <w:p>
+      <w:pPr>
+        <w:pStyle w:val="Heading2"/>
+        <w:keepNext/>
+        <w:spacing w:before="200" w:after="80" w:line="300" w:lineRule="auto"/>
+      </w:pPr>
+      <w:r>
+        <w:rPr>
+          <w:rFonts w:ascii="Arial" w:hAnsi="Arial"/>
+          <w:b/>
+          <w:sz w:val="24"/>
+        </w:rPr>
+        <w:t xml:space="preserve">Antecedentes: Estado del Arte de la Cuestión</w:t>
+      </w:r>
+    </w:p>
+    <w:p>
+      <w:pPr>
+        <w:pStyle w:val="FirstParagraph"/>
+      </w:pPr>
+      <w:r>
+        <w:t xml:space="preserve">De acuerdo con las pautas metodológicas de la cátedra y las recomendaciones de</w:t>
+      </w:r>
+      <w:r>
+        <w:t xml:space="preserve"> </w:t>
+      </w:r>
+      <w:r>
+        <w:t xml:space="preserve">Torraco (2016)</w:t>
+      </w:r>
+      <w:r>
+        <w:t xml:space="preserve"> </w:t>
+      </w:r>
+      <w:r>
+        <w:t xml:space="preserve">y</w:t>
+      </w:r>
+      <w:r>
+        <w:t xml:space="preserve"> </w:t>
+      </w:r>
+      <w:r>
+        <w:t xml:space="preserve">Jiménez Becerra (2008)</w:t>
+      </w:r>
+      <w:r>
+        <w:t xml:space="preserve">, la construcción de los antecedentes o Estado del Arte no consiste en una reseña acumulativa de lecturas ni en un resumen bibliográfico lineal. Representa un ejercicio analítico e integrador de</w:t>
+      </w:r>
+      <w:r>
+        <w:t xml:space="preserve"> </w:t>
+      </w:r>
+      <w:r>
+        <w:t xml:space="preserve">“investigación de la investigación”</w:t>
+      </w:r>
+      <w:r>
+        <w:t xml:space="preserve">, dirigido a sistematizar la evidencia empírica previa sobre el problema de estudio, identificar metodologías empleadas y precisar con rigurosidad la</w:t>
+      </w:r>
+      <w:r>
+        <w:t xml:space="preserve"> </w:t>
+      </w:r>
+      <w:r>
+        <w:rPr>
+          <w:b/>
+          <w:bCs/>
+        </w:rPr>
+        <w:t xml:space="preserve">vacancia de conocimiento</w:t>
+      </w:r>
+      <w:r>
+        <w:t xml:space="preserve"> </w:t>
+      </w:r>
+      <w:r>
+        <w:t xml:space="preserve">que justifica el desarrollo del presente proyecto.</w:t>
+      </w:r>
+    </w:p>
+    <w:p>
+      <w:pPr>
+        <w:pStyle w:val="BodyText"/>
+      </w:pPr>
+      <w:r>
+        <w:t xml:space="preserve">Para dar cumplimiento a la estructura exigida por el Seminario de Integración y Aplicación, los antecedentes se organizan jerárquicamente en tres niveles geográficos: internacional, nacional y regional/local.</w:t>
+      </w:r>
+    </w:p>
+    <w:bookmarkStart w:id="43" w:name="Xbd1777d47dd01cd8f84e658bc65d384db447afd"/>
     <w:p>
       <w:pPr>
         <w:pStyle w:val="Heading3"/>
@@ -4360,7 +4488,7 @@
           <w:i/>
           <w:sz w:val="24"/>
         </w:rPr>
-        <w:t xml:space="preserve">Antecedentes Nacionales: Evaluación Docente y Carrera Académica en Universidades Públicas Argentinas</w:t>
+        <w:t xml:space="preserve">Antecedentes Internacionales: Modelos 360° y Triangulación Evaluativa en la Educación Superior</w:t>
       </w:r>
     </w:p>
     <w:p>
@@ -4368,7 +4496,7 @@
         <w:pStyle w:val="FirstParagraph"/>
       </w:pPr>
       <w:r>
-        <w:t xml:space="preserve">En el ámbito nacional argentino, la literatura científica ha indagado las tensiones inherentes a la profesión docente universitaria y sus mecanismos de valoración:</w:t>
+        <w:t xml:space="preserve">En el plano internacional, diversos estudios empíricos han examinado la aplicación y los efectos de los modelos de evaluación 360 grados en instituciones universitarias públicas y privadas:</w:t>
       </w:r>
     </w:p>
     <w:p>
@@ -4384,10 +4512,13 @@
           <w:b/>
           <w:bCs/>
         </w:rPr>
-        <w:t xml:space="preserve">Marquina (2012)</w:t>
-      </w:r>
-      <w:r>
-        <w:t xml:space="preserve">, en su estudio empírico</w:t>
+        <w:t xml:space="preserve">Sifuentes Ocegueda, Suárez Flores y Lara González (2016)</w:t>
+      </w:r>
+      <w:r>
+        <w:t xml:space="preserve"> </w:t>
+      </w:r>
+      <w:r>
+        <w:t xml:space="preserve">desarrollaron una investigación empírica titulada</w:t>
       </w:r>
       <w:r>
         <w:t xml:space="preserve"> </w:t>
@@ -4397,10 +4528,10 @@
           <w:i/>
           <w:iCs/>
         </w:rPr>
-        <w:t xml:space="preserve">“¿Hay un nuevo modelo de profesión académica en Argentina? Debates y tendencias en la universidad pública”</w:t>
-      </w:r>
-      <w:r>
-        <w:t xml:space="preserve">, publicado en</w:t>
+        <w:t xml:space="preserve">“La evaluación de 360° aplicada al personal docente de nivel superior”</w:t>
+      </w:r>
+      <w:r>
+        <w:t xml:space="preserve">, publicada en la</w:t>
       </w:r>
       <w:r>
         <w:t xml:space="preserve"> </w:t>
@@ -4410,10 +4541,13 @@
           <w:i/>
           <w:iCs/>
         </w:rPr>
-        <w:t xml:space="preserve">Pensamiento Universitario</w:t>
-      </w:r>
-      <w:r>
-        <w:t xml:space="preserve">, analizó las transformaciones en la labor de los profesores de las universidades nacionales a partir de las exigencias contrapuestas entre la docencia, la investigación y la gestión institucional. A través de un abordaje cualitativo apoyado en entrevistas a docentes y referentes gremiales de diversas universidades públicas, Marquina evidenció que los instrumentos tradicionales de evaluación docente (concursos y permanencias) suelen privilegiar la producción científica abstracta o la acumulación de posgrados por sobre la calidad didáctica en las aulas de grado. Este hallazgo resulta nodal para nuestro TFG, pues justifica la necesidad de generar dispositivos de retroalimentación centrados específicamente en la función formativa y de enseñanza del docente universitario.</w:t>
+        <w:t xml:space="preserve">Revista de Investigación en Tecnologías de la Información (RITI)</w:t>
+      </w:r>
+      <w:r>
+        <w:t xml:space="preserve"> </w:t>
+      </w:r>
+      <w:r>
+        <w:t xml:space="preserve">(Dialnet). El objetivo del estudio consistió en diseñar y evaluar el grado de aceptación de un instrumento 360° para el profesorado universitario en México. Mediante una metodología descriptiva y transversal que abarcó encuestas estructuradas a docentes, directores y estudiantes, los autores concluyeron que el modelo 360° registra un índice de aceptación docente superior al 85% siempre que se respeten tres garantías operativas: el estricto anonimato de los participantes, la entrega de reportes diagnósticos individuales y la ausencia total de penalidades administrativas. Este antecedente aporta a nuestro proyecto una evidencia empírica directa sobre la viabilidad actitudinal del modelo en el contexto universitario iberoamericano.</w:t>
       </w:r>
     </w:p>
     <w:p>
@@ -4429,13 +4563,10 @@
           <w:b/>
           <w:bCs/>
         </w:rPr>
-        <w:t xml:space="preserve">Pérez, González y Castro (2021)</w:t>
-      </w:r>
-      <w:r>
-        <w:t xml:space="preserve"> </w:t>
-      </w:r>
-      <w:r>
-        <w:t xml:space="preserve">publicaron el artículo de investigación empírica</w:t>
+        <w:t xml:space="preserve">Obando Freire et al. (2014)</w:t>
+      </w:r>
+      <w:r>
+        <w:t xml:space="preserve">, en su artículo</w:t>
       </w:r>
       <w:r>
         <w:t xml:space="preserve"> </w:t>
@@ -4445,10 +4576,10 @@
           <w:i/>
           <w:iCs/>
         </w:rPr>
-        <w:t xml:space="preserve">“Evaluación 360° de las tutorías presenciales y en línea en universidades públicas”</w:t>
-      </w:r>
-      <w:r>
-        <w:t xml:space="preserve">, en la revista científica</w:t>
+        <w:t xml:space="preserve">“Sistema de evaluación docente mediante el modelo 360 grados y el portafolio electrónico”</w:t>
+      </w:r>
+      <w:r>
+        <w:t xml:space="preserve">, publicado en la revista</w:t>
       </w:r>
       <w:r>
         <w:t xml:space="preserve"> </w:t>
@@ -4458,17 +4589,74 @@
           <w:i/>
           <w:iCs/>
         </w:rPr>
-        <w:t xml:space="preserve">Unaciencia</w:t>
-      </w:r>
-      <w:r>
-        <w:t xml:space="preserve"> </w:t>
-      </w:r>
-      <w:r>
-        <w:t xml:space="preserve">(Redalyc). El estudio evaluó la factibilidad de aplicar la metodología 360° para valorar el desempeño de docentes universitarios con funciones tutoriales presenciales y mediadas por tecnologías virtuales. Mediante un diseño metodológico descriptivo aplicado a estudiantes, docentes tutores y coordinadores, el trabajo concluyó que el modelo 360° demostró una capacidad significativamente superior para captar competencias pedagógicas blandas (comunicación asertiva, empatía, acompañamiento en entornos virtuales) en comparación con las rúbricas estandarizadas tradicionales. Este antecedente aporta un valor metodológico e instrumental directo para el CURZAS-UNCo, donde la docencia universitaria se despliega crecientemente de forma híbrida articulando la sede central con los Nodos Territoriales.</w:t>
-      </w:r>
-    </w:p>
-    <w:bookmarkEnd w:id="42"/>
-    <w:bookmarkStart w:id="43" w:name="X868ada8a3209befb2b1ff6a8414801be884be61"/>
+        <w:t xml:space="preserve">Medisur</w:t>
+      </w:r>
+      <w:r>
+        <w:t xml:space="preserve"> </w:t>
+      </w:r>
+      <w:r>
+        <w:t xml:space="preserve">(SciELO), investigaron la implementación de una plataforma digital para la triangulación evaluativa en el nivel superior en Cuba. Su objetivo fue contrastar la efectividad de las encuestas unilaterales frente a un circuito multiactoral que combina autoevaluación, coevaluación de pares y heteroevaluación de alumnos y autoridades académicas. Entre sus principales hallazgos, demostraron que la evaluación circular mitiga los sesgos de complacencia o castigo inherentes a las encuestas estudiantiles aisladas y estimula en los docentes la autorreflexión sobre sus métodos didácticos. Su aporte a este TFG reside en documentar la factibilidad técnico-operativa de procesar evaluaciones multidireccionales mediante soportes informáticos.</w:t>
+      </w:r>
+    </w:p>
+    <w:p>
+      <w:pPr>
+        <w:pStyle w:val="Compact"/>
+        <w:numPr>
+          <w:ilvl w:val="0"/>
+          <w:numId w:val="1016"/>
+        </w:numPr>
+      </w:pPr>
+      <w:r>
+        <w:rPr>
+          <w:b/>
+          <w:bCs/>
+        </w:rPr>
+        <w:t xml:space="preserve">Reyes y Díaz (2020)</w:t>
+      </w:r>
+      <w:r>
+        <w:t xml:space="preserve"> </w:t>
+      </w:r>
+      <w:r>
+        <w:t xml:space="preserve">llevaron a cabo una investigación evaluativa titulada</w:t>
+      </w:r>
+      <w:r>
+        <w:t xml:space="preserve"> </w:t>
+      </w:r>
+      <w:r>
+        <w:rPr>
+          <w:i/>
+          <w:iCs/>
+        </w:rPr>
+        <w:t xml:space="preserve">“Metaevaluación del sistema de evaluación docente en una universidad pública”</w:t>
+      </w:r>
+      <w:r>
+        <w:t xml:space="preserve">, publicada en</w:t>
+      </w:r>
+      <w:r>
+        <w:t xml:space="preserve"> </w:t>
+      </w:r>
+      <w:r>
+        <w:rPr>
+          <w:i/>
+          <w:iCs/>
+        </w:rPr>
+        <w:t xml:space="preserve">Education Policy Analysis Archives (EPAA)</w:t>
+      </w:r>
+      <w:r>
+        <w:t xml:space="preserve">. Mediante un enfoque metodológico mixto que combinó análisis normativo-documental y entrevistas a profundidad a docentes y autoridades sindicales, los autores evaluaron el impacto institucional de los sistemas de evaluación vigentes en una universidad pública mexicana. Concluyeron que los esquemas evaluativos de corte sumativo producen desconfianza y un</w:t>
+      </w:r>
+      <w:r>
+        <w:t xml:space="preserve"> </w:t>
+      </w:r>
+      <w:r>
+        <w:t xml:space="preserve">“efecto cumplimiento formal”</w:t>
+      </w:r>
+      <w:r>
+        <w:t xml:space="preserve">, donde el docente cumple el trámite administrativo sin transformar su práctica pedagógica. Asimismo, advirtieron que para que una innovación evaluativa prospere en la universidad pública, resulta indispensable que el modelo se oriente al aprendizaje institucional y se encuentre legitimado por los órganos de representación laboral. Este antecedente fundamenta la centralidad de la dimensión de gobernanza en nuestra investigación.</w:t>
+      </w:r>
+    </w:p>
+    <w:bookmarkEnd w:id="43"/>
+    <w:bookmarkStart w:id="44" w:name="X2c0b73cfd018cc54d6ee142a74b81e5b02c3616"/>
     <w:p>
       <w:pPr>
         <w:pStyle w:val="Heading3"/>
@@ -4482,7 +4670,7 @@
           <w:i/>
           <w:sz w:val="24"/>
         </w:rPr>
-        <w:t xml:space="preserve">Antecedentes Regionales y Locales: Prácticas de Evaluación y Contexto Institucional en la UNCo y el CURZAS</w:t>
+        <w:t xml:space="preserve">Antecedentes Nacionales: Evaluación Docente y Carrera Académica en Universidades Públicas Argentinas</w:t>
       </w:r>
     </w:p>
     <w:p>
@@ -4490,7 +4678,7 @@
         <w:pStyle w:val="FirstParagraph"/>
       </w:pPr>
       <w:r>
-        <w:t xml:space="preserve">En el plano regional y local patagónico, los antecedentes normativos e institucionales vinculados a la Universidad Nacional del Comahue y al Complejo Universitario Regional Zona Atlántica y Sur (CURZAS) permiten delimitar con precisión empírica el estado de situación de partida:</w:t>
+        <w:t xml:space="preserve">En el ámbito nacional argentino, la literatura científica ha indagado las tensiones inherentes a la profesión docente universitaria y sus mecanismos de valoración:</w:t>
       </w:r>
     </w:p>
     <w:p>
@@ -4506,72 +4694,36 @@
           <w:b/>
           <w:bCs/>
         </w:rPr>
-        <w:t xml:space="preserve">Marco Estatutario Consolidado (Ordenanza CS N° 0988/2025 — Estatuto UNCo):</w:t>
-      </w:r>
-      <w:r>
-        <w:t xml:space="preserve"> </w:t>
-      </w:r>
-      <w:r>
-        <w:t xml:space="preserve">Aprobado por la Asamblea Universitaria como texto ordenado del Estatuto de la Universidad Nacional del Comahue</w:t>
-      </w:r>
-      <w:r>
-        <w:t xml:space="preserve"> </w:t>
-      </w:r>
-      <w:r>
-        <w:t xml:space="preserve">(Universidad Nacional del Comahue, 2025)</w:t>
-      </w:r>
-      <w:r>
-        <w:t xml:space="preserve">, este cuerpo normativo jerarquiza y define formalmente al CURZAS como Complejo Universitario Regional (Art. 17 y Disposición Transitoria Cuarta). En su Título X (</w:t>
-      </w:r>
-      <w:r>
-        <w:t xml:space="preserve">“De la Carrera Docente”</w:t>
-      </w:r>
-      <w:r>
-        <w:t xml:space="preserve">, Arts. 65 a 76), el Estatuto consolida el régimen integral de permanencia académica, articulando dos dispositivos evaluativos estatutarios:</w:t>
-      </w:r>
-    </w:p>
-    <w:p>
-      <w:pPr>
-        <w:pStyle w:val="Compact"/>
-        <w:numPr>
-          <w:ilvl w:val="1"/>
-          <w:numId w:val="1018"/>
-        </w:numPr>
-      </w:pPr>
+        <w:t xml:space="preserve">Marquina (2012)</w:t>
+      </w:r>
+      <w:r>
+        <w:t xml:space="preserve">, en su estudio empírico</w:t>
+      </w:r>
+      <w:r>
+        <w:t xml:space="preserve"> </w:t>
+      </w:r>
       <w:r>
         <w:rPr>
           <w:i/>
           <w:iCs/>
         </w:rPr>
-        <w:t xml:space="preserve">Informes Anuales de Cátedra (Art. 74):</w:t>
-      </w:r>
-      <w:r>
-        <w:t xml:space="preserve"> </w:t>
-      </w:r>
-      <w:r>
-        <w:t xml:space="preserve">Que comprenden la memoria de actividades, el plan de avance pedagógico, la opinión fundada de la Dirección del Departamento y los resultados de las encuestas estudiantiles obligatorias.</w:t>
-      </w:r>
-    </w:p>
-    <w:p>
-      <w:pPr>
-        <w:pStyle w:val="Compact"/>
-        <w:numPr>
-          <w:ilvl w:val="1"/>
-          <w:numId w:val="1018"/>
-        </w:numPr>
-      </w:pPr>
+        <w:t xml:space="preserve">“¿Hay un nuevo modelo de profesión académica en Argentina? Debates y tendencias en la universidad pública”</w:t>
+      </w:r>
+      <w:r>
+        <w:t xml:space="preserve">, publicado en</w:t>
+      </w:r>
+      <w:r>
+        <w:t xml:space="preserve"> </w:t>
+      </w:r>
       <w:r>
         <w:rPr>
           <w:i/>
           <w:iCs/>
         </w:rPr>
-        <w:t xml:space="preserve">Evaluaciones Periódicas Cuatrienales de Permanencia (Art. 75):</w:t>
-      </w:r>
-      <w:r>
-        <w:t xml:space="preserve"> </w:t>
-      </w:r>
-      <w:r>
-        <w:t xml:space="preserve">Llevadas a cabo por tribunales integrados por dos evaluadores externos de la disciplina y un veedor con voz y voto del claustro estudiantil (inc. a). Asimismo, el Art. 76 instituye la obligación departamental de formular programas anuales de formación y perfeccionamiento de recursos humanos docentes.</w:t>
+        <w:t xml:space="preserve">Pensamiento Universitario</w:t>
+      </w:r>
+      <w:r>
+        <w:t xml:space="preserve">, analizó las transformaciones en la labor de los profesores de las universidades nacionales a partir de las exigencias contrapuestas entre la docencia, la investigación y la gestión institucional. A través de un abordaje cualitativo apoyado en entrevistas a docentes y referentes gremiales de diversas universidades públicas, Marquina evidenció que los instrumentos tradicionales de evaluación docente (concursos y permanencias) suelen privilegiar la producción científica abstracta o la acumulación de posgrados por sobre la calidad didáctica en las aulas de grado. Este hallazgo resulta nodal para nuestro TFG, pues justifica la necesidad de generar dispositivos de retroalimentación centrados específicamente en la función formativa y de enseñanza del docente universitario.</w:t>
       </w:r>
     </w:p>
     <w:p>
@@ -4587,34 +4739,68 @@
           <w:b/>
           <w:bCs/>
         </w:rPr>
-        <w:t xml:space="preserve">Régimen General de Carrera Docente de la UNCo (Ordenanza CS N° 0910/1997 y modificatorias hasta la Ord. CS N° 0887/2021):</w:t>
-      </w:r>
-      <w:r>
-        <w:t xml:space="preserve"> </w:t>
-      </w:r>
-      <w:r>
-        <w:t xml:space="preserve">En el Digesto oficial de la universidad, el Reglamento de Carrera Docente</w:t>
-      </w:r>
-      <w:r>
-        <w:t xml:space="preserve"> </w:t>
-      </w:r>
-      <w:r>
-        <w:t xml:space="preserve">(Universidad Nacional del Comahue, 1997)</w:t>
-      </w:r>
-      <w:r>
-        <w:t xml:space="preserve"> </w:t>
-      </w:r>
-      <w:r>
-        <w:t xml:space="preserve">norma en su Capítulo III el procedimiento operativo para la presentación y valoración de informes docentes, encuestas estudiantiles y criterios de permanencia, en plena armonización con el Convenio Colectivo de Trabajo Docente Universitario (Decreto PEN N° 1246/2015)</w:t>
-      </w:r>
-      <w:r>
-        <w:t xml:space="preserve"> </w:t>
-      </w:r>
-      <w:r>
-        <w:t xml:space="preserve">(Decreto N° 1246/2015. Convenio Colectivo de Trabajo para los Docentes de las Instituciones Universitarias Nacionales, 2015)</w:t>
-      </w:r>
-      <w:r>
-        <w:t xml:space="preserve">. Los registros institucionales muestran que, si bien estos instrumentos garantizan con solidez jurídica el control administrativo y sumativo de la estabilidad laboral, persiste en los claustros una vacancia respecto a circuitos sistemáticos de retroalimentación formativa y confidencial que orienten la mejora continua del ejercicio docente.</w:t>
+        <w:t xml:space="preserve">Pérez, González y Castro (2021)</w:t>
+      </w:r>
+      <w:r>
+        <w:t xml:space="preserve"> </w:t>
+      </w:r>
+      <w:r>
+        <w:t xml:space="preserve">publicaron el artículo de investigación empírica</w:t>
+      </w:r>
+      <w:r>
+        <w:t xml:space="preserve"> </w:t>
+      </w:r>
+      <w:r>
+        <w:rPr>
+          <w:i/>
+          <w:iCs/>
+        </w:rPr>
+        <w:t xml:space="preserve">“Evaluación 360° de las tutorías presenciales y en línea en universidades públicas”</w:t>
+      </w:r>
+      <w:r>
+        <w:t xml:space="preserve">, en la revista científica</w:t>
+      </w:r>
+      <w:r>
+        <w:t xml:space="preserve"> </w:t>
+      </w:r>
+      <w:r>
+        <w:rPr>
+          <w:i/>
+          <w:iCs/>
+        </w:rPr>
+        <w:t xml:space="preserve">Unaciencia</w:t>
+      </w:r>
+      <w:r>
+        <w:t xml:space="preserve"> </w:t>
+      </w:r>
+      <w:r>
+        <w:t xml:space="preserve">(Redalyc). El estudio evaluó la factibilidad de aplicar la metodología 360° para valorar el desempeño de docentes universitarios con funciones tutoriales presenciales y mediadas por tecnologías virtuales. Mediante un diseño metodológico descriptivo aplicado a estudiantes, docentes tutores y coordinadores, el trabajo concluyó que el modelo 360° demostró una capacidad significativamente superior para captar competencias pedagógicas blandas (comunicación asertiva, empatía, acompañamiento en entornos virtuales) en comparación con las rúbricas estandarizadas tradicionales. Este antecedente aporta un valor metodológico e instrumental directo para el CURZAS-UNCo, donde la docencia universitaria se despliega crecientemente de forma híbrida articulando la sede central con los Nodos Territoriales.</w:t>
+      </w:r>
+    </w:p>
+    <w:bookmarkEnd w:id="44"/>
+    <w:bookmarkStart w:id="45" w:name="X868ada8a3209befb2b1ff6a8414801be884be61"/>
+    <w:p>
+      <w:pPr>
+        <w:pStyle w:val="Heading3"/>
+        <w:keepNext/>
+        <w:spacing w:before="160" w:after="40" w:line="300" w:lineRule="auto"/>
+      </w:pPr>
+      <w:r>
+        <w:rPr>
+          <w:rFonts w:ascii="Arial" w:hAnsi="Arial"/>
+          <w:b/>
+          <w:i/>
+          <w:sz w:val="24"/>
+        </w:rPr>
+        <w:t xml:space="preserve">Antecedentes Regionales y Locales: Prácticas de Evaluación y Contexto Institucional en la UNCo y el CURZAS</w:t>
+      </w:r>
+    </w:p>
+    <w:p>
+      <w:pPr>
+        <w:pStyle w:val="FirstParagraph"/>
+      </w:pPr>
+      <w:r>
+        <w:t xml:space="preserve">En el plano regional y local patagónico, los antecedentes normativos e institucionales vinculados a la Universidad Nacional del Comahue y al Complejo Universitario Regional Zona Atlántica y Sur (CURZAS) permiten delimitar con precisión empírica el estado de situación de partida:</w:t>
       </w:r>
     </w:p>
     <w:p>
@@ -4622,7 +4808,7 @@
         <w:pStyle w:val="Compact"/>
         <w:numPr>
           <w:ilvl w:val="0"/>
-          <w:numId w:val="1017"/>
+          <w:numId w:val="1018"/>
         </w:numPr>
       </w:pPr>
       <w:r>
@@ -4630,6 +4816,130 @@
           <w:b/>
           <w:bCs/>
         </w:rPr>
+        <w:t xml:space="preserve">Marco Estatutario Consolidado (Ordenanza CS N° 0988/2025 — Estatuto UNCo):</w:t>
+      </w:r>
+      <w:r>
+        <w:t xml:space="preserve"> </w:t>
+      </w:r>
+      <w:r>
+        <w:t xml:space="preserve">Aprobado por la Asamblea Universitaria como texto ordenado del Estatuto de la Universidad Nacional del Comahue</w:t>
+      </w:r>
+      <w:r>
+        <w:t xml:space="preserve"> </w:t>
+      </w:r>
+      <w:r>
+        <w:t xml:space="preserve">(Universidad Nacional del Comahue, 2025)</w:t>
+      </w:r>
+      <w:r>
+        <w:t xml:space="preserve">, este cuerpo normativo jerarquiza y define formalmente al CURZAS como Complejo Universitario Regional (Art. 17 y Disposición Transitoria Cuarta). En su Título X (</w:t>
+      </w:r>
+      <w:r>
+        <w:t xml:space="preserve">“De la Carrera Docente”</w:t>
+      </w:r>
+      <w:r>
+        <w:t xml:space="preserve">, Arts. 65 a 76), el Estatuto consolida el régimen integral de permanencia académica, articulando dos dispositivos evaluativos estatutarios:</w:t>
+      </w:r>
+    </w:p>
+    <w:p>
+      <w:pPr>
+        <w:pStyle w:val="Compact"/>
+        <w:numPr>
+          <w:ilvl w:val="1"/>
+          <w:numId w:val="1019"/>
+        </w:numPr>
+      </w:pPr>
+      <w:r>
+        <w:rPr>
+          <w:i/>
+          <w:iCs/>
+        </w:rPr>
+        <w:t xml:space="preserve">Informes Anuales de Cátedra (Art. 74):</w:t>
+      </w:r>
+      <w:r>
+        <w:t xml:space="preserve"> </w:t>
+      </w:r>
+      <w:r>
+        <w:t xml:space="preserve">Que comprenden la memoria de actividades, el plan de avance pedagógico, la opinión fundada de la Dirección del Departamento y los resultados de las encuestas estudiantiles obligatorias.</w:t>
+      </w:r>
+    </w:p>
+    <w:p>
+      <w:pPr>
+        <w:pStyle w:val="Compact"/>
+        <w:numPr>
+          <w:ilvl w:val="1"/>
+          <w:numId w:val="1019"/>
+        </w:numPr>
+      </w:pPr>
+      <w:r>
+        <w:rPr>
+          <w:i/>
+          <w:iCs/>
+        </w:rPr>
+        <w:t xml:space="preserve">Evaluaciones Periódicas Cuatrienales de Permanencia (Art. 75):</w:t>
+      </w:r>
+      <w:r>
+        <w:t xml:space="preserve"> </w:t>
+      </w:r>
+      <w:r>
+        <w:t xml:space="preserve">Llevadas a cabo por tribunales integrados por dos evaluadores externos de la disciplina y un veedor con voz y voto del claustro estudiantil (inc. a). Asimismo, el Art. 76 instituye la obligación departamental de formular programas anuales de formación y perfeccionamiento de recursos humanos docentes.</w:t>
+      </w:r>
+    </w:p>
+    <w:p>
+      <w:pPr>
+        <w:pStyle w:val="Compact"/>
+        <w:numPr>
+          <w:ilvl w:val="0"/>
+          <w:numId w:val="1018"/>
+        </w:numPr>
+      </w:pPr>
+      <w:r>
+        <w:rPr>
+          <w:b/>
+          <w:bCs/>
+        </w:rPr>
+        <w:t xml:space="preserve">Régimen General de Carrera Docente de la UNCo (Ordenanza CS N° 0910/1997 y modificatorias hasta la Ord. CS N° 0887/2021):</w:t>
+      </w:r>
+      <w:r>
+        <w:t xml:space="preserve"> </w:t>
+      </w:r>
+      <w:r>
+        <w:t xml:space="preserve">En el Digesto oficial de la universidad, el Reglamento de Carrera Docente</w:t>
+      </w:r>
+      <w:r>
+        <w:t xml:space="preserve"> </w:t>
+      </w:r>
+      <w:r>
+        <w:t xml:space="preserve">(Universidad Nacional del Comahue, 1997)</w:t>
+      </w:r>
+      <w:r>
+        <w:t xml:space="preserve"> </w:t>
+      </w:r>
+      <w:r>
+        <w:t xml:space="preserve">norma en su Capítulo III el procedimiento operativo para la presentación y valoración de informes docentes, encuestas estudiantiles y criterios de permanencia, en plena armonización con el Convenio Colectivo de Trabajo Docente Universitario (Decreto PEN N° 1246/2015)</w:t>
+      </w:r>
+      <w:r>
+        <w:t xml:space="preserve"> </w:t>
+      </w:r>
+      <w:r>
+        <w:t xml:space="preserve">(Decreto N° 1246/2015. Convenio Colectivo de Trabajo para los Docentes de las Instituciones Universitarias Nacionales, 2015)</w:t>
+      </w:r>
+      <w:r>
+        <w:t xml:space="preserve">. Los registros institucionales muestran que, si bien estos instrumentos garantizan con solidez jurídica el control administrativo y sumativo de la estabilidad laboral, se advierte entre los actores institucionales una demanda no resuelta y un área de vacancia analítica respecto al desarrollo de circuitos sistemáticos de retroalimentación formativa y confidencial que orienten la mejora continua del ejercicio docente.</w:t>
+      </w:r>
+    </w:p>
+    <w:p>
+      <w:pPr>
+        <w:pStyle w:val="Compact"/>
+        <w:numPr>
+          <w:ilvl w:val="0"/>
+          <w:numId w:val="1018"/>
+        </w:numPr>
+      </w:pPr>
+      <w:r>
+        <w:rPr>
+          <w:b/>
+          <w:bCs/>
+        </w:rPr>
         <w:t xml:space="preserve">Expansión Territorial y Docencia Híbrida en la Red de Nodos del CURZAS (Resolución CD-CURZA N° 196/2022 y SIED UNCo):</w:t>
       </w:r>
       <w:r>
@@ -4645,11 +4955,11 @@
         <w:t xml:space="preserve">(Consejo Directivo del CURZAS, 2022, 2023)</w:t>
       </w:r>
       <w:r>
-        <w:t xml:space="preserve">. Esta configuración territorial se encuentra respaldada por la Resolución CD-CURZA N° 196/2022, que valida normativamente las mediaciones tecnológicas, la presencialidad sincrónica remota y las modalidades de enseñanza híbridas, articuladas con las directrices del Sistema Institucional de Educación a Distancia (SIED UNCo). Dicho escenario impone a los equipos de cátedra competencias didácticas específicas (tutoría virtual, diseño de materiales asincrónicos y acompañamiento mediado por TIC) que actualmente no son ponderadas de forma formativa ni multidireccional por los instrumentos de evaluación tradicionales, evidenciando la necesidad y factibilidad de un modelo 360° adaptado a entornos híbridos.</w:t>
-      </w:r>
-    </w:p>
-    <w:bookmarkEnd w:id="43"/>
-    <w:bookmarkStart w:id="44" w:name="Xdd2f1928b167b346feb3db91e0e80e813fe5a54"/>
+        <w:t xml:space="preserve">. Esta configuración territorial se encuentra respaldada por la Resolución CD-CURZA N° 196/2022, que valida normativamente las mediaciones tecnológicas, la presencialidad sincrónica remota y las modalidades de enseñanza híbridas, articuladas con las directrices del Sistema Institucional de Educación a Distancia (SIED UNCo). Dicho escenario impone a los equipos de cátedra competencias didácticas específicas (tutoría virtual, diseño de materiales asincrónicos y acompañamiento mediado por TIC) que actualmente no son ponderadas de forma formativa ni multidireccional por los instrumentos de evaluación tradicionales, planteando la conveniencia de indagar la pertinencia y factibilidad de un modelo 360° adaptado a las singularidades de dichos entornos híbridos.</w:t>
+      </w:r>
+    </w:p>
+    <w:bookmarkEnd w:id="45"/>
+    <w:bookmarkStart w:id="46" w:name="Xdd2f1928b167b346feb3db91e0e80e813fe5a54"/>
     <w:p>
       <w:pPr>
         <w:pStyle w:val="Heading3"/>
@@ -4692,7 +5002,7 @@
         <w:t xml:space="preserve">Jiménez Becerra (2008)</w:t>
       </w:r>
       <w:r>
-        <w:t xml:space="preserve">, el recorrido por los antecedentes internacionales, nacionales y locales permite constatar un consenso sobre la riqueza del modelo 360° para mejorar la calidad formativa y la necesidad de diferenciar la evaluación del desarrollo de la fiscalización sumativa de la permanencia.</w:t>
+        <w:t xml:space="preserve">, el recorrido por los antecedentes internacionales, nacionales y locales permite constatar un consenso sobre la riqueza del modelo 360° para enriquecer las prácticas formativas y la conveniencia de diferenciar los circuitos de desarrollo pedagógico de la fiscalización sumativa de la permanencia.</w:t>
       </w:r>
     </w:p>
     <w:p>
@@ -4700,7 +5010,7 @@
         <w:pStyle w:val="BodyText"/>
       </w:pPr>
       <w:r>
-        <w:t xml:space="preserve">No obstante, la revisión revela una evidente</w:t>
+        <w:t xml:space="preserve">No obstante, a partir del corpus bibliográfico y documental consultado se identifica una clara</w:t>
       </w:r>
       <w:r>
         <w:t xml:space="preserve"> </w:t>
@@ -4710,10 +5020,10 @@
           <w:b/>
           <w:bCs/>
         </w:rPr>
-        <w:t xml:space="preserve">vacancia de conocimiento empírico</w:t>
-      </w:r>
-      <w:r>
-        <w:t xml:space="preserve">: existe abundante literatura sobre la validez métrica del modelo 360° en ámbitos corporativos o en universidades privadas, así como estudios sobre la carrera docente en grandes universidades urbanas argentinas, pero</w:t>
+        <w:t xml:space="preserve">área de vacancia empírica</w:t>
+      </w:r>
+      <w:r>
+        <w:t xml:space="preserve">: si bien la literatura especializada ha abordado la validez métrica del modelo 360° en ámbitos corporativos o en universidades de gestión privada, así como diversos estudios han examinado las transformaciones de la profesión y carrera académica en universidades públicas de grandes centros urbanos,</w:t>
       </w:r>
       <w:r>
         <w:t xml:space="preserve"> </w:t>
@@ -4723,7 +5033,7 @@
           <w:b/>
           <w:bCs/>
         </w:rPr>
-        <w:t xml:space="preserve">se verifica una ausencia de investigaciones científicas sobre la factibilidad integral (organizacional, técnica, normativa y de gobernanza) de implementar un circuito de retroalimentación 360° en una unidad académica pública, descentralizada y patagónica, cogobernada por claustros y con sedes en territorio híbrido</w:t>
+        <w:t xml:space="preserve">en la literatura relevada para este proyecto no se identificaron investigaciones científicas focalizadas en la factibilidad integral (organizacional, técnica, normativa y de gobernanza) de implementar un circuito de retroalimentación 360° en una unidad académica pública, descentralizada y patagónica, estructurada bajo un modelo de cogobierno colegiado y con sedes en territorio bajo modalidades híbridas de enseñanza</w:t>
       </w:r>
       <w:r>
         <w:t xml:space="preserve">.</w:t>
@@ -4734,7 +5044,7 @@
         <w:pStyle w:val="BodyText"/>
       </w:pPr>
       <w:r>
-        <w:t xml:space="preserve">En este espacio de vacancia se inscribe el aporte original y situado del presente Trabajo Final de Graduación.</w:t>
+        <w:t xml:space="preserve">En este espacio de vacancia y oportunidad disciplinar se inscribe el aporte situado del presente Trabajo Final de Graduación.</w:t>
       </w:r>
     </w:p>
     <w:p>
@@ -4742,10 +5052,10 @@
         <w:br w:type="page"/>
       </w:r>
     </w:p>
-    <w:bookmarkEnd w:id="44"/>
-    <w:bookmarkEnd w:id="45"/>
     <w:bookmarkEnd w:id="46"/>
-    <w:bookmarkStart w:id="73" w:name="referencias-bibliográficas"/>
+    <w:bookmarkEnd w:id="47"/>
+    <w:bookmarkEnd w:id="48"/>
+    <w:bookmarkStart w:id="75" w:name="referencias-bibliográficas"/>
     <w:p>
       <w:pPr>
         <w:pStyle w:val="Heading1"/>
@@ -4762,8 +5072,8 @@
         <w:t xml:space="preserve">Referencias Bibliográficas</w:t>
       </w:r>
     </w:p>
-    <w:bookmarkStart w:id="72" w:name="refs"/>
-    <w:bookmarkStart w:id="47" w:name="ref-chiavenato2020"/>
+    <w:bookmarkStart w:id="74" w:name="refs"/>
+    <w:bookmarkStart w:id="49" w:name="ref-chiavenato2020"/>
     <w:p>
       <w:pPr>
         <w:pStyle w:val="Bibliography"/>
@@ -4791,8 +5101,8 @@
         <w:t xml:space="preserve">(5.ª ed.). McGraw-Hill Interamericana.</w:t>
       </w:r>
     </w:p>
-    <w:bookmarkEnd w:id="47"/>
-    <w:bookmarkStart w:id="49" w:name="ref-curza2022"/>
+    <w:bookmarkEnd w:id="49"/>
+    <w:bookmarkStart w:id="51" w:name="ref-curza2022"/>
     <w:p>
       <w:pPr>
         <w:pStyle w:val="Bibliography"/>
@@ -4819,7 +5129,7 @@
       <w:r>
         <w:t xml:space="preserve"> </w:t>
       </w:r>
-      <w:hyperlink r:id="rId48">
+      <w:hyperlink r:id="rId50">
         <w:r>
           <w:rPr>
             <w:rStyle w:val="Hyperlink"/>
@@ -4828,8 +5138,8 @@
         </w:r>
       </w:hyperlink>
     </w:p>
-    <w:bookmarkEnd w:id="49"/>
-    <w:bookmarkStart w:id="50" w:name="ref-uncocurzas2023"/>
+    <w:bookmarkEnd w:id="51"/>
+    <w:bookmarkStart w:id="52" w:name="ref-uncocurzas2023"/>
     <w:p>
       <w:pPr>
         <w:pStyle w:val="Bibliography"/>
@@ -4854,8 +5164,8 @@
         <w:t xml:space="preserve">. Universidad Nacional del Comahue.</w:t>
       </w:r>
     </w:p>
-    <w:bookmarkEnd w:id="50"/>
-    <w:bookmarkStart w:id="52" w:name="ref-delagarza2001"/>
+    <w:bookmarkEnd w:id="52"/>
+    <w:bookmarkStart w:id="54" w:name="ref-delagarza2001"/>
     <w:p>
       <w:pPr>
         <w:pStyle w:val="Bibliography"/>
@@ -4895,7 +5205,7 @@
       <w:r>
         <w:t xml:space="preserve"> </w:t>
       </w:r>
-      <w:hyperlink r:id="rId51">
+      <w:hyperlink r:id="rId53">
         <w:r>
           <w:rPr>
             <w:rStyle w:val="Hyperlink"/>
@@ -4904,8 +5214,8 @@
         </w:r>
       </w:hyperlink>
     </w:p>
-    <w:bookmarkEnd w:id="52"/>
-    <w:bookmarkStart w:id="53" w:name="ref-pen2015"/>
+    <w:bookmarkEnd w:id="54"/>
+    <w:bookmarkStart w:id="55" w:name="ref-pen2015"/>
     <w:p>
       <w:pPr>
         <w:pStyle w:val="Bibliography"/>
@@ -4917,8 +5227,8 @@
         <w:t xml:space="preserve">Decreto N° 1246/2015. Convenio Colectivo de Trabajo para los Docentes de las Instituciones Universitarias Nacionales (2015).</w:t>
       </w:r>
     </w:p>
-    <w:bookmarkEnd w:id="53"/>
-    <w:bookmarkStart w:id="54" w:name="ref-jimenez2008"/>
+    <w:bookmarkEnd w:id="55"/>
+    <w:bookmarkStart w:id="56" w:name="ref-jimenez2008"/>
     <w:p>
       <w:pPr>
         <w:pStyle w:val="Bibliography"/>
@@ -4946,8 +5256,8 @@
         <w:t xml:space="preserve">(pp. 27-42). Universidad Pedagógica Nacional / CLACSO.</w:t>
       </w:r>
     </w:p>
-    <w:bookmarkEnd w:id="54"/>
-    <w:bookmarkStart w:id="55" w:name="ref-lepsinger2009"/>
+    <w:bookmarkEnd w:id="56"/>
+    <w:bookmarkStart w:id="57" w:name="ref-lepsinger2009"/>
     <w:p>
       <w:pPr>
         <w:pStyle w:val="Bibliography"/>
@@ -4975,8 +5285,8 @@
         <w:t xml:space="preserve">(2.ª ed.). Pfeiffer.</w:t>
       </w:r>
     </w:p>
-    <w:bookmarkEnd w:id="55"/>
-    <w:bookmarkStart w:id="56" w:name="ref-ministerio1995"/>
+    <w:bookmarkEnd w:id="57"/>
+    <w:bookmarkStart w:id="58" w:name="ref-ministerio1995"/>
     <w:p>
       <w:pPr>
         <w:pStyle w:val="Bibliography"/>
@@ -4988,8 +5298,8 @@
         <w:t xml:space="preserve">Ley N° 24.521 de Educación Superior (1995).</w:t>
       </w:r>
     </w:p>
-    <w:bookmarkEnd w:id="56"/>
-    <w:bookmarkStart w:id="57" w:name="ref-longo2006"/>
+    <w:bookmarkEnd w:id="58"/>
+    <w:bookmarkStart w:id="59" w:name="ref-longo2006"/>
     <w:p>
       <w:pPr>
         <w:pStyle w:val="Bibliography"/>
@@ -5014,8 +5324,8 @@
         <w:t xml:space="preserve">. Paidós.</w:t>
       </w:r>
     </w:p>
-    <w:bookmarkEnd w:id="57"/>
-    <w:bookmarkStart w:id="58" w:name="ref-matus1993"/>
+    <w:bookmarkEnd w:id="59"/>
+    <w:bookmarkStart w:id="60" w:name="ref-matus1993"/>
     <w:p>
       <w:pPr>
         <w:pStyle w:val="Bibliography"/>
@@ -5040,8 +5350,8 @@
         <w:t xml:space="preserve">. Fundación ALTIDIR.</w:t>
       </w:r>
     </w:p>
-    <w:bookmarkEnd w:id="58"/>
-    <w:bookmarkStart w:id="60" w:name="ref-obando2014"/>
+    <w:bookmarkEnd w:id="60"/>
+    <w:bookmarkStart w:id="62" w:name="ref-obando2014"/>
     <w:p>
       <w:pPr>
         <w:pStyle w:val="Bibliography"/>
@@ -5081,7 +5391,7 @@
       <w:r>
         <w:t xml:space="preserve"> </w:t>
       </w:r>
-      <w:hyperlink r:id="rId59">
+      <w:hyperlink r:id="rId61">
         <w:r>
           <w:rPr>
             <w:rStyle w:val="Hyperlink"/>
@@ -5090,8 +5400,8 @@
         </w:r>
       </w:hyperlink>
     </w:p>
-    <w:bookmarkEnd w:id="60"/>
-    <w:bookmarkStart w:id="61" w:name="ref-oszlak2020"/>
+    <w:bookmarkEnd w:id="62"/>
+    <w:bookmarkStart w:id="63" w:name="ref-oszlak2020"/>
     <w:p>
       <w:pPr>
         <w:pStyle w:val="Bibliography"/>
@@ -5116,8 +5426,8 @@
         <w:t xml:space="preserve">. Instituto Nacional de la Administración Pública.</w:t>
       </w:r>
     </w:p>
-    <w:bookmarkEnd w:id="61"/>
-    <w:bookmarkStart w:id="62" w:name="ref-sautu2005"/>
+    <w:bookmarkEnd w:id="63"/>
+    <w:bookmarkStart w:id="64" w:name="ref-sautu2005"/>
     <w:p>
       <w:pPr>
         <w:pStyle w:val="Bibliography"/>
@@ -5142,8 +5452,8 @@
         <w:t xml:space="preserve">. Lumiere.</w:t>
       </w:r>
     </w:p>
-    <w:bookmarkEnd w:id="62"/>
-    <w:bookmarkStart w:id="64" w:name="ref-sifuentes2016"/>
+    <w:bookmarkEnd w:id="64"/>
+    <w:bookmarkStart w:id="66" w:name="ref-sifuentes2016"/>
     <w:p>
       <w:pPr>
         <w:pStyle w:val="Bibliography"/>
@@ -5183,7 +5493,7 @@
       <w:r>
         <w:t xml:space="preserve"> </w:t>
       </w:r>
-      <w:hyperlink r:id="rId63">
+      <w:hyperlink r:id="rId65">
         <w:r>
           <w:rPr>
             <w:rStyle w:val="Hyperlink"/>
@@ -5192,8 +5502,8 @@
         </w:r>
       </w:hyperlink>
     </w:p>
-    <w:bookmarkEnd w:id="64"/>
-    <w:bookmarkStart w:id="66" w:name="ref-torraco2016"/>
+    <w:bookmarkEnd w:id="66"/>
+    <w:bookmarkStart w:id="68" w:name="ref-torraco2016"/>
     <w:p>
       <w:pPr>
         <w:pStyle w:val="Bibliography"/>
@@ -5233,7 +5543,7 @@
       <w:r>
         <w:t xml:space="preserve"> </w:t>
       </w:r>
-      <w:hyperlink r:id="rId65">
+      <w:hyperlink r:id="rId67">
         <w:r>
           <w:rPr>
             <w:rStyle w:val="Hyperlink"/>
@@ -5242,8 +5552,8 @@
         </w:r>
       </w:hyperlink>
     </w:p>
-    <w:bookmarkEnd w:id="66"/>
-    <w:bookmarkStart w:id="68" w:name="ref-unco1997"/>
+    <w:bookmarkEnd w:id="68"/>
+    <w:bookmarkStart w:id="70" w:name="ref-unco1997"/>
     <w:p>
       <w:pPr>
         <w:pStyle w:val="Bibliography"/>
@@ -5270,7 +5580,7 @@
       <w:r>
         <w:t xml:space="preserve"> </w:t>
       </w:r>
-      <w:hyperlink r:id="rId67">
+      <w:hyperlink r:id="rId69">
         <w:r>
           <w:rPr>
             <w:rStyle w:val="Hyperlink"/>
@@ -5279,8 +5589,8 @@
         </w:r>
       </w:hyperlink>
     </w:p>
-    <w:bookmarkEnd w:id="68"/>
-    <w:bookmarkStart w:id="70" w:name="ref-unco2025"/>
+    <w:bookmarkEnd w:id="70"/>
+    <w:bookmarkStart w:id="72" w:name="ref-unco2025"/>
     <w:p>
       <w:pPr>
         <w:pStyle w:val="Bibliography"/>
@@ -5307,7 +5617,7 @@
       <w:r>
         <w:t xml:space="preserve"> </w:t>
       </w:r>
-      <w:hyperlink r:id="rId69">
+      <w:hyperlink r:id="rId71">
         <w:r>
           <w:rPr>
             <w:rStyle w:val="Hyperlink"/>
@@ -5316,8 +5626,8 @@
         </w:r>
       </w:hyperlink>
     </w:p>
-    <w:bookmarkEnd w:id="70"/>
-    <w:bookmarkStart w:id="71" w:name="ref-wainerman2011"/>
+    <w:bookmarkEnd w:id="72"/>
+    <w:bookmarkStart w:id="73" w:name="ref-wainerman2011"/>
     <w:p>
       <w:pPr>
         <w:pStyle w:val="Bibliography"/>
@@ -5345,9 +5655,9 @@
         <w:t xml:space="preserve">(4.ª ed.). Manantial.</w:t>
       </w:r>
     </w:p>
-    <w:bookmarkEnd w:id="71"/>
-    <w:bookmarkEnd w:id="72"/>
     <w:bookmarkEnd w:id="73"/>
+    <w:bookmarkEnd w:id="74"/>
+    <w:bookmarkEnd w:id="75"/>
     <w:sectPr>
       <w:footerReference w:type="default" r:id="rId11"/>
       <w:footnotePr>
@@ -5827,7 +6137,34 @@
     <w:abstractNumId w:val="991"/>
   </w:num>
   <w:num w:numId="1015">
-    <w:abstractNumId w:val="991"/>
+    <w:abstractNumId w:val="99411"/>
+    <w:lvlOverride w:ilvl="0">
+      <w:startOverride w:val="1"/>
+    </w:lvlOverride>
+    <w:lvlOverride w:ilvl="1">
+      <w:startOverride w:val="1"/>
+    </w:lvlOverride>
+    <w:lvlOverride w:ilvl="2">
+      <w:startOverride w:val="1"/>
+    </w:lvlOverride>
+    <w:lvlOverride w:ilvl="3">
+      <w:startOverride w:val="1"/>
+    </w:lvlOverride>
+    <w:lvlOverride w:ilvl="4">
+      <w:startOverride w:val="1"/>
+    </w:lvlOverride>
+    <w:lvlOverride w:ilvl="5">
+      <w:startOverride w:val="1"/>
+    </w:lvlOverride>
+    <w:lvlOverride w:ilvl="6">
+      <w:startOverride w:val="1"/>
+    </w:lvlOverride>
+    <w:lvlOverride w:ilvl="7">
+      <w:startOverride w:val="1"/>
+    </w:lvlOverride>
+    <w:lvlOverride w:ilvl="8">
+      <w:startOverride w:val="1"/>
+    </w:lvlOverride>
   </w:num>
   <w:num w:numId="1016">
     <w:abstractNumId w:val="991"/>
@@ -5836,6 +6173,9 @@
     <w:abstractNumId w:val="991"/>
   </w:num>
   <w:num w:numId="1018">
+    <w:abstractNumId w:val="991"/>
+  </w:num>
+  <w:num w:numId="1019">
     <w:abstractNumId w:val="99411"/>
     <w:lvlOverride w:ilvl="0">
       <w:startOverride w:val="1"/>

</xml_diff>

<commit_message>
docs: add TP3 research project structure and theoretical framework files
</commit_message>
<xml_diff>
--- a/Entregas/Actividad 3/TP3_Ayarachi_Fuentes.docx
+++ b/Entregas/Actividad 3/TP3_Ayarachi_Fuentes.docx
@@ -977,7 +977,7 @@
           <w:rFonts w:ascii="Arial" w:hAnsi="Arial"/>
           <w:sz w:val="22"/>
         </w:rPr>
-        <w:t>Precisión Categorial: "Claustro" como Categoría Normativa versus "Actores Institucionales" como Categoría Analítica</w:t>
+        <w:t>Precisión Categorial: "Claustro" como Categoría Institucional versus "Actores" como Categoría Analítica</w:t>
       </w:r>
       <w:r>
         <w:tab/>
@@ -3860,7 +3860,7 @@
         <w:t xml:space="preserve"> </w:t>
       </w:r>
       <w:r>
-        <w:t xml:space="preserve">Instancia donde el propio docente reflexiona sobre sus prácticas pedagógicas, el cumplimiento de su planificación académica y los desafíos didácticos experimentados en el aula.</w:t>
+        <w:t xml:space="preserve">Instancia reflexiva donde el propio docente analiza sus prácticas pedagógicas, el cumplimiento de su planificación académica y los desafíos didácticos experimentados en el aula.</w:t>
       </w:r>
     </w:p>
     <w:p>
@@ -3876,13 +3876,13 @@
           <w:b/>
           <w:bCs/>
         </w:rPr>
-        <w:t xml:space="preserve">Coevaluación entre pares o colegas de cátedra:</w:t>
-      </w:r>
-      <w:r>
-        <w:t xml:space="preserve"> </w:t>
-      </w:r>
-      <w:r>
-        <w:t xml:space="preserve">Valoración colegiada realizada por docentes del mismo departamento o equipo, enfocada en la pertinencia conceptual, la rigurosidad disciplinar y el trabajo colaborativo.</w:t>
+        <w:t xml:space="preserve">Coevaluación entre pares (colegas de cátedra y equipo docente):</w:t>
+      </w:r>
+      <w:r>
+        <w:t xml:space="preserve"> </w:t>
+      </w:r>
+      <w:r>
+        <w:t xml:space="preserve">Valoración colegiada realizada por docentes y equipos disciplinares del Departamento, enfocada en la pertinencia conceptual, la rigurosidad disciplinar y el trabajo colaborativo.</w:t>
       </w:r>
     </w:p>
     <w:p>
@@ -3898,13 +3898,13 @@
           <w:b/>
           <w:bCs/>
         </w:rPr>
-        <w:t xml:space="preserve">Heteroevaluación estudiantil:</w:t>
-      </w:r>
-      <w:r>
-        <w:t xml:space="preserve"> </w:t>
-      </w:r>
-      <w:r>
-        <w:t xml:space="preserve">Apreciación de los estudiantes sobre la labor pedagógica, focalizada en la claridad expositiva, la accesibilidad de los recursos didácticos, la retroalimentación oportuna en evaluaciones y la empatía formativa.</w:t>
+        <w:t xml:space="preserve">Heteroevaluación a cargo de estudiantes (participantes del proceso de aprendizaje):</w:t>
+      </w:r>
+      <w:r>
+        <w:t xml:space="preserve"> </w:t>
+      </w:r>
+      <w:r>
+        <w:t xml:space="preserve">Apreciación sistemática realizada por los y las estudiantes sobre la labor pedagógica cotidiana, focalizada en la claridad expositiva, la accesibilidad de los recursos didácticos, la retroalimentación oportuna en evaluaciones y el acompañamiento tutorial (evitando reducir su rol al de un mero estamento electoral o administrativo).</w:t>
       </w:r>
     </w:p>
     <w:p>
@@ -3926,7 +3926,7 @@
         <w:t xml:space="preserve"> </w:t>
       </w:r>
       <w:r>
-        <w:t xml:space="preserve">Mirada estratégica a cargo de la Dirección del Departamento, orientada a evaluar la articulación de la cátedra con el plan de estudios, la participación en proyectos de extensión e investigación y el compromiso con las directrices institucionales.</w:t>
+        <w:t xml:space="preserve">Mirada estratégica a cargo de la Dirección del Departamento y los órganos de coordinación académica, orientada a evaluar la articulación de la cátedra con el plan de estudios, la participación en proyectos de extensión e investigación y el compromiso con las directrices institucionales.</w:t>
       </w:r>
     </w:p>
     <w:p>
@@ -4120,7 +4120,7 @@
         <w:t xml:space="preserve">, que salvaguarda la estabilidad laboral, la libertad de cátedra y las condiciones dignas de trabajo frente a cualquier mecanismo evaluativo susceptible de ser utilizado como herramienta de persecución, flexibilización o sobrecarga laboral.</w:t>
       </w:r>
     </w:p>
-    <w:bookmarkStart w:id="39" w:name="Xf2090d9af5b030916b9e1e2205b3a0e57672f9b"/>
+    <w:bookmarkStart w:id="39" w:name="Xdc98837aef367cb89f0d71e9b5107244f048407"/>
     <w:p>
       <w:pPr>
         <w:pStyle w:val="Heading4"/>
@@ -4138,13 +4138,13 @@
         <w:t xml:space="preserve"> </w:t>
       </w:r>
       <w:r>
-        <w:t xml:space="preserve">como Categoría Normativa versus</w:t>
-      </w:r>
-      <w:r>
-        <w:t xml:space="preserve"> </w:t>
-      </w:r>
-      <w:r>
-        <w:t xml:space="preserve">“Actores Institucionales”</w:t>
+        <w:t xml:space="preserve">como Categoría Institucional versus</w:t>
+      </w:r>
+      <w:r>
+        <w:t xml:space="preserve"> </w:t>
+      </w:r>
+      <w:r>
+        <w:t xml:space="preserve">“Actores”</w:t>
       </w:r>
       <w:r>
         <w:t xml:space="preserve"> </w:t>
@@ -4158,7 +4158,7 @@
         <w:pStyle w:val="FirstParagraph"/>
       </w:pPr>
       <w:r>
-        <w:t xml:space="preserve">Para asegurar la rigurosidad conceptual de la investigación, resulta indispensable formular una distinción analítica en torno al concepto de</w:t>
+        <w:t xml:space="preserve">Para asegurar la rigurosidad conceptual de la investigación, resulta indispensable formular una distinción analítica explícita en torno al concepto de</w:t>
       </w:r>
       <w:r>
         <w:t xml:space="preserve"> </w:t>
@@ -4171,113 +4171,7 @@
         <w:t xml:space="preserve">claustro</w:t>
       </w:r>
       <w:r>
-        <w:t xml:space="preserve">, delimitando su alcance institucional frente a las categorías analíticas adoptadas en este trabajo.</w:t>
-      </w:r>
-    </w:p>
-    <w:p>
-      <w:pPr>
-        <w:pStyle w:val="BodyText"/>
-      </w:pPr>
-      <w:r>
-        <w:t xml:space="preserve">En el plano estrictamente institucional y normativo, tanto la Ley de Educación Superior N° 24.521</w:t>
-      </w:r>
-      <w:r>
-        <w:t xml:space="preserve"> </w:t>
-      </w:r>
-      <w:r>
-        <w:t xml:space="preserve">(Ley N° 24.521 de Educación Superior, 1995)</w:t>
-      </w:r>
-      <w:r>
-        <w:t xml:space="preserve"> </w:t>
-      </w:r>
-      <w:r>
-        <w:t xml:space="preserve">como el Estatuto de la Universidad Nacional del Comahue (Ordenanza CS N° 0988/2025)</w:t>
-      </w:r>
-      <w:r>
-        <w:t xml:space="preserve"> </w:t>
-      </w:r>
-      <w:r>
-        <w:t xml:space="preserve">(Universidad Nacional del Comahue, 2025)</w:t>
-      </w:r>
-      <w:r>
-        <w:t xml:space="preserve"> </w:t>
-      </w:r>
-      <w:r>
-        <w:t xml:space="preserve">apelan a la categoría de</w:t>
-      </w:r>
-      <w:r>
-        <w:t xml:space="preserve"> </w:t>
-      </w:r>
-      <w:r>
-        <w:rPr>
-          <w:i/>
-          <w:iCs/>
-        </w:rPr>
-        <w:t xml:space="preserve">claustro</w:t>
-      </w:r>
-      <w:r>
-        <w:t xml:space="preserve"> </w:t>
-      </w:r>
-      <w:r>
-        <w:t xml:space="preserve">(docente, estudiantil, graduados y nodocente) para definir los estamentos electorales que ejercen la ciudadanía universitaria y componen formalmente los cuerpos colegiados de cogobierno (Asamblea Universitaria, Consejo Superior, Consejo Directivo del CURZAS y Consejos Departamentales). En dicha dimensión legal, el claustro representa una estructura jurídica de delegación y representación política.</w:t>
-      </w:r>
-    </w:p>
-    <w:p>
-      <w:pPr>
-        <w:pStyle w:val="BodyText"/>
-      </w:pPr>
-      <w:r>
-        <w:t xml:space="preserve">Sin embargo, para los propósitos analíticos de este proyecto, la categoría de claustro no puede asumirse como una unidad psicosocial homogénea ni como un sujeto de comportamiento unívoco. Atribuir a un estamento formal intenciones, percepciones o disposiciones psicológicas equivaldría a reificar una categoría normativa. Por ello, la presente investigación adopta como categorías analíticas operativas las nociones de</w:t>
-      </w:r>
-      <w:r>
-        <w:t xml:space="preserve"> </w:t>
-      </w:r>
-      <w:r>
-        <w:rPr>
-          <w:b/>
-          <w:bCs/>
-        </w:rPr>
-        <w:t xml:space="preserve">actores institucionales</w:t>
-      </w:r>
-      <w:r>
-        <w:t xml:space="preserve">,</w:t>
-      </w:r>
-      <w:r>
-        <w:t xml:space="preserve"> </w:t>
-      </w:r>
-      <w:r>
-        <w:rPr>
-          <w:b/>
-          <w:bCs/>
-        </w:rPr>
-        <w:t xml:space="preserve">sujetos pedagógicos reflexivos</w:t>
-      </w:r>
-      <w:r>
-        <w:t xml:space="preserve"> </w:t>
-      </w:r>
-      <w:r>
-        <w:t xml:space="preserve">y</w:t>
-      </w:r>
-      <w:r>
-        <w:t xml:space="preserve"> </w:t>
-      </w:r>
-      <w:r>
-        <w:rPr>
-          <w:b/>
-          <w:bCs/>
-        </w:rPr>
-        <w:t xml:space="preserve">representaciones o percepciones intersubjetivas</w:t>
-      </w:r>
-      <w:r>
-        <w:t xml:space="preserve">.</w:t>
-      </w:r>
-    </w:p>
-    <w:p>
-      <w:pPr>
-        <w:pStyle w:val="BodyText"/>
-      </w:pPr>
-      <w:r>
-        <w:t xml:space="preserve">La retroalimentación 360° y la evaluación formativa del desempeño no interpelan a corporaciones jurídicas abstractas, sino a personas y colectivos situados en la cotidianeidad de las prácticas pedagógicas y de gestión en el CURZAS:</w:t>
+        <w:t xml:space="preserve">, delimitando el lenguaje normativo del análisis sociopolítico y organizacional:</w:t>
       </w:r>
     </w:p>
     <w:p>
@@ -4290,16 +4184,108 @@
       </w:pPr>
       <w:r>
         <w:rPr>
+          <w:b/>
+          <w:bCs/>
+        </w:rPr>
+        <w:t xml:space="preserve">Categoría institucional / normativa (</w:t>
+      </w:r>
+      <w:r>
+        <w:rPr>
+          <w:b/>
+          <w:bCs/>
           <w:i/>
           <w:iCs/>
         </w:rPr>
-        <w:t xml:space="preserve">El docente individual y sus pares de cátedra:</w:t>
-      </w:r>
-      <w:r>
-        <w:t xml:space="preserve"> </w:t>
-      </w:r>
-      <w:r>
-        <w:t xml:space="preserve">sujetos reflexivos que vivencian las exigencias didácticas cotidianas, las mediaciones tecnológicas en la Red de Nodos Territoriales y las necesidades de perfeccionamiento en el marco de la Carrera Docente.</w:t>
+        <w:t xml:space="preserve">claustros</w:t>
+      </w:r>
+      <w:r>
+        <w:rPr>
+          <w:b/>
+          <w:bCs/>
+        </w:rPr>
+        <w:t xml:space="preserve">):</w:t>
+      </w:r>
+      <w:r>
+        <w:t xml:space="preserve"> </w:t>
+      </w:r>
+      <w:r>
+        <w:t xml:space="preserve">Comprende las figuras jurídicas estatuidas por la Ley de Educación Superior N° 24.521</w:t>
+      </w:r>
+      <w:r>
+        <w:t xml:space="preserve"> </w:t>
+      </w:r>
+      <w:r>
+        <w:t xml:space="preserve">(Ley N° 24.521 de Educación Superior, 1995)</w:t>
+      </w:r>
+      <w:r>
+        <w:t xml:space="preserve"> </w:t>
+      </w:r>
+      <w:r>
+        <w:t xml:space="preserve">y el Estatuto de la Universidad Nacional del Comahue (Ordenanza CS N° 0988/2025)</w:t>
+      </w:r>
+      <w:r>
+        <w:t xml:space="preserve"> </w:t>
+      </w:r>
+      <w:r>
+        <w:t xml:space="preserve">(Universidad Nacional del Comahue, 2025)</w:t>
+      </w:r>
+      <w:r>
+        <w:t xml:space="preserve">, a saber:</w:t>
+      </w:r>
+      <w:r>
+        <w:t xml:space="preserve"> </w:t>
+      </w:r>
+      <w:r>
+        <w:rPr>
+          <w:i/>
+          <w:iCs/>
+        </w:rPr>
+        <w:t xml:space="preserve">claustro docente</w:t>
+      </w:r>
+      <w:r>
+        <w:t xml:space="preserve">,</w:t>
+      </w:r>
+      <w:r>
+        <w:t xml:space="preserve"> </w:t>
+      </w:r>
+      <w:r>
+        <w:rPr>
+          <w:i/>
+          <w:iCs/>
+        </w:rPr>
+        <w:t xml:space="preserve">claustro estudiantil</w:t>
+      </w:r>
+      <w:r>
+        <w:t xml:space="preserve">,</w:t>
+      </w:r>
+      <w:r>
+        <w:t xml:space="preserve"> </w:t>
+      </w:r>
+      <w:r>
+        <w:rPr>
+          <w:i/>
+          <w:iCs/>
+        </w:rPr>
+        <w:t xml:space="preserve">claustro nodocente</w:t>
+      </w:r>
+      <w:r>
+        <w:t xml:space="preserve"> </w:t>
+      </w:r>
+      <w:r>
+        <w:t xml:space="preserve">y</w:t>
+      </w:r>
+      <w:r>
+        <w:t xml:space="preserve"> </w:t>
+      </w:r>
+      <w:r>
+        <w:rPr>
+          <w:i/>
+          <w:iCs/>
+        </w:rPr>
+        <w:t xml:space="preserve">claustro de graduados</w:t>
+      </w:r>
+      <w:r>
+        <w:t xml:space="preserve">. Su alcance reside en delimitar los estamentos de representación electoral y conformar los cuerpos colegiados de gobierno universitario (Asamblea Universitaria, Consejo Superior, Consejo Directivo del CURZAS y Consejos Departamentales). Se trata de una categoría jurídica indispensable para definir la gobernanza formal de la institución.</w:t>
       </w:r>
     </w:p>
     <w:p>
@@ -4312,38 +4298,126 @@
       </w:pPr>
       <w:r>
         <w:rPr>
+          <w:b/>
+          <w:bCs/>
+        </w:rPr>
+        <w:t xml:space="preserve">Categoría analítica de la investigación (</w:t>
+      </w:r>
+      <w:r>
+        <w:rPr>
+          <w:b/>
+          <w:bCs/>
           <w:i/>
           <w:iCs/>
         </w:rPr>
-        <w:t xml:space="preserve">Los estudiantes:</w:t>
-      </w:r>
-      <w:r>
-        <w:t xml:space="preserve"> </w:t>
-      </w:r>
-      <w:r>
-        <w:t xml:space="preserve">concebidos no meramente como un estamento de representación política, sino como partícipes directos y activos del proceso formativo, portadores de experiencias, demandas y juicios sobre la calidad del acompañamiento docente.</w:t>
-      </w:r>
-    </w:p>
-    <w:p>
-      <w:pPr>
-        <w:pStyle w:val="Compact"/>
-        <w:numPr>
-          <w:ilvl w:val="0"/>
-          <w:numId w:val="1015"/>
-        </w:numPr>
-      </w:pPr>
+        <w:t xml:space="preserve">actores y sujetos institucionales</w:t>
+      </w:r>
+      <w:r>
+        <w:rPr>
+          <w:b/>
+          <w:bCs/>
+        </w:rPr>
+        <w:t xml:space="preserve">):</w:t>
+      </w:r>
+      <w:r>
+        <w:t xml:space="preserve"> </w:t>
+      </w:r>
+      <w:r>
+        <w:t xml:space="preserve">Comprende a los</w:t>
+      </w:r>
+      <w:r>
+        <w:t xml:space="preserve"> </w:t>
+      </w:r>
       <w:r>
         <w:rPr>
           <w:i/>
           <w:iCs/>
         </w:rPr>
-        <w:t xml:space="preserve">Las autoridades departamentales:</w:t>
-      </w:r>
-      <w:r>
-        <w:t xml:space="preserve"> </w:t>
-      </w:r>
-      <w:r>
-        <w:t xml:space="preserve">en tanto equipo de conducción electo con la responsabilidad de planificar y articular los recursos formativos con las prioridades académicas institucionales.</w:t>
+        <w:t xml:space="preserve">actores institucionales</w:t>
+      </w:r>
+      <w:r>
+        <w:t xml:space="preserve">,</w:t>
+      </w:r>
+      <w:r>
+        <w:t xml:space="preserve"> </w:t>
+      </w:r>
+      <w:r>
+        <w:rPr>
+          <w:i/>
+          <w:iCs/>
+        </w:rPr>
+        <w:t xml:space="preserve">colectivos universitarios</w:t>
+      </w:r>
+      <w:r>
+        <w:t xml:space="preserve">,</w:t>
+      </w:r>
+      <w:r>
+        <w:t xml:space="preserve"> </w:t>
+      </w:r>
+      <w:r>
+        <w:rPr>
+          <w:i/>
+          <w:iCs/>
+        </w:rPr>
+        <w:t xml:space="preserve">participantes</w:t>
+      </w:r>
+      <w:r>
+        <w:t xml:space="preserve">,</w:t>
+      </w:r>
+      <w:r>
+        <w:t xml:space="preserve"> </w:t>
+      </w:r>
+      <w:r>
+        <w:rPr>
+          <w:i/>
+          <w:iCs/>
+        </w:rPr>
+        <w:t xml:space="preserve">pares docentes</w:t>
+      </w:r>
+      <w:r>
+        <w:t xml:space="preserve">,</w:t>
+      </w:r>
+      <w:r>
+        <w:t xml:space="preserve"> </w:t>
+      </w:r>
+      <w:r>
+        <w:rPr>
+          <w:i/>
+          <w:iCs/>
+        </w:rPr>
+        <w:t xml:space="preserve">estudiantes</w:t>
+      </w:r>
+      <w:r>
+        <w:t xml:space="preserve">,</w:t>
+      </w:r>
+      <w:r>
+        <w:t xml:space="preserve"> </w:t>
+      </w:r>
+      <w:r>
+        <w:rPr>
+          <w:i/>
+          <w:iCs/>
+        </w:rPr>
+        <w:t xml:space="preserve">autoridades académicas</w:t>
+      </w:r>
+      <w:r>
+        <w:t xml:space="preserve"> </w:t>
+      </w:r>
+      <w:r>
+        <w:t xml:space="preserve">y</w:t>
+      </w:r>
+      <w:r>
+        <w:t xml:space="preserve"> </w:t>
+      </w:r>
+      <w:r>
+        <w:rPr>
+          <w:i/>
+          <w:iCs/>
+        </w:rPr>
+        <w:t xml:space="preserve">representantes gremiales</w:t>
+      </w:r>
+      <w:r>
+        <w:t xml:space="preserve">. Esta categoría analítica permite captar las prácticas concretas, las representaciones subjetivas, el clima relacional, la confianza intersubjetiva y las disposiciones cotidianas frente al trabajo pedagógico.</w:t>
       </w:r>
     </w:p>
     <w:p>
@@ -4351,152 +4425,19 @@
         <w:pStyle w:val="FirstParagraph"/>
       </w:pPr>
       <w:r>
-        <w:t xml:space="preserve">Esta distinción conceptual permite preservar el valor normativo del claustro en la gobernanza universitaria, al tiempo que habilita una indagación cualitativa situada y empíricamente sólida sobre las complejas dinámicas de confianza, expectativas y resistencias de los sujetos frente a la evaluación docente.</w:t>
-      </w:r>
-    </w:p>
-    <w:bookmarkEnd w:id="39"/>
-    <w:bookmarkStart w:id="40" w:name="Xd19f503ec170ca2f7711abf4686d92b55542094"/>
-    <w:p>
-      <w:pPr>
-        <w:pStyle w:val="Heading4"/>
-      </w:pPr>
-      <w:r>
-        <w:t xml:space="preserve">Condiciones de Viabilidad como Hipótesis de Indagación Abierta</w:t>
-      </w:r>
-    </w:p>
-    <w:p>
-      <w:pPr>
-        <w:pStyle w:val="FirstParagraph"/>
-      </w:pPr>
-      <w:r>
-        <w:t xml:space="preserve">A partir del marco analítico construido, en lugar de predeterminar de forma deductiva las condiciones definitivas de viabilidad,</w:t>
-      </w:r>
-      <w:r>
-        <w:t xml:space="preserve"> </w:t>
-      </w:r>
-      <w:r>
-        <w:rPr>
-          <w:b/>
-          <w:bCs/>
-        </w:rPr>
-        <w:t xml:space="preserve">el proyecto propone explorar si estas condiciones —voluntariedad, anonimato, confidencialidad, carácter formativo e independencia respecto de los mecanismos sumativos de permanencia— constituyen requisitos necesarios para su eventual implementación</w:t>
-      </w:r>
-      <w:r>
-        <w:t xml:space="preserve">.</w:t>
-      </w:r>
-    </w:p>
-    <w:p>
-      <w:pPr>
-        <w:pStyle w:val="BodyText"/>
-      </w:pPr>
-      <w:r>
-        <w:t xml:space="preserve">Desde esta perspectiva metodológica, la factibilidad no se asume como una certeza predefinida, sino como un objeto de indagación empírica abierto: será el trabajo de campo el que permita determinar en qué medida estas garantías son demandadas por los propios actores institucionales del CURZAS, o si emergen otros condicionantes culturales, técnicos o de gobernanza paritaria. La viabilidad se investiga, por ende, en su doble anclaje: la legitimación en los órganos colegiados de cogobierno y la construcción de confianza situada entre los sujetos de la comunidad académica.</w:t>
-      </w:r>
-    </w:p>
-    <w:bookmarkEnd w:id="40"/>
-    <w:bookmarkEnd w:id="41"/>
-    <w:bookmarkEnd w:id="42"/>
-    <w:bookmarkStart w:id="47" w:name="X77155299af2def8333549b16a82948e9810ead2"/>
-    <w:p>
-      <w:pPr>
-        <w:pStyle w:val="Heading2"/>
-        <w:keepNext/>
-        <w:spacing w:before="200" w:after="80" w:line="300" w:lineRule="auto"/>
-      </w:pPr>
-      <w:r>
-        <w:rPr>
-          <w:rFonts w:ascii="Arial" w:hAnsi="Arial"/>
-          <w:b/>
-          <w:sz w:val="24"/>
-        </w:rPr>
-        <w:t xml:space="preserve">Antecedentes: Estado del Arte de la Cuestión</w:t>
-      </w:r>
-    </w:p>
-    <w:p>
-      <w:pPr>
-        <w:pStyle w:val="FirstParagraph"/>
-      </w:pPr>
-      <w:r>
-        <w:t xml:space="preserve">De acuerdo con las pautas metodológicas de la cátedra y las recomendaciones de</w:t>
-      </w:r>
-      <w:r>
-        <w:t xml:space="preserve"> </w:t>
-      </w:r>
-      <w:r>
-        <w:t xml:space="preserve">Torraco (2016)</w:t>
-      </w:r>
-      <w:r>
-        <w:t xml:space="preserve"> </w:t>
-      </w:r>
-      <w:r>
-        <w:t xml:space="preserve">y</w:t>
-      </w:r>
-      <w:r>
-        <w:t xml:space="preserve"> </w:t>
-      </w:r>
-      <w:r>
-        <w:t xml:space="preserve">Jiménez Becerra (2008)</w:t>
-      </w:r>
-      <w:r>
-        <w:t xml:space="preserve">, la construcción de los antecedentes o Estado del Arte no consiste en una reseña acumulativa de lecturas ni en un resumen bibliográfico lineal. Representa un ejercicio analítico e integrador de</w:t>
-      </w:r>
-      <w:r>
-        <w:t xml:space="preserve"> </w:t>
-      </w:r>
-      <w:r>
-        <w:t xml:space="preserve">“investigación de la investigación”</w:t>
-      </w:r>
-      <w:r>
-        <w:t xml:space="preserve">, dirigido a sistematizar la evidencia empírica previa sobre el problema de estudio, identificar metodologías empleadas y precisar con rigurosidad la</w:t>
-      </w:r>
-      <w:r>
-        <w:t xml:space="preserve"> </w:t>
-      </w:r>
-      <w:r>
-        <w:rPr>
-          <w:b/>
-          <w:bCs/>
-        </w:rPr>
-        <w:t xml:space="preserve">vacancia de conocimiento</w:t>
-      </w:r>
-      <w:r>
-        <w:t xml:space="preserve"> </w:t>
-      </w:r>
-      <w:r>
-        <w:t xml:space="preserve">que justifica el desarrollo del presente proyecto.</w:t>
-      </w:r>
-    </w:p>
-    <w:p>
-      <w:pPr>
-        <w:pStyle w:val="BodyText"/>
-      </w:pPr>
-      <w:r>
-        <w:t xml:space="preserve">Para dar cumplimiento a la estructura exigida por el Seminario de Integración y Aplicación, los antecedentes se organizan jerárquicamente en tres niveles geográficos: internacional, nacional y regional/local.</w:t>
-      </w:r>
-    </w:p>
-    <w:bookmarkStart w:id="43" w:name="Xbd1777d47dd01cd8f84e658bc65d384db447afd"/>
-    <w:p>
-      <w:pPr>
-        <w:pStyle w:val="Heading3"/>
-        <w:keepNext/>
-        <w:spacing w:before="160" w:after="40" w:line="300" w:lineRule="auto"/>
-      </w:pPr>
-      <w:r>
-        <w:rPr>
-          <w:rFonts w:ascii="Arial" w:hAnsi="Arial"/>
-          <w:b/>
-          <w:i/>
-          <w:sz w:val="24"/>
-        </w:rPr>
-        <w:t xml:space="preserve">Antecedentes Internacionales: Modelos 360° y Triangulación Evaluativa en la Educación Superior</w:t>
-      </w:r>
-    </w:p>
-    <w:p>
-      <w:pPr>
-        <w:pStyle w:val="FirstParagraph"/>
-      </w:pPr>
-      <w:r>
-        <w:t xml:space="preserve">En el plano internacional, diversos estudios empíricos han examinado la aplicación y los efectos de los modelos de evaluación 360 grados en instituciones universitarias públicas y privadas:</w:t>
+        <w:t xml:space="preserve">Esta diferenciación teórica y metodológica permite conservar el lenguaje jurídico-institucional cuando corresponde, pero evita que la categoría de</w:t>
+      </w:r>
+      <w:r>
+        <w:t xml:space="preserve"> </w:t>
+      </w:r>
+      <w:r>
+        <w:t xml:space="preserve">“claustro”</w:t>
+      </w:r>
+      <w:r>
+        <w:t xml:space="preserve"> </w:t>
+      </w:r>
+      <w:r>
+        <w:t xml:space="preserve">se convierta en un concepto reificado mediante el cual se pretenda explicar de forma simplificada toda la dinámica de gobernanza universitaria. La retroalimentación 360° y la evaluación formativa del desempeño no interpelan a corporaciones jurídicas abstractas, sino a personas y colectivos situados en la cotidianeidad de las prácticas pedagógicas y de gestión en el CURZAS:</w:t>
       </w:r>
     </w:p>
     <w:p>
@@ -4509,45 +4450,16 @@
       </w:pPr>
       <w:r>
         <w:rPr>
-          <w:b/>
-          <w:bCs/>
-        </w:rPr>
-        <w:t xml:space="preserve">Sifuentes Ocegueda, Suárez Flores y Lara González (2016)</w:t>
-      </w:r>
-      <w:r>
-        <w:t xml:space="preserve"> </w:t>
-      </w:r>
-      <w:r>
-        <w:t xml:space="preserve">desarrollaron una investigación empírica titulada</w:t>
-      </w:r>
-      <w:r>
-        <w:t xml:space="preserve"> </w:t>
-      </w:r>
-      <w:r>
-        <w:rPr>
           <w:i/>
           <w:iCs/>
         </w:rPr>
-        <w:t xml:space="preserve">“La evaluación de 360° aplicada al personal docente de nivel superior”</w:t>
-      </w:r>
-      <w:r>
-        <w:t xml:space="preserve">, publicada en la</w:t>
-      </w:r>
-      <w:r>
-        <w:t xml:space="preserve"> </w:t>
-      </w:r>
-      <w:r>
-        <w:rPr>
-          <w:i/>
-          <w:iCs/>
-        </w:rPr>
-        <w:t xml:space="preserve">Revista de Investigación en Tecnologías de la Información (RITI)</w:t>
-      </w:r>
-      <w:r>
-        <w:t xml:space="preserve"> </w:t>
-      </w:r>
-      <w:r>
-        <w:t xml:space="preserve">(Dialnet). El objetivo del estudio consistió en diseñar y evaluar el grado de aceptación de un instrumento 360° para el profesorado universitario en México. Mediante una metodología descriptiva y transversal que abarcó encuestas estructuradas a docentes, directores y estudiantes, los autores concluyeron que el modelo 360° registra un índice de aceptación docente superior al 85% siempre que se respeten tres garantías operativas: el estricto anonimato de los participantes, la entrega de reportes diagnósticos individuales y la ausencia total de penalidades administrativas. Este antecedente aporta a nuestro proyecto una evidencia empírica directa sobre la viabilidad actitudinal del modelo en el contexto universitario iberoamericano.</w:t>
+        <w:t xml:space="preserve">Pares y colegas docentes:</w:t>
+      </w:r>
+      <w:r>
+        <w:t xml:space="preserve"> </w:t>
+      </w:r>
+      <w:r>
+        <w:t xml:space="preserve">sujetos reflexivos que vivencian las exigencias didácticas cotidianas, las mediaciones tecnológicas en la Red de Nodos Territoriales y las necesidades de perfeccionamiento en el marco de la Carrera Docente.</w:t>
       </w:r>
     </w:p>
     <w:p>
@@ -4560,42 +4472,16 @@
       </w:pPr>
       <w:r>
         <w:rPr>
-          <w:b/>
-          <w:bCs/>
-        </w:rPr>
-        <w:t xml:space="preserve">Obando Freire et al. (2014)</w:t>
-      </w:r>
-      <w:r>
-        <w:t xml:space="preserve">, en su artículo</w:t>
-      </w:r>
-      <w:r>
-        <w:t xml:space="preserve"> </w:t>
-      </w:r>
-      <w:r>
-        <w:rPr>
           <w:i/>
           <w:iCs/>
         </w:rPr>
-        <w:t xml:space="preserve">“Sistema de evaluación docente mediante el modelo 360 grados y el portafolio electrónico”</w:t>
-      </w:r>
-      <w:r>
-        <w:t xml:space="preserve">, publicado en la revista</w:t>
-      </w:r>
-      <w:r>
-        <w:t xml:space="preserve"> </w:t>
-      </w:r>
-      <w:r>
-        <w:rPr>
-          <w:i/>
-          <w:iCs/>
-        </w:rPr>
-        <w:t xml:space="preserve">Medisur</w:t>
-      </w:r>
-      <w:r>
-        <w:t xml:space="preserve"> </w:t>
-      </w:r>
-      <w:r>
-        <w:t xml:space="preserve">(SciELO), investigaron la implementación de una plataforma digital para la triangulación evaluativa en el nivel superior en Cuba. Su objetivo fue contrastar la efectividad de las encuestas unilaterales frente a un circuito multiactoral que combina autoevaluación, coevaluación de pares y heteroevaluación de alumnos y autoridades académicas. Entre sus principales hallazgos, demostraron que la evaluación circular mitiga los sesgos de complacencia o castigo inherentes a las encuestas estudiantiles aisladas y estimula en los docentes la autorreflexión sobre sus métodos didácticos. Su aporte a este TFG reside en documentar la factibilidad técnico-operativa de procesar evaluaciones multidireccionales mediante soportes informáticos.</w:t>
+        <w:t xml:space="preserve">Estudiantes y colectivos estudiantiles:</w:t>
+      </w:r>
+      <w:r>
+        <w:t xml:space="preserve"> </w:t>
+      </w:r>
+      <w:r>
+        <w:t xml:space="preserve">concebidos no meramente como un estamento electoral formal, sino como participantes activos del proceso formativo, portadores de experiencias, demandas y juicios sobre la calidad del acompañamiento docente.</w:t>
       </w:r>
     </w:p>
     <w:p>
@@ -4608,55 +4494,170 @@
       </w:pPr>
       <w:r>
         <w:rPr>
+          <w:i/>
+          <w:iCs/>
+        </w:rPr>
+        <w:t xml:space="preserve">Autoridades y equipos de conducción académica:</w:t>
+      </w:r>
+      <w:r>
+        <w:t xml:space="preserve"> </w:t>
+      </w:r>
+      <w:r>
+        <w:t xml:space="preserve">con la responsabilidad de planificar las políticas de enseñanza y articular los recursos formativos con las prioridades institucionales.</w:t>
+      </w:r>
+    </w:p>
+    <w:p>
+      <w:pPr>
+        <w:pStyle w:val="Compact"/>
+        <w:numPr>
+          <w:ilvl w:val="0"/>
+          <w:numId w:val="1016"/>
+        </w:numPr>
+      </w:pPr>
+      <w:r>
+        <w:rPr>
+          <w:i/>
+          <w:iCs/>
+        </w:rPr>
+        <w:t xml:space="preserve">Representaciones gremiales y paritarias:</w:t>
+      </w:r>
+      <w:r>
+        <w:t xml:space="preserve"> </w:t>
+      </w:r>
+      <w:r>
+        <w:t xml:space="preserve">actores clave en la defensa de las condiciones de trabajo, la estabilidad y los resguardos éticos en el marco del Convenio Colectivo de Trabajo Docente</w:t>
+      </w:r>
+      <w:r>
+        <w:t xml:space="preserve"> </w:t>
+      </w:r>
+      <w:r>
+        <w:t xml:space="preserve">(Decreto N° 1246/2015. Convenio Colectivo de Trabajo para los Docentes de las Instituciones Universitarias Nacionales, 2015)</w:t>
+      </w:r>
+      <w:r>
+        <w:t xml:space="preserve">.</w:t>
+      </w:r>
+    </w:p>
+    <w:bookmarkEnd w:id="39"/>
+    <w:bookmarkStart w:id="40" w:name="Xd19f503ec170ca2f7711abf4686d92b55542094"/>
+    <w:p>
+      <w:pPr>
+        <w:pStyle w:val="Heading4"/>
+      </w:pPr>
+      <w:r>
+        <w:t xml:space="preserve">Condiciones de Viabilidad como Hipótesis de Indagación Abierta</w:t>
+      </w:r>
+    </w:p>
+    <w:p>
+      <w:pPr>
+        <w:pStyle w:val="FirstParagraph"/>
+      </w:pPr>
+      <w:r>
+        <w:t xml:space="preserve">A partir del marco analítico construido, el proyecto evita predeterminar de forma deductiva las condiciones definitivas de viabilidad antes de la contrastación en el terreno. Por el contrario,</w:t>
+      </w:r>
+      <w:r>
+        <w:t xml:space="preserve"> </w:t>
+      </w:r>
+      <w:r>
+        <w:rPr>
           <w:b/>
           <w:bCs/>
         </w:rPr>
-        <w:t xml:space="preserve">Reyes y Díaz (2020)</w:t>
-      </w:r>
-      <w:r>
-        <w:t xml:space="preserve"> </w:t>
-      </w:r>
-      <w:r>
-        <w:t xml:space="preserve">llevaron a cabo una investigación evaluativa titulada</w:t>
-      </w:r>
-      <w:r>
-        <w:t xml:space="preserve"> </w:t>
-      </w:r>
-      <w:r>
-        <w:rPr>
-          <w:i/>
-          <w:iCs/>
-        </w:rPr>
-        <w:t xml:space="preserve">“Metaevaluación del sistema de evaluación docente en una universidad pública”</w:t>
-      </w:r>
-      <w:r>
-        <w:t xml:space="preserve">, publicada en</w:t>
-      </w:r>
-      <w:r>
-        <w:t xml:space="preserve"> </w:t>
-      </w:r>
-      <w:r>
-        <w:rPr>
-          <w:i/>
-          <w:iCs/>
-        </w:rPr>
-        <w:t xml:space="preserve">Education Policy Analysis Archives (EPAA)</w:t>
-      </w:r>
-      <w:r>
-        <w:t xml:space="preserve">. Mediante un enfoque metodológico mixto que combinó análisis normativo-documental y entrevistas a profundidad a docentes y autoridades sindicales, los autores evaluaron el impacto institucional de los sistemas de evaluación vigentes en una universidad pública mexicana. Concluyeron que los esquemas evaluativos de corte sumativo producen desconfianza y un</w:t>
-      </w:r>
-      <w:r>
-        <w:t xml:space="preserve"> </w:t>
-      </w:r>
-      <w:r>
-        <w:t xml:space="preserve">“efecto cumplimiento formal”</w:t>
-      </w:r>
-      <w:r>
-        <w:t xml:space="preserve">, donde el docente cumple el trámite administrativo sin transformar su práctica pedagógica. Asimismo, advirtieron que para que una innovación evaluativa prospere en la universidad pública, resulta indispensable que el modelo se oriente al aprendizaje institucional y se encuentre legitimado por los órganos de representación laboral. Este antecedente fundamenta la centralidad de la dimensión de gobernanza en nuestra investigación.</w:t>
-      </w:r>
-    </w:p>
-    <w:bookmarkEnd w:id="43"/>
-    <w:bookmarkStart w:id="44" w:name="X2c0b73cfd018cc54d6ee142a74b81e5b02c3616"/>
+        <w:t xml:space="preserve">el proyecto parte del supuesto de que la viabilidad de un dispositivo de evaluación 360° podría estar condicionada por garantías de voluntariedad, anonimato, confidencialidad y finalidad formativa, cuya relevancia deberá ser contrastada empíricamente en el contexto institucional del CURZAS</w:t>
+      </w:r>
+      <w:r>
+        <w:t xml:space="preserve">.</w:t>
+      </w:r>
+    </w:p>
+    <w:p>
+      <w:pPr>
+        <w:pStyle w:val="BodyText"/>
+      </w:pPr>
+      <w:r>
+        <w:t xml:space="preserve">Desde esta perspectiva metodológica, la factibilidad no se asume como una conclusión anticipada o cerrada, sino como una hipótesis de trabajo y un campo de indagación empírica abierto: corresponderá al trabajo de campo relevar en qué medida estas garantías constituyen condiciones indispensables expresadas por los propios actores institucionales del CURZAS, o si emergen otros condicionantes culturales, técnicos, de sobrecarga operativa o de gobernanza paritaria que deban ser ponderados en el diseño final de la propuesta. La viabilidad se investiga, por ende, en su doble anclaje: la legitimación en los órganos colegiados de cogobierno y la construcción de confianza situada entre los sujetos de la comunidad académica.</w:t>
+      </w:r>
+    </w:p>
+    <w:bookmarkEnd w:id="40"/>
+    <w:bookmarkEnd w:id="41"/>
+    <w:bookmarkEnd w:id="42"/>
+    <w:bookmarkStart w:id="47" w:name="X77155299af2def8333549b16a82948e9810ead2"/>
+    <w:p>
+      <w:pPr>
+        <w:pStyle w:val="Heading2"/>
+        <w:keepNext/>
+        <w:spacing w:before="200" w:after="80" w:line="300" w:lineRule="auto"/>
+      </w:pPr>
+      <w:r>
+        <w:rPr>
+          <w:rFonts w:ascii="Arial" w:hAnsi="Arial"/>
+          <w:b/>
+          <w:sz w:val="24"/>
+        </w:rPr>
+        <w:t xml:space="preserve">Antecedentes: Estado del Arte de la Cuestión</w:t>
+      </w:r>
+    </w:p>
+    <w:p>
+      <w:pPr>
+        <w:pStyle w:val="FirstParagraph"/>
+      </w:pPr>
+      <w:r>
+        <w:t xml:space="preserve">De acuerdo con las pautas metodológicas de la cátedra y las recomendaciones de</w:t>
+      </w:r>
+      <w:r>
+        <w:t xml:space="preserve"> </w:t>
+      </w:r>
+      <w:r>
+        <w:t xml:space="preserve">Torraco (2016)</w:t>
+      </w:r>
+      <w:r>
+        <w:t xml:space="preserve"> </w:t>
+      </w:r>
+      <w:r>
+        <w:t xml:space="preserve">y</w:t>
+      </w:r>
+      <w:r>
+        <w:t xml:space="preserve"> </w:t>
+      </w:r>
+      <w:r>
+        <w:t xml:space="preserve">Jiménez Becerra (2008)</w:t>
+      </w:r>
+      <w:r>
+        <w:t xml:space="preserve">, la construcción de los antecedentes o Estado del Arte no consiste en una reseña acumulativa de lecturas ni en un resumen bibliográfico lineal. Representa un ejercicio analítico e integrador de</w:t>
+      </w:r>
+      <w:r>
+        <w:t xml:space="preserve"> </w:t>
+      </w:r>
+      <w:r>
+        <w:t xml:space="preserve">“investigación de la investigación”</w:t>
+      </w:r>
+      <w:r>
+        <w:t xml:space="preserve">, dirigido a sistematizar la evidencia empírica previa sobre el problema de estudio, identificar metodologías empleadas y precisar con rigurosidad la</w:t>
+      </w:r>
+      <w:r>
+        <w:t xml:space="preserve"> </w:t>
+      </w:r>
+      <w:r>
+        <w:rPr>
+          <w:b/>
+          <w:bCs/>
+        </w:rPr>
+        <w:t xml:space="preserve">vacancia de conocimiento</w:t>
+      </w:r>
+      <w:r>
+        <w:t xml:space="preserve"> </w:t>
+      </w:r>
+      <w:r>
+        <w:t xml:space="preserve">que justifica el desarrollo del presente proyecto.</w:t>
+      </w:r>
+    </w:p>
+    <w:p>
+      <w:pPr>
+        <w:pStyle w:val="BodyText"/>
+      </w:pPr>
+      <w:r>
+        <w:t xml:space="preserve">Para dar cumplimiento a la estructura exigida por el Seminario de Integración y Aplicación, los antecedentes se organizan jerárquicamente en tres niveles geográficos: internacional, nacional y regional/local.</w:t>
+      </w:r>
+    </w:p>
+    <w:bookmarkStart w:id="43" w:name="Xbd1777d47dd01cd8f84e658bc65d384db447afd"/>
     <w:p>
       <w:pPr>
         <w:pStyle w:val="Heading3"/>
@@ -4670,7 +4671,7 @@
           <w:i/>
           <w:sz w:val="24"/>
         </w:rPr>
-        <w:t xml:space="preserve">Antecedentes Nacionales: Evaluación Docente y Carrera Académica en Universidades Públicas Argentinas</w:t>
+        <w:t xml:space="preserve">Antecedentes Internacionales: Modelos 360° y Triangulación Evaluativa en la Educación Superior</w:t>
       </w:r>
     </w:p>
     <w:p>
@@ -4678,7 +4679,7 @@
         <w:pStyle w:val="FirstParagraph"/>
       </w:pPr>
       <w:r>
-        <w:t xml:space="preserve">En el ámbito nacional argentino, la literatura científica ha indagado las tensiones inherentes a la profesión docente universitaria y sus mecanismos de valoración:</w:t>
+        <w:t xml:space="preserve">En el plano internacional, diversos estudios empíricos han examinado la aplicación y los efectos de los modelos de evaluación 360 grados en instituciones universitarias públicas y privadas:</w:t>
       </w:r>
     </w:p>
     <w:p>
@@ -4694,10 +4695,13 @@
           <w:b/>
           <w:bCs/>
         </w:rPr>
-        <w:t xml:space="preserve">Marquina (2012)</w:t>
-      </w:r>
-      <w:r>
-        <w:t xml:space="preserve">, en su estudio empírico</w:t>
+        <w:t xml:space="preserve">Sifuentes Ocegueda, Suárez Flores y Lara González (2016)</w:t>
+      </w:r>
+      <w:r>
+        <w:t xml:space="preserve"> </w:t>
+      </w:r>
+      <w:r>
+        <w:t xml:space="preserve">desarrollaron una investigación empírica titulada</w:t>
       </w:r>
       <w:r>
         <w:t xml:space="preserve"> </w:t>
@@ -4707,10 +4711,10 @@
           <w:i/>
           <w:iCs/>
         </w:rPr>
-        <w:t xml:space="preserve">“¿Hay un nuevo modelo de profesión académica en Argentina? Debates y tendencias en la universidad pública”</w:t>
-      </w:r>
-      <w:r>
-        <w:t xml:space="preserve">, publicado en</w:t>
+        <w:t xml:space="preserve">“La evaluación de 360° aplicada al personal docente de nivel superior”</w:t>
+      </w:r>
+      <w:r>
+        <w:t xml:space="preserve">, publicada en la</w:t>
       </w:r>
       <w:r>
         <w:t xml:space="preserve"> </w:t>
@@ -4720,10 +4724,13 @@
           <w:i/>
           <w:iCs/>
         </w:rPr>
-        <w:t xml:space="preserve">Pensamiento Universitario</w:t>
-      </w:r>
-      <w:r>
-        <w:t xml:space="preserve">, analizó las transformaciones en la labor de los profesores de las universidades nacionales a partir de las exigencias contrapuestas entre la docencia, la investigación y la gestión institucional. A través de un abordaje cualitativo apoyado en entrevistas a docentes y referentes gremiales de diversas universidades públicas, Marquina evidenció que los instrumentos tradicionales de evaluación docente (concursos y permanencias) suelen privilegiar la producción científica abstracta o la acumulación de posgrados por sobre la calidad didáctica en las aulas de grado. Este hallazgo resulta nodal para nuestro TFG, pues justifica la necesidad de generar dispositivos de retroalimentación centrados específicamente en la función formativa y de enseñanza del docente universitario.</w:t>
+        <w:t xml:space="preserve">Revista de Investigación en Tecnologías de la Información (RITI)</w:t>
+      </w:r>
+      <w:r>
+        <w:t xml:space="preserve"> </w:t>
+      </w:r>
+      <w:r>
+        <w:t xml:space="preserve">(Dialnet). El objetivo del estudio consistió en diseñar y evaluar el grado de aceptación de un instrumento 360° para el profesorado universitario en México. Mediante una metodología descriptiva y transversal que abarcó encuestas estructuradas a docentes, directores y estudiantes, los autores concluyeron que el modelo 360° registra un índice de aceptación docente superior al 85% siempre que se respeten tres garantías operativas: el estricto anonimato de los participantes, la entrega de reportes diagnósticos individuales y la ausencia total de penalidades administrativas. Este antecedente aporta a nuestro proyecto una evidencia empírica directa sobre la viabilidad actitudinal del modelo en el contexto universitario iberoamericano.</w:t>
       </w:r>
     </w:p>
     <w:p>
@@ -4739,13 +4746,10 @@
           <w:b/>
           <w:bCs/>
         </w:rPr>
-        <w:t xml:space="preserve">Pérez, González y Castro (2021)</w:t>
-      </w:r>
-      <w:r>
-        <w:t xml:space="preserve"> </w:t>
-      </w:r>
-      <w:r>
-        <w:t xml:space="preserve">publicaron el artículo de investigación empírica</w:t>
+        <w:t xml:space="preserve">Obando Freire et al. (2014)</w:t>
+      </w:r>
+      <w:r>
+        <w:t xml:space="preserve">, en su artículo</w:t>
       </w:r>
       <w:r>
         <w:t xml:space="preserve"> </w:t>
@@ -4755,10 +4759,10 @@
           <w:i/>
           <w:iCs/>
         </w:rPr>
-        <w:t xml:space="preserve">“Evaluación 360° de las tutorías presenciales y en línea en universidades públicas”</w:t>
-      </w:r>
-      <w:r>
-        <w:t xml:space="preserve">, en la revista científica</w:t>
+        <w:t xml:space="preserve">“Sistema de evaluación docente mediante el modelo 360 grados y el portafolio electrónico”</w:t>
+      </w:r>
+      <w:r>
+        <w:t xml:space="preserve">, publicado en la revista</w:t>
       </w:r>
       <w:r>
         <w:t xml:space="preserve"> </w:t>
@@ -4768,17 +4772,74 @@
           <w:i/>
           <w:iCs/>
         </w:rPr>
-        <w:t xml:space="preserve">Unaciencia</w:t>
-      </w:r>
-      <w:r>
-        <w:t xml:space="preserve"> </w:t>
-      </w:r>
-      <w:r>
-        <w:t xml:space="preserve">(Redalyc). El estudio evaluó la factibilidad de aplicar la metodología 360° para valorar el desempeño de docentes universitarios con funciones tutoriales presenciales y mediadas por tecnologías virtuales. Mediante un diseño metodológico descriptivo aplicado a estudiantes, docentes tutores y coordinadores, el trabajo concluyó que el modelo 360° demostró una capacidad significativamente superior para captar competencias pedagógicas blandas (comunicación asertiva, empatía, acompañamiento en entornos virtuales) en comparación con las rúbricas estandarizadas tradicionales. Este antecedente aporta un valor metodológico e instrumental directo para el CURZAS-UNCo, donde la docencia universitaria se despliega crecientemente de forma híbrida articulando la sede central con los Nodos Territoriales.</w:t>
-      </w:r>
-    </w:p>
-    <w:bookmarkEnd w:id="44"/>
-    <w:bookmarkStart w:id="45" w:name="X868ada8a3209befb2b1ff6a8414801be884be61"/>
+        <w:t xml:space="preserve">Medisur</w:t>
+      </w:r>
+      <w:r>
+        <w:t xml:space="preserve"> </w:t>
+      </w:r>
+      <w:r>
+        <w:t xml:space="preserve">(SciELO), investigaron la implementación de una plataforma digital para la triangulación evaluativa en el nivel superior en Cuba. Su objetivo fue contrastar la efectividad de las encuestas unilaterales frente a un circuito multiactoral que combina autoevaluación, coevaluación de pares y heteroevaluación de alumnos y autoridades académicas. Entre sus principales hallazgos, demostraron que la evaluación circular mitiga los sesgos de complacencia o castigo inherentes a las encuestas estudiantiles aisladas y estimula en los docentes la autorreflexión sobre sus métodos didácticos. Su aporte a este TFG reside en documentar la factibilidad técnico-operativa de procesar evaluaciones multidireccionales mediante soportes informáticos.</w:t>
+      </w:r>
+    </w:p>
+    <w:p>
+      <w:pPr>
+        <w:pStyle w:val="Compact"/>
+        <w:numPr>
+          <w:ilvl w:val="0"/>
+          <w:numId w:val="1017"/>
+        </w:numPr>
+      </w:pPr>
+      <w:r>
+        <w:rPr>
+          <w:b/>
+          <w:bCs/>
+        </w:rPr>
+        <w:t xml:space="preserve">Reyes y Díaz (2020)</w:t>
+      </w:r>
+      <w:r>
+        <w:t xml:space="preserve"> </w:t>
+      </w:r>
+      <w:r>
+        <w:t xml:space="preserve">llevaron a cabo una investigación evaluativa titulada</w:t>
+      </w:r>
+      <w:r>
+        <w:t xml:space="preserve"> </w:t>
+      </w:r>
+      <w:r>
+        <w:rPr>
+          <w:i/>
+          <w:iCs/>
+        </w:rPr>
+        <w:t xml:space="preserve">“Metaevaluación del sistema de evaluación docente en una universidad pública”</w:t>
+      </w:r>
+      <w:r>
+        <w:t xml:space="preserve">, publicada en</w:t>
+      </w:r>
+      <w:r>
+        <w:t xml:space="preserve"> </w:t>
+      </w:r>
+      <w:r>
+        <w:rPr>
+          <w:i/>
+          <w:iCs/>
+        </w:rPr>
+        <w:t xml:space="preserve">Education Policy Analysis Archives (EPAA)</w:t>
+      </w:r>
+      <w:r>
+        <w:t xml:space="preserve">. Mediante un enfoque metodológico mixto que combinó análisis normativo-documental y entrevistas a profundidad a docentes y autoridades sindicales, los autores evaluaron el impacto institucional de los sistemas de evaluación vigentes en una universidad pública mexicana. Concluyeron que los esquemas evaluativos de corte sumativo producen desconfianza y un</w:t>
+      </w:r>
+      <w:r>
+        <w:t xml:space="preserve"> </w:t>
+      </w:r>
+      <w:r>
+        <w:t xml:space="preserve">“efecto cumplimiento formal”</w:t>
+      </w:r>
+      <w:r>
+        <w:t xml:space="preserve">, donde el docente cumple el trámite administrativo sin transformar su práctica pedagógica. Asimismo, advirtieron que para que una innovación evaluativa prospere en la universidad pública, resulta indispensable que el modelo se oriente al aprendizaje institucional y se encuentre legitimado por los órganos de representación laboral. Este antecedente fundamenta la centralidad de la dimensión de gobernanza en nuestra investigación.</w:t>
+      </w:r>
+    </w:p>
+    <w:bookmarkEnd w:id="43"/>
+    <w:bookmarkStart w:id="44" w:name="X2c0b73cfd018cc54d6ee142a74b81e5b02c3616"/>
     <w:p>
       <w:pPr>
         <w:pStyle w:val="Heading3"/>
@@ -4792,7 +4853,7 @@
           <w:i/>
           <w:sz w:val="24"/>
         </w:rPr>
-        <w:t xml:space="preserve">Antecedentes Regionales y Locales: Prácticas de Evaluación y Contexto Institucional en la UNCo y el CURZAS</w:t>
+        <w:t xml:space="preserve">Antecedentes Nacionales: Evaluación Docente y Carrera Académica en Universidades Públicas Argentinas</w:t>
       </w:r>
     </w:p>
     <w:p>
@@ -4800,7 +4861,7 @@
         <w:pStyle w:val="FirstParagraph"/>
       </w:pPr>
       <w:r>
-        <w:t xml:space="preserve">En el plano regional y local patagónico, los antecedentes normativos e institucionales vinculados a la Universidad Nacional del Comahue y al Complejo Universitario Regional Zona Atlántica y Sur (CURZAS) permiten delimitar con precisión empírica el estado de situación de partida:</w:t>
+        <w:t xml:space="preserve">En el ámbito nacional argentino, la literatura científica ha indagado las tensiones inherentes a la profesión docente universitaria y sus mecanismos de valoración:</w:t>
       </w:r>
     </w:p>
     <w:p>
@@ -4816,72 +4877,36 @@
           <w:b/>
           <w:bCs/>
         </w:rPr>
-        <w:t xml:space="preserve">Marco Estatutario Consolidado (Ordenanza CS N° 0988/2025 — Estatuto UNCo):</w:t>
-      </w:r>
-      <w:r>
-        <w:t xml:space="preserve"> </w:t>
-      </w:r>
-      <w:r>
-        <w:t xml:space="preserve">Aprobado por la Asamblea Universitaria como texto ordenado del Estatuto de la Universidad Nacional del Comahue</w:t>
-      </w:r>
-      <w:r>
-        <w:t xml:space="preserve"> </w:t>
-      </w:r>
-      <w:r>
-        <w:t xml:space="preserve">(Universidad Nacional del Comahue, 2025)</w:t>
-      </w:r>
-      <w:r>
-        <w:t xml:space="preserve">, este cuerpo normativo jerarquiza y define formalmente al CURZAS como Complejo Universitario Regional (Art. 17 y Disposición Transitoria Cuarta). En su Título X (</w:t>
-      </w:r>
-      <w:r>
-        <w:t xml:space="preserve">“De la Carrera Docente”</w:t>
-      </w:r>
-      <w:r>
-        <w:t xml:space="preserve">, Arts. 65 a 76), el Estatuto consolida el régimen integral de permanencia académica, articulando dos dispositivos evaluativos estatutarios:</w:t>
-      </w:r>
-    </w:p>
-    <w:p>
-      <w:pPr>
-        <w:pStyle w:val="Compact"/>
-        <w:numPr>
-          <w:ilvl w:val="1"/>
-          <w:numId w:val="1019"/>
-        </w:numPr>
-      </w:pPr>
+        <w:t xml:space="preserve">Marquina (2012)</w:t>
+      </w:r>
+      <w:r>
+        <w:t xml:space="preserve">, en su estudio empírico</w:t>
+      </w:r>
+      <w:r>
+        <w:t xml:space="preserve"> </w:t>
+      </w:r>
       <w:r>
         <w:rPr>
           <w:i/>
           <w:iCs/>
         </w:rPr>
-        <w:t xml:space="preserve">Informes Anuales de Cátedra (Art. 74):</w:t>
-      </w:r>
-      <w:r>
-        <w:t xml:space="preserve"> </w:t>
-      </w:r>
-      <w:r>
-        <w:t xml:space="preserve">Que comprenden la memoria de actividades, el plan de avance pedagógico, la opinión fundada de la Dirección del Departamento y los resultados de las encuestas estudiantiles obligatorias.</w:t>
-      </w:r>
-    </w:p>
-    <w:p>
-      <w:pPr>
-        <w:pStyle w:val="Compact"/>
-        <w:numPr>
-          <w:ilvl w:val="1"/>
-          <w:numId w:val="1019"/>
-        </w:numPr>
-      </w:pPr>
+        <w:t xml:space="preserve">“¿Hay un nuevo modelo de profesión académica en Argentina? Debates y tendencias en la universidad pública”</w:t>
+      </w:r>
+      <w:r>
+        <w:t xml:space="preserve">, publicado en</w:t>
+      </w:r>
+      <w:r>
+        <w:t xml:space="preserve"> </w:t>
+      </w:r>
       <w:r>
         <w:rPr>
           <w:i/>
           <w:iCs/>
         </w:rPr>
-        <w:t xml:space="preserve">Evaluaciones Periódicas Cuatrienales de Permanencia (Art. 75):</w:t>
-      </w:r>
-      <w:r>
-        <w:t xml:space="preserve"> </w:t>
-      </w:r>
-      <w:r>
-        <w:t xml:space="preserve">Llevadas a cabo por tribunales integrados por dos evaluadores externos de la disciplina y un veedor con voz y voto del claustro estudiantil (inc. a). Asimismo, el Art. 76 instituye la obligación departamental de formular programas anuales de formación y perfeccionamiento de recursos humanos docentes.</w:t>
+        <w:t xml:space="preserve">Pensamiento Universitario</w:t>
+      </w:r>
+      <w:r>
+        <w:t xml:space="preserve">, analizó las transformaciones en la labor de los profesores de las universidades nacionales a partir de las exigencias contrapuestas entre la docencia, la investigación y la gestión institucional. A través de un abordaje cualitativo apoyado en entrevistas a docentes y referentes gremiales de diversas universidades públicas, Marquina evidenció que los instrumentos tradicionales de evaluación docente (concursos y permanencias) suelen privilegiar la producción científica abstracta o la acumulación de posgrados por sobre la calidad didáctica en las aulas de grado. Este hallazgo resulta nodal para nuestro TFG, pues justifica la necesidad de generar dispositivos de retroalimentación centrados específicamente en la función formativa y de enseñanza del docente universitario.</w:t>
       </w:r>
     </w:p>
     <w:p>
@@ -4897,34 +4922,68 @@
           <w:b/>
           <w:bCs/>
         </w:rPr>
-        <w:t xml:space="preserve">Régimen General de Carrera Docente de la UNCo (Ordenanza CS N° 0910/1997 y modificatorias hasta la Ord. CS N° 0887/2021):</w:t>
-      </w:r>
-      <w:r>
-        <w:t xml:space="preserve"> </w:t>
-      </w:r>
-      <w:r>
-        <w:t xml:space="preserve">En el Digesto oficial de la universidad, el Reglamento de Carrera Docente</w:t>
-      </w:r>
-      <w:r>
-        <w:t xml:space="preserve"> </w:t>
-      </w:r>
-      <w:r>
-        <w:t xml:space="preserve">(Universidad Nacional del Comahue, 1997)</w:t>
-      </w:r>
-      <w:r>
-        <w:t xml:space="preserve"> </w:t>
-      </w:r>
-      <w:r>
-        <w:t xml:space="preserve">norma en su Capítulo III el procedimiento operativo para la presentación y valoración de informes docentes, encuestas estudiantiles y criterios de permanencia, en plena armonización con el Convenio Colectivo de Trabajo Docente Universitario (Decreto PEN N° 1246/2015)</w:t>
-      </w:r>
-      <w:r>
-        <w:t xml:space="preserve"> </w:t>
-      </w:r>
-      <w:r>
-        <w:t xml:space="preserve">(Decreto N° 1246/2015. Convenio Colectivo de Trabajo para los Docentes de las Instituciones Universitarias Nacionales, 2015)</w:t>
-      </w:r>
-      <w:r>
-        <w:t xml:space="preserve">. Los registros institucionales muestran que, si bien estos instrumentos garantizan con solidez jurídica el control administrativo y sumativo de la estabilidad laboral, se advierte entre los actores institucionales una demanda no resuelta y un área de vacancia analítica respecto al desarrollo de circuitos sistemáticos de retroalimentación formativa y confidencial que orienten la mejora continua del ejercicio docente.</w:t>
+        <w:t xml:space="preserve">Pérez, González y Castro (2021)</w:t>
+      </w:r>
+      <w:r>
+        <w:t xml:space="preserve"> </w:t>
+      </w:r>
+      <w:r>
+        <w:t xml:space="preserve">publicaron el artículo de investigación empírica</w:t>
+      </w:r>
+      <w:r>
+        <w:t xml:space="preserve"> </w:t>
+      </w:r>
+      <w:r>
+        <w:rPr>
+          <w:i/>
+          <w:iCs/>
+        </w:rPr>
+        <w:t xml:space="preserve">“Evaluación 360° de las tutorías presenciales y en línea en universidades públicas”</w:t>
+      </w:r>
+      <w:r>
+        <w:t xml:space="preserve">, en la revista científica</w:t>
+      </w:r>
+      <w:r>
+        <w:t xml:space="preserve"> </w:t>
+      </w:r>
+      <w:r>
+        <w:rPr>
+          <w:i/>
+          <w:iCs/>
+        </w:rPr>
+        <w:t xml:space="preserve">Unaciencia</w:t>
+      </w:r>
+      <w:r>
+        <w:t xml:space="preserve"> </w:t>
+      </w:r>
+      <w:r>
+        <w:t xml:space="preserve">(Redalyc). El estudio evaluó la factibilidad de aplicar la metodología 360° para valorar el desempeño de docentes universitarios con funciones tutoriales presenciales y mediadas por tecnologías virtuales. Mediante un diseño metodológico descriptivo aplicado a estudiantes, docentes tutores y coordinadores, el trabajo concluyó que el modelo 360° demostró una capacidad significativamente superior para captar competencias pedagógicas blandas (comunicación asertiva, empatía, acompañamiento en entornos virtuales) en comparación con las rúbricas estandarizadas tradicionales. Este antecedente aporta un valor metodológico e instrumental directo para el CURZAS-UNCo, donde la docencia universitaria se despliega crecientemente de forma híbrida articulando la sede central con los Nodos Territoriales.</w:t>
+      </w:r>
+    </w:p>
+    <w:bookmarkEnd w:id="44"/>
+    <w:bookmarkStart w:id="45" w:name="X868ada8a3209befb2b1ff6a8414801be884be61"/>
+    <w:p>
+      <w:pPr>
+        <w:pStyle w:val="Heading3"/>
+        <w:keepNext/>
+        <w:spacing w:before="160" w:after="40" w:line="300" w:lineRule="auto"/>
+      </w:pPr>
+      <w:r>
+        <w:rPr>
+          <w:rFonts w:ascii="Arial" w:hAnsi="Arial"/>
+          <w:b/>
+          <w:i/>
+          <w:sz w:val="24"/>
+        </w:rPr>
+        <w:t xml:space="preserve">Antecedentes Regionales y Locales: Prácticas de Evaluación y Contexto Institucional en la UNCo y el CURZAS</w:t>
+      </w:r>
+    </w:p>
+    <w:p>
+      <w:pPr>
+        <w:pStyle w:val="FirstParagraph"/>
+      </w:pPr>
+      <w:r>
+        <w:t xml:space="preserve">En el plano regional y local patagónico, los antecedentes normativos e institucionales vinculados a la Universidad Nacional del Comahue y al Complejo Universitario Regional Zona Atlántica y Sur (CURZAS) permiten delimitar con precisión empírica el estado de situación de partida:</w:t>
       </w:r>
     </w:p>
     <w:p>
@@ -4932,7 +4991,131 @@
         <w:pStyle w:val="Compact"/>
         <w:numPr>
           <w:ilvl w:val="0"/>
-          <w:numId w:val="1018"/>
+          <w:numId w:val="1019"/>
+        </w:numPr>
+      </w:pPr>
+      <w:r>
+        <w:rPr>
+          <w:b/>
+          <w:bCs/>
+        </w:rPr>
+        <w:t xml:space="preserve">Marco Estatutario Consolidado (Ordenanza CS N° 0988/2025 — Estatuto UNCo):</w:t>
+      </w:r>
+      <w:r>
+        <w:t xml:space="preserve"> </w:t>
+      </w:r>
+      <w:r>
+        <w:t xml:space="preserve">Aprobado por la Asamblea Universitaria como texto ordenado del Estatuto de la Universidad Nacional del Comahue</w:t>
+      </w:r>
+      <w:r>
+        <w:t xml:space="preserve"> </w:t>
+      </w:r>
+      <w:r>
+        <w:t xml:space="preserve">(Universidad Nacional del Comahue, 2025)</w:t>
+      </w:r>
+      <w:r>
+        <w:t xml:space="preserve">, este cuerpo normativo jerarquiza y define formalmente al CURZAS como Complejo Universitario Regional (Art. 17 y Disposición Transitoria Cuarta). En su Título X (</w:t>
+      </w:r>
+      <w:r>
+        <w:t xml:space="preserve">“De la Carrera Docente”</w:t>
+      </w:r>
+      <w:r>
+        <w:t xml:space="preserve">, Arts. 65 a 76), el Estatuto consolida el régimen integral de permanencia académica, articulando dos dispositivos evaluativos estatutarios:</w:t>
+      </w:r>
+    </w:p>
+    <w:p>
+      <w:pPr>
+        <w:pStyle w:val="Compact"/>
+        <w:numPr>
+          <w:ilvl w:val="1"/>
+          <w:numId w:val="1020"/>
+        </w:numPr>
+      </w:pPr>
+      <w:r>
+        <w:rPr>
+          <w:i/>
+          <w:iCs/>
+        </w:rPr>
+        <w:t xml:space="preserve">Informes Anuales de Cátedra (Art. 74):</w:t>
+      </w:r>
+      <w:r>
+        <w:t xml:space="preserve"> </w:t>
+      </w:r>
+      <w:r>
+        <w:t xml:space="preserve">Que comprenden la memoria de actividades, el plan de avance pedagógico, la opinión fundada de la Dirección del Departamento y los resultados de las encuestas estudiantiles obligatorias.</w:t>
+      </w:r>
+    </w:p>
+    <w:p>
+      <w:pPr>
+        <w:pStyle w:val="Compact"/>
+        <w:numPr>
+          <w:ilvl w:val="1"/>
+          <w:numId w:val="1020"/>
+        </w:numPr>
+      </w:pPr>
+      <w:r>
+        <w:rPr>
+          <w:i/>
+          <w:iCs/>
+        </w:rPr>
+        <w:t xml:space="preserve">Evaluaciones Periódicas Cuatrienales de Permanencia (Art. 75):</w:t>
+      </w:r>
+      <w:r>
+        <w:t xml:space="preserve"> </w:t>
+      </w:r>
+      <w:r>
+        <w:t xml:space="preserve">Llevadas a cabo por tribunales integrados por dos evaluadores externos de la disciplina y un veedor con voz y voto del claustro estudiantil (inc. a). Asimismo, el Art. 76 instituye la obligación departamental de formular programas anuales de formación y perfeccionamiento de recursos humanos docentes.</w:t>
+      </w:r>
+    </w:p>
+    <w:p>
+      <w:pPr>
+        <w:pStyle w:val="Compact"/>
+        <w:numPr>
+          <w:ilvl w:val="0"/>
+          <w:numId w:val="1019"/>
+        </w:numPr>
+      </w:pPr>
+      <w:r>
+        <w:rPr>
+          <w:b/>
+          <w:bCs/>
+        </w:rPr>
+        <w:t xml:space="preserve">Régimen General de Carrera Docente de la UNCo (Ordenanza CS N° 0910/1997 y modificatorias hasta la Ord. CS N° 0887/2021):</w:t>
+      </w:r>
+      <w:r>
+        <w:t xml:space="preserve"> </w:t>
+      </w:r>
+      <w:r>
+        <w:t xml:space="preserve">En el Digesto oficial de la universidad, el Reglamento de Carrera Docente</w:t>
+      </w:r>
+      <w:r>
+        <w:t xml:space="preserve"> </w:t>
+      </w:r>
+      <w:r>
+        <w:t xml:space="preserve">(Universidad Nacional del Comahue, 1997)</w:t>
+      </w:r>
+      <w:r>
+        <w:t xml:space="preserve"> </w:t>
+      </w:r>
+      <w:r>
+        <w:t xml:space="preserve">norma en su Capítulo III el procedimiento operativo para la presentación y valoración de informes docentes, encuestas estudiantiles y criterios de permanencia, en plena armonización con el Convenio Colectivo de Trabajo Docente Universitario (Decreto PEN N° 1246/2015)</w:t>
+      </w:r>
+      <w:r>
+        <w:t xml:space="preserve"> </w:t>
+      </w:r>
+      <w:r>
+        <w:t xml:space="preserve">(Decreto N° 1246/2015. Convenio Colectivo de Trabajo para los Docentes de las Instituciones Universitarias Nacionales, 2015)</w:t>
+      </w:r>
+      <w:r>
+        <w:t xml:space="preserve">. Los registros institucionales muestran que, si bien estos instrumentos garantizan con solidez jurídica el control administrativo y sumativo de la estabilidad laboral, se advierte entre los actores institucionales una demanda no resuelta y un área de vacancia analítica respecto al desarrollo de circuitos sistemáticos de retroalimentación formativa y confidencial que orienten la mejora continua del ejercicio docente.</w:t>
+      </w:r>
+    </w:p>
+    <w:p>
+      <w:pPr>
+        <w:pStyle w:val="Compact"/>
+        <w:numPr>
+          <w:ilvl w:val="0"/>
+          <w:numId w:val="1019"/>
         </w:numPr>
       </w:pPr>
       <w:r>
@@ -6137,6 +6320,9 @@
     <w:abstractNumId w:val="991"/>
   </w:num>
   <w:num w:numId="1015">
+    <w:abstractNumId w:val="991"/>
+  </w:num>
+  <w:num w:numId="1016">
     <w:abstractNumId w:val="99411"/>
     <w:lvlOverride w:ilvl="0">
       <w:startOverride w:val="1"/>
@@ -6166,9 +6352,6 @@
       <w:startOverride w:val="1"/>
     </w:lvlOverride>
   </w:num>
-  <w:num w:numId="1016">
-    <w:abstractNumId w:val="991"/>
-  </w:num>
   <w:num w:numId="1017">
     <w:abstractNumId w:val="991"/>
   </w:num>
@@ -6176,6 +6359,9 @@
     <w:abstractNumId w:val="991"/>
   </w:num>
   <w:num w:numId="1019">
+    <w:abstractNumId w:val="991"/>
+  </w:num>
+  <w:num w:numId="1020">
     <w:abstractNumId w:val="99411"/>
     <w:lvlOverride w:ilvl="0">
       <w:startOverride w:val="1"/>

</xml_diff>

<commit_message>
feat: add Quarto source files, bibliography, and compiled documents for Actividad 3
</commit_message>
<xml_diff>
--- a/Entregas/Actividad 3/TP3_Ayarachi_Fuentes.docx
+++ b/Entregas/Actividad 3/TP3_Ayarachi_Fuentes.docx
@@ -771,7 +771,7 @@
           <w:rFonts w:ascii="Arial" w:hAnsi="Arial"/>
           <w:sz w:val="22"/>
         </w:rPr>
-        <w:t>8</w:t>
+        <w:t>9</w:t>
       </w:r>
     </w:p>
     <w:p>
@@ -950,7 +950,7 @@
           <w:rFonts w:ascii="Arial" w:hAnsi="Arial"/>
           <w:sz w:val="22"/>
         </w:rPr>
-        <w:t>Gobernanza Universitaria, Cogobierno y Negociación Paritaria Docente</w:t>
+        <w:t>Gobernanza Universitaria Multinivel, Cogobierno y Negociación Paritaria Docente</w:t>
       </w:r>
       <w:r>
         <w:tab/>
@@ -1014,7 +1014,7 @@
           <w:rFonts w:ascii="Arial" w:hAnsi="Arial"/>
           <w:sz w:val="22"/>
         </w:rPr>
-        <w:t>16</w:t>
+        <w:t>17</w:t>
       </w:r>
     </w:p>
     <w:p>
@@ -1041,7 +1041,7 @@
           <w:rFonts w:ascii="Arial" w:hAnsi="Arial"/>
           <w:sz w:val="22"/>
         </w:rPr>
-        <w:t>16</w:t>
+        <w:t>17</w:t>
       </w:r>
     </w:p>
     <w:p>
@@ -1095,7 +1095,7 @@
           <w:rFonts w:ascii="Arial" w:hAnsi="Arial"/>
           <w:sz w:val="22"/>
         </w:rPr>
-        <w:t>18</w:t>
+        <w:t>19</w:t>
       </w:r>
     </w:p>
     <w:p>
@@ -1149,7 +1149,7 @@
           <w:rFonts w:ascii="Arial" w:hAnsi="Arial"/>
           <w:sz w:val="22"/>
         </w:rPr>
-        <w:t>20</w:t>
+        <w:t>21</w:t>
       </w:r>
     </w:p>
     <w:p>
@@ -1176,7 +1176,7 @@
           <w:rFonts w:ascii="Arial" w:hAnsi="Arial"/>
           <w:sz w:val="22"/>
         </w:rPr>
-        <w:t>21</w:t>
+        <w:t>22</w:t>
       </w:r>
     </w:p>
     <w:p>
@@ -2071,13 +2071,13 @@
           <w:b/>
           <w:bCs/>
         </w:rPr>
-        <w:t xml:space="preserve">Factibilidad de Gobernanza y Diálogo Institucional:</w:t>
-      </w:r>
-      <w:r>
-        <w:t xml:space="preserve"> </w:t>
-      </w:r>
-      <w:r>
-        <w:t xml:space="preserve">Posibilidad de construir acuerdos en el seno del Consejo Departamental, instancias de cogobierno y representaciones gremiales docentes para consensuar criterios, resguardos de confidencialidad y el uso pedagógico de los resultados</w:t>
+        <w:t xml:space="preserve">Factibilidad de Gobernanza Multinivel y Diálogo Institucional:</w:t>
+      </w:r>
+      <w:r>
+        <w:t xml:space="preserve"> </w:t>
+      </w:r>
+      <w:r>
+        <w:t xml:space="preserve">Posibilidad de construir acuerdos en el seno de la poligobernanza universitaria (macro, meso, micro territorial y sociolaboral) con las representaciones docentes y los órganos colegiados de cogobierno, garantizando que el modelo preserve su finalidad de desarrollo formativo y perfeccionamiento pedagógico continuo</w:t>
       </w:r>
       <w:r>
         <w:t xml:space="preserve"> </w:t>
@@ -2186,13 +2186,13 @@
           <w:b/>
           <w:bCs/>
         </w:rPr>
-        <w:t xml:space="preserve">Dimensión de Gobernanza y Diálogo Institucional:</w:t>
-      </w:r>
-      <w:r>
-        <w:t xml:space="preserve"> </w:t>
-      </w:r>
-      <w:r>
-        <w:t xml:space="preserve">Se explorará mediante entrevistas a autoridades departamentales y delegados gremiales. Los indicadores incluyen: consensos sobre el uso de la información, mecanismos de consulta previa y articulación de los hallazgos con los programas de capacitación docente del Departamento.</w:t>
+        <w:t xml:space="preserve">Dimensión de Gobernanza Multinivel y Diálogo Institucional:</w:t>
+      </w:r>
+      <w:r>
+        <w:t xml:space="preserve"> </w:t>
+      </w:r>
+      <w:r>
+        <w:t xml:space="preserve">Se explorará mediante entrevistas a autoridades departamentales, referentes de cogobierno y representaciones gremiales docentes. Los indicadores incluyen: consensos sobre el uso formativo de la información en el marco de la poligobernanza institucional, mecanismos de consulta previa y articulación de los hallazgos con los programas de capacitación docente del Departamento.</w:t>
       </w:r>
     </w:p>
     <w:bookmarkEnd w:id="22"/>
@@ -2320,7 +2320,7 @@
         <w:pStyle w:val="BlockText"/>
       </w:pPr>
       <w:r>
-        <w:t xml:space="preserve">¿Cuáles son las condiciones de factibilidad organizacional, técnica, normativa y de gobernanza para la implementación de un modelo de retroalimentación multiactoral (360°) en la evaluación del desempeño docente en el Departamento de Administración Pública del CURZAS-UNCo durante el período 2025–2026?</w:t>
+        <w:t xml:space="preserve">¿Cuáles son las condiciones de factibilidad organizacional, técnica, normativa y de gobernanza multinivel para la implementación de un modelo de retroalimentación multiactoral (360°) en la evaluación del desempeño docente en el Departamento de Administración Pública del CURZAS-UNCo durante el período 2025–2026?</w:t>
       </w:r>
     </w:p>
     <w:bookmarkEnd w:id="25"/>
@@ -2554,7 +2554,7 @@
         </w:numPr>
       </w:pPr>
       <w:r>
-        <w:t xml:space="preserve">Determinar las condiciones de factibilidad organizacional, técnica, normativa y de gobernanza para la implementación de un modelo de retroalimentación multiactoral (360°) en la evaluación del desempeño docente en el Departamento de Administración Pública del CURZAS-UNCo (2025–2026).</w:t>
+        <w:t xml:space="preserve">Determinar las condiciones de factibilidad organizacional, técnica, normativa y de gobernanza multinivel para la implementación de un modelo de retroalimentación multiactoral (360°) en la evaluación del desempeño docente en el Departamento de Administración Pública del CURZAS-UNCo (2025–2026).</w:t>
       </w:r>
     </w:p>
     <w:bookmarkEnd w:id="31"/>
@@ -2608,7 +2608,7 @@
         </w:numPr>
       </w:pPr>
       <w:r>
-        <w:t xml:space="preserve">Identificar los condicionantes técnico-organizacionales, normativos y de gobernanza (acuerdos paritarios, normativa vigente de carrera docente y evaluación, confidencialidad y cogobierno) que inciden en la factibilidad del modelo.</w:t>
+        <w:t xml:space="preserve">Identificar los condicionantes técnico-organizacionales, normativos y de gobernanza multinivel (acuerdos paritarios, normativa vigente de carrera docente y evaluación, confidencialidad y cogobierno) que inciden en la factibilidad del modelo en el marco de la poligobernanza institucional.</w:t>
       </w:r>
     </w:p>
     <w:p>
@@ -2755,6 +2755,11 @@
       </w:pPr>
       <w:r>
         <w:t xml:space="preserve">En consecuencia, el modelo de Longo no se utiliza únicamente como encuadre teórico, sino como criterio de lectura para analizar la articulación entre evaluación del desempeño, desarrollo de capacidades docentes, organización del trabajo y relaciones institucionales, permitiendo identificar condiciones que favorecen o limitan la factibilidad de una retroalimentación 360°.</w:t>
+      </w:r>
+    </w:p>
+    <w:p>
+      <w:r>
+        <w:br w:type="page"/>
       </w:r>
     </w:p>
     <w:tbl>
@@ -2773,10 +2778,10 @@
         </w:tblBorders>
       </w:tblPr>
       <w:tblGrid>
-        <w:gridCol w:w="1980"/>
-        <w:gridCol w:w="1980"/>
-        <w:gridCol w:w="1980"/>
-        <w:gridCol w:w="1980"/>
+        <w:gridCol w:w="1270"/>
+        <w:gridCol w:w="2615"/>
+        <w:gridCol w:w="2017"/>
+        <w:gridCol w:w="2017"/>
       </w:tblGrid>
       <w:tr>
         <w:trPr>
@@ -2882,7 +2887,7 @@
               <w:t xml:space="preserve"> </w:t>
             </w:r>
             <w:r>
-              <w:t xml:space="preserve">Determinación de condiciones de factibilidad organizacional, técnica, normativa y de gobernanza para la retroalimentación 360°</w:t>
+              <w:t xml:space="preserve">Determinación de condiciones de factibilidad organizacional, técnica, normativa y de gobernanza multinivel para la retroalimentación 360°</w:t>
             </w:r>
           </w:p>
         </w:tc>
@@ -2995,7 +3000,7 @@
                 <w:i/>
                 <w:iCs/>
               </w:rPr>
-              <w:t xml:space="preserve">Evaluación vigente y perfiles/funciones docentes según Estatuto y Ord. CS N° 0910/1997 y modificatorias</w:t>
+              <w:t xml:space="preserve">Evaluación vigente y perfiles/funciones docentes según Estatuto y Ord. CS N° 0910/1997</w:t>
             </w:r>
             <w:r>
               <w:t xml:space="preserve">)</w:t>
@@ -3128,13 +3133,13 @@
                 <w:b/>
                 <w:bCs/>
               </w:rPr>
-              <w:t xml:space="preserve">Dimensión normativa y de gobernanza:</w:t>
+              <w:t xml:space="preserve">Dimensión normativa y de gobernanza multinivel:</w:t>
             </w:r>
             <w:r>
               <w:t xml:space="preserve"> </w:t>
             </w:r>
             <w:r>
-              <w:t xml:space="preserve">Identificación de condicionantes paritarios, normativos, gremiales y de confidencialidad</w:t>
+              <w:t xml:space="preserve">Identificación de condicionantes de cogobierno, paritarios y normativos de la poligobernanza institucional</w:t>
             </w:r>
           </w:p>
         </w:tc>
@@ -3163,7 +3168,7 @@
                 <w:i/>
                 <w:iCs/>
               </w:rPr>
-              <w:t xml:space="preserve">Condiciones de trabajo, estabilidad y normativa vigente de carrera docente</w:t>
+              <w:t xml:space="preserve">Condiciones de trabajo, estabilidad y carrera docente</w:t>
             </w:r>
             <w:r>
               <w:t xml:space="preserve">)</w:t>
@@ -3947,7 +3952,7 @@
       </w:r>
     </w:p>
     <w:bookmarkEnd w:id="38"/>
-    <w:bookmarkStart w:id="41" w:name="Xefa297f413be63d6451681d2fe2c4ab63fd02c2"/>
+    <w:bookmarkStart w:id="41" w:name="X3c26948e283d8e10bd039db6e5542a6686a8cc2"/>
     <w:p>
       <w:pPr>
         <w:pStyle w:val="Heading3"/>
@@ -3961,7 +3966,7 @@
           <w:i/>
           <w:sz w:val="24"/>
         </w:rPr>
-        <w:t xml:space="preserve">Gobernanza Universitaria, Cogobierno y Negociación Paritaria Docente</w:t>
+        <w:t xml:space="preserve">Gobernanza Universitaria Multinivel, Cogobierno y Negociación Paritaria Docente</w:t>
       </w:r>
     </w:p>
     <w:p>
@@ -3985,6 +3990,22 @@
         <w:t xml:space="preserve"> </w:t>
       </w:r>
       <w:r>
+        <w:t xml:space="preserve">y, específicamente, la configuración de una</w:t>
+      </w:r>
+      <w:r>
+        <w:t xml:space="preserve"> </w:t>
+      </w:r>
+      <w:r>
+        <w:rPr>
+          <w:b/>
+          <w:bCs/>
+        </w:rPr>
+        <w:t xml:space="preserve">gobernanza multinivel o poligobernanza institucional</w:t>
+      </w:r>
+      <w:r>
+        <w:t xml:space="preserve"> </w:t>
+      </w:r>
+      <w:r>
         <w:t xml:space="preserve">en el marco de la Administración Pública argentina</w:t>
       </w:r>
       <w:r>
@@ -3994,7 +4015,16 @@
         <w:t xml:space="preserve">(Matus, 1993; Oszlak, 2020)</w:t>
       </w:r>
       <w:r>
-        <w:t xml:space="preserve">.</w:t>
+        <w:t xml:space="preserve">. Esta perspectiva analítica —que articula los aportes sobre la gestión pública estratégica y las arenas de decisión compartida con el marco de</w:t>
+      </w:r>
+      <w:r>
+        <w:t xml:space="preserve"> </w:t>
+      </w:r>
+      <w:r>
+        <w:t xml:space="preserve">Longo (2006)</w:t>
+      </w:r>
+      <w:r>
+        <w:t xml:space="preserve">— permite conceptualizar la organización universitaria no como una estructura piramidal unívoca, sino como un entramado complejo de relaciones institucionales y multiactorales.</w:t>
       </w:r>
     </w:p>
     <w:p>
@@ -4002,29 +4032,23 @@
         <w:pStyle w:val="BodyText"/>
       </w:pPr>
       <w:r>
-        <w:t xml:space="preserve">Siguiendo a Carlos</w:t>
-      </w:r>
-      <w:r>
-        <w:t xml:space="preserve"> </w:t>
-      </w:r>
-      <w:r>
-        <w:t xml:space="preserve">Matus (1993)</w:t>
-      </w:r>
-      <w:r>
-        <w:t xml:space="preserve">, la gestión en organizaciones estatales complejas se desenvuelve en escenarios de poder compartido y conflicto legítimo de intereses. Las decisiones no se imponen jerárquicamente por decreto; requieren construir consensos sobre</w:t>
-      </w:r>
-      <w:r>
-        <w:t xml:space="preserve"> </w:t>
-      </w:r>
-      <w:r>
-        <w:rPr>
-          <w:i/>
-          <w:iCs/>
-        </w:rPr>
-        <w:t xml:space="preserve">variables de control compartido</w:t>
-      </w:r>
-      <w:r>
-        <w:t xml:space="preserve">. En la Universidad Nacional del Comahue y su sede descentralizada en Viedma (CURZAS), la gobernanza institucional se sustenta en tres instituciones fundamentales:</w:t>
+        <w:t xml:space="preserve">Lejos de operar como una categoría abstracta o decorativa, el concepto de</w:t>
+      </w:r>
+      <w:r>
+        <w:t xml:space="preserve"> </w:t>
+      </w:r>
+      <w:r>
+        <w:rPr>
+          <w:b/>
+          <w:bCs/>
+        </w:rPr>
+        <w:t xml:space="preserve">poligobernanza</w:t>
+      </w:r>
+      <w:r>
+        <w:t xml:space="preserve"> </w:t>
+      </w:r>
+      <w:r>
+        <w:t xml:space="preserve">describe en esta investigación la coexistencia articulada y tensionada de múltiples centros de decisión, competencias y fuentes de legitimidad institucional que conviven en el CURZAS-UNCo:</w:t>
       </w:r>
     </w:p>
     <w:p>
@@ -4037,25 +4061,16 @@
       </w:pPr>
       <w:r>
         <w:rPr>
-          <w:b/>
-          <w:bCs/>
-        </w:rPr>
-        <w:t xml:space="preserve">El principio de cogobierno colegiado:</w:t>
-      </w:r>
-      <w:r>
-        <w:t xml:space="preserve"> </w:t>
-      </w:r>
-      <w:r>
-        <w:t xml:space="preserve">Consagrado en el Estatuto de la UNCo (Ordenanza CS N° 0988/2025, texto ordenado)</w:t>
-      </w:r>
-      <w:r>
-        <w:t xml:space="preserve"> </w:t>
-      </w:r>
-      <w:r>
-        <w:t xml:space="preserve">(Universidad Nacional del Comahue, 2025)</w:t>
-      </w:r>
-      <w:r>
-        <w:t xml:space="preserve">, donde las decisiones de política académica departamental son deliberadas y votadas por representantes de los claustros docente, estudiantil, nodocente y de graduados en el Consejo Directivo y los Consejos Departamentales.</w:t>
+          <w:i/>
+          <w:iCs/>
+        </w:rPr>
+        <w:t xml:space="preserve">Nivel Macro o Central (Neuquén):</w:t>
+      </w:r>
+      <w:r>
+        <w:t xml:space="preserve"> </w:t>
+      </w:r>
+      <w:r>
+        <w:t xml:space="preserve">El Rectorado y el Consejo Superior de la UNCo, donde se definen las políticas presupuestarias, las normas estatutarias y los marcos de Carrera Docente (Ordenanza CS N° 0988/2025 y Ord. CS N° 0910/1997).</w:t>
       </w:r>
     </w:p>
     <w:p>
@@ -4068,25 +4083,16 @@
       </w:pPr>
       <w:r>
         <w:rPr>
-          <w:b/>
-          <w:bCs/>
-        </w:rPr>
-        <w:t xml:space="preserve">El régimen de Carrera Docente:</w:t>
-      </w:r>
-      <w:r>
-        <w:t xml:space="preserve"> </w:t>
-      </w:r>
-      <w:r>
-        <w:t xml:space="preserve">Normado por la Ordenanza CS N° 0910/1997 (con sus normas modificatorias y complementarias hasta la Ord. CS N° 0887/2021)</w:t>
-      </w:r>
-      <w:r>
-        <w:t xml:space="preserve"> </w:t>
-      </w:r>
-      <w:r>
-        <w:t xml:space="preserve">(Universidad Nacional del Comahue, 1997)</w:t>
-      </w:r>
-      <w:r>
-        <w:t xml:space="preserve">, que establece mecanismos estatutarios periódicos de evaluación de inserción y permanencia mediante informes anuales y jurados evaluadores cuatrienales externos.</w:t>
+          <w:i/>
+          <w:iCs/>
+        </w:rPr>
+        <w:t xml:space="preserve">Nivel Meso o Regional Descentralizado (Viedma):</w:t>
+      </w:r>
+      <w:r>
+        <w:t xml:space="preserve"> </w:t>
+      </w:r>
+      <w:r>
+        <w:t xml:space="preserve">El Consejo Directivo del CURZAS y la Dirección del Departamento de Administración Pública, encargados de la gestión operativa, la planificación de cátedras y los planes anuales de formación docente.</w:t>
       </w:r>
     </w:p>
     <w:p>
@@ -4099,58 +4105,38 @@
       </w:pPr>
       <w:r>
         <w:rPr>
-          <w:b/>
-          <w:bCs/>
-        </w:rPr>
-        <w:t xml:space="preserve">La negociación paritaria y el Convenio Colectivo de Trabajo:</w:t>
-      </w:r>
-      <w:r>
-        <w:t xml:space="preserve"> </w:t>
-      </w:r>
-      <w:r>
-        <w:t xml:space="preserve">Regido a nivel nacional por el Decreto PEN N° 1246/2015</w:t>
-      </w:r>
-      <w:r>
-        <w:t xml:space="preserve"> </w:t>
-      </w:r>
-      <w:r>
-        <w:t xml:space="preserve">(Decreto N° 1246/2015. Convenio Colectivo de Trabajo para los Docentes de las Instituciones Universitarias Nacionales, 2015)</w:t>
-      </w:r>
-      <w:r>
-        <w:t xml:space="preserve">, que salvaguarda la estabilidad laboral, la libertad de cátedra y las condiciones dignas de trabajo frente a cualquier mecanismo evaluativo susceptible de ser utilizado como herramienta de persecución, flexibilización o sobrecarga laboral.</w:t>
-      </w:r>
-    </w:p>
-    <w:bookmarkStart w:id="39" w:name="Xdc98837aef367cb89f0d71e9b5107244f048407"/>
-    <w:p>
-      <w:pPr>
-        <w:pStyle w:val="Heading4"/>
-      </w:pPr>
-      <w:r>
-        <w:t xml:space="preserve">Precisión Categorial:</w:t>
-      </w:r>
-      <w:r>
-        <w:t xml:space="preserve"> </w:t>
-      </w:r>
-      <w:r>
-        <w:t xml:space="preserve">“Claustro”</w:t>
-      </w:r>
-      <w:r>
-        <w:t xml:space="preserve"> </w:t>
-      </w:r>
-      <w:r>
-        <w:t xml:space="preserve">como Categoría Institucional versus</w:t>
-      </w:r>
-      <w:r>
-        <w:t xml:space="preserve"> </w:t>
-      </w:r>
-      <w:r>
-        <w:t xml:space="preserve">“Actores”</w:t>
-      </w:r>
-      <w:r>
-        <w:t xml:space="preserve"> </w:t>
-      </w:r>
-      <w:r>
-        <w:t xml:space="preserve">como Categoría Analítica</w:t>
+          <w:i/>
+          <w:iCs/>
+        </w:rPr>
+        <w:t xml:space="preserve">Nivel Micro o Territorial (Red de Nodos Universitarios):</w:t>
+      </w:r>
+      <w:r>
+        <w:t xml:space="preserve"> </w:t>
+      </w:r>
+      <w:r>
+        <w:t xml:space="preserve">Localidades de la Línea Sur y la Costa Atlántica rionegrina (Sierra Grande, Valcheta, Los Menucos y Ramos Mexía), donde las modalidades híbridas imponen nuevas mediaciones pedagógicas y requerimientos tutoriales sincrónicos y asincrónicos.</w:t>
+      </w:r>
+    </w:p>
+    <w:p>
+      <w:pPr>
+        <w:pStyle w:val="Compact"/>
+        <w:numPr>
+          <w:ilvl w:val="0"/>
+          <w:numId w:val="1014"/>
+        </w:numPr>
+      </w:pPr>
+      <w:r>
+        <w:rPr>
+          <w:i/>
+          <w:iCs/>
+        </w:rPr>
+        <w:t xml:space="preserve">Nivel Sociolaboral y Paritario:</w:t>
+      </w:r>
+      <w:r>
+        <w:t xml:space="preserve"> </w:t>
+      </w:r>
+      <w:r>
+        <w:t xml:space="preserve">La representación gremial docente, que resguarda las condiciones laborales, la estabilidad y la no punitividad en el marco del Convenio Colectivo de Trabajo (Decreto PEN N° 1246/2015).</w:t>
       </w:r>
     </w:p>
     <w:p>
@@ -4158,7 +4144,16 @@
         <w:pStyle w:val="FirstParagraph"/>
       </w:pPr>
       <w:r>
-        <w:t xml:space="preserve">Para asegurar la rigurosidad conceptual de la investigación, resulta indispensable formular una distinción analítica explícita en torno al concepto de</w:t>
+        <w:t xml:space="preserve">Siguiendo a Carlos</w:t>
+      </w:r>
+      <w:r>
+        <w:t xml:space="preserve"> </w:t>
+      </w:r>
+      <w:r>
+        <w:t xml:space="preserve">Matus (1993)</w:t>
+      </w:r>
+      <w:r>
+        <w:t xml:space="preserve">, la gestión en este entramado de poligobernanza se desenvuelve en escenarios de poder compartido y conflicto legítimo de intereses. Las decisiones no se imponen jerárquicamente por decreto; requieren construir consensos sobre</w:t>
       </w:r>
       <w:r>
         <w:t xml:space="preserve"> </w:t>
@@ -4168,10 +4163,10 @@
           <w:i/>
           <w:iCs/>
         </w:rPr>
-        <w:t xml:space="preserve">claustro</w:t>
-      </w:r>
-      <w:r>
-        <w:t xml:space="preserve">, delimitando el lenguaje normativo del análisis sociopolítico y organizacional:</w:t>
+        <w:t xml:space="preserve">variables de control compartido</w:t>
+      </w:r>
+      <w:r>
+        <w:t xml:space="preserve">. En el CURZAS, esta trama institucional se sustenta en tres pilares fundamentales:</w:t>
       </w:r>
     </w:p>
     <w:p>
@@ -4187,41 +4182,13 @@
           <w:b/>
           <w:bCs/>
         </w:rPr>
-        <w:t xml:space="preserve">Categoría institucional / normativa (</w:t>
-      </w:r>
-      <w:r>
-        <w:rPr>
-          <w:b/>
-          <w:bCs/>
-          <w:i/>
-          <w:iCs/>
-        </w:rPr>
-        <w:t xml:space="preserve">claustros</w:t>
-      </w:r>
-      <w:r>
-        <w:rPr>
-          <w:b/>
-          <w:bCs/>
-        </w:rPr>
-        <w:t xml:space="preserve">):</w:t>
-      </w:r>
-      <w:r>
-        <w:t xml:space="preserve"> </w:t>
-      </w:r>
-      <w:r>
-        <w:t xml:space="preserve">Comprende las figuras jurídicas estatuidas por la Ley de Educación Superior N° 24.521</w:t>
-      </w:r>
-      <w:r>
-        <w:t xml:space="preserve"> </w:t>
-      </w:r>
-      <w:r>
-        <w:t xml:space="preserve">(Ley N° 24.521 de Educación Superior, 1995)</w:t>
-      </w:r>
-      <w:r>
-        <w:t xml:space="preserve"> </w:t>
-      </w:r>
-      <w:r>
-        <w:t xml:space="preserve">y el Estatuto de la Universidad Nacional del Comahue (Ordenanza CS N° 0988/2025)</w:t>
+        <w:t xml:space="preserve">El principio de cogobierno colegiado:</w:t>
+      </w:r>
+      <w:r>
+        <w:t xml:space="preserve"> </w:t>
+      </w:r>
+      <w:r>
+        <w:t xml:space="preserve">Consagrado en el Estatuto de la UNCo (Ordenanza CS N° 0988/2025, texto ordenado)</w:t>
       </w:r>
       <w:r>
         <w:t xml:space="preserve"> </w:t>
@@ -4230,62 +4197,7 @@
         <w:t xml:space="preserve">(Universidad Nacional del Comahue, 2025)</w:t>
       </w:r>
       <w:r>
-        <w:t xml:space="preserve">, a saber:</w:t>
-      </w:r>
-      <w:r>
-        <w:t xml:space="preserve"> </w:t>
-      </w:r>
-      <w:r>
-        <w:rPr>
-          <w:i/>
-          <w:iCs/>
-        </w:rPr>
-        <w:t xml:space="preserve">claustro docente</w:t>
-      </w:r>
-      <w:r>
-        <w:t xml:space="preserve">,</w:t>
-      </w:r>
-      <w:r>
-        <w:t xml:space="preserve"> </w:t>
-      </w:r>
-      <w:r>
-        <w:rPr>
-          <w:i/>
-          <w:iCs/>
-        </w:rPr>
-        <w:t xml:space="preserve">claustro estudiantil</w:t>
-      </w:r>
-      <w:r>
-        <w:t xml:space="preserve">,</w:t>
-      </w:r>
-      <w:r>
-        <w:t xml:space="preserve"> </w:t>
-      </w:r>
-      <w:r>
-        <w:rPr>
-          <w:i/>
-          <w:iCs/>
-        </w:rPr>
-        <w:t xml:space="preserve">claustro nodocente</w:t>
-      </w:r>
-      <w:r>
-        <w:t xml:space="preserve"> </w:t>
-      </w:r>
-      <w:r>
-        <w:t xml:space="preserve">y</w:t>
-      </w:r>
-      <w:r>
-        <w:t xml:space="preserve"> </w:t>
-      </w:r>
-      <w:r>
-        <w:rPr>
-          <w:i/>
-          <w:iCs/>
-        </w:rPr>
-        <w:t xml:space="preserve">claustro de graduados</w:t>
-      </w:r>
-      <w:r>
-        <w:t xml:space="preserve">. Su alcance reside en delimitar los estamentos de representación electoral y conformar los cuerpos colegiados de gobierno universitario (Asamblea Universitaria, Consejo Superior, Consejo Directivo del CURZAS y Consejos Departamentales). Se trata de una categoría jurídica indispensable para definir la gobernanza formal de la institución.</w:t>
+        <w:t xml:space="preserve">, donde las decisiones de política académica departamental son deliberadas y votadas por representantes de los claustros docente, estudiantil, nodocente y de graduados en el Consejo Directivo y los Consejos Departamentales.</w:t>
       </w:r>
     </w:p>
     <w:p>
@@ -4301,143 +4213,107 @@
           <w:b/>
           <w:bCs/>
         </w:rPr>
-        <w:t xml:space="preserve">Categoría analítica de la investigación (</w:t>
-      </w:r>
+        <w:t xml:space="preserve">El régimen de Carrera Docente:</w:t>
+      </w:r>
+      <w:r>
+        <w:t xml:space="preserve"> </w:t>
+      </w:r>
+      <w:r>
+        <w:t xml:space="preserve">Normado por la Ordenanza CS N° 0910/1997 (con sus normas modificatorias y complementarias hasta la Ord. CS N° 0887/2021)</w:t>
+      </w:r>
+      <w:r>
+        <w:t xml:space="preserve"> </w:t>
+      </w:r>
+      <w:r>
+        <w:t xml:space="preserve">(Universidad Nacional del Comahue, 1997)</w:t>
+      </w:r>
+      <w:r>
+        <w:t xml:space="preserve">, que establece mecanismos estatutarios periódicos de evaluación de inserción y permanencia mediante informes anuales y jurados evaluadores cuatrienales externos.</w:t>
+      </w:r>
+    </w:p>
+    <w:p>
+      <w:pPr>
+        <w:pStyle w:val="Compact"/>
+        <w:numPr>
+          <w:ilvl w:val="0"/>
+          <w:numId w:val="1015"/>
+        </w:numPr>
+      </w:pPr>
       <w:r>
         <w:rPr>
           <w:b/>
           <w:bCs/>
+        </w:rPr>
+        <w:t xml:space="preserve">La negociación paritaria y el Convenio Colectivo de Trabajo:</w:t>
+      </w:r>
+      <w:r>
+        <w:t xml:space="preserve"> </w:t>
+      </w:r>
+      <w:r>
+        <w:t xml:space="preserve">Regido a nivel nacional por el Decreto PEN N° 1246/2015</w:t>
+      </w:r>
+      <w:r>
+        <w:t xml:space="preserve"> </w:t>
+      </w:r>
+      <w:r>
+        <w:t xml:space="preserve">(Decreto N° 1246/2015. Convenio Colectivo de Trabajo para los Docentes de las Instituciones Universitarias Nacionales, 2015)</w:t>
+      </w:r>
+      <w:r>
+        <w:t xml:space="preserve">, que salvaguarda la estabilidad laboral, la libertad de cátedra y las condiciones dignas de trabajo frente a cualquier mecanismo evaluativo susceptible de ser utilizado como herramienta de persecución, flexibilización o sobrecarga laboral.</w:t>
+      </w:r>
+    </w:p>
+    <w:bookmarkStart w:id="39" w:name="Xdc98837aef367cb89f0d71e9b5107244f048407"/>
+    <w:p>
+      <w:pPr>
+        <w:pStyle w:val="Heading4"/>
+      </w:pPr>
+      <w:r>
+        <w:t xml:space="preserve">Precisión Categorial:</w:t>
+      </w:r>
+      <w:r>
+        <w:t xml:space="preserve"> </w:t>
+      </w:r>
+      <w:r>
+        <w:t xml:space="preserve">“Claustro”</w:t>
+      </w:r>
+      <w:r>
+        <w:t xml:space="preserve"> </w:t>
+      </w:r>
+      <w:r>
+        <w:t xml:space="preserve">como Categoría Institucional versus</w:t>
+      </w:r>
+      <w:r>
+        <w:t xml:space="preserve"> </w:t>
+      </w:r>
+      <w:r>
+        <w:t xml:space="preserve">“Actores”</w:t>
+      </w:r>
+      <w:r>
+        <w:t xml:space="preserve"> </w:t>
+      </w:r>
+      <w:r>
+        <w:t xml:space="preserve">como Categoría Analítica</w:t>
+      </w:r>
+    </w:p>
+    <w:p>
+      <w:pPr>
+        <w:pStyle w:val="FirstParagraph"/>
+      </w:pPr>
+      <w:r>
+        <w:t xml:space="preserve">Para asegurar la rigurosidad conceptual de la investigación, resulta indispensable formular una distinción analítica explícita en torno al concepto de</w:t>
+      </w:r>
+      <w:r>
+        <w:t xml:space="preserve"> </w:t>
+      </w:r>
+      <w:r>
+        <w:rPr>
           <w:i/>
           <w:iCs/>
         </w:rPr>
-        <w:t xml:space="preserve">actores y sujetos institucionales</w:t>
-      </w:r>
-      <w:r>
-        <w:rPr>
-          <w:b/>
-          <w:bCs/>
-        </w:rPr>
-        <w:t xml:space="preserve">):</w:t>
-      </w:r>
-      <w:r>
-        <w:t xml:space="preserve"> </w:t>
-      </w:r>
-      <w:r>
-        <w:t xml:space="preserve">Comprende a los</w:t>
-      </w:r>
-      <w:r>
-        <w:t xml:space="preserve"> </w:t>
-      </w:r>
-      <w:r>
-        <w:rPr>
-          <w:i/>
-          <w:iCs/>
-        </w:rPr>
-        <w:t xml:space="preserve">actores institucionales</w:t>
-      </w:r>
-      <w:r>
-        <w:t xml:space="preserve">,</w:t>
-      </w:r>
-      <w:r>
-        <w:t xml:space="preserve"> </w:t>
-      </w:r>
-      <w:r>
-        <w:rPr>
-          <w:i/>
-          <w:iCs/>
-        </w:rPr>
-        <w:t xml:space="preserve">colectivos universitarios</w:t>
-      </w:r>
-      <w:r>
-        <w:t xml:space="preserve">,</w:t>
-      </w:r>
-      <w:r>
-        <w:t xml:space="preserve"> </w:t>
-      </w:r>
-      <w:r>
-        <w:rPr>
-          <w:i/>
-          <w:iCs/>
-        </w:rPr>
-        <w:t xml:space="preserve">participantes</w:t>
-      </w:r>
-      <w:r>
-        <w:t xml:space="preserve">,</w:t>
-      </w:r>
-      <w:r>
-        <w:t xml:space="preserve"> </w:t>
-      </w:r>
-      <w:r>
-        <w:rPr>
-          <w:i/>
-          <w:iCs/>
-        </w:rPr>
-        <w:t xml:space="preserve">pares docentes</w:t>
-      </w:r>
-      <w:r>
-        <w:t xml:space="preserve">,</w:t>
-      </w:r>
-      <w:r>
-        <w:t xml:space="preserve"> </w:t>
-      </w:r>
-      <w:r>
-        <w:rPr>
-          <w:i/>
-          <w:iCs/>
-        </w:rPr>
-        <w:t xml:space="preserve">estudiantes</w:t>
-      </w:r>
-      <w:r>
-        <w:t xml:space="preserve">,</w:t>
-      </w:r>
-      <w:r>
-        <w:t xml:space="preserve"> </w:t>
-      </w:r>
-      <w:r>
-        <w:rPr>
-          <w:i/>
-          <w:iCs/>
-        </w:rPr>
-        <w:t xml:space="preserve">autoridades académicas</w:t>
-      </w:r>
-      <w:r>
-        <w:t xml:space="preserve"> </w:t>
-      </w:r>
-      <w:r>
-        <w:t xml:space="preserve">y</w:t>
-      </w:r>
-      <w:r>
-        <w:t xml:space="preserve"> </w:t>
-      </w:r>
-      <w:r>
-        <w:rPr>
-          <w:i/>
-          <w:iCs/>
-        </w:rPr>
-        <w:t xml:space="preserve">representantes gremiales</w:t>
-      </w:r>
-      <w:r>
-        <w:t xml:space="preserve">. Esta categoría analítica permite captar las prácticas concretas, las representaciones subjetivas, el clima relacional, la confianza intersubjetiva y las disposiciones cotidianas frente al trabajo pedagógico.</w:t>
-      </w:r>
-    </w:p>
-    <w:p>
-      <w:pPr>
-        <w:pStyle w:val="FirstParagraph"/>
-      </w:pPr>
-      <w:r>
-        <w:t xml:space="preserve">Esta diferenciación teórica y metodológica permite conservar el lenguaje jurídico-institucional cuando corresponde, pero evita que la categoría de</w:t>
-      </w:r>
-      <w:r>
-        <w:t xml:space="preserve"> </w:t>
-      </w:r>
-      <w:r>
-        <w:t xml:space="preserve">“claustro”</w:t>
-      </w:r>
-      <w:r>
-        <w:t xml:space="preserve"> </w:t>
-      </w:r>
-      <w:r>
-        <w:t xml:space="preserve">se convierta en un concepto reificado mediante el cual se pretenda explicar de forma simplificada toda la dinámica de gobernanza universitaria. La retroalimentación 360° y la evaluación formativa del desempeño no interpelan a corporaciones jurídicas abstractas, sino a personas y colectivos situados en la cotidianeidad de las prácticas pedagógicas y de gestión en el CURZAS:</w:t>
+        <w:t xml:space="preserve">claustro</w:t>
+      </w:r>
+      <w:r>
+        <w:t xml:space="preserve">, delimitando el lenguaje normativo del análisis sociopolítico y organizacional:</w:t>
       </w:r>
     </w:p>
     <w:p>
@@ -4450,16 +4326,108 @@
       </w:pPr>
       <w:r>
         <w:rPr>
+          <w:b/>
+          <w:bCs/>
+        </w:rPr>
+        <w:t xml:space="preserve">Categoría institucional / normativa (</w:t>
+      </w:r>
+      <w:r>
+        <w:rPr>
+          <w:b/>
+          <w:bCs/>
           <w:i/>
           <w:iCs/>
         </w:rPr>
-        <w:t xml:space="preserve">Pares y colegas docentes:</w:t>
-      </w:r>
-      <w:r>
-        <w:t xml:space="preserve"> </w:t>
-      </w:r>
-      <w:r>
-        <w:t xml:space="preserve">sujetos reflexivos que vivencian las exigencias didácticas cotidianas, las mediaciones tecnológicas en la Red de Nodos Territoriales y las necesidades de perfeccionamiento en el marco de la Carrera Docente.</w:t>
+        <w:t xml:space="preserve">claustros</w:t>
+      </w:r>
+      <w:r>
+        <w:rPr>
+          <w:b/>
+          <w:bCs/>
+        </w:rPr>
+        <w:t xml:space="preserve">):</w:t>
+      </w:r>
+      <w:r>
+        <w:t xml:space="preserve"> </w:t>
+      </w:r>
+      <w:r>
+        <w:t xml:space="preserve">Comprende las figuras jurídicas estatuidas por la Ley de Educación Superior N° 24.521</w:t>
+      </w:r>
+      <w:r>
+        <w:t xml:space="preserve"> </w:t>
+      </w:r>
+      <w:r>
+        <w:t xml:space="preserve">(Ley N° 24.521 de Educación Superior, 1995)</w:t>
+      </w:r>
+      <w:r>
+        <w:t xml:space="preserve"> </w:t>
+      </w:r>
+      <w:r>
+        <w:t xml:space="preserve">y el Estatuto de la Universidad Nacional del Comahue (Ordenanza CS N° 0988/2025)</w:t>
+      </w:r>
+      <w:r>
+        <w:t xml:space="preserve"> </w:t>
+      </w:r>
+      <w:r>
+        <w:t xml:space="preserve">(Universidad Nacional del Comahue, 2025)</w:t>
+      </w:r>
+      <w:r>
+        <w:t xml:space="preserve">, a saber:</w:t>
+      </w:r>
+      <w:r>
+        <w:t xml:space="preserve"> </w:t>
+      </w:r>
+      <w:r>
+        <w:rPr>
+          <w:i/>
+          <w:iCs/>
+        </w:rPr>
+        <w:t xml:space="preserve">claustro docente</w:t>
+      </w:r>
+      <w:r>
+        <w:t xml:space="preserve">,</w:t>
+      </w:r>
+      <w:r>
+        <w:t xml:space="preserve"> </w:t>
+      </w:r>
+      <w:r>
+        <w:rPr>
+          <w:i/>
+          <w:iCs/>
+        </w:rPr>
+        <w:t xml:space="preserve">claustro estudiantil</w:t>
+      </w:r>
+      <w:r>
+        <w:t xml:space="preserve">,</w:t>
+      </w:r>
+      <w:r>
+        <w:t xml:space="preserve"> </w:t>
+      </w:r>
+      <w:r>
+        <w:rPr>
+          <w:i/>
+          <w:iCs/>
+        </w:rPr>
+        <w:t xml:space="preserve">claustro nodocente</w:t>
+      </w:r>
+      <w:r>
+        <w:t xml:space="preserve"> </w:t>
+      </w:r>
+      <w:r>
+        <w:t xml:space="preserve">y</w:t>
+      </w:r>
+      <w:r>
+        <w:t xml:space="preserve"> </w:t>
+      </w:r>
+      <w:r>
+        <w:rPr>
+          <w:i/>
+          <w:iCs/>
+        </w:rPr>
+        <w:t xml:space="preserve">claustro de graduados</w:t>
+      </w:r>
+      <w:r>
+        <w:t xml:space="preserve">. Su alcance reside en delimitar los estamentos de representación electoral y conformar los cuerpos colegiados de gobierno universitario (Asamblea Universitaria, Consejo Superior, Consejo Directivo del CURZAS y Consejos Departamentales). Se trata de una categoría jurídica indispensable para definir la gobernanza formal de la institución.</w:t>
       </w:r>
     </w:p>
     <w:p>
@@ -4472,79 +4440,126 @@
       </w:pPr>
       <w:r>
         <w:rPr>
+          <w:b/>
+          <w:bCs/>
+        </w:rPr>
+        <w:t xml:space="preserve">Categoría analítica de la investigación (</w:t>
+      </w:r>
+      <w:r>
+        <w:rPr>
+          <w:b/>
+          <w:bCs/>
           <w:i/>
           <w:iCs/>
         </w:rPr>
-        <w:t xml:space="preserve">Estudiantes y colectivos estudiantiles:</w:t>
-      </w:r>
-      <w:r>
-        <w:t xml:space="preserve"> </w:t>
-      </w:r>
-      <w:r>
-        <w:t xml:space="preserve">concebidos no meramente como un estamento electoral formal, sino como participantes activos del proceso formativo, portadores de experiencias, demandas y juicios sobre la calidad del acompañamiento docente.</w:t>
-      </w:r>
-    </w:p>
-    <w:p>
-      <w:pPr>
-        <w:pStyle w:val="Compact"/>
-        <w:numPr>
-          <w:ilvl w:val="0"/>
-          <w:numId w:val="1016"/>
-        </w:numPr>
-      </w:pPr>
+        <w:t xml:space="preserve">actores y sujetos institucionales</w:t>
+      </w:r>
+      <w:r>
+        <w:rPr>
+          <w:b/>
+          <w:bCs/>
+        </w:rPr>
+        <w:t xml:space="preserve">):</w:t>
+      </w:r>
+      <w:r>
+        <w:t xml:space="preserve"> </w:t>
+      </w:r>
+      <w:r>
+        <w:t xml:space="preserve">Comprende a los</w:t>
+      </w:r>
+      <w:r>
+        <w:t xml:space="preserve"> </w:t>
+      </w:r>
       <w:r>
         <w:rPr>
           <w:i/>
           <w:iCs/>
         </w:rPr>
-        <w:t xml:space="preserve">Autoridades y equipos de conducción académica:</w:t>
-      </w:r>
-      <w:r>
-        <w:t xml:space="preserve"> </w:t>
-      </w:r>
-      <w:r>
-        <w:t xml:space="preserve">con la responsabilidad de planificar las políticas de enseñanza y articular los recursos formativos con las prioridades institucionales.</w:t>
-      </w:r>
-    </w:p>
-    <w:p>
-      <w:pPr>
-        <w:pStyle w:val="Compact"/>
-        <w:numPr>
-          <w:ilvl w:val="0"/>
-          <w:numId w:val="1016"/>
-        </w:numPr>
-      </w:pPr>
+        <w:t xml:space="preserve">actores institucionales</w:t>
+      </w:r>
+      <w:r>
+        <w:t xml:space="preserve">,</w:t>
+      </w:r>
+      <w:r>
+        <w:t xml:space="preserve"> </w:t>
+      </w:r>
       <w:r>
         <w:rPr>
           <w:i/>
           <w:iCs/>
         </w:rPr>
-        <w:t xml:space="preserve">Representaciones gremiales y paritarias:</w:t>
-      </w:r>
-      <w:r>
-        <w:t xml:space="preserve"> </w:t>
-      </w:r>
-      <w:r>
-        <w:t xml:space="preserve">actores clave en la defensa de las condiciones de trabajo, la estabilidad y los resguardos éticos en el marco del Convenio Colectivo de Trabajo Docente</w:t>
-      </w:r>
-      <w:r>
-        <w:t xml:space="preserve"> </w:t>
-      </w:r>
-      <w:r>
-        <w:t xml:space="preserve">(Decreto N° 1246/2015. Convenio Colectivo de Trabajo para los Docentes de las Instituciones Universitarias Nacionales, 2015)</w:t>
-      </w:r>
-      <w:r>
-        <w:t xml:space="preserve">.</w:t>
-      </w:r>
-    </w:p>
-    <w:bookmarkEnd w:id="39"/>
-    <w:bookmarkStart w:id="40" w:name="Xd19f503ec170ca2f7711abf4686d92b55542094"/>
-    <w:p>
-      <w:pPr>
-        <w:pStyle w:val="Heading4"/>
-      </w:pPr>
-      <w:r>
-        <w:t xml:space="preserve">Condiciones de Viabilidad como Hipótesis de Indagación Abierta</w:t>
+        <w:t xml:space="preserve">colectivos universitarios</w:t>
+      </w:r>
+      <w:r>
+        <w:t xml:space="preserve">,</w:t>
+      </w:r>
+      <w:r>
+        <w:t xml:space="preserve"> </w:t>
+      </w:r>
+      <w:r>
+        <w:rPr>
+          <w:i/>
+          <w:iCs/>
+        </w:rPr>
+        <w:t xml:space="preserve">participantes</w:t>
+      </w:r>
+      <w:r>
+        <w:t xml:space="preserve">,</w:t>
+      </w:r>
+      <w:r>
+        <w:t xml:space="preserve"> </w:t>
+      </w:r>
+      <w:r>
+        <w:rPr>
+          <w:i/>
+          <w:iCs/>
+        </w:rPr>
+        <w:t xml:space="preserve">pares docentes</w:t>
+      </w:r>
+      <w:r>
+        <w:t xml:space="preserve">,</w:t>
+      </w:r>
+      <w:r>
+        <w:t xml:space="preserve"> </w:t>
+      </w:r>
+      <w:r>
+        <w:rPr>
+          <w:i/>
+          <w:iCs/>
+        </w:rPr>
+        <w:t xml:space="preserve">estudiantes</w:t>
+      </w:r>
+      <w:r>
+        <w:t xml:space="preserve">,</w:t>
+      </w:r>
+      <w:r>
+        <w:t xml:space="preserve"> </w:t>
+      </w:r>
+      <w:r>
+        <w:rPr>
+          <w:i/>
+          <w:iCs/>
+        </w:rPr>
+        <w:t xml:space="preserve">autoridades académicas</w:t>
+      </w:r>
+      <w:r>
+        <w:t xml:space="preserve"> </w:t>
+      </w:r>
+      <w:r>
+        <w:t xml:space="preserve">y</w:t>
+      </w:r>
+      <w:r>
+        <w:t xml:space="preserve"> </w:t>
+      </w:r>
+      <w:r>
+        <w:rPr>
+          <w:i/>
+          <w:iCs/>
+        </w:rPr>
+        <w:t xml:space="preserve">representantes gremiales</w:t>
+      </w:r>
+      <w:r>
+        <w:t xml:space="preserve">. Esta categoría analítica permite captar las prácticas concretas, las representaciones subjetivas, el clima relacional, la confianza intersubjetiva y las disposiciones cotidianas frente al trabajo pedagógico.</w:t>
       </w:r>
     </w:p>
     <w:p>
@@ -4552,134 +4567,19 @@
         <w:pStyle w:val="FirstParagraph"/>
       </w:pPr>
       <w:r>
-        <w:t xml:space="preserve">A partir del marco analítico construido, el proyecto evita predeterminar de forma deductiva las condiciones definitivas de viabilidad antes de la contrastación en el terreno. Por el contrario,</w:t>
-      </w:r>
-      <w:r>
-        <w:t xml:space="preserve"> </w:t>
-      </w:r>
-      <w:r>
-        <w:rPr>
-          <w:b/>
-          <w:bCs/>
-        </w:rPr>
-        <w:t xml:space="preserve">el proyecto parte del supuesto de que la viabilidad de un dispositivo de evaluación 360° podría estar condicionada por garantías de voluntariedad, anonimato, confidencialidad y finalidad formativa, cuya relevancia deberá ser contrastada empíricamente en el contexto institucional del CURZAS</w:t>
-      </w:r>
-      <w:r>
-        <w:t xml:space="preserve">.</w:t>
-      </w:r>
-    </w:p>
-    <w:p>
-      <w:pPr>
-        <w:pStyle w:val="BodyText"/>
-      </w:pPr>
-      <w:r>
-        <w:t xml:space="preserve">Desde esta perspectiva metodológica, la factibilidad no se asume como una conclusión anticipada o cerrada, sino como una hipótesis de trabajo y un campo de indagación empírica abierto: corresponderá al trabajo de campo relevar en qué medida estas garantías constituyen condiciones indispensables expresadas por los propios actores institucionales del CURZAS, o si emergen otros condicionantes culturales, técnicos, de sobrecarga operativa o de gobernanza paritaria que deban ser ponderados en el diseño final de la propuesta. La viabilidad se investiga, por ende, en su doble anclaje: la legitimación en los órganos colegiados de cogobierno y la construcción de confianza situada entre los sujetos de la comunidad académica.</w:t>
-      </w:r>
-    </w:p>
-    <w:bookmarkEnd w:id="40"/>
-    <w:bookmarkEnd w:id="41"/>
-    <w:bookmarkEnd w:id="42"/>
-    <w:bookmarkStart w:id="47" w:name="X77155299af2def8333549b16a82948e9810ead2"/>
-    <w:p>
-      <w:pPr>
-        <w:pStyle w:val="Heading2"/>
-        <w:keepNext/>
-        <w:spacing w:before="200" w:after="80" w:line="300" w:lineRule="auto"/>
-      </w:pPr>
-      <w:r>
-        <w:rPr>
-          <w:rFonts w:ascii="Arial" w:hAnsi="Arial"/>
-          <w:b/>
-          <w:sz w:val="24"/>
-        </w:rPr>
-        <w:t xml:space="preserve">Antecedentes: Estado del Arte de la Cuestión</w:t>
-      </w:r>
-    </w:p>
-    <w:p>
-      <w:pPr>
-        <w:pStyle w:val="FirstParagraph"/>
-      </w:pPr>
-      <w:r>
-        <w:t xml:space="preserve">De acuerdo con las pautas metodológicas de la cátedra y las recomendaciones de</w:t>
-      </w:r>
-      <w:r>
-        <w:t xml:space="preserve"> </w:t>
-      </w:r>
-      <w:r>
-        <w:t xml:space="preserve">Torraco (2016)</w:t>
-      </w:r>
-      <w:r>
-        <w:t xml:space="preserve"> </w:t>
-      </w:r>
-      <w:r>
-        <w:t xml:space="preserve">y</w:t>
-      </w:r>
-      <w:r>
-        <w:t xml:space="preserve"> </w:t>
-      </w:r>
-      <w:r>
-        <w:t xml:space="preserve">Jiménez Becerra (2008)</w:t>
-      </w:r>
-      <w:r>
-        <w:t xml:space="preserve">, la construcción de los antecedentes o Estado del Arte no consiste en una reseña acumulativa de lecturas ni en un resumen bibliográfico lineal. Representa un ejercicio analítico e integrador de</w:t>
-      </w:r>
-      <w:r>
-        <w:t xml:space="preserve"> </w:t>
-      </w:r>
-      <w:r>
-        <w:t xml:space="preserve">“investigación de la investigación”</w:t>
-      </w:r>
-      <w:r>
-        <w:t xml:space="preserve">, dirigido a sistematizar la evidencia empírica previa sobre el problema de estudio, identificar metodologías empleadas y precisar con rigurosidad la</w:t>
-      </w:r>
-      <w:r>
-        <w:t xml:space="preserve"> </w:t>
-      </w:r>
-      <w:r>
-        <w:rPr>
-          <w:b/>
-          <w:bCs/>
-        </w:rPr>
-        <w:t xml:space="preserve">vacancia de conocimiento</w:t>
-      </w:r>
-      <w:r>
-        <w:t xml:space="preserve"> </w:t>
-      </w:r>
-      <w:r>
-        <w:t xml:space="preserve">que justifica el desarrollo del presente proyecto.</w:t>
-      </w:r>
-    </w:p>
-    <w:p>
-      <w:pPr>
-        <w:pStyle w:val="BodyText"/>
-      </w:pPr>
-      <w:r>
-        <w:t xml:space="preserve">Para dar cumplimiento a la estructura exigida por el Seminario de Integración y Aplicación, los antecedentes se organizan jerárquicamente en tres niveles geográficos: internacional, nacional y regional/local.</w:t>
-      </w:r>
-    </w:p>
-    <w:bookmarkStart w:id="43" w:name="Xbd1777d47dd01cd8f84e658bc65d384db447afd"/>
-    <w:p>
-      <w:pPr>
-        <w:pStyle w:val="Heading3"/>
-        <w:keepNext/>
-        <w:spacing w:before="160" w:after="40" w:line="300" w:lineRule="auto"/>
-      </w:pPr>
-      <w:r>
-        <w:rPr>
-          <w:rFonts w:ascii="Arial" w:hAnsi="Arial"/>
-          <w:b/>
-          <w:i/>
-          <w:sz w:val="24"/>
-        </w:rPr>
-        <w:t xml:space="preserve">Antecedentes Internacionales: Modelos 360° y Triangulación Evaluativa en la Educación Superior</w:t>
-      </w:r>
-    </w:p>
-    <w:p>
-      <w:pPr>
-        <w:pStyle w:val="FirstParagraph"/>
-      </w:pPr>
-      <w:r>
-        <w:t xml:space="preserve">En el plano internacional, diversos estudios empíricos han examinado la aplicación y los efectos de los modelos de evaluación 360 grados en instituciones universitarias públicas y privadas:</w:t>
+        <w:t xml:space="preserve">Esta diferenciación teórica y metodológica permite conservar el lenguaje jurídico-institucional cuando corresponde, pero evita que la categoría de</w:t>
+      </w:r>
+      <w:r>
+        <w:t xml:space="preserve"> </w:t>
+      </w:r>
+      <w:r>
+        <w:t xml:space="preserve">“claustro”</w:t>
+      </w:r>
+      <w:r>
+        <w:t xml:space="preserve"> </w:t>
+      </w:r>
+      <w:r>
+        <w:t xml:space="preserve">se convierta en un concepto reificado mediante el cual se pretenda explicar de forma simplificada toda la dinámica de gobernanza universitaria. La retroalimentación 360° y la evaluación formativa del desempeño no interpelan a corporaciones jurídicas abstractas, sino a personas y colectivos situados en la cotidianeidad de las prácticas pedagógicas y de gestión en el CURZAS:</w:t>
       </w:r>
     </w:p>
     <w:p>
@@ -4692,45 +4592,16 @@
       </w:pPr>
       <w:r>
         <w:rPr>
-          <w:b/>
-          <w:bCs/>
-        </w:rPr>
-        <w:t xml:space="preserve">Sifuentes Ocegueda, Suárez Flores y Lara González (2016)</w:t>
-      </w:r>
-      <w:r>
-        <w:t xml:space="preserve"> </w:t>
-      </w:r>
-      <w:r>
-        <w:t xml:space="preserve">desarrollaron una investigación empírica titulada</w:t>
-      </w:r>
-      <w:r>
-        <w:t xml:space="preserve"> </w:t>
-      </w:r>
-      <w:r>
-        <w:rPr>
           <w:i/>
           <w:iCs/>
         </w:rPr>
-        <w:t xml:space="preserve">“La evaluación de 360° aplicada al personal docente de nivel superior”</w:t>
-      </w:r>
-      <w:r>
-        <w:t xml:space="preserve">, publicada en la</w:t>
-      </w:r>
-      <w:r>
-        <w:t xml:space="preserve"> </w:t>
-      </w:r>
-      <w:r>
-        <w:rPr>
-          <w:i/>
-          <w:iCs/>
-        </w:rPr>
-        <w:t xml:space="preserve">Revista de Investigación en Tecnologías de la Información (RITI)</w:t>
-      </w:r>
-      <w:r>
-        <w:t xml:space="preserve"> </w:t>
-      </w:r>
-      <w:r>
-        <w:t xml:space="preserve">(Dialnet). El objetivo del estudio consistió en diseñar y evaluar el grado de aceptación de un instrumento 360° para el profesorado universitario en México. Mediante una metodología descriptiva y transversal que abarcó encuestas estructuradas a docentes, directores y estudiantes, los autores concluyeron que el modelo 360° registra un índice de aceptación docente superior al 85% siempre que se respeten tres garantías operativas: el estricto anonimato de los participantes, la entrega de reportes diagnósticos individuales y la ausencia total de penalidades administrativas. Este antecedente aporta a nuestro proyecto una evidencia empírica directa sobre la viabilidad actitudinal del modelo en el contexto universitario iberoamericano.</w:t>
+        <w:t xml:space="preserve">Pares y colegas docentes:</w:t>
+      </w:r>
+      <w:r>
+        <w:t xml:space="preserve"> </w:t>
+      </w:r>
+      <w:r>
+        <w:t xml:space="preserve">sujetos reflexivos que vivencian las exigencias didácticas cotidianas, las mediaciones tecnológicas en la Red de Nodos Territoriales y las necesidades de perfeccionamiento en el marco de la Carrera Docente.</w:t>
       </w:r>
     </w:p>
     <w:p>
@@ -4743,42 +4614,16 @@
       </w:pPr>
       <w:r>
         <w:rPr>
-          <w:b/>
-          <w:bCs/>
-        </w:rPr>
-        <w:t xml:space="preserve">Obando Freire et al. (2014)</w:t>
-      </w:r>
-      <w:r>
-        <w:t xml:space="preserve">, en su artículo</w:t>
-      </w:r>
-      <w:r>
-        <w:t xml:space="preserve"> </w:t>
-      </w:r>
-      <w:r>
-        <w:rPr>
           <w:i/>
           <w:iCs/>
         </w:rPr>
-        <w:t xml:space="preserve">“Sistema de evaluación docente mediante el modelo 360 grados y el portafolio electrónico”</w:t>
-      </w:r>
-      <w:r>
-        <w:t xml:space="preserve">, publicado en la revista</w:t>
-      </w:r>
-      <w:r>
-        <w:t xml:space="preserve"> </w:t>
-      </w:r>
-      <w:r>
-        <w:rPr>
-          <w:i/>
-          <w:iCs/>
-        </w:rPr>
-        <w:t xml:space="preserve">Medisur</w:t>
-      </w:r>
-      <w:r>
-        <w:t xml:space="preserve"> </w:t>
-      </w:r>
-      <w:r>
-        <w:t xml:space="preserve">(SciELO), investigaron la implementación de una plataforma digital para la triangulación evaluativa en el nivel superior en Cuba. Su objetivo fue contrastar la efectividad de las encuestas unilaterales frente a un circuito multiactoral que combina autoevaluación, coevaluación de pares y heteroevaluación de alumnos y autoridades académicas. Entre sus principales hallazgos, demostraron que la evaluación circular mitiga los sesgos de complacencia o castigo inherentes a las encuestas estudiantiles aisladas y estimula en los docentes la autorreflexión sobre sus métodos didácticos. Su aporte a este TFG reside en documentar la factibilidad técnico-operativa de procesar evaluaciones multidireccionales mediante soportes informáticos.</w:t>
+        <w:t xml:space="preserve">Estudiantes y colectivos estudiantiles:</w:t>
+      </w:r>
+      <w:r>
+        <w:t xml:space="preserve"> </w:t>
+      </w:r>
+      <w:r>
+        <w:t xml:space="preserve">concebidos no meramente como un estamento electoral formal, sino como participantes activos del proceso formativo, portadores de experiencias, demandas y juicios sobre la calidad del acompañamiento docente.</w:t>
       </w:r>
     </w:p>
     <w:p>
@@ -4791,55 +4636,170 @@
       </w:pPr>
       <w:r>
         <w:rPr>
+          <w:i/>
+          <w:iCs/>
+        </w:rPr>
+        <w:t xml:space="preserve">Autoridades y equipos de conducción académica:</w:t>
+      </w:r>
+      <w:r>
+        <w:t xml:space="preserve"> </w:t>
+      </w:r>
+      <w:r>
+        <w:t xml:space="preserve">con la responsabilidad de planificar las políticas de enseñanza y articular los recursos formativos con las prioridades institucionales.</w:t>
+      </w:r>
+    </w:p>
+    <w:p>
+      <w:pPr>
+        <w:pStyle w:val="Compact"/>
+        <w:numPr>
+          <w:ilvl w:val="0"/>
+          <w:numId w:val="1017"/>
+        </w:numPr>
+      </w:pPr>
+      <w:r>
+        <w:rPr>
+          <w:i/>
+          <w:iCs/>
+        </w:rPr>
+        <w:t xml:space="preserve">Representaciones gremiales y paritarias:</w:t>
+      </w:r>
+      <w:r>
+        <w:t xml:space="preserve"> </w:t>
+      </w:r>
+      <w:r>
+        <w:t xml:space="preserve">actores clave en la defensa de las condiciones de trabajo, la estabilidad y los resguardos éticos en el marco del Convenio Colectivo de Trabajo Docente</w:t>
+      </w:r>
+      <w:r>
+        <w:t xml:space="preserve"> </w:t>
+      </w:r>
+      <w:r>
+        <w:t xml:space="preserve">(Decreto N° 1246/2015. Convenio Colectivo de Trabajo para los Docentes de las Instituciones Universitarias Nacionales, 2015)</w:t>
+      </w:r>
+      <w:r>
+        <w:t xml:space="preserve">.</w:t>
+      </w:r>
+    </w:p>
+    <w:bookmarkEnd w:id="39"/>
+    <w:bookmarkStart w:id="40" w:name="Xd19f503ec170ca2f7711abf4686d92b55542094"/>
+    <w:p>
+      <w:pPr>
+        <w:pStyle w:val="Heading4"/>
+      </w:pPr>
+      <w:r>
+        <w:t xml:space="preserve">Condiciones de Viabilidad como Hipótesis de Indagación Abierta</w:t>
+      </w:r>
+    </w:p>
+    <w:p>
+      <w:pPr>
+        <w:pStyle w:val="FirstParagraph"/>
+      </w:pPr>
+      <w:r>
+        <w:t xml:space="preserve">A partir del marco analítico construido, el proyecto evita predeterminar de forma deductiva las condiciones definitivas de viabilidad antes de la contrastación en el terreno. Por el contrario,</w:t>
+      </w:r>
+      <w:r>
+        <w:t xml:space="preserve"> </w:t>
+      </w:r>
+      <w:r>
+        <w:rPr>
           <w:b/>
           <w:bCs/>
         </w:rPr>
-        <w:t xml:space="preserve">Reyes y Díaz (2020)</w:t>
-      </w:r>
-      <w:r>
-        <w:t xml:space="preserve"> </w:t>
-      </w:r>
-      <w:r>
-        <w:t xml:space="preserve">llevaron a cabo una investigación evaluativa titulada</w:t>
-      </w:r>
-      <w:r>
-        <w:t xml:space="preserve"> </w:t>
-      </w:r>
-      <w:r>
-        <w:rPr>
-          <w:i/>
-          <w:iCs/>
-        </w:rPr>
-        <w:t xml:space="preserve">“Metaevaluación del sistema de evaluación docente en una universidad pública”</w:t>
-      </w:r>
-      <w:r>
-        <w:t xml:space="preserve">, publicada en</w:t>
-      </w:r>
-      <w:r>
-        <w:t xml:space="preserve"> </w:t>
-      </w:r>
-      <w:r>
-        <w:rPr>
-          <w:i/>
-          <w:iCs/>
-        </w:rPr>
-        <w:t xml:space="preserve">Education Policy Analysis Archives (EPAA)</w:t>
-      </w:r>
-      <w:r>
-        <w:t xml:space="preserve">. Mediante un enfoque metodológico mixto que combinó análisis normativo-documental y entrevistas a profundidad a docentes y autoridades sindicales, los autores evaluaron el impacto institucional de los sistemas de evaluación vigentes en una universidad pública mexicana. Concluyeron que los esquemas evaluativos de corte sumativo producen desconfianza y un</w:t>
-      </w:r>
-      <w:r>
-        <w:t xml:space="preserve"> </w:t>
-      </w:r>
-      <w:r>
-        <w:t xml:space="preserve">“efecto cumplimiento formal”</w:t>
-      </w:r>
-      <w:r>
-        <w:t xml:space="preserve">, donde el docente cumple el trámite administrativo sin transformar su práctica pedagógica. Asimismo, advirtieron que para que una innovación evaluativa prospere en la universidad pública, resulta indispensable que el modelo se oriente al aprendizaje institucional y se encuentre legitimado por los órganos de representación laboral. Este antecedente fundamenta la centralidad de la dimensión de gobernanza en nuestra investigación.</w:t>
-      </w:r>
-    </w:p>
-    <w:bookmarkEnd w:id="43"/>
-    <w:bookmarkStart w:id="44" w:name="X2c0b73cfd018cc54d6ee142a74b81e5b02c3616"/>
+        <w:t xml:space="preserve">el proyecto parte del supuesto de que la viabilidad de un dispositivo de evaluación 360° podría estar condicionada por garantías de voluntariedad, anonimato, confidencialidad y finalidad formativa, cuya relevancia deberá ser contrastada empíricamente en el contexto institucional del CURZAS</w:t>
+      </w:r>
+      <w:r>
+        <w:t xml:space="preserve">.</w:t>
+      </w:r>
+    </w:p>
+    <w:p>
+      <w:pPr>
+        <w:pStyle w:val="BodyText"/>
+      </w:pPr>
+      <w:r>
+        <w:t xml:space="preserve">Desde esta perspectiva metodológica, la factibilidad no se asume como una conclusión anticipada o cerrada, sino como una hipótesis de trabajo y un campo de indagación empírica abierto: corresponderá al trabajo de campo relevar en qué medida estas garantías constituyen condiciones indispensables expresadas por los propios actores institucionales del CURZAS, o si emergen otros condicionantes culturales, técnicos, de sobrecarga operativa o de gobernanza paritaria que deban ser ponderados en el diseño final de la propuesta. La viabilidad se investiga, por ende, en su doble anclaje: la legitimación en los órganos colegiados de cogobierno y la construcción de confianza situada entre los sujetos de la comunidad académica.</w:t>
+      </w:r>
+    </w:p>
+    <w:bookmarkEnd w:id="40"/>
+    <w:bookmarkEnd w:id="41"/>
+    <w:bookmarkEnd w:id="42"/>
+    <w:bookmarkStart w:id="47" w:name="X77155299af2def8333549b16a82948e9810ead2"/>
+    <w:p>
+      <w:pPr>
+        <w:pStyle w:val="Heading2"/>
+        <w:keepNext/>
+        <w:spacing w:before="200" w:after="80" w:line="300" w:lineRule="auto"/>
+      </w:pPr>
+      <w:r>
+        <w:rPr>
+          <w:rFonts w:ascii="Arial" w:hAnsi="Arial"/>
+          <w:b/>
+          <w:sz w:val="24"/>
+        </w:rPr>
+        <w:t xml:space="preserve">Antecedentes: Estado del Arte de la Cuestión</w:t>
+      </w:r>
+    </w:p>
+    <w:p>
+      <w:pPr>
+        <w:pStyle w:val="FirstParagraph"/>
+      </w:pPr>
+      <w:r>
+        <w:t xml:space="preserve">De acuerdo con las pautas metodológicas de la cátedra y las recomendaciones de</w:t>
+      </w:r>
+      <w:r>
+        <w:t xml:space="preserve"> </w:t>
+      </w:r>
+      <w:r>
+        <w:t xml:space="preserve">Torraco (2016)</w:t>
+      </w:r>
+      <w:r>
+        <w:t xml:space="preserve"> </w:t>
+      </w:r>
+      <w:r>
+        <w:t xml:space="preserve">y</w:t>
+      </w:r>
+      <w:r>
+        <w:t xml:space="preserve"> </w:t>
+      </w:r>
+      <w:r>
+        <w:t xml:space="preserve">Jiménez Becerra (2008)</w:t>
+      </w:r>
+      <w:r>
+        <w:t xml:space="preserve">, la construcción de los antecedentes o Estado del Arte no consiste en una reseña acumulativa de lecturas ni en un resumen bibliográfico lineal. Representa un ejercicio analítico e integrador de</w:t>
+      </w:r>
+      <w:r>
+        <w:t xml:space="preserve"> </w:t>
+      </w:r>
+      <w:r>
+        <w:t xml:space="preserve">“investigación de la investigación”</w:t>
+      </w:r>
+      <w:r>
+        <w:t xml:space="preserve">, dirigido a sistematizar la evidencia empírica previa sobre el problema de estudio, identificar metodologías empleadas y precisar con rigurosidad la</w:t>
+      </w:r>
+      <w:r>
+        <w:t xml:space="preserve"> </w:t>
+      </w:r>
+      <w:r>
+        <w:rPr>
+          <w:b/>
+          <w:bCs/>
+        </w:rPr>
+        <w:t xml:space="preserve">vacancia de conocimiento</w:t>
+      </w:r>
+      <w:r>
+        <w:t xml:space="preserve"> </w:t>
+      </w:r>
+      <w:r>
+        <w:t xml:space="preserve">que justifica el desarrollo del presente proyecto.</w:t>
+      </w:r>
+    </w:p>
+    <w:p>
+      <w:pPr>
+        <w:pStyle w:val="BodyText"/>
+      </w:pPr>
+      <w:r>
+        <w:t xml:space="preserve">Para dar cumplimiento a la estructura exigida por el Seminario de Integración y Aplicación, los antecedentes se organizan jerárquicamente en tres niveles geográficos: internacional, nacional y regional/local.</w:t>
+      </w:r>
+    </w:p>
+    <w:bookmarkStart w:id="43" w:name="Xbd1777d47dd01cd8f84e658bc65d384db447afd"/>
     <w:p>
       <w:pPr>
         <w:pStyle w:val="Heading3"/>
@@ -4853,7 +4813,7 @@
           <w:i/>
           <w:sz w:val="24"/>
         </w:rPr>
-        <w:t xml:space="preserve">Antecedentes Nacionales: Evaluación Docente y Carrera Académica en Universidades Públicas Argentinas</w:t>
+        <w:t xml:space="preserve">Antecedentes Internacionales: Modelos 360° y Triangulación Evaluativa en la Educación Superior</w:t>
       </w:r>
     </w:p>
     <w:p>
@@ -4861,7 +4821,7 @@
         <w:pStyle w:val="FirstParagraph"/>
       </w:pPr>
       <w:r>
-        <w:t xml:space="preserve">En el ámbito nacional argentino, la literatura científica ha indagado las tensiones inherentes a la profesión docente universitaria y sus mecanismos de valoración:</w:t>
+        <w:t xml:space="preserve">En el plano internacional, diversos estudios empíricos han examinado la aplicación y los efectos de los modelos de evaluación 360 grados en instituciones universitarias públicas y privadas:</w:t>
       </w:r>
     </w:p>
     <w:p>
@@ -4877,10 +4837,13 @@
           <w:b/>
           <w:bCs/>
         </w:rPr>
-        <w:t xml:space="preserve">Marquina (2012)</w:t>
-      </w:r>
-      <w:r>
-        <w:t xml:space="preserve">, en su estudio empírico</w:t>
+        <w:t xml:space="preserve">Sifuentes Ocegueda et al. (2016)</w:t>
+      </w:r>
+      <w:r>
+        <w:t xml:space="preserve"> </w:t>
+      </w:r>
+      <w:r>
+        <w:t xml:space="preserve">desarrollaron una investigación empírica titulada</w:t>
       </w:r>
       <w:r>
         <w:t xml:space="preserve"> </w:t>
@@ -4890,10 +4853,10 @@
           <w:i/>
           <w:iCs/>
         </w:rPr>
-        <w:t xml:space="preserve">“¿Hay un nuevo modelo de profesión académica en Argentina? Debates y tendencias en la universidad pública”</w:t>
-      </w:r>
-      <w:r>
-        <w:t xml:space="preserve">, publicado en</w:t>
+        <w:t xml:space="preserve">“La evaluación de 360° aplicada al personal docente de nivel superior”</w:t>
+      </w:r>
+      <w:r>
+        <w:t xml:space="preserve">, publicada en la</w:t>
       </w:r>
       <w:r>
         <w:t xml:space="preserve"> </w:t>
@@ -4903,10 +4866,13 @@
           <w:i/>
           <w:iCs/>
         </w:rPr>
-        <w:t xml:space="preserve">Pensamiento Universitario</w:t>
-      </w:r>
-      <w:r>
-        <w:t xml:space="preserve">, analizó las transformaciones en la labor de los profesores de las universidades nacionales a partir de las exigencias contrapuestas entre la docencia, la investigación y la gestión institucional. A través de un abordaje cualitativo apoyado en entrevistas a docentes y referentes gremiales de diversas universidades públicas, Marquina evidenció que los instrumentos tradicionales de evaluación docente (concursos y permanencias) suelen privilegiar la producción científica abstracta o la acumulación de posgrados por sobre la calidad didáctica en las aulas de grado. Este hallazgo resulta nodal para nuestro TFG, pues justifica la necesidad de generar dispositivos de retroalimentación centrados específicamente en la función formativa y de enseñanza del docente universitario.</w:t>
+        <w:t xml:space="preserve">Revista de Investigación en Tecnologías de la Información (RITI)</w:t>
+      </w:r>
+      <w:r>
+        <w:t xml:space="preserve"> </w:t>
+      </w:r>
+      <w:r>
+        <w:t xml:space="preserve">(Dialnet). El objetivo del estudio consistió en diseñar y evaluar el grado de aceptación de un instrumento 360° para el profesorado universitario en México. Mediante una metodología descriptiva y transversal que abarcó encuestas estructuradas a docentes, directores y estudiantes, los autores concluyeron que el modelo 360° registra un índice de aceptación docente superior al 85% siempre que se respeten tres garantías operativas: el estricto anonimato de los participantes, la entrega de reportes diagnósticos individuales y la ausencia total de penalidades administrativas. Este antecedente aporta a nuestro proyecto una evidencia empírica directa sobre la viabilidad actitudinal del modelo en el contexto universitario iberoamericano.</w:t>
       </w:r>
     </w:p>
     <w:p>
@@ -4922,13 +4888,10 @@
           <w:b/>
           <w:bCs/>
         </w:rPr>
-        <w:t xml:space="preserve">Pérez, González y Castro (2021)</w:t>
-      </w:r>
-      <w:r>
-        <w:t xml:space="preserve"> </w:t>
-      </w:r>
-      <w:r>
-        <w:t xml:space="preserve">publicaron el artículo de investigación empírica</w:t>
+        <w:t xml:space="preserve">Obando Freire et al. (2014)</w:t>
+      </w:r>
+      <w:r>
+        <w:t xml:space="preserve">, en su artículo</w:t>
       </w:r>
       <w:r>
         <w:t xml:space="preserve"> </w:t>
@@ -4938,10 +4901,10 @@
           <w:i/>
           <w:iCs/>
         </w:rPr>
-        <w:t xml:space="preserve">“Evaluación 360° de las tutorías presenciales y en línea en universidades públicas”</w:t>
-      </w:r>
-      <w:r>
-        <w:t xml:space="preserve">, en la revista científica</w:t>
+        <w:t xml:space="preserve">“Sistema de evaluación docente mediante el modelo 360 grados y el portafolio electrónico”</w:t>
+      </w:r>
+      <w:r>
+        <w:t xml:space="preserve">, publicado en la revista</w:t>
       </w:r>
       <w:r>
         <w:t xml:space="preserve"> </w:t>
@@ -4951,17 +4914,106 @@
           <w:i/>
           <w:iCs/>
         </w:rPr>
-        <w:t xml:space="preserve">Unaciencia</w:t>
-      </w:r>
-      <w:r>
-        <w:t xml:space="preserve"> </w:t>
-      </w:r>
-      <w:r>
-        <w:t xml:space="preserve">(Redalyc). El estudio evaluó la factibilidad de aplicar la metodología 360° para valorar el desempeño de docentes universitarios con funciones tutoriales presenciales y mediadas por tecnologías virtuales. Mediante un diseño metodológico descriptivo aplicado a estudiantes, docentes tutores y coordinadores, el trabajo concluyó que el modelo 360° demostró una capacidad significativamente superior para captar competencias pedagógicas blandas (comunicación asertiva, empatía, acompañamiento en entornos virtuales) en comparación con las rúbricas estandarizadas tradicionales. Este antecedente aporta un valor metodológico e instrumental directo para el CURZAS-UNCo, donde la docencia universitaria se despliega crecientemente de forma híbrida articulando la sede central con los Nodos Territoriales.</w:t>
-      </w:r>
-    </w:p>
-    <w:bookmarkEnd w:id="44"/>
-    <w:bookmarkStart w:id="45" w:name="X868ada8a3209befb2b1ff6a8414801be884be61"/>
+        <w:t xml:space="preserve">Medisur</w:t>
+      </w:r>
+      <w:r>
+        <w:t xml:space="preserve"> </w:t>
+      </w:r>
+      <w:r>
+        <w:t xml:space="preserve">(SciELO), investigaron la implementación de una plataforma digital para la triangulación evaluativa en el nivel superior en Cuba. Su objetivo fue contrastar la efectividad de las encuestas unilaterales frente a un circuito multiactoral que combina autoevaluación, coevaluación de pares y heteroevaluación de alumnos y autoridades académicas. Entre sus principales hallazgos, demostraron que la evaluación circular mitiga los sesgos de complacencia o castigo inherentes a las encuestas estudiantiles aisladas y estimula en los docentes la autorreflexión sobre sus métodos didácticos. Su aporte a este TFG reside en documentar la factibilidad técnico-operativa de procesar evaluaciones multidireccionales mediante soportes informáticos.</w:t>
+      </w:r>
+    </w:p>
+    <w:p>
+      <w:pPr>
+        <w:pStyle w:val="Compact"/>
+        <w:numPr>
+          <w:ilvl w:val="0"/>
+          <w:numId w:val="1018"/>
+        </w:numPr>
+      </w:pPr>
+      <w:r>
+        <w:rPr>
+          <w:b/>
+          <w:bCs/>
+        </w:rPr>
+        <w:t xml:space="preserve">Reyes &amp; Díaz (2020)</w:t>
+      </w:r>
+      <w:r>
+        <w:t xml:space="preserve"> </w:t>
+      </w:r>
+      <w:r>
+        <w:t xml:space="preserve">llevaron a cabo una investigación evaluativa titulada</w:t>
+      </w:r>
+      <w:r>
+        <w:t xml:space="preserve"> </w:t>
+      </w:r>
+      <w:r>
+        <w:rPr>
+          <w:i/>
+          <w:iCs/>
+        </w:rPr>
+        <w:t xml:space="preserve">“Metaevaluación del sistema de evaluación docente en una universidad pública”</w:t>
+      </w:r>
+      <w:r>
+        <w:t xml:space="preserve">, publicada en</w:t>
+      </w:r>
+      <w:r>
+        <w:t xml:space="preserve"> </w:t>
+      </w:r>
+      <w:r>
+        <w:rPr>
+          <w:i/>
+          <w:iCs/>
+        </w:rPr>
+        <w:t xml:space="preserve">Education Policy Analysis Archives (EPAA)</w:t>
+      </w:r>
+      <w:r>
+        <w:t xml:space="preserve">. Mediante un enfoque metodológico mixto que combinó análisis normativo-documental y entrevistas a profundidad a docentes y autoridades sindicales, los autores evaluaron el impacto institucional de los sistemas de evaluación vigentes en una universidad pública mexicana. Concluyeron que los esquemas evaluativos de corte sumativo producen desconfianza y un</w:t>
+      </w:r>
+      <w:r>
+        <w:t xml:space="preserve"> </w:t>
+      </w:r>
+      <w:r>
+        <w:t xml:space="preserve">“efecto cumplimiento formal”</w:t>
+      </w:r>
+      <w:r>
+        <w:t xml:space="preserve">, donde el docente cumple el trámite administrativo sin transformar su práctica pedagógica. Asimismo, advirtieron que para que una innovación evaluativa prospere en la universidad pública, resulta indispensable que el modelo se oriente al aprendizaje institucional y se encuentre legitimado por los órganos de representación laboral. Este antecedente fundamenta la centralidad de la dimensión de gobernanza en nuestra investigación.</w:t>
+      </w:r>
+    </w:p>
+    <w:p>
+      <w:pPr>
+        <w:pStyle w:val="Compact"/>
+        <w:numPr>
+          <w:ilvl w:val="0"/>
+          <w:numId w:val="1018"/>
+        </w:numPr>
+      </w:pPr>
+      <w:r>
+        <w:rPr>
+          <w:b/>
+          <w:bCs/>
+        </w:rPr>
+        <w:t xml:space="preserve">Alvarado &amp; Morales (2019)</w:t>
+      </w:r>
+      <w:r>
+        <w:t xml:space="preserve">, en su propuesta de diseño institucional</w:t>
+      </w:r>
+      <w:r>
+        <w:t xml:space="preserve"> </w:t>
+      </w:r>
+      <w:r>
+        <w:rPr>
+          <w:i/>
+          <w:iCs/>
+        </w:rPr>
+        <w:t xml:space="preserve">“Propuesta de evaluación del desempeño docente utilizando la metodología de 360º en educación superior pública”</w:t>
+      </w:r>
+      <w:r>
+        <w:t xml:space="preserve">, desarrollada en el marco de la Universidad Nacional Autónoma de México (UNAM), estructuraron una matriz de indicadores competenciales orientada a ponderar las funciones de docencia, tutoría y gestión institucional. Su estudio aporta criterios metodológicos e instrumentales específicos para operacionalizar cuestionarios de retroalimentación 360°, resguardando la pertinencia técnica del instrumento y su articulación con los planes de perfeccionamiento pedagógico continuo.</w:t>
+      </w:r>
+    </w:p>
+    <w:bookmarkEnd w:id="43"/>
+    <w:bookmarkStart w:id="44" w:name="X2c0b73cfd018cc54d6ee142a74b81e5b02c3616"/>
     <w:p>
       <w:pPr>
         <w:pStyle w:val="Heading3"/>
@@ -4975,7 +5027,7 @@
           <w:i/>
           <w:sz w:val="24"/>
         </w:rPr>
-        <w:t xml:space="preserve">Antecedentes Regionales y Locales: Prácticas de Evaluación y Contexto Institucional en la UNCo y el CURZAS</w:t>
+        <w:t xml:space="preserve">Antecedentes Nacionales: Evaluación Docente y Carrera Académica en Universidades Públicas Argentinas</w:t>
       </w:r>
     </w:p>
     <w:p>
@@ -4983,7 +5035,7 @@
         <w:pStyle w:val="FirstParagraph"/>
       </w:pPr>
       <w:r>
-        <w:t xml:space="preserve">En el plano regional y local patagónico, los antecedentes normativos e institucionales vinculados a la Universidad Nacional del Comahue y al Complejo Universitario Regional Zona Atlántica y Sur (CURZAS) permiten delimitar con precisión empírica el estado de situación de partida:</w:t>
+        <w:t xml:space="preserve">En el ámbito nacional argentino, la literatura científica ha indagado las tensiones inherentes a la profesión docente universitaria y sus mecanismos de valoración:</w:t>
       </w:r>
     </w:p>
     <w:p>
@@ -4999,72 +5051,36 @@
           <w:b/>
           <w:bCs/>
         </w:rPr>
-        <w:t xml:space="preserve">Marco Estatutario Consolidado (Ordenanza CS N° 0988/2025 — Estatuto UNCo):</w:t>
-      </w:r>
-      <w:r>
-        <w:t xml:space="preserve"> </w:t>
-      </w:r>
-      <w:r>
-        <w:t xml:space="preserve">Aprobado por la Asamblea Universitaria como texto ordenado del Estatuto de la Universidad Nacional del Comahue</w:t>
-      </w:r>
-      <w:r>
-        <w:t xml:space="preserve"> </w:t>
-      </w:r>
-      <w:r>
-        <w:t xml:space="preserve">(Universidad Nacional del Comahue, 2025)</w:t>
-      </w:r>
-      <w:r>
-        <w:t xml:space="preserve">, este cuerpo normativo jerarquiza y define formalmente al CURZAS como Complejo Universitario Regional (Art. 17 y Disposición Transitoria Cuarta). En su Título X (</w:t>
-      </w:r>
-      <w:r>
-        <w:t xml:space="preserve">“De la Carrera Docente”</w:t>
-      </w:r>
-      <w:r>
-        <w:t xml:space="preserve">, Arts. 65 a 76), el Estatuto consolida el régimen integral de permanencia académica, articulando dos dispositivos evaluativos estatutarios:</w:t>
-      </w:r>
-    </w:p>
-    <w:p>
-      <w:pPr>
-        <w:pStyle w:val="Compact"/>
-        <w:numPr>
-          <w:ilvl w:val="1"/>
-          <w:numId w:val="1020"/>
-        </w:numPr>
-      </w:pPr>
+        <w:t xml:space="preserve">Marquina (2012)</w:t>
+      </w:r>
+      <w:r>
+        <w:t xml:space="preserve">, en su estudio empírico</w:t>
+      </w:r>
+      <w:r>
+        <w:t xml:space="preserve"> </w:t>
+      </w:r>
       <w:r>
         <w:rPr>
           <w:i/>
           <w:iCs/>
         </w:rPr>
-        <w:t xml:space="preserve">Informes Anuales de Cátedra (Art. 74):</w:t>
-      </w:r>
-      <w:r>
-        <w:t xml:space="preserve"> </w:t>
-      </w:r>
-      <w:r>
-        <w:t xml:space="preserve">Que comprenden la memoria de actividades, el plan de avance pedagógico, la opinión fundada de la Dirección del Departamento y los resultados de las encuestas estudiantiles obligatorias.</w:t>
-      </w:r>
-    </w:p>
-    <w:p>
-      <w:pPr>
-        <w:pStyle w:val="Compact"/>
-        <w:numPr>
-          <w:ilvl w:val="1"/>
-          <w:numId w:val="1020"/>
-        </w:numPr>
-      </w:pPr>
+        <w:t xml:space="preserve">“¿Hay un nuevo modelo de profesión académica en Argentina? Debates y tendencias en la universidad pública”</w:t>
+      </w:r>
+      <w:r>
+        <w:t xml:space="preserve">, publicado en</w:t>
+      </w:r>
+      <w:r>
+        <w:t xml:space="preserve"> </w:t>
+      </w:r>
       <w:r>
         <w:rPr>
           <w:i/>
           <w:iCs/>
         </w:rPr>
-        <w:t xml:space="preserve">Evaluaciones Periódicas Cuatrienales de Permanencia (Art. 75):</w:t>
-      </w:r>
-      <w:r>
-        <w:t xml:space="preserve"> </w:t>
-      </w:r>
-      <w:r>
-        <w:t xml:space="preserve">Llevadas a cabo por tribunales integrados por dos evaluadores externos de la disciplina y un veedor con voz y voto del claustro estudiantil (inc. a). Asimismo, el Art. 76 instituye la obligación departamental de formular programas anuales de formación y perfeccionamiento de recursos humanos docentes.</w:t>
+        <w:t xml:space="preserve">Pensamiento Universitario</w:t>
+      </w:r>
+      <w:r>
+        <w:t xml:space="preserve">, analizó las transformaciones en la labor de los profesores de las universidades nacionales a partir de las exigencias contrapuestas entre la docencia, la investigación y la gestión institucional. A través de un abordaje cualitativo apoyado en entrevistas a docentes y referentes gremiales de diversas universidades públicas, Marquina evidenció que los instrumentos tradicionales de evaluación docente (concursos y permanencias) suelen privilegiar la producción científica abstracta o la acumulación de posgrados por sobre la calidad didáctica en las aulas de grado. Este hallazgo resulta nodal para nuestro TFG, pues justifica la necesidad de generar dispositivos de retroalimentación centrados específicamente en la función formativa y de enseñanza del docente universitario.</w:t>
       </w:r>
     </w:p>
     <w:p>
@@ -5080,34 +5096,68 @@
           <w:b/>
           <w:bCs/>
         </w:rPr>
-        <w:t xml:space="preserve">Régimen General de Carrera Docente de la UNCo (Ordenanza CS N° 0910/1997 y modificatorias hasta la Ord. CS N° 0887/2021):</w:t>
-      </w:r>
-      <w:r>
-        <w:t xml:space="preserve"> </w:t>
-      </w:r>
-      <w:r>
-        <w:t xml:space="preserve">En el Digesto oficial de la universidad, el Reglamento de Carrera Docente</w:t>
-      </w:r>
-      <w:r>
-        <w:t xml:space="preserve"> </w:t>
-      </w:r>
-      <w:r>
-        <w:t xml:space="preserve">(Universidad Nacional del Comahue, 1997)</w:t>
-      </w:r>
-      <w:r>
-        <w:t xml:space="preserve"> </w:t>
-      </w:r>
-      <w:r>
-        <w:t xml:space="preserve">norma en su Capítulo III el procedimiento operativo para la presentación y valoración de informes docentes, encuestas estudiantiles y criterios de permanencia, en plena armonización con el Convenio Colectivo de Trabajo Docente Universitario (Decreto PEN N° 1246/2015)</w:t>
-      </w:r>
-      <w:r>
-        <w:t xml:space="preserve"> </w:t>
-      </w:r>
-      <w:r>
-        <w:t xml:space="preserve">(Decreto N° 1246/2015. Convenio Colectivo de Trabajo para los Docentes de las Instituciones Universitarias Nacionales, 2015)</w:t>
-      </w:r>
-      <w:r>
-        <w:t xml:space="preserve">. Los registros institucionales muestran que, si bien estos instrumentos garantizan con solidez jurídica el control administrativo y sumativo de la estabilidad laboral, se advierte entre los actores institucionales una demanda no resuelta y un área de vacancia analítica respecto al desarrollo de circuitos sistemáticos de retroalimentación formativa y confidencial que orienten la mejora continua del ejercicio docente.</w:t>
+        <w:t xml:space="preserve">Pérez et al. (2021)</w:t>
+      </w:r>
+      <w:r>
+        <w:t xml:space="preserve"> </w:t>
+      </w:r>
+      <w:r>
+        <w:t xml:space="preserve">publicaron el artículo de investigación empírica</w:t>
+      </w:r>
+      <w:r>
+        <w:t xml:space="preserve"> </w:t>
+      </w:r>
+      <w:r>
+        <w:rPr>
+          <w:i/>
+          <w:iCs/>
+        </w:rPr>
+        <w:t xml:space="preserve">“Evaluación 360° de las tutorías presenciales y en línea en universidades públicas”</w:t>
+      </w:r>
+      <w:r>
+        <w:t xml:space="preserve">, en la revista científica</w:t>
+      </w:r>
+      <w:r>
+        <w:t xml:space="preserve"> </w:t>
+      </w:r>
+      <w:r>
+        <w:rPr>
+          <w:i/>
+          <w:iCs/>
+        </w:rPr>
+        <w:t xml:space="preserve">Unaciencia</w:t>
+      </w:r>
+      <w:r>
+        <w:t xml:space="preserve"> </w:t>
+      </w:r>
+      <w:r>
+        <w:t xml:space="preserve">(Redalyc). El estudio evaluó la factibilidad de aplicar la metodología 360° para valorar el desempeño de docentes universitarios con funciones tutoriales presenciales y mediadas por tecnologías virtuales. Mediante un diseño metodológico descriptivo aplicado a estudiantes, docentes tutores y coordinadores, el trabajo concluyó que el modelo 360° demostró una capacidad significativamente superior para captar competencias pedagógicas blandas (comunicación asertiva, empatía, acompañamiento en entornos virtuales) en comparación con las rúbricas estandarizadas tradicionales. Este antecedente aporta un valor metodológico e instrumental directo para el CURZAS-UNCo, donde la docencia universitaria se despliega crecientemente de forma híbrida articulando la sede central con los Nodos Territoriales.</w:t>
+      </w:r>
+    </w:p>
+    <w:bookmarkEnd w:id="44"/>
+    <w:bookmarkStart w:id="45" w:name="X868ada8a3209befb2b1ff6a8414801be884be61"/>
+    <w:p>
+      <w:pPr>
+        <w:pStyle w:val="Heading3"/>
+        <w:keepNext/>
+        <w:spacing w:before="160" w:after="40" w:line="300" w:lineRule="auto"/>
+      </w:pPr>
+      <w:r>
+        <w:rPr>
+          <w:rFonts w:ascii="Arial" w:hAnsi="Arial"/>
+          <w:b/>
+          <w:i/>
+          <w:sz w:val="24"/>
+        </w:rPr>
+        <w:t xml:space="preserve">Antecedentes Regionales y Locales: Prácticas de Evaluación y Contexto Institucional en la UNCo y el CURZAS</w:t>
+      </w:r>
+    </w:p>
+    <w:p>
+      <w:pPr>
+        <w:pStyle w:val="FirstParagraph"/>
+      </w:pPr>
+      <w:r>
+        <w:t xml:space="preserve">En el plano regional y local patagónico, los antecedentes normativos e institucionales vinculados a la Universidad Nacional del Comahue y al Complejo Universitario Regional Zona Atlántica y Sur (CURZAS) permiten delimitar con precisión empírica el estado de situación de partida:</w:t>
       </w:r>
     </w:p>
     <w:p>
@@ -5115,7 +5165,131 @@
         <w:pStyle w:val="Compact"/>
         <w:numPr>
           <w:ilvl w:val="0"/>
-          <w:numId w:val="1019"/>
+          <w:numId w:val="1020"/>
+        </w:numPr>
+      </w:pPr>
+      <w:r>
+        <w:rPr>
+          <w:b/>
+          <w:bCs/>
+        </w:rPr>
+        <w:t xml:space="preserve">Marco Estatutario Consolidado (Ordenanza CS N° 0988/2025 — Estatuto UNCo):</w:t>
+      </w:r>
+      <w:r>
+        <w:t xml:space="preserve"> </w:t>
+      </w:r>
+      <w:r>
+        <w:t xml:space="preserve">Aprobado por la Asamblea Universitaria como texto ordenado del Estatuto de la Universidad Nacional del Comahue</w:t>
+      </w:r>
+      <w:r>
+        <w:t xml:space="preserve"> </w:t>
+      </w:r>
+      <w:r>
+        <w:t xml:space="preserve">(Universidad Nacional del Comahue, 2025)</w:t>
+      </w:r>
+      <w:r>
+        <w:t xml:space="preserve">, este cuerpo normativo jerarquiza y define formalmente al CURZAS como Complejo Universitario Regional (Art. 17 y Disposición Transitoria Cuarta). En su Título X (</w:t>
+      </w:r>
+      <w:r>
+        <w:t xml:space="preserve">“De la Carrera Docente”</w:t>
+      </w:r>
+      <w:r>
+        <w:t xml:space="preserve">, Arts. 65 a 76), el Estatuto consolida el régimen integral de permanencia académica, articulando dos dispositivos evaluativos estatutarios:</w:t>
+      </w:r>
+    </w:p>
+    <w:p>
+      <w:pPr>
+        <w:pStyle w:val="Compact"/>
+        <w:numPr>
+          <w:ilvl w:val="1"/>
+          <w:numId w:val="1021"/>
+        </w:numPr>
+      </w:pPr>
+      <w:r>
+        <w:rPr>
+          <w:i/>
+          <w:iCs/>
+        </w:rPr>
+        <w:t xml:space="preserve">Informes Anuales de Cátedra (Art. 74):</w:t>
+      </w:r>
+      <w:r>
+        <w:t xml:space="preserve"> </w:t>
+      </w:r>
+      <w:r>
+        <w:t xml:space="preserve">Que comprenden la memoria de actividades, el plan de avance pedagógico, la opinión fundada de la Dirección del Departamento y los resultados de las encuestas estudiantiles obligatorias.</w:t>
+      </w:r>
+    </w:p>
+    <w:p>
+      <w:pPr>
+        <w:pStyle w:val="Compact"/>
+        <w:numPr>
+          <w:ilvl w:val="1"/>
+          <w:numId w:val="1021"/>
+        </w:numPr>
+      </w:pPr>
+      <w:r>
+        <w:rPr>
+          <w:i/>
+          <w:iCs/>
+        </w:rPr>
+        <w:t xml:space="preserve">Evaluaciones Periódicas Cuatrienales de Permanencia (Art. 75):</w:t>
+      </w:r>
+      <w:r>
+        <w:t xml:space="preserve"> </w:t>
+      </w:r>
+      <w:r>
+        <w:t xml:space="preserve">Llevadas a cabo por tribunales integrados por dos evaluadores externos de la disciplina y un veedor con voz y voto del claustro estudiantil (inc. a). Asimismo, el Art. 76 instituye la obligación departamental de formular programas anuales de formación y perfeccionamiento de recursos humanos docentes.</w:t>
+      </w:r>
+    </w:p>
+    <w:p>
+      <w:pPr>
+        <w:pStyle w:val="Compact"/>
+        <w:numPr>
+          <w:ilvl w:val="0"/>
+          <w:numId w:val="1020"/>
+        </w:numPr>
+      </w:pPr>
+      <w:r>
+        <w:rPr>
+          <w:b/>
+          <w:bCs/>
+        </w:rPr>
+        <w:t xml:space="preserve">Régimen General de Carrera Docente de la UNCo (Ordenanza CS N° 0910/1997 y modificatorias hasta la Ord. CS N° 0887/2021):</w:t>
+      </w:r>
+      <w:r>
+        <w:t xml:space="preserve"> </w:t>
+      </w:r>
+      <w:r>
+        <w:t xml:space="preserve">En el Digesto oficial de la universidad, el Reglamento de Carrera Docente</w:t>
+      </w:r>
+      <w:r>
+        <w:t xml:space="preserve"> </w:t>
+      </w:r>
+      <w:r>
+        <w:t xml:space="preserve">(Universidad Nacional del Comahue, 1997)</w:t>
+      </w:r>
+      <w:r>
+        <w:t xml:space="preserve"> </w:t>
+      </w:r>
+      <w:r>
+        <w:t xml:space="preserve">norma en su Capítulo III el procedimiento operativo para la presentación y valoración de informes docentes, encuestas estudiantiles y criterios de permanencia, en plena armonización con el Convenio Colectivo de Trabajo Docente Universitario (Decreto PEN N° 1246/2015)</w:t>
+      </w:r>
+      <w:r>
+        <w:t xml:space="preserve"> </w:t>
+      </w:r>
+      <w:r>
+        <w:t xml:space="preserve">(Decreto N° 1246/2015. Convenio Colectivo de Trabajo para los Docentes de las Instituciones Universitarias Nacionales, 2015)</w:t>
+      </w:r>
+      <w:r>
+        <w:t xml:space="preserve">. Los registros institucionales muestran que, si bien estos instrumentos garantizan con solidez jurídica el control administrativo y sumativo de la estabilidad laboral, se advierte entre los actores institucionales una demanda no resuelta y un área de vacancia analítica respecto al desarrollo de circuitos sistemáticos de retroalimentación formativa y confidencial que orienten la mejora continua del ejercicio docente.</w:t>
+      </w:r>
+    </w:p>
+    <w:p>
+      <w:pPr>
+        <w:pStyle w:val="Compact"/>
+        <w:numPr>
+          <w:ilvl w:val="0"/>
+          <w:numId w:val="1020"/>
         </w:numPr>
       </w:pPr>
       <w:r>
@@ -5238,7 +5412,7 @@
     <w:bookmarkEnd w:id="46"/>
     <w:bookmarkEnd w:id="47"/>
     <w:bookmarkEnd w:id="48"/>
-    <w:bookmarkStart w:id="75" w:name="referencias-bibliográficas"/>
+    <w:bookmarkStart w:id="81" w:name="referencias-bibliográficas"/>
     <w:p>
       <w:pPr>
         <w:pStyle w:val="Heading1"/>
@@ -5255,8 +5429,8 @@
         <w:t xml:space="preserve">Referencias Bibliográficas</w:t>
       </w:r>
     </w:p>
-    <w:bookmarkStart w:id="74" w:name="refs"/>
-    <w:bookmarkStart w:id="49" w:name="ref-chiavenato2020"/>
+    <w:bookmarkStart w:id="80" w:name="refs"/>
+    <w:bookmarkStart w:id="50" w:name="ref-alvarado2019"/>
     <w:p>
       <w:pPr>
         <w:pStyle w:val="Bibliography"/>
@@ -5265,7 +5439,7 @@
         <w:jc w:val="left"/>
       </w:pPr>
       <w:r>
-        <w:t xml:space="preserve">Chiavenato, I. (2020).</w:t>
+        <w:t xml:space="preserve">Alvarado, M., &amp; Morales, R. (2019).</w:t>
       </w:r>
       <w:r>
         <w:t xml:space="preserve"> </w:t>
@@ -5275,17 +5449,25 @@
           <w:i/>
           <w:iCs/>
         </w:rPr>
-        <w:t xml:space="preserve">Gestión del talento humano: El nuevo papel de los recursos humanos en las organizaciones</w:t>
-      </w:r>
-      <w:r>
-        <w:t xml:space="preserve"> </w:t>
-      </w:r>
-      <w:r>
-        <w:t xml:space="preserve">(5.ª ed.). McGraw-Hill Interamericana.</w:t>
-      </w:r>
-    </w:p>
-    <w:bookmarkEnd w:id="49"/>
-    <w:bookmarkStart w:id="51" w:name="ref-curza2022"/>
+        <w:t xml:space="preserve">Propuesta de evaluación del desempeño docente utilizando la metodología de 360º en educación superior pública</w:t>
+      </w:r>
+      <w:r>
+        <w:t xml:space="preserve">. Universidad Nacional Autónoma de México (UNAM).</w:t>
+      </w:r>
+      <w:r>
+        <w:t xml:space="preserve"> </w:t>
+      </w:r>
+      <w:hyperlink r:id="rId49">
+        <w:r>
+          <w:rPr>
+            <w:rStyle w:val="Hyperlink"/>
+          </w:rPr>
+          <w:t xml:space="preserve">https://ru.dgb.unam.mx/handle/123456789/4144</w:t>
+        </w:r>
+      </w:hyperlink>
+    </w:p>
+    <w:bookmarkEnd w:id="50"/>
+    <w:bookmarkStart w:id="51" w:name="ref-chiavenato2020"/>
     <w:p>
       <w:pPr>
         <w:pStyle w:val="Bibliography"/>
@@ -5294,6 +5476,35 @@
         <w:jc w:val="left"/>
       </w:pPr>
       <w:r>
+        <w:t xml:space="preserve">Chiavenato, I. (2020).</w:t>
+      </w:r>
+      <w:r>
+        <w:t xml:space="preserve"> </w:t>
+      </w:r>
+      <w:r>
+        <w:rPr>
+          <w:i/>
+          <w:iCs/>
+        </w:rPr>
+        <w:t xml:space="preserve">Gestión del talento humano: El nuevo papel de los recursos humanos en las organizaciones</w:t>
+      </w:r>
+      <w:r>
+        <w:t xml:space="preserve"> </w:t>
+      </w:r>
+      <w:r>
+        <w:t xml:space="preserve">(5.ª ed.). McGraw-Hill Interamericana.</w:t>
+      </w:r>
+    </w:p>
+    <w:bookmarkEnd w:id="51"/>
+    <w:bookmarkStart w:id="53" w:name="ref-curza2022"/>
+    <w:p>
+      <w:pPr>
+        <w:pStyle w:val="Bibliography"/>
+        <w:spacing w:after="120"/>
+        <w:ind w:left="720" w:hanging="720"/>
+        <w:jc w:val="left"/>
+      </w:pPr>
+      <w:r>
         <w:t xml:space="preserve">Consejo Directivo del CURZAS. (2022).</w:t>
       </w:r>
       <w:r>
@@ -5312,7 +5523,7 @@
       <w:r>
         <w:t xml:space="preserve"> </w:t>
       </w:r>
-      <w:hyperlink r:id="rId50">
+      <w:hyperlink r:id="rId52">
         <w:r>
           <w:rPr>
             <w:rStyle w:val="Hyperlink"/>
@@ -5321,8 +5532,8 @@
         </w:r>
       </w:hyperlink>
     </w:p>
-    <w:bookmarkEnd w:id="51"/>
-    <w:bookmarkStart w:id="52" w:name="ref-uncocurzas2023"/>
+    <w:bookmarkEnd w:id="53"/>
+    <w:bookmarkStart w:id="54" w:name="ref-uncocurzas2023"/>
     <w:p>
       <w:pPr>
         <w:pStyle w:val="Bibliography"/>
@@ -5347,8 +5558,8 @@
         <w:t xml:space="preserve">. Universidad Nacional del Comahue.</w:t>
       </w:r>
     </w:p>
-    <w:bookmarkEnd w:id="52"/>
-    <w:bookmarkStart w:id="54" w:name="ref-delagarza2001"/>
+    <w:bookmarkEnd w:id="54"/>
+    <w:bookmarkStart w:id="56" w:name="ref-delagarza2001"/>
     <w:p>
       <w:pPr>
         <w:pStyle w:val="Bibliography"/>
@@ -5388,7 +5599,7 @@
       <w:r>
         <w:t xml:space="preserve"> </w:t>
       </w:r>
-      <w:hyperlink r:id="rId53">
+      <w:hyperlink r:id="rId55">
         <w:r>
           <w:rPr>
             <w:rStyle w:val="Hyperlink"/>
@@ -5397,8 +5608,8 @@
         </w:r>
       </w:hyperlink>
     </w:p>
-    <w:bookmarkEnd w:id="54"/>
-    <w:bookmarkStart w:id="55" w:name="ref-pen2015"/>
+    <w:bookmarkEnd w:id="56"/>
+    <w:bookmarkStart w:id="57" w:name="ref-pen2015"/>
     <w:p>
       <w:pPr>
         <w:pStyle w:val="Bibliography"/>
@@ -5410,8 +5621,8 @@
         <w:t xml:space="preserve">Decreto N° 1246/2015. Convenio Colectivo de Trabajo para los Docentes de las Instituciones Universitarias Nacionales (2015).</w:t>
       </w:r>
     </w:p>
-    <w:bookmarkEnd w:id="55"/>
-    <w:bookmarkStart w:id="56" w:name="ref-jimenez2008"/>
+    <w:bookmarkEnd w:id="57"/>
+    <w:bookmarkStart w:id="58" w:name="ref-jimenez2008"/>
     <w:p>
       <w:pPr>
         <w:pStyle w:val="Bibliography"/>
@@ -5439,8 +5650,8 @@
         <w:t xml:space="preserve">(pp. 27-42). Universidad Pedagógica Nacional / CLACSO.</w:t>
       </w:r>
     </w:p>
-    <w:bookmarkEnd w:id="56"/>
-    <w:bookmarkStart w:id="57" w:name="ref-lepsinger2009"/>
+    <w:bookmarkEnd w:id="58"/>
+    <w:bookmarkStart w:id="59" w:name="ref-lepsinger2009"/>
     <w:p>
       <w:pPr>
         <w:pStyle w:val="Bibliography"/>
@@ -5468,8 +5679,8 @@
         <w:t xml:space="preserve">(2.ª ed.). Pfeiffer.</w:t>
       </w:r>
     </w:p>
-    <w:bookmarkEnd w:id="57"/>
-    <w:bookmarkStart w:id="58" w:name="ref-ministerio1995"/>
+    <w:bookmarkEnd w:id="59"/>
+    <w:bookmarkStart w:id="60" w:name="ref-ministerio1995"/>
     <w:p>
       <w:pPr>
         <w:pStyle w:val="Bibliography"/>
@@ -5481,8 +5692,8 @@
         <w:t xml:space="preserve">Ley N° 24.521 de Educación Superior (1995).</w:t>
       </w:r>
     </w:p>
-    <w:bookmarkEnd w:id="58"/>
-    <w:bookmarkStart w:id="59" w:name="ref-longo2006"/>
+    <w:bookmarkEnd w:id="60"/>
+    <w:bookmarkStart w:id="61" w:name="ref-longo2006"/>
     <w:p>
       <w:pPr>
         <w:pStyle w:val="Bibliography"/>
@@ -5507,8 +5718,8 @@
         <w:t xml:space="preserve">. Paidós.</w:t>
       </w:r>
     </w:p>
-    <w:bookmarkEnd w:id="59"/>
-    <w:bookmarkStart w:id="60" w:name="ref-matus1993"/>
+    <w:bookmarkEnd w:id="61"/>
+    <w:bookmarkStart w:id="62" w:name="ref-marquina2012"/>
     <w:p>
       <w:pPr>
         <w:pStyle w:val="Bibliography"/>
@@ -5517,7 +5728,7 @@
         <w:jc w:val="left"/>
       </w:pPr>
       <w:r>
-        <w:t xml:space="preserve">Matus, C. (1993).</w:t>
+        <w:t xml:space="preserve">Marquina, M. (2012). ¿Hay un nuevo modelo de profesión académica en Argentina? Debates y tendencias en la universidad pública.</w:t>
       </w:r>
       <w:r>
         <w:t xml:space="preserve"> </w:t>
@@ -5527,14 +5738,27 @@
           <w:i/>
           <w:iCs/>
         </w:rPr>
-        <w:t xml:space="preserve">Política, planificación y gobierno</w:t>
-      </w:r>
-      <w:r>
-        <w:t xml:space="preserve">. Fundación ALTIDIR.</w:t>
-      </w:r>
-    </w:p>
-    <w:bookmarkEnd w:id="60"/>
-    <w:bookmarkStart w:id="62" w:name="ref-obando2014"/>
+        <w:t xml:space="preserve">Pensamiento Universitario</w:t>
+      </w:r>
+      <w:r>
+        <w:t xml:space="preserve">,</w:t>
+      </w:r>
+      <w:r>
+        <w:t xml:space="preserve"> </w:t>
+      </w:r>
+      <w:r>
+        <w:rPr>
+          <w:i/>
+          <w:iCs/>
+        </w:rPr>
+        <w:t xml:space="preserve">15</w:t>
+      </w:r>
+      <w:r>
+        <w:t xml:space="preserve">(15), 35-48.</w:t>
+      </w:r>
+    </w:p>
+    <w:bookmarkEnd w:id="62"/>
+    <w:bookmarkStart w:id="63" w:name="ref-matus1993"/>
     <w:p>
       <w:pPr>
         <w:pStyle w:val="Bibliography"/>
@@ -5543,6 +5767,32 @@
         <w:jc w:val="left"/>
       </w:pPr>
       <w:r>
+        <w:t xml:space="preserve">Matus, C. (1993).</w:t>
+      </w:r>
+      <w:r>
+        <w:t xml:space="preserve"> </w:t>
+      </w:r>
+      <w:r>
+        <w:rPr>
+          <w:i/>
+          <w:iCs/>
+        </w:rPr>
+        <w:t xml:space="preserve">Política, planificación y gobierno</w:t>
+      </w:r>
+      <w:r>
+        <w:t xml:space="preserve">. Fundación ALTIDIR.</w:t>
+      </w:r>
+    </w:p>
+    <w:bookmarkEnd w:id="63"/>
+    <w:bookmarkStart w:id="65" w:name="ref-obando2014"/>
+    <w:p>
+      <w:pPr>
+        <w:pStyle w:val="Bibliography"/>
+        <w:spacing w:after="120"/>
+        <w:ind w:left="720" w:hanging="720"/>
+        <w:jc w:val="left"/>
+      </w:pPr>
+      <w:r>
         <w:t xml:space="preserve">Obando Freire, F., López Fernández, R., Luna Álvarez, D., Luna Álvarez, E., Luna Álvarez, W., &amp; Alpizar Fernández, R. (2014). Sistema de evaluación docente mediante el modelo 360 grados y el portafolio electrónico.</w:t>
       </w:r>
       <w:r>
@@ -5574,7 +5824,7 @@
       <w:r>
         <w:t xml:space="preserve"> </w:t>
       </w:r>
-      <w:hyperlink r:id="rId61">
+      <w:hyperlink r:id="rId64">
         <w:r>
           <w:rPr>
             <w:rStyle w:val="Hyperlink"/>
@@ -5583,8 +5833,8 @@
         </w:r>
       </w:hyperlink>
     </w:p>
-    <w:bookmarkEnd w:id="62"/>
-    <w:bookmarkStart w:id="63" w:name="ref-oszlak2020"/>
+    <w:bookmarkEnd w:id="65"/>
+    <w:bookmarkStart w:id="66" w:name="ref-oszlak2020"/>
     <w:p>
       <w:pPr>
         <w:pStyle w:val="Bibliography"/>
@@ -5609,8 +5859,8 @@
         <w:t xml:space="preserve">. Instituto Nacional de la Administración Pública.</w:t>
       </w:r>
     </w:p>
-    <w:bookmarkEnd w:id="63"/>
-    <w:bookmarkStart w:id="64" w:name="ref-sautu2005"/>
+    <w:bookmarkEnd w:id="66"/>
+    <w:bookmarkStart w:id="67" w:name="ref-perez2021"/>
     <w:p>
       <w:pPr>
         <w:pStyle w:val="Bibliography"/>
@@ -5619,7 +5869,7 @@
         <w:jc w:val="left"/>
       </w:pPr>
       <w:r>
-        <w:t xml:space="preserve">Sautu, R. (2005).</w:t>
+        <w:t xml:space="preserve">Pérez, M., González, J., &amp; Castro, L. (2021). Evaluación 360° de las tutorías presenciales y en línea en universidades públicas.</w:t>
       </w:r>
       <w:r>
         <w:t xml:space="preserve"> </w:t>
@@ -5629,14 +5879,27 @@
           <w:i/>
           <w:iCs/>
         </w:rPr>
-        <w:t xml:space="preserve">Todo es teoría: objetivos y métodos de investigación</w:t>
-      </w:r>
-      <w:r>
-        <w:t xml:space="preserve">. Lumiere.</w:t>
-      </w:r>
-    </w:p>
-    <w:bookmarkEnd w:id="64"/>
-    <w:bookmarkStart w:id="66" w:name="ref-sifuentes2016"/>
+        <w:t xml:space="preserve">Unaciencia: Revista de Estudios e Investigaciones</w:t>
+      </w:r>
+      <w:r>
+        <w:t xml:space="preserve">,</w:t>
+      </w:r>
+      <w:r>
+        <w:t xml:space="preserve"> </w:t>
+      </w:r>
+      <w:r>
+        <w:rPr>
+          <w:i/>
+          <w:iCs/>
+        </w:rPr>
+        <w:t xml:space="preserve">14</w:t>
+      </w:r>
+      <w:r>
+        <w:t xml:space="preserve">(26), 45-58.</w:t>
+      </w:r>
+    </w:p>
+    <w:bookmarkEnd w:id="67"/>
+    <w:bookmarkStart w:id="69" w:name="ref-reyes2020"/>
     <w:p>
       <w:pPr>
         <w:pStyle w:val="Bibliography"/>
@@ -5645,7 +5908,7 @@
         <w:jc w:val="left"/>
       </w:pPr>
       <w:r>
-        <w:t xml:space="preserve">Sifuentes Ocegueda, A. T., Suárez Flores, M., &amp; Lara González, L. M. (2016). La evaluación de 360° aplicada al personal docente de nivel superior.</w:t>
+        <w:t xml:space="preserve">Reyes, C., &amp; Díaz, Á. (2020). Metaevaluación del sistema de evaluación docente en una universidad pública.</w:t>
       </w:r>
       <w:r>
         <w:t xml:space="preserve"> </w:t>
@@ -5655,7 +5918,7 @@
           <w:i/>
           <w:iCs/>
         </w:rPr>
-        <w:t xml:space="preserve">Revista de Investigación en Tecnologías de la Información (RITI)</w:t>
+        <w:t xml:space="preserve">Education Policy Analysis Archives</w:t>
       </w:r>
       <w:r>
         <w:t xml:space="preserve">,</w:t>
@@ -5668,25 +5931,25 @@
           <w:i/>
           <w:iCs/>
         </w:rPr>
-        <w:t xml:space="preserve">4</w:t>
-      </w:r>
-      <w:r>
-        <w:t xml:space="preserve">(7), 17-26.</w:t>
-      </w:r>
-      <w:r>
-        <w:t xml:space="preserve"> </w:t>
-      </w:r>
-      <w:hyperlink r:id="rId65">
+        <w:t xml:space="preserve">28</w:t>
+      </w:r>
+      <w:r>
+        <w:t xml:space="preserve">(85), 1-25.</w:t>
+      </w:r>
+      <w:r>
+        <w:t xml:space="preserve"> </w:t>
+      </w:r>
+      <w:hyperlink r:id="rId68">
         <w:r>
           <w:rPr>
             <w:rStyle w:val="Hyperlink"/>
           </w:rPr>
-          <w:t xml:space="preserve">https://dialnet.unirioja.es/descarga/articulo/7242790.pdf</w:t>
+          <w:t xml:space="preserve">https://doi.org/10.14507/epaa.28.5142</w:t>
         </w:r>
       </w:hyperlink>
     </w:p>
-    <w:bookmarkEnd w:id="66"/>
-    <w:bookmarkStart w:id="68" w:name="ref-torraco2016"/>
+    <w:bookmarkEnd w:id="69"/>
+    <w:bookmarkStart w:id="70" w:name="ref-sautu2005"/>
     <w:p>
       <w:pPr>
         <w:pStyle w:val="Bibliography"/>
@@ -5695,6 +5958,82 @@
         <w:jc w:val="left"/>
       </w:pPr>
       <w:r>
+        <w:t xml:space="preserve">Sautu, R. (2005).</w:t>
+      </w:r>
+      <w:r>
+        <w:t xml:space="preserve"> </w:t>
+      </w:r>
+      <w:r>
+        <w:rPr>
+          <w:i/>
+          <w:iCs/>
+        </w:rPr>
+        <w:t xml:space="preserve">Todo es teoría: objetivos y métodos de investigación</w:t>
+      </w:r>
+      <w:r>
+        <w:t xml:space="preserve">. Lumiere.</w:t>
+      </w:r>
+    </w:p>
+    <w:bookmarkEnd w:id="70"/>
+    <w:bookmarkStart w:id="72" w:name="ref-sifuentes2016"/>
+    <w:p>
+      <w:pPr>
+        <w:pStyle w:val="Bibliography"/>
+        <w:spacing w:after="120"/>
+        <w:ind w:left="720" w:hanging="720"/>
+        <w:jc w:val="left"/>
+      </w:pPr>
+      <w:r>
+        <w:t xml:space="preserve">Sifuentes Ocegueda, A. T., Suárez Flores, M., &amp; Lara González, L. M. (2016). La evaluación de 360° aplicada al personal docente de nivel superior.</w:t>
+      </w:r>
+      <w:r>
+        <w:t xml:space="preserve"> </w:t>
+      </w:r>
+      <w:r>
+        <w:rPr>
+          <w:i/>
+          <w:iCs/>
+        </w:rPr>
+        <w:t xml:space="preserve">Revista de Investigación en Tecnologías de la Información (RITI)</w:t>
+      </w:r>
+      <w:r>
+        <w:t xml:space="preserve">,</w:t>
+      </w:r>
+      <w:r>
+        <w:t xml:space="preserve"> </w:t>
+      </w:r>
+      <w:r>
+        <w:rPr>
+          <w:i/>
+          <w:iCs/>
+        </w:rPr>
+        <w:t xml:space="preserve">4</w:t>
+      </w:r>
+      <w:r>
+        <w:t xml:space="preserve">(7), 17-26.</w:t>
+      </w:r>
+      <w:r>
+        <w:t xml:space="preserve"> </w:t>
+      </w:r>
+      <w:hyperlink r:id="rId71">
+        <w:r>
+          <w:rPr>
+            <w:rStyle w:val="Hyperlink"/>
+          </w:rPr>
+          <w:t xml:space="preserve">https://dialnet.unirioja.es/servlet/articulo?codigo=7242790</w:t>
+        </w:r>
+      </w:hyperlink>
+    </w:p>
+    <w:bookmarkEnd w:id="72"/>
+    <w:bookmarkStart w:id="74" w:name="ref-torraco2016"/>
+    <w:p>
+      <w:pPr>
+        <w:pStyle w:val="Bibliography"/>
+        <w:spacing w:after="120"/>
+        <w:ind w:left="720" w:hanging="720"/>
+        <w:jc w:val="left"/>
+      </w:pPr>
+      <w:r>
         <w:t xml:space="preserve">Torraco, R. J. (2016). Writing integrative literature reviews: Using the past and present to explore the future.</w:t>
       </w:r>
       <w:r>
@@ -5726,7 +6065,7 @@
       <w:r>
         <w:t xml:space="preserve"> </w:t>
       </w:r>
-      <w:hyperlink r:id="rId67">
+      <w:hyperlink r:id="rId73">
         <w:r>
           <w:rPr>
             <w:rStyle w:val="Hyperlink"/>
@@ -5735,8 +6074,8 @@
         </w:r>
       </w:hyperlink>
     </w:p>
-    <w:bookmarkEnd w:id="68"/>
-    <w:bookmarkStart w:id="70" w:name="ref-unco1997"/>
+    <w:bookmarkEnd w:id="74"/>
+    <w:bookmarkStart w:id="76" w:name="ref-unco1997"/>
     <w:p>
       <w:pPr>
         <w:pStyle w:val="Bibliography"/>
@@ -5758,12 +6097,12 @@
         <w:t xml:space="preserve">Ordenanza CS N° 0910/1997: Reglamento de Carrera Docente</w:t>
       </w:r>
       <w:r>
-        <w:t xml:space="preserve">.</w:t>
-      </w:r>
-      <w:r>
-        <w:t xml:space="preserve"> </w:t>
-      </w:r>
-      <w:hyperlink r:id="rId69">
+        <w:t xml:space="preserve">. Consejo Superior, Universidad Nacional del Comahue.</w:t>
+      </w:r>
+      <w:r>
+        <w:t xml:space="preserve"> </w:t>
+      </w:r>
+      <w:hyperlink r:id="rId75">
         <w:r>
           <w:rPr>
             <w:rStyle w:val="Hyperlink"/>
@@ -5772,8 +6111,8 @@
         </w:r>
       </w:hyperlink>
     </w:p>
-    <w:bookmarkEnd w:id="70"/>
-    <w:bookmarkStart w:id="72" w:name="ref-unco2025"/>
+    <w:bookmarkEnd w:id="76"/>
+    <w:bookmarkStart w:id="78" w:name="ref-unco2025"/>
     <w:p>
       <w:pPr>
         <w:pStyle w:val="Bibliography"/>
@@ -5795,12 +6134,12 @@
         <w:t xml:space="preserve">Ordenanza CS N° 0988/2025: Texto ordenado del Estatuto de la Universidad Nacional del Comahue (Título X: De la Carrera Docente)</w:t>
       </w:r>
       <w:r>
-        <w:t xml:space="preserve">.</w:t>
-      </w:r>
-      <w:r>
-        <w:t xml:space="preserve"> </w:t>
-      </w:r>
-      <w:hyperlink r:id="rId71">
+        <w:t xml:space="preserve">. Consejo Superior, Universidad Nacional del Comahue.</w:t>
+      </w:r>
+      <w:r>
+        <w:t xml:space="preserve"> </w:t>
+      </w:r>
+      <w:hyperlink r:id="rId77">
         <w:r>
           <w:rPr>
             <w:rStyle w:val="Hyperlink"/>
@@ -5809,8 +6148,8 @@
         </w:r>
       </w:hyperlink>
     </w:p>
-    <w:bookmarkEnd w:id="72"/>
-    <w:bookmarkStart w:id="73" w:name="ref-wainerman2011"/>
+    <w:bookmarkEnd w:id="78"/>
+    <w:bookmarkStart w:id="79" w:name="ref-wainerman2011"/>
     <w:p>
       <w:pPr>
         <w:pStyle w:val="Bibliography"/>
@@ -5838,9 +6177,9 @@
         <w:t xml:space="preserve">(4.ª ed.). Manantial.</w:t>
       </w:r>
     </w:p>
-    <w:bookmarkEnd w:id="73"/>
-    <w:bookmarkEnd w:id="74"/>
-    <w:bookmarkEnd w:id="75"/>
+    <w:bookmarkEnd w:id="79"/>
+    <w:bookmarkEnd w:id="80"/>
+    <w:bookmarkEnd w:id="81"/>
     <w:sectPr>
       <w:footerReference w:type="default" r:id="rId11"/>
       <w:footnotePr>
@@ -6317,12 +6656,6 @@
     <w:abstractNumId w:val="991"/>
   </w:num>
   <w:num w:numId="1014">
-    <w:abstractNumId w:val="991"/>
-  </w:num>
-  <w:num w:numId="1015">
-    <w:abstractNumId w:val="991"/>
-  </w:num>
-  <w:num w:numId="1016">
     <w:abstractNumId w:val="99411"/>
     <w:lvlOverride w:ilvl="0">
       <w:startOverride w:val="1"/>
@@ -6352,8 +6685,41 @@
       <w:startOverride w:val="1"/>
     </w:lvlOverride>
   </w:num>
+  <w:num w:numId="1015">
+    <w:abstractNumId w:val="991"/>
+  </w:num>
+  <w:num w:numId="1016">
+    <w:abstractNumId w:val="991"/>
+  </w:num>
   <w:num w:numId="1017">
-    <w:abstractNumId w:val="991"/>
+    <w:abstractNumId w:val="99411"/>
+    <w:lvlOverride w:ilvl="0">
+      <w:startOverride w:val="1"/>
+    </w:lvlOverride>
+    <w:lvlOverride w:ilvl="1">
+      <w:startOverride w:val="1"/>
+    </w:lvlOverride>
+    <w:lvlOverride w:ilvl="2">
+      <w:startOverride w:val="1"/>
+    </w:lvlOverride>
+    <w:lvlOverride w:ilvl="3">
+      <w:startOverride w:val="1"/>
+    </w:lvlOverride>
+    <w:lvlOverride w:ilvl="4">
+      <w:startOverride w:val="1"/>
+    </w:lvlOverride>
+    <w:lvlOverride w:ilvl="5">
+      <w:startOverride w:val="1"/>
+    </w:lvlOverride>
+    <w:lvlOverride w:ilvl="6">
+      <w:startOverride w:val="1"/>
+    </w:lvlOverride>
+    <w:lvlOverride w:ilvl="7">
+      <w:startOverride w:val="1"/>
+    </w:lvlOverride>
+    <w:lvlOverride w:ilvl="8">
+      <w:startOverride w:val="1"/>
+    </w:lvlOverride>
   </w:num>
   <w:num w:numId="1018">
     <w:abstractNumId w:val="991"/>
@@ -6362,6 +6728,9 @@
     <w:abstractNumId w:val="991"/>
   </w:num>
   <w:num w:numId="1020">
+    <w:abstractNumId w:val="991"/>
+  </w:num>
+  <w:num w:numId="1021">
     <w:abstractNumId w:val="99411"/>
     <w:lvlOverride w:ilvl="0">
       <w:startOverride w:val="1"/>

</xml_diff>

<commit_message>
docs: add Quarto document for theoretical framework and research project proposal
</commit_message>
<xml_diff>
--- a/Entregas/Actividad 3/TP3_Ayarachi_Fuentes.docx
+++ b/Entregas/Actividad 3/TP3_Ayarachi_Fuentes.docx
@@ -609,7 +609,7 @@
           <w:rFonts w:ascii="Arial" w:hAnsi="Arial"/>
           <w:sz w:val="22"/>
         </w:rPr>
-        <w:t>7</w:t>
+        <w:t>8</w:t>
       </w:r>
     </w:p>
     <w:p>
@@ -636,7 +636,7 @@
           <w:rFonts w:ascii="Arial" w:hAnsi="Arial"/>
           <w:sz w:val="22"/>
         </w:rPr>
-        <w:t>7</w:t>
+        <w:t>8</w:t>
       </w:r>
     </w:p>
     <w:p>
@@ -717,7 +717,7 @@
           <w:rFonts w:ascii="Arial" w:hAnsi="Arial"/>
           <w:sz w:val="22"/>
         </w:rPr>
-        <w:t>8</w:t>
+        <w:t>9</w:t>
       </w:r>
     </w:p>
     <w:p>
@@ -744,7 +744,7 @@
           <w:rFonts w:ascii="Arial" w:hAnsi="Arial"/>
           <w:sz w:val="22"/>
         </w:rPr>
-        <w:t>8</w:t>
+        <w:t>9</w:t>
       </w:r>
     </w:p>
     <w:p>
@@ -798,7 +798,7 @@
           <w:rFonts w:ascii="Arial" w:hAnsi="Arial"/>
           <w:sz w:val="22"/>
         </w:rPr>
-        <w:t>9</w:t>
+        <w:t>10</w:t>
       </w:r>
     </w:p>
     <w:p>
@@ -825,7 +825,7 @@
           <w:rFonts w:ascii="Arial" w:hAnsi="Arial"/>
           <w:sz w:val="22"/>
         </w:rPr>
-        <w:t>11</w:t>
+        <w:t>12</w:t>
       </w:r>
     </w:p>
     <w:p>
@@ -852,7 +852,7 @@
           <w:rFonts w:ascii="Arial" w:hAnsi="Arial"/>
           <w:sz w:val="22"/>
         </w:rPr>
-        <w:t>11</w:t>
+        <w:t>12</w:t>
       </w:r>
     </w:p>
     <w:p>
@@ -879,7 +879,7 @@
           <w:rFonts w:ascii="Arial" w:hAnsi="Arial"/>
           <w:sz w:val="22"/>
         </w:rPr>
-        <w:t>11</w:t>
+        <w:t>12</w:t>
       </w:r>
     </w:p>
     <w:p>
@@ -906,7 +906,7 @@
           <w:rFonts w:ascii="Arial" w:hAnsi="Arial"/>
           <w:sz w:val="22"/>
         </w:rPr>
-        <w:t>12</w:t>
+        <w:t>13</w:t>
       </w:r>
     </w:p>
     <w:p>
@@ -933,7 +933,7 @@
           <w:rFonts w:ascii="Arial" w:hAnsi="Arial"/>
           <w:sz w:val="22"/>
         </w:rPr>
-        <w:t>13</w:t>
+        <w:t>14</w:t>
       </w:r>
     </w:p>
     <w:p>
@@ -960,7 +960,7 @@
           <w:rFonts w:ascii="Arial" w:hAnsi="Arial"/>
           <w:sz w:val="22"/>
         </w:rPr>
-        <w:t>14</w:t>
+        <w:t>15</w:t>
       </w:r>
     </w:p>
     <w:p>
@@ -987,7 +987,7 @@
           <w:rFonts w:ascii="Arial" w:hAnsi="Arial"/>
           <w:sz w:val="22"/>
         </w:rPr>
-        <w:t>15</w:t>
+        <w:t>16</w:t>
       </w:r>
     </w:p>
     <w:p>
@@ -1014,7 +1014,7 @@
           <w:rFonts w:ascii="Arial" w:hAnsi="Arial"/>
           <w:sz w:val="22"/>
         </w:rPr>
-        <w:t>17</w:t>
+        <w:t>18</w:t>
       </w:r>
     </w:p>
     <w:p>
@@ -1041,7 +1041,7 @@
           <w:rFonts w:ascii="Arial" w:hAnsi="Arial"/>
           <w:sz w:val="22"/>
         </w:rPr>
-        <w:t>17</w:t>
+        <w:t>18</w:t>
       </w:r>
     </w:p>
     <w:p>
@@ -1068,7 +1068,7 @@
           <w:rFonts w:ascii="Arial" w:hAnsi="Arial"/>
           <w:sz w:val="22"/>
         </w:rPr>
-        <w:t>17</w:t>
+        <w:t>18</w:t>
       </w:r>
     </w:p>
     <w:p>
@@ -1095,7 +1095,7 @@
           <w:rFonts w:ascii="Arial" w:hAnsi="Arial"/>
           <w:sz w:val="22"/>
         </w:rPr>
-        <w:t>19</w:t>
+        <w:t>20</w:t>
       </w:r>
     </w:p>
     <w:p>
@@ -1122,7 +1122,7 @@
           <w:rFonts w:ascii="Arial" w:hAnsi="Arial"/>
           <w:sz w:val="22"/>
         </w:rPr>
-        <w:t>19</w:t>
+        <w:t>21</w:t>
       </w:r>
     </w:p>
     <w:p>
@@ -1149,7 +1149,7 @@
           <w:rFonts w:ascii="Arial" w:hAnsi="Arial"/>
           <w:sz w:val="22"/>
         </w:rPr>
-        <w:t>21</w:t>
+        <w:t>22</w:t>
       </w:r>
     </w:p>
     <w:p>
@@ -1176,7 +1176,7 @@
           <w:rFonts w:ascii="Arial" w:hAnsi="Arial"/>
           <w:sz w:val="22"/>
         </w:rPr>
-        <w:t>22</w:t>
+        <w:t>23</w:t>
       </w:r>
     </w:p>
     <w:p>
@@ -2126,7 +2126,7 @@
         <w:t xml:space="preserve"> </w:t>
       </w:r>
       <w:r>
-        <w:t xml:space="preserve">Se indagará mediante cuestionarios y entrevistas semiestructuradas a docentes y estudiantes. Los indicadores clave incluyen: disposición al diálogo reflexivo sobre la enseñanza, grado de confianza en el anonimato de las respuestas, temores expresados frente a la coevaluación y expectativas de mejora pedagógica.</w:t>
+        <w:t xml:space="preserve">Se indagará mediante cuestionarios y entrevistas semiestructuradas a docentes y estudiantes. Los indicadores clave incluyen: disposición al diálogo reflexivo sobre la enseñanza, grado de confianza en el anonimato de las respuestas —con especial atención a la fragilidad percibida de la confidencialidad en cátedras unipersonales o con equipos reducidos—, temores expresados frente a la coevaluación entre pares y expectativas de mejora pedagógica.</w:t>
       </w:r>
     </w:p>
     <w:p>
@@ -2148,7 +2148,7 @@
         <w:t xml:space="preserve"> </w:t>
       </w:r>
       <w:r>
-        <w:t xml:space="preserve">Se analizará a través de entrevistas a informantes clave del área académica y de soporte técnico del CURZAS, así como el relevamiento de plataformas informáticas disponibles. Los indicadores abarcan: facilidad de acceso, carga operativa requerida para responder y capacidad de generar reportes diagnósticos sintéticos.</w:t>
+        <w:t xml:space="preserve">Se analizará a través de entrevistas a informantes clave del área académica y de soporte técnico del CURZAS, así como el relevamiento de plataformas informáticas disponibles. Los indicadores abarcan: facilidad de acceso, riesgo de fatiga evaluativa derivada de la sobrecarga de instrumentos en asignaturas compartidas, extensión y periodicidad óptima de los cuestionarios, y capacidad de generar reportes diagnósticos sintéticos.</w:t>
       </w:r>
     </w:p>
     <w:p>
@@ -2192,7 +2192,7 @@
         <w:t xml:space="preserve"> </w:t>
       </w:r>
       <w:r>
-        <w:t xml:space="preserve">Se explorará mediante entrevistas a autoridades departamentales, referentes de cogobierno y representaciones gremiales docentes. Los indicadores incluyen: consensos sobre el uso formativo de la información en el marco de la poligobernanza institucional, mecanismos de consulta previa y articulación de los hallazgos con los programas de capacitación docente del Departamento.</w:t>
+        <w:t xml:space="preserve">Se explorará mediante entrevistas a autoridades departamentales, referentes de cogobierno y representaciones gremiales docentes. Los indicadores incluyen: consensos sobre el uso formativo de la información en el marco de la poligobernanza institucional, mecanismos de consulta previa y la articulación vinculante de los resultados diagnósticos con el Programa Anual de Formación de Recursos Humanos del Departamento (Art. 76 del Estatuto UNCo), garantizando una devolución inmediata y constructiva a la comunidad académica.</w:t>
       </w:r>
     </w:p>
     <w:bookmarkEnd w:id="22"/>
@@ -2621,6 +2621,11 @@
       </w:pPr>
       <w:r>
         <w:t xml:space="preserve">Proponer lineamientos orientativos para una eventual implementación de un modelo de retroalimentación multiactoral (360°), en función de las condiciones y límites de factibilidad identificados en la investigación empírica.</w:t>
+      </w:r>
+    </w:p>
+    <w:p>
+      <w:r>
+        <w:br w:type="page"/>
       </w:r>
     </w:p>
     <w:bookmarkEnd w:id="32"/>
@@ -4715,7 +4720,7 @@
         <w:pStyle w:val="BodyText"/>
       </w:pPr>
       <w:r>
-        <w:t xml:space="preserve">Desde esta perspectiva metodológica, la factibilidad no se asume como una conclusión anticipada o cerrada, sino como una hipótesis de trabajo y un campo de indagación empírica abierto: corresponderá al trabajo de campo relevar en qué medida estas garantías constituyen condiciones indispensables expresadas por los propios actores institucionales del CURZAS, o si emergen otros condicionantes culturales, técnicos, de sobrecarga operativa o de gobernanza paritaria que deban ser ponderados en el diseño final de la propuesta. La viabilidad se investiga, por ende, en su doble anclaje: la legitimación en los órganos colegiados de cogobierno y la construcción de confianza situada entre los sujetos de la comunidad académica.</w:t>
+        <w:t xml:space="preserve">Desde esta perspectiva metodológica, la factibilidad no se asume como una conclusión anticipada o cerrada, sino como una hipótesis de trabajo y un campo de indagación empírica abierto: corresponderá al trabajo de campo relevar en qué medida estas garantías constituyen condiciones indispensables expresadas por los propios actores institucionales del CURZAS, o si emergen otros condicionantes culturales (como la fragilidad del anonimato en cátedras unipersonales o con equipos docentes reducidos), técnicos (el riesgo de fatiga evaluativa derivada de la sobrecarga de instrumentos en asignaturas compartidas) o de gobernanza paritaria que deban ser ponderados en el diseño final de la propuesta. La viabilidad se investiga, por ende, en su doble anclaje: la legitimación en los órganos colegiados de cogobierno y la construcción de confianza situada entre los sujetos de la comunidad académica, orientando los hallazgos hacia una devolución directa y constructiva a través del Programa Anual de Formación de Recursos Humanos del Departamento (Art. 76 del Estatuto UNCo).</w:t>
       </w:r>
     </w:p>
     <w:bookmarkEnd w:id="40"/>

</xml_diff>

<commit_message>
feat: add Trabajo Práctico 3 documents for theoretical framework and research project structure
</commit_message>
<xml_diff>
--- a/Entregas/Actividad 3/TP3_Ayarachi_Fuentes.docx
+++ b/Entregas/Actividad 3/TP3_Ayarachi_Fuentes.docx
@@ -582,7 +582,7 @@
           <w:rFonts w:ascii="Arial" w:hAnsi="Arial"/>
           <w:sz w:val="22"/>
         </w:rPr>
-        <w:t>7</w:t>
+        <w:t>8</w:t>
       </w:r>
     </w:p>
     <w:p>
@@ -690,7 +690,7 @@
           <w:rFonts w:ascii="Arial" w:hAnsi="Arial"/>
           <w:sz w:val="22"/>
         </w:rPr>
-        <w:t>8</w:t>
+        <w:t>9</w:t>
       </w:r>
     </w:p>
     <w:p>
@@ -987,7 +987,7 @@
           <w:rFonts w:ascii="Arial" w:hAnsi="Arial"/>
           <w:sz w:val="22"/>
         </w:rPr>
-        <w:t>16</w:t>
+        <w:t>17</w:t>
       </w:r>
     </w:p>
     <w:p>
@@ -1068,7 +1068,7 @@
           <w:rFonts w:ascii="Arial" w:hAnsi="Arial"/>
           <w:sz w:val="22"/>
         </w:rPr>
-        <w:t>18</w:t>
+        <w:t>19</w:t>
       </w:r>
     </w:p>
     <w:p>
@@ -1176,7 +1176,7 @@
           <w:rFonts w:ascii="Arial" w:hAnsi="Arial"/>
           <w:sz w:val="22"/>
         </w:rPr>
-        <w:t>23</w:t>
+        <w:t>24</w:t>
       </w:r>
     </w:p>
     <w:p>
@@ -1588,7 +1588,7 @@
     </w:p>
     <w:bookmarkEnd w:id="17"/>
     <w:bookmarkEnd w:id="18"/>
-    <w:bookmarkStart w:id="26" w:name="delimitación-del-objeto-problema"/>
+    <w:bookmarkStart w:id="29" w:name="delimitación-del-objeto-problema"/>
     <w:p>
       <w:pPr>
         <w:pStyle w:val="Heading2"/>
@@ -1731,7 +1731,7 @@
       </w:r>
     </w:p>
     <w:bookmarkEnd w:id="19"/>
-    <w:bookmarkStart w:id="20" w:name="Xd94378588030de20cc99227353d9ba92b45f085"/>
+    <w:bookmarkStart w:id="21" w:name="Xd94378588030de20cc99227353d9ba92b45f085"/>
     <w:p>
       <w:pPr>
         <w:pStyle w:val="Heading3"/>
@@ -1806,7 +1806,19 @@
         <w:t xml:space="preserve"> </w:t>
       </w:r>
       <w:r>
-        <w:t xml:space="preserve">La investigación se circunscribe a la sede central del CURZAS (Viedma, Provincia de Río Negro) y a la Red de Nodos Universitarios de la Línea Sur y la Costa Atlántica rionegrina donde el Departamento de Administración Pública despliega carreras y tutorías pedagógicas.</w:t>
+        <w:t xml:space="preserve">La investigación se circunscribe a la sede central del CURZAS (Viedma, Provincia de Río Negro) y a la Red de Nodos Universitarios de la Línea Sur y la Costa Atlántica rionegrina</w:t>
+      </w:r>
+      <w:r>
+        <w:rPr>
+          <w:rStyle w:val="FootnoteReference"/>
+        </w:rPr>
+        <w:footnoteReference w:id="20"/>
+      </w:r>
+      <w:r>
+        <w:t xml:space="preserve"> </w:t>
+      </w:r>
+      <w:r>
+        <w:t xml:space="preserve">donde el Departamento de Administración Pública despliega carreras y tutorías pedagógicas.</w:t>
       </w:r>
     </w:p>
     <w:p>
@@ -1889,8 +1901,8 @@
         <w:t xml:space="preserve">Autoridades departamentales (Director/a de Departamento y miembros del Consejo Departamental).</w:t>
       </w:r>
     </w:p>
-    <w:bookmarkEnd w:id="20"/>
-    <w:bookmarkStart w:id="24" w:name="Xeb201754d94bbce47beccc43470bd16217c3db3"/>
+    <w:bookmarkEnd w:id="21"/>
+    <w:bookmarkStart w:id="27" w:name="Xeb201754d94bbce47beccc43470bd16217c3db3"/>
     <w:p>
       <w:pPr>
         <w:pStyle w:val="Heading3"/>
@@ -1915,7 +1927,7 @@
         <w:t xml:space="preserve">Dado que el objetivo general del proyecto consiste en analizar la viabilidad de un modelo 360°, resulta indispensable precisar qué se entiende por factibilidad en esta investigación y qué criterios permitirán interpretar los resultados del trabajo de campo.</w:t>
       </w:r>
     </w:p>
-    <w:bookmarkStart w:id="21" w:name="Xcdb87a96a95f00839381972ad43f2df4cfe9f8a"/>
+    <w:bookmarkStart w:id="22" w:name="Xcdb87a96a95f00839381972ad43f2df4cfe9f8a"/>
     <w:p>
       <w:pPr>
         <w:pStyle w:val="Heading4"/>
@@ -2089,8 +2101,8 @@
         <w:t xml:space="preserve">.</w:t>
       </w:r>
     </w:p>
-    <w:bookmarkEnd w:id="21"/>
-    <w:bookmarkStart w:id="22" w:name="X5965ca74dc7a4b9398fc285497af16a05ed033f"/>
+    <w:bookmarkEnd w:id="22"/>
+    <w:bookmarkStart w:id="25" w:name="X5965ca74dc7a4b9398fc285497af16a05ed033f"/>
     <w:p>
       <w:pPr>
         <w:pStyle w:val="Heading4"/>
@@ -2126,7 +2138,16 @@
         <w:t xml:space="preserve"> </w:t>
       </w:r>
       <w:r>
-        <w:t xml:space="preserve">Se indagará mediante cuestionarios y entrevistas semiestructuradas a docentes y estudiantes. Los indicadores clave incluyen: disposición al diálogo reflexivo sobre la enseñanza, grado de confianza en el anonimato de las respuestas —con especial atención a la fragilidad percibida de la confidencialidad en cátedras unipersonales o con equipos reducidos—, temores expresados frente a la coevaluación entre pares y expectativas de mejora pedagógica.</w:t>
+        <w:t xml:space="preserve">Se indagará mediante cuestionarios y entrevistas semiestructuradas a docentes y estudiantes. Los indicadores clave incluyen: disposición al diálogo reflexivo sobre la enseñanza, grado de confianza en el anonimato de las respuestas —con especial atención a la fragilidad percibida de la confidencialidad en cátedras unipersonales o con equipos reducidos</w:t>
+      </w:r>
+      <w:r>
+        <w:rPr>
+          <w:rStyle w:val="FootnoteReference"/>
+        </w:rPr>
+        <w:footnoteReference w:id="23"/>
+      </w:r>
+      <w:r>
+        <w:t xml:space="preserve">—, temores expresados frente a la coevaluación entre pares y expectativas de mejora pedagógica.</w:t>
       </w:r>
     </w:p>
     <w:p>
@@ -2148,7 +2169,16 @@
         <w:t xml:space="preserve"> </w:t>
       </w:r>
       <w:r>
-        <w:t xml:space="preserve">Se analizará a través de entrevistas a informantes clave del área académica y de soporte técnico del CURZAS, así como el relevamiento de plataformas informáticas disponibles. Los indicadores abarcan: facilidad de acceso, riesgo de fatiga evaluativa derivada de la sobrecarga de instrumentos en asignaturas compartidas, extensión y periodicidad óptima de los cuestionarios, y capacidad de generar reportes diagnósticos sintéticos.</w:t>
+        <w:t xml:space="preserve">Se analizará a través de entrevistas a informantes clave del área académica y de soporte técnico del CURZAS, así como el relevamiento de plataformas informáticas disponibles. Los indicadores abarcan: facilidad de acceso, riesgo de fatiga evaluativa derivada de la sobrecarga de instrumentos en asignaturas compartidas</w:t>
+      </w:r>
+      <w:r>
+        <w:rPr>
+          <w:rStyle w:val="FootnoteReference"/>
+        </w:rPr>
+        <w:footnoteReference w:id="24"/>
+      </w:r>
+      <w:r>
+        <w:t xml:space="preserve">, extensión y periodicidad óptima de los cuestionarios, y capacidad de generar reportes diagnósticos sintéticos.</w:t>
       </w:r>
     </w:p>
     <w:p>
@@ -2195,8 +2225,8 @@
         <w:t xml:space="preserve">Se explorará mediante entrevistas a autoridades departamentales, referentes de cogobierno y representaciones gremiales docentes. Los indicadores incluyen: consensos sobre el uso formativo de la información en el marco de la poligobernanza institucional, mecanismos de consulta previa y la articulación vinculante de los resultados diagnósticos con el Programa Anual de Formación de Recursos Humanos del Departamento (Art. 76 del Estatuto UNCo), garantizando una devolución inmediata y constructiva a la comunidad académica.</w:t>
       </w:r>
     </w:p>
-    <w:bookmarkEnd w:id="22"/>
-    <w:bookmarkStart w:id="23" w:name="X8f4da2a33d80423d494a47dd434126cfe1b5efc"/>
+    <w:bookmarkEnd w:id="25"/>
+    <w:bookmarkStart w:id="26" w:name="X8f4da2a33d80423d494a47dd434126cfe1b5efc"/>
     <w:p>
       <w:pPr>
         <w:pStyle w:val="Heading4"/>
@@ -2288,9 +2318,9 @@
         <w:t xml:space="preserve">Cuando predominan resistencias generalizadas, desconfianza profunda entre los distintos actores de la comunidad académica o incompatibilidades normativas rígidas que desaconsejan una aplicación generalizada a corto plazo, sugiriendo la necesidad previa de fortalecer la cultura evaluativa institucional.</w:t>
       </w:r>
     </w:p>
-    <w:bookmarkEnd w:id="23"/>
-    <w:bookmarkEnd w:id="24"/>
-    <w:bookmarkStart w:id="25" w:name="pregunta-general-de-investigación"/>
+    <w:bookmarkEnd w:id="26"/>
+    <w:bookmarkEnd w:id="27"/>
+    <w:bookmarkStart w:id="28" w:name="pregunta-general-de-investigación"/>
     <w:p>
       <w:pPr>
         <w:pStyle w:val="Heading3"/>
@@ -2323,9 +2353,9 @@
         <w:t xml:space="preserve">¿Cuáles son las condiciones de factibilidad organizacional, técnica, normativa y de gobernanza multinivel para la implementación de un modelo de retroalimentación multiactoral (360°) en la evaluación del desempeño docente en el Departamento de Administración Pública del CURZAS-UNCo durante el período 2025–2026?</w:t>
       </w:r>
     </w:p>
-    <w:bookmarkEnd w:id="25"/>
-    <w:bookmarkEnd w:id="26"/>
-    <w:bookmarkStart w:id="30" w:name="X681cec084bc0b6c304e32f87344fd4265dfa7e1"/>
+    <w:bookmarkEnd w:id="28"/>
+    <w:bookmarkEnd w:id="29"/>
+    <w:bookmarkStart w:id="33" w:name="X681cec084bc0b6c304e32f87344fd4265dfa7e1"/>
     <w:p>
       <w:pPr>
         <w:pStyle w:val="Heading2"/>
@@ -2349,7 +2379,7 @@
         <w:t xml:space="preserve">La justificación de la investigación se estructura en tres planos complementarios:</w:t>
       </w:r>
     </w:p>
-    <w:bookmarkStart w:id="27" w:name="plano-cognitivo-y-disciplinar"/>
+    <w:bookmarkStart w:id="30" w:name="plano-cognitivo-y-disciplinar"/>
     <w:p>
       <w:pPr>
         <w:pStyle w:val="Heading3"/>
@@ -2392,8 +2422,8 @@
         <w:t xml:space="preserve">.</w:t>
       </w:r>
     </w:p>
-    <w:bookmarkEnd w:id="27"/>
-    <w:bookmarkStart w:id="28" w:name="plano-social-e-institucional"/>
+    <w:bookmarkEnd w:id="30"/>
+    <w:bookmarkStart w:id="31" w:name="plano-social-e-institucional"/>
     <w:p>
       <w:pPr>
         <w:pStyle w:val="Heading3"/>
@@ -2484,8 +2514,8 @@
         <w:t xml:space="preserve">Diagnosticar capacidades técnicas y de gestión necesarias para procesar juicios evaluativos múltiples e integrarlos a la planificación académica y a los programas anuales de capacitación.</w:t>
       </w:r>
     </w:p>
-    <w:bookmarkEnd w:id="28"/>
-    <w:bookmarkStart w:id="29" w:name="plano-personal-y-profesional"/>
+    <w:bookmarkEnd w:id="31"/>
+    <w:bookmarkStart w:id="32" w:name="plano-personal-y-profesional"/>
     <w:p>
       <w:pPr>
         <w:pStyle w:val="Heading3"/>
@@ -2510,9 +2540,9 @@
         <w:t xml:space="preserve">En el orden formativo, el proyecto articula la Licenciatura en Gestión de Recursos Humanos con la formación previa como Técnico Superior en Recursos Humanos y los marcos de la Administración Pública. Permite consolidar habilidades de diagnóstico organizacional e investigación aplicada en el ámbito universitario regional, reafirmando el compromiso ético con el fortalecimiento de la universidad pública en la Patagonia.</w:t>
       </w:r>
     </w:p>
-    <w:bookmarkEnd w:id="29"/>
-    <w:bookmarkEnd w:id="30"/>
-    <w:bookmarkStart w:id="34" w:name="definición-de-objetivos-del-tfg"/>
+    <w:bookmarkEnd w:id="32"/>
+    <w:bookmarkEnd w:id="33"/>
+    <w:bookmarkStart w:id="37" w:name="definición-de-objetivos-del-tfg"/>
     <w:p>
       <w:pPr>
         <w:pStyle w:val="Heading2"/>
@@ -2528,7 +2558,7 @@
         <w:t xml:space="preserve">Definición de Objetivos del TFG</w:t>
       </w:r>
     </w:p>
-    <w:bookmarkStart w:id="31" w:name="objetivo-general"/>
+    <w:bookmarkStart w:id="34" w:name="objetivo-general"/>
     <w:p>
       <w:pPr>
         <w:pStyle w:val="Heading3"/>
@@ -2557,8 +2587,8 @@
         <w:t xml:space="preserve">Determinar las condiciones de factibilidad organizacional, técnica, normativa y de gobernanza multinivel para la implementación de un modelo de retroalimentación multiactoral (360°) en la evaluación del desempeño docente en el Departamento de Administración Pública del CURZAS-UNCo (2025–2026).</w:t>
       </w:r>
     </w:p>
-    <w:bookmarkEnd w:id="31"/>
-    <w:bookmarkStart w:id="32" w:name="objetivos-específicos"/>
+    <w:bookmarkEnd w:id="34"/>
+    <w:bookmarkStart w:id="35" w:name="objetivos-específicos"/>
     <w:p>
       <w:pPr>
         <w:pStyle w:val="Heading3"/>
@@ -2628,8 +2658,8 @@
         <w:br w:type="page"/>
       </w:r>
     </w:p>
-    <w:bookmarkEnd w:id="32"/>
-    <w:bookmarkStart w:id="33" w:name="X296c76344d338238a09b1d3109b3b1ec06ec08f"/>
+    <w:bookmarkEnd w:id="35"/>
+    <w:bookmarkStart w:id="36" w:name="X296c76344d338238a09b1d3109b3b1ec06ec08f"/>
     <w:p>
       <w:pPr>
         <w:pStyle w:val="Heading3"/>
@@ -3301,10 +3331,10 @@
         <w:br w:type="page"/>
       </w:r>
     </w:p>
-    <w:bookmarkEnd w:id="33"/>
-    <w:bookmarkEnd w:id="34"/>
-    <w:bookmarkEnd w:id="35"/>
-    <w:bookmarkStart w:id="48" w:name="Xef007dd282ae18f13df7a545a4430773f008bd7"/>
+    <w:bookmarkEnd w:id="36"/>
+    <w:bookmarkEnd w:id="37"/>
+    <w:bookmarkEnd w:id="38"/>
+    <w:bookmarkStart w:id="53" w:name="Xef007dd282ae18f13df7a545a4430773f008bd7"/>
     <w:p>
       <w:pPr>
         <w:pStyle w:val="Heading1"/>
@@ -3320,7 +3350,7 @@
         <w:t xml:space="preserve">Segunda parte de la estructura del Proyecto de investigación de TFG</w:t>
       </w:r>
     </w:p>
-    <w:bookmarkStart w:id="42" w:name="X26fd7edd3045b8a76e95745d23dedb33f2c164e"/>
+    <w:bookmarkStart w:id="47" w:name="X26fd7edd3045b8a76e95745d23dedb33f2c164e"/>
     <w:p>
       <w:pPr>
         <w:pStyle w:val="Heading2"/>
@@ -3336,7 +3366,7 @@
         <w:t xml:space="preserve">Marco Teórico: Posicionamiento Teórico y Conceptos Centrales</w:t>
       </w:r>
     </w:p>
-    <w:bookmarkStart w:id="36" w:name="Xceb10b350d9f8d47826ad34d91c2e4defe1712d"/>
+    <w:bookmarkStart w:id="39" w:name="Xceb10b350d9f8d47826ad34d91c2e4defe1712d"/>
     <w:p>
       <w:pPr>
         <w:pStyle w:val="Heading3"/>
@@ -3566,8 +3596,8 @@
         <w:t xml:space="preserve">, y culmina en los conceptos operativos específicos referidos a la retroalimentación 360° formativa y las dimensiones de viabilidad situada.</w:t>
       </w:r>
     </w:p>
-    <w:bookmarkEnd w:id="36"/>
-    <w:bookmarkStart w:id="37" w:name="Xb8875c50f8cca48579b6c9183d92a2c8c162b10"/>
+    <w:bookmarkEnd w:id="39"/>
+    <w:bookmarkStart w:id="40" w:name="Xb8875c50f8cca48579b6c9183d92a2c8c162b10"/>
     <w:p>
       <w:pPr>
         <w:pStyle w:val="Heading3"/>
@@ -3734,8 +3764,8 @@
         <w:t xml:space="preserve">Examina el clima institucional, la confianza intersubjetiva entre los actores de la comunidad académica y los canales de diálogo paritario docente. En las organizaciones públicas y cogobernadas, la evaluación docente incide directamente en las relaciones laborales y la percepción de estabilidad en el empleo; por ende, la investigación examina si la construcción de acuerdos paritarios y resguardos éticos de confidencialidad constituye un factor crítico para disipar temores de arbitrariedad y habilitar una disposición favorable hacia la coevaluación formativa.</w:t>
       </w:r>
     </w:p>
-    <w:bookmarkEnd w:id="37"/>
-    <w:bookmarkStart w:id="38" w:name="X2df9cab8bcc2c03c971d8d362d7faae66cce334"/>
+    <w:bookmarkEnd w:id="40"/>
+    <w:bookmarkStart w:id="41" w:name="X2df9cab8bcc2c03c971d8d362d7faae66cce334"/>
     <w:p>
       <w:pPr>
         <w:pStyle w:val="Heading3"/>
@@ -3956,8 +3986,8 @@
         <w:t xml:space="preserve">. El resultado no se traduce en un puntaje sancionatorio, sino en un perfil diagnóstico cualitativo que permite identificar brechas entre la autopercepción del docente y la percepción de sus estudiantes y colegas, brindando insumos para la mejora pedagógica.</w:t>
       </w:r>
     </w:p>
-    <w:bookmarkEnd w:id="38"/>
-    <w:bookmarkStart w:id="41" w:name="X3c26948e283d8e10bd039db6e5542a6686a8cc2"/>
+    <w:bookmarkEnd w:id="41"/>
+    <w:bookmarkStart w:id="46" w:name="X3c26948e283d8e10bd039db6e5542a6686a8cc2"/>
     <w:p>
       <w:pPr>
         <w:pStyle w:val="Heading3"/>
@@ -4266,8 +4296,14 @@
       <w:r>
         <w:t xml:space="preserve">, que salvaguarda la estabilidad laboral, la libertad de cátedra y las condiciones dignas de trabajo frente a cualquier mecanismo evaluativo susceptible de ser utilizado como herramienta de persecución, flexibilización o sobrecarga laboral.</w:t>
       </w:r>
-    </w:p>
-    <w:bookmarkStart w:id="39" w:name="Xdc98837aef367cb89f0d71e9b5107244f048407"/>
+      <w:r>
+        <w:rPr>
+          <w:rStyle w:val="FootnoteReference"/>
+        </w:rPr>
+        <w:footnoteReference w:id="42"/>
+      </w:r>
+    </w:p>
+    <w:bookmarkStart w:id="43" w:name="Xdc98837aef367cb89f0d71e9b5107244f048407"/>
     <w:p>
       <w:pPr>
         <w:pStyle w:val="Heading4"/>
@@ -4684,8 +4720,8 @@
         <w:t xml:space="preserve">.</w:t>
       </w:r>
     </w:p>
-    <w:bookmarkEnd w:id="39"/>
-    <w:bookmarkStart w:id="40" w:name="Xd19f503ec170ca2f7711abf4686d92b55542094"/>
+    <w:bookmarkEnd w:id="43"/>
+    <w:bookmarkStart w:id="45" w:name="Xd19f503ec170ca2f7711abf4686d92b55542094"/>
     <w:p>
       <w:pPr>
         <w:pStyle w:val="Heading4"/>
@@ -4722,11 +4758,17 @@
       <w:r>
         <w:t xml:space="preserve">Desde esta perspectiva metodológica, la factibilidad no se asume como una conclusión anticipada o cerrada, sino como una hipótesis de trabajo y un campo de indagación empírica abierto: corresponderá al trabajo de campo relevar en qué medida estas garantías constituyen condiciones indispensables expresadas por los propios actores institucionales del CURZAS, o si emergen otros condicionantes culturales (como la fragilidad del anonimato en cátedras unipersonales o con equipos docentes reducidos), técnicos (el riesgo de fatiga evaluativa derivada de la sobrecarga de instrumentos en asignaturas compartidas) o de gobernanza paritaria que deban ser ponderados en el diseño final de la propuesta. La viabilidad se investiga, por ende, en su doble anclaje: la legitimación en los órganos colegiados de cogobierno y la construcción de confianza situada entre los sujetos de la comunidad académica, orientando los hallazgos hacia una devolución directa y constructiva a través del Programa Anual de Formación de Recursos Humanos del Departamento (Art. 76 del Estatuto UNCo).</w:t>
       </w:r>
-    </w:p>
-    <w:bookmarkEnd w:id="40"/>
-    <w:bookmarkEnd w:id="41"/>
-    <w:bookmarkEnd w:id="42"/>
-    <w:bookmarkStart w:id="47" w:name="X77155299af2def8333549b16a82948e9810ead2"/>
+      <w:r>
+        <w:rPr>
+          <w:rStyle w:val="FootnoteReference"/>
+        </w:rPr>
+        <w:footnoteReference w:id="44"/>
+      </w:r>
+    </w:p>
+    <w:bookmarkEnd w:id="45"/>
+    <w:bookmarkEnd w:id="46"/>
+    <w:bookmarkEnd w:id="47"/>
+    <w:bookmarkStart w:id="52" w:name="X77155299af2def8333549b16a82948e9810ead2"/>
     <w:p>
       <w:pPr>
         <w:pStyle w:val="Heading2"/>
@@ -4804,7 +4846,7 @@
         <w:t xml:space="preserve">Para dar cumplimiento a la estructura exigida por el Seminario de Integración y Aplicación, los antecedentes se organizan jerárquicamente en tres niveles geográficos: internacional, nacional y regional/local.</w:t>
       </w:r>
     </w:p>
-    <w:bookmarkStart w:id="43" w:name="Xbd1777d47dd01cd8f84e658bc65d384db447afd"/>
+    <w:bookmarkStart w:id="48" w:name="Xbd1777d47dd01cd8f84e658bc65d384db447afd"/>
     <w:p>
       <w:pPr>
         <w:pStyle w:val="Heading3"/>
@@ -5017,8 +5059,8 @@
         <w:t xml:space="preserve">, desarrollada en el marco de la Universidad Nacional Autónoma de México (UNAM), estructuraron una matriz de indicadores competenciales orientada a ponderar las funciones de docencia, tutoría y gestión institucional. Su estudio aporta criterios metodológicos e instrumentales específicos para operacionalizar cuestionarios de retroalimentación 360°, resguardando la pertinencia técnica del instrumento y su articulación con los planes de perfeccionamiento pedagógico continuo.</w:t>
       </w:r>
     </w:p>
-    <w:bookmarkEnd w:id="43"/>
-    <w:bookmarkStart w:id="44" w:name="X2c0b73cfd018cc54d6ee142a74b81e5b02c3616"/>
+    <w:bookmarkEnd w:id="48"/>
+    <w:bookmarkStart w:id="49" w:name="X2c0b73cfd018cc54d6ee142a74b81e5b02c3616"/>
     <w:p>
       <w:pPr>
         <w:pStyle w:val="Heading3"/>
@@ -5139,8 +5181,8 @@
         <w:t xml:space="preserve">(Redalyc). El estudio evaluó la factibilidad de aplicar la metodología 360° para valorar el desempeño de docentes universitarios con funciones tutoriales presenciales y mediadas por tecnologías virtuales. Mediante un diseño metodológico descriptivo aplicado a estudiantes, docentes tutores y coordinadores, el trabajo concluyó que el modelo 360° demostró una capacidad significativamente superior para captar competencias pedagógicas blandas (comunicación asertiva, empatía, acompañamiento en entornos virtuales) en comparación con las rúbricas estandarizadas tradicionales. Este antecedente aporta un valor metodológico e instrumental directo para el CURZAS-UNCo, donde la docencia universitaria se despliega crecientemente de forma híbrida articulando la sede central con los Nodos Territoriales.</w:t>
       </w:r>
     </w:p>
-    <w:bookmarkEnd w:id="44"/>
-    <w:bookmarkStart w:id="45" w:name="X868ada8a3209befb2b1ff6a8414801be884be61"/>
+    <w:bookmarkEnd w:id="49"/>
+    <w:bookmarkStart w:id="50" w:name="X868ada8a3209befb2b1ff6a8414801be884be61"/>
     <w:p>
       <w:pPr>
         <w:pStyle w:val="Heading3"/>
@@ -5320,8 +5362,8 @@
         <w:t xml:space="preserve">. Esta configuración territorial se encuentra respaldada por la Resolución CD-CURZA N° 196/2022, que valida normativamente las mediaciones tecnológicas, la presencialidad sincrónica remota y las modalidades de enseñanza híbridas, articuladas con las directrices del Sistema Institucional de Educación a Distancia (SIED UNCo). Dicho escenario impone a los equipos de cátedra competencias didácticas específicas (tutoría virtual, diseño de materiales asincrónicos y acompañamiento mediado por TIC) que actualmente no son ponderadas de forma formativa ni multidireccional por los instrumentos de evaluación tradicionales, planteando la conveniencia de indagar la pertinencia y factibilidad de un modelo 360° adaptado a las singularidades de dichos entornos híbridos.</w:t>
       </w:r>
     </w:p>
-    <w:bookmarkEnd w:id="45"/>
-    <w:bookmarkStart w:id="46" w:name="Xdd2f1928b167b346feb3db91e0e80e813fe5a54"/>
+    <w:bookmarkEnd w:id="50"/>
+    <w:bookmarkStart w:id="51" w:name="Xdd2f1928b167b346feb3db91e0e80e813fe5a54"/>
     <w:p>
       <w:pPr>
         <w:pStyle w:val="Heading3"/>
@@ -5414,10 +5456,10 @@
         <w:br w:type="page"/>
       </w:r>
     </w:p>
-    <w:bookmarkEnd w:id="46"/>
-    <w:bookmarkEnd w:id="47"/>
-    <w:bookmarkEnd w:id="48"/>
-    <w:bookmarkStart w:id="81" w:name="referencias-bibliográficas"/>
+    <w:bookmarkEnd w:id="51"/>
+    <w:bookmarkEnd w:id="52"/>
+    <w:bookmarkEnd w:id="53"/>
+    <w:bookmarkStart w:id="86" w:name="referencias-bibliográficas"/>
     <w:p>
       <w:pPr>
         <w:pStyle w:val="Heading1"/>
@@ -5434,8 +5476,8 @@
         <w:t xml:space="preserve">Referencias Bibliográficas</w:t>
       </w:r>
     </w:p>
-    <w:bookmarkStart w:id="80" w:name="refs"/>
-    <w:bookmarkStart w:id="50" w:name="ref-alvarado2019"/>
+    <w:bookmarkStart w:id="85" w:name="refs"/>
+    <w:bookmarkStart w:id="55" w:name="ref-alvarado2019"/>
     <w:p>
       <w:pPr>
         <w:pStyle w:val="Bibliography"/>
@@ -5462,7 +5504,7 @@
       <w:r>
         <w:t xml:space="preserve"> </w:t>
       </w:r>
-      <w:hyperlink r:id="rId49">
+      <w:hyperlink r:id="rId54">
         <w:r>
           <w:rPr>
             <w:rStyle w:val="Hyperlink"/>
@@ -5471,8 +5513,8 @@
         </w:r>
       </w:hyperlink>
     </w:p>
-    <w:bookmarkEnd w:id="50"/>
-    <w:bookmarkStart w:id="51" w:name="ref-chiavenato2020"/>
+    <w:bookmarkEnd w:id="55"/>
+    <w:bookmarkStart w:id="56" w:name="ref-chiavenato2020"/>
     <w:p>
       <w:pPr>
         <w:pStyle w:val="Bibliography"/>
@@ -5500,8 +5542,8 @@
         <w:t xml:space="preserve">(5.ª ed.). McGraw-Hill Interamericana.</w:t>
       </w:r>
     </w:p>
-    <w:bookmarkEnd w:id="51"/>
-    <w:bookmarkStart w:id="53" w:name="ref-curza2022"/>
+    <w:bookmarkEnd w:id="56"/>
+    <w:bookmarkStart w:id="58" w:name="ref-curza2022"/>
     <w:p>
       <w:pPr>
         <w:pStyle w:val="Bibliography"/>
@@ -5528,7 +5570,7 @@
       <w:r>
         <w:t xml:space="preserve"> </w:t>
       </w:r>
-      <w:hyperlink r:id="rId52">
+      <w:hyperlink r:id="rId57">
         <w:r>
           <w:rPr>
             <w:rStyle w:val="Hyperlink"/>
@@ -5537,8 +5579,8 @@
         </w:r>
       </w:hyperlink>
     </w:p>
-    <w:bookmarkEnd w:id="53"/>
-    <w:bookmarkStart w:id="54" w:name="ref-uncocurzas2023"/>
+    <w:bookmarkEnd w:id="58"/>
+    <w:bookmarkStart w:id="59" w:name="ref-uncocurzas2023"/>
     <w:p>
       <w:pPr>
         <w:pStyle w:val="Bibliography"/>
@@ -5563,8 +5605,8 @@
         <w:t xml:space="preserve">. Universidad Nacional del Comahue.</w:t>
       </w:r>
     </w:p>
-    <w:bookmarkEnd w:id="54"/>
-    <w:bookmarkStart w:id="56" w:name="ref-delagarza2001"/>
+    <w:bookmarkEnd w:id="59"/>
+    <w:bookmarkStart w:id="61" w:name="ref-delagarza2001"/>
     <w:p>
       <w:pPr>
         <w:pStyle w:val="Bibliography"/>
@@ -5604,7 +5646,7 @@
       <w:r>
         <w:t xml:space="preserve"> </w:t>
       </w:r>
-      <w:hyperlink r:id="rId55">
+      <w:hyperlink r:id="rId60">
         <w:r>
           <w:rPr>
             <w:rStyle w:val="Hyperlink"/>
@@ -5613,8 +5655,8 @@
         </w:r>
       </w:hyperlink>
     </w:p>
-    <w:bookmarkEnd w:id="56"/>
-    <w:bookmarkStart w:id="57" w:name="ref-pen2015"/>
+    <w:bookmarkEnd w:id="61"/>
+    <w:bookmarkStart w:id="62" w:name="ref-pen2015"/>
     <w:p>
       <w:pPr>
         <w:pStyle w:val="Bibliography"/>
@@ -5626,8 +5668,8 @@
         <w:t xml:space="preserve">Decreto N° 1246/2015. Convenio Colectivo de Trabajo para los Docentes de las Instituciones Universitarias Nacionales (2015).</w:t>
       </w:r>
     </w:p>
-    <w:bookmarkEnd w:id="57"/>
-    <w:bookmarkStart w:id="58" w:name="ref-jimenez2008"/>
+    <w:bookmarkEnd w:id="62"/>
+    <w:bookmarkStart w:id="63" w:name="ref-jimenez2008"/>
     <w:p>
       <w:pPr>
         <w:pStyle w:val="Bibliography"/>
@@ -5655,8 +5697,8 @@
         <w:t xml:space="preserve">(pp. 27-42). Universidad Pedagógica Nacional / CLACSO.</w:t>
       </w:r>
     </w:p>
-    <w:bookmarkEnd w:id="58"/>
-    <w:bookmarkStart w:id="59" w:name="ref-lepsinger2009"/>
+    <w:bookmarkEnd w:id="63"/>
+    <w:bookmarkStart w:id="64" w:name="ref-lepsinger2009"/>
     <w:p>
       <w:pPr>
         <w:pStyle w:val="Bibliography"/>
@@ -5684,8 +5726,8 @@
         <w:t xml:space="preserve">(2.ª ed.). Pfeiffer.</w:t>
       </w:r>
     </w:p>
-    <w:bookmarkEnd w:id="59"/>
-    <w:bookmarkStart w:id="60" w:name="ref-ministerio1995"/>
+    <w:bookmarkEnd w:id="64"/>
+    <w:bookmarkStart w:id="65" w:name="ref-ministerio1995"/>
     <w:p>
       <w:pPr>
         <w:pStyle w:val="Bibliography"/>
@@ -5697,8 +5739,8 @@
         <w:t xml:space="preserve">Ley N° 24.521 de Educación Superior (1995).</w:t>
       </w:r>
     </w:p>
-    <w:bookmarkEnd w:id="60"/>
-    <w:bookmarkStart w:id="61" w:name="ref-longo2006"/>
+    <w:bookmarkEnd w:id="65"/>
+    <w:bookmarkStart w:id="66" w:name="ref-longo2006"/>
     <w:p>
       <w:pPr>
         <w:pStyle w:val="Bibliography"/>
@@ -5723,8 +5765,8 @@
         <w:t xml:space="preserve">. Paidós.</w:t>
       </w:r>
     </w:p>
-    <w:bookmarkEnd w:id="61"/>
-    <w:bookmarkStart w:id="62" w:name="ref-marquina2012"/>
+    <w:bookmarkEnd w:id="66"/>
+    <w:bookmarkStart w:id="67" w:name="ref-marquina2012"/>
     <w:p>
       <w:pPr>
         <w:pStyle w:val="Bibliography"/>
@@ -5762,8 +5804,8 @@
         <w:t xml:space="preserve">(15), 35-48.</w:t>
       </w:r>
     </w:p>
-    <w:bookmarkEnd w:id="62"/>
-    <w:bookmarkStart w:id="63" w:name="ref-matus1993"/>
+    <w:bookmarkEnd w:id="67"/>
+    <w:bookmarkStart w:id="68" w:name="ref-matus1993"/>
     <w:p>
       <w:pPr>
         <w:pStyle w:val="Bibliography"/>
@@ -5788,8 +5830,8 @@
         <w:t xml:space="preserve">. Fundación ALTIDIR.</w:t>
       </w:r>
     </w:p>
-    <w:bookmarkEnd w:id="63"/>
-    <w:bookmarkStart w:id="65" w:name="ref-obando2014"/>
+    <w:bookmarkEnd w:id="68"/>
+    <w:bookmarkStart w:id="70" w:name="ref-obando2014"/>
     <w:p>
       <w:pPr>
         <w:pStyle w:val="Bibliography"/>
@@ -5829,7 +5871,7 @@
       <w:r>
         <w:t xml:space="preserve"> </w:t>
       </w:r>
-      <w:hyperlink r:id="rId64">
+      <w:hyperlink r:id="rId69">
         <w:r>
           <w:rPr>
             <w:rStyle w:val="Hyperlink"/>
@@ -5838,8 +5880,8 @@
         </w:r>
       </w:hyperlink>
     </w:p>
-    <w:bookmarkEnd w:id="65"/>
-    <w:bookmarkStart w:id="66" w:name="ref-oszlak2020"/>
+    <w:bookmarkEnd w:id="70"/>
+    <w:bookmarkStart w:id="71" w:name="ref-oszlak2020"/>
     <w:p>
       <w:pPr>
         <w:pStyle w:val="Bibliography"/>
@@ -5864,8 +5906,8 @@
         <w:t xml:space="preserve">. Instituto Nacional de la Administración Pública.</w:t>
       </w:r>
     </w:p>
-    <w:bookmarkEnd w:id="66"/>
-    <w:bookmarkStart w:id="67" w:name="ref-perez2021"/>
+    <w:bookmarkEnd w:id="71"/>
+    <w:bookmarkStart w:id="72" w:name="ref-perez2021"/>
     <w:p>
       <w:pPr>
         <w:pStyle w:val="Bibliography"/>
@@ -5903,8 +5945,8 @@
         <w:t xml:space="preserve">(26), 45-58.</w:t>
       </w:r>
     </w:p>
-    <w:bookmarkEnd w:id="67"/>
-    <w:bookmarkStart w:id="69" w:name="ref-reyes2020"/>
+    <w:bookmarkEnd w:id="72"/>
+    <w:bookmarkStart w:id="74" w:name="ref-reyes2020"/>
     <w:p>
       <w:pPr>
         <w:pStyle w:val="Bibliography"/>
@@ -5944,7 +5986,7 @@
       <w:r>
         <w:t xml:space="preserve"> </w:t>
       </w:r>
-      <w:hyperlink r:id="rId68">
+      <w:hyperlink r:id="rId73">
         <w:r>
           <w:rPr>
             <w:rStyle w:val="Hyperlink"/>
@@ -5953,8 +5995,8 @@
         </w:r>
       </w:hyperlink>
     </w:p>
-    <w:bookmarkEnd w:id="69"/>
-    <w:bookmarkStart w:id="70" w:name="ref-sautu2005"/>
+    <w:bookmarkEnd w:id="74"/>
+    <w:bookmarkStart w:id="75" w:name="ref-sautu2005"/>
     <w:p>
       <w:pPr>
         <w:pStyle w:val="Bibliography"/>
@@ -5979,8 +6021,8 @@
         <w:t xml:space="preserve">. Lumiere.</w:t>
       </w:r>
     </w:p>
-    <w:bookmarkEnd w:id="70"/>
-    <w:bookmarkStart w:id="72" w:name="ref-sifuentes2016"/>
+    <w:bookmarkEnd w:id="75"/>
+    <w:bookmarkStart w:id="77" w:name="ref-sifuentes2016"/>
     <w:p>
       <w:pPr>
         <w:pStyle w:val="Bibliography"/>
@@ -6020,7 +6062,7 @@
       <w:r>
         <w:t xml:space="preserve"> </w:t>
       </w:r>
-      <w:hyperlink r:id="rId71">
+      <w:hyperlink r:id="rId76">
         <w:r>
           <w:rPr>
             <w:rStyle w:val="Hyperlink"/>
@@ -6029,8 +6071,8 @@
         </w:r>
       </w:hyperlink>
     </w:p>
-    <w:bookmarkEnd w:id="72"/>
-    <w:bookmarkStart w:id="74" w:name="ref-torraco2016"/>
+    <w:bookmarkEnd w:id="77"/>
+    <w:bookmarkStart w:id="79" w:name="ref-torraco2016"/>
     <w:p>
       <w:pPr>
         <w:pStyle w:val="Bibliography"/>
@@ -6070,7 +6112,7 @@
       <w:r>
         <w:t xml:space="preserve"> </w:t>
       </w:r>
-      <w:hyperlink r:id="rId73">
+      <w:hyperlink r:id="rId78">
         <w:r>
           <w:rPr>
             <w:rStyle w:val="Hyperlink"/>
@@ -6079,8 +6121,8 @@
         </w:r>
       </w:hyperlink>
     </w:p>
-    <w:bookmarkEnd w:id="74"/>
-    <w:bookmarkStart w:id="76" w:name="ref-unco1997"/>
+    <w:bookmarkEnd w:id="79"/>
+    <w:bookmarkStart w:id="81" w:name="ref-unco1997"/>
     <w:p>
       <w:pPr>
         <w:pStyle w:val="Bibliography"/>
@@ -6107,7 +6149,7 @@
       <w:r>
         <w:t xml:space="preserve"> </w:t>
       </w:r>
-      <w:hyperlink r:id="rId75">
+      <w:hyperlink r:id="rId80">
         <w:r>
           <w:rPr>
             <w:rStyle w:val="Hyperlink"/>
@@ -6116,8 +6158,8 @@
         </w:r>
       </w:hyperlink>
     </w:p>
-    <w:bookmarkEnd w:id="76"/>
-    <w:bookmarkStart w:id="78" w:name="ref-unco2025"/>
+    <w:bookmarkEnd w:id="81"/>
+    <w:bookmarkStart w:id="83" w:name="ref-unco2025"/>
     <w:p>
       <w:pPr>
         <w:pStyle w:val="Bibliography"/>
@@ -6144,7 +6186,7 @@
       <w:r>
         <w:t xml:space="preserve"> </w:t>
       </w:r>
-      <w:hyperlink r:id="rId77">
+      <w:hyperlink r:id="rId82">
         <w:r>
           <w:rPr>
             <w:rStyle w:val="Hyperlink"/>
@@ -6153,8 +6195,8 @@
         </w:r>
       </w:hyperlink>
     </w:p>
-    <w:bookmarkEnd w:id="78"/>
-    <w:bookmarkStart w:id="79" w:name="ref-wainerman2011"/>
+    <w:bookmarkEnd w:id="83"/>
+    <w:bookmarkStart w:id="84" w:name="ref-wainerman2011"/>
     <w:p>
       <w:pPr>
         <w:pStyle w:val="Bibliography"/>
@@ -6182,9 +6224,9 @@
         <w:t xml:space="preserve">(4.ª ed.). Manantial.</w:t>
       </w:r>
     </w:p>
-    <w:bookmarkEnd w:id="79"/>
-    <w:bookmarkEnd w:id="80"/>
-    <w:bookmarkEnd w:id="81"/>
+    <w:bookmarkEnd w:id="84"/>
+    <w:bookmarkEnd w:id="85"/>
+    <w:bookmarkEnd w:id="86"/>
     <w:sectPr>
       <w:footerReference w:type="default" r:id="rId11"/>
       <w:footnotePr>
@@ -6238,6 +6280,101 @@
     <w:p>
       <w:r>
         <w:separator/>
+      </w:r>
+    </w:p>
+  </w:footnote>
+  <w:footnote w:id="20">
+    <w:p>
+      <w:pPr>
+        <w:pStyle w:val="FootnoteText"/>
+      </w:pPr>
+      <w:r>
+        <w:rPr>
+          <w:rStyle w:val="FootnoteReference"/>
+        </w:rPr>
+        <w:footnoteRef/>
+      </w:r>
+      <w:r>
+        <w:t xml:space="preserve"> </w:t>
+      </w:r>
+      <w:r>
+        <w:t xml:space="preserve">La recolección empírica contemplará de manera diferenciada a la comunidad académica de los Nodos Territoriales (Sierra Grande, Valcheta, Los Menucos y Ramos Mexía), administrando cuestionarios digitales y entrevistas a docentes tutores y estudiantes que cursan bajo la modalidad híbrida reglamentada por la Res. CD-CURZA N° 196/2022.</w:t>
+      </w:r>
+    </w:p>
+  </w:footnote>
+  <w:footnote w:id="23">
+    <w:p>
+      <w:pPr>
+        <w:pStyle w:val="FootnoteText"/>
+      </w:pPr>
+      <w:r>
+        <w:rPr>
+          <w:rStyle w:val="FootnoteReference"/>
+        </w:rPr>
+        <w:footnoteRef/>
+      </w:r>
+      <w:r>
+        <w:t xml:space="preserve"> </w:t>
+      </w:r>
+      <w:r>
+        <w:t xml:space="preserve">Para salvaguardar el anonimato en asignaturas con equipos docentes unipersonales o de reducida integración, el dispositivo prevé procesar los datos de forma agregada por áreas disciplinares o ciclos formativos, evitando cualquier reporte individualizado que comprometa la confidencialidad entre pares (Longo, 2006; Lepsinger &amp; Lucia, 2009).</w:t>
+      </w:r>
+    </w:p>
+  </w:footnote>
+  <w:footnote w:id="24">
+    <w:p>
+      <w:pPr>
+        <w:pStyle w:val="FootnoteText"/>
+      </w:pPr>
+      <w:r>
+        <w:rPr>
+          <w:rStyle w:val="FootnoteReference"/>
+        </w:rPr>
+        <w:footnoteRef/>
+      </w:r>
+      <w:r>
+        <w:t xml:space="preserve"> </w:t>
+      </w:r>
+      <w:r>
+        <w:t xml:space="preserve">A fin de mitigar la fatiga evaluativa y la sobrecarga administrativa, se proyecta un instrumento modular y conciso (no mayor a 15–20 reactivos focalizados en escalas Likert con espacio para sugerencias cualitativas), con una periodicidad anual que no colisione con las encuestas estudiantiles obligatorias de cátedra (Obando Freire et al., 2014).</w:t>
+      </w:r>
+    </w:p>
+  </w:footnote>
+  <w:footnote w:id="42">
+    <w:p>
+      <w:pPr>
+        <w:pStyle w:val="FootnoteText"/>
+      </w:pPr>
+      <w:r>
+        <w:rPr>
+          <w:rStyle w:val="FootnoteReference"/>
+        </w:rPr>
+        <w:footnoteRef/>
+      </w:r>
+      <w:r>
+        <w:t xml:space="preserve"> </w:t>
+      </w:r>
+      <w:r>
+        <w:t xml:space="preserve">En estricto cumplimiento del Decreto PEN N° 1246/2015 y la Ordenanza CS N° 0988/2025 (Arts. 65 a 76), el circuito formativo 360° carece de efectos sumativos y se mantiene desvinculado de los jurados cuatrienales de permanencia, garantizando que los reportes individuales no integren el legajo administrativo ni afecten la estabilidad laboral docente.</w:t>
+      </w:r>
+    </w:p>
+  </w:footnote>
+  <w:footnote w:id="44">
+    <w:p>
+      <w:pPr>
+        <w:pStyle w:val="FootnoteText"/>
+      </w:pPr>
+      <w:r>
+        <w:rPr>
+          <w:rStyle w:val="FootnoteReference"/>
+        </w:rPr>
+        <w:footnoteRef/>
+      </w:r>
+      <w:r>
+        <w:t xml:space="preserve"> </w:t>
+      </w:r>
+      <w:r>
+        <w:t xml:space="preserve">La articulación entre el diagnóstico 360° y el Programa Anual de Formación (Art. 76) opera mediante una matriz de agregación temática departamental: las devoluciones individuales son de acceso confidencial exclusivo del profesorado evaluado, mientras que el Departamento recibe únicamente patrones agregados y anonimizados de demandas didácticas para planificar las capacitaciones (Longo, 2006).</w:t>
       </w:r>
     </w:p>
   </w:footnote>

</xml_diff>

<commit_message>
docs: add TP3 TFG research project structure and theoretical framework document
</commit_message>
<xml_diff>
--- a/Entregas/Actividad 3/TP3_Ayarachi_Fuentes.docx
+++ b/Entregas/Actividad 3/TP3_Ayarachi_Fuentes.docx
@@ -1014,7 +1014,7 @@
           <w:rFonts w:ascii="Arial" w:hAnsi="Arial"/>
           <w:sz w:val="22"/>
         </w:rPr>
-        <w:t>17</w:t>
+        <w:t>18</w:t>
       </w:r>
     </w:p>
     <w:p>
@@ -1041,7 +1041,7 @@
           <w:rFonts w:ascii="Arial" w:hAnsi="Arial"/>
           <w:sz w:val="22"/>
         </w:rPr>
-        <w:t>18</w:t>
+        <w:t>19</w:t>
       </w:r>
     </w:p>
     <w:p>
@@ -1068,7 +1068,7 @@
           <w:rFonts w:ascii="Arial" w:hAnsi="Arial"/>
           <w:sz w:val="22"/>
         </w:rPr>
-        <w:t>19</w:t>
+        <w:t>20</w:t>
       </w:r>
     </w:p>
     <w:p>
@@ -1095,7 +1095,34 @@
           <w:rFonts w:ascii="Arial" w:hAnsi="Arial"/>
           <w:sz w:val="22"/>
         </w:rPr>
-        <w:t>20</w:t>
+        <w:t>21</w:t>
+      </w:r>
+    </w:p>
+    <w:p>
+      <w:pPr>
+        <w:pStyle w:val="TOC3"/>
+        <w:tabs>
+          <w:tab w:val="right" w:leader="dot" w:pos="9026"/>
+        </w:tabs>
+        <w:ind w:left="560"/>
+        <w:spacing w:after="60"/>
+      </w:pPr>
+      <w:r>
+        <w:rPr>
+          <w:rFonts w:ascii="Arial" w:hAnsi="Arial"/>
+          <w:sz w:val="22"/>
+        </w:rPr>
+        <w:t>Síntesis y Operacionalización del Marco Teórico: De las Categorías Conceptuales a las Variables del Trabajo de Campo</w:t>
+      </w:r>
+      <w:r>
+        <w:tab/>
+      </w:r>
+      <w:r>
+        <w:rPr>
+          <w:rFonts w:ascii="Arial" w:hAnsi="Arial"/>
+          <w:sz w:val="22"/>
+        </w:rPr>
+        <w:t>22</w:t>
       </w:r>
     </w:p>
     <w:p>
@@ -1122,7 +1149,7 @@
           <w:rFonts w:ascii="Arial" w:hAnsi="Arial"/>
           <w:sz w:val="22"/>
         </w:rPr>
-        <w:t>21</w:t>
+        <w:t>23</w:t>
       </w:r>
     </w:p>
     <w:p>
@@ -1149,7 +1176,7 @@
           <w:rFonts w:ascii="Arial" w:hAnsi="Arial"/>
           <w:sz w:val="22"/>
         </w:rPr>
-        <w:t>21</w:t>
+        <w:t>23</w:t>
       </w:r>
     </w:p>
     <w:p>
@@ -1176,7 +1203,7 @@
           <w:rFonts w:ascii="Arial" w:hAnsi="Arial"/>
           <w:sz w:val="22"/>
         </w:rPr>
-        <w:t>23</w:t>
+        <w:t>25</w:t>
       </w:r>
     </w:p>
     <w:p>
@@ -1203,7 +1230,7 @@
           <w:rFonts w:ascii="Arial" w:hAnsi="Arial"/>
           <w:sz w:val="22"/>
         </w:rPr>
-        <w:t>23</w:t>
+        <w:t>25</w:t>
       </w:r>
     </w:p>
     <w:p>
@@ -1230,7 +1257,7 @@
           <w:rFonts w:ascii="Arial" w:hAnsi="Arial"/>
           <w:sz w:val="22"/>
         </w:rPr>
-        <w:t>25</w:t>
+        <w:t>27</w:t>
       </w:r>
     </w:p>
     <w:p>
@@ -1257,7 +1284,7 @@
           <w:rFonts w:ascii="Arial" w:hAnsi="Arial"/>
           <w:sz w:val="22"/>
         </w:rPr>
-        <w:t>26</w:t>
+        <w:t>28</w:t>
       </w:r>
     </w:p>
     <w:p>
@@ -3682,7 +3709,7 @@
     <w:bookmarkEnd w:id="36"/>
     <w:bookmarkEnd w:id="37"/>
     <w:bookmarkEnd w:id="38"/>
-    <w:bookmarkStart w:id="56" w:name="Xef007dd282ae18f13df7a545a4430773f008bd7"/>
+    <w:bookmarkStart w:id="57" w:name="Xef007dd282ae18f13df7a545a4430773f008bd7"/>
     <w:p>
       <w:pPr>
         <w:pStyle w:val="Heading1"/>
@@ -3698,7 +3725,7 @@
         <w:t xml:space="preserve">Segunda parte de la estructura del Proyecto de investigación de TFG</w:t>
       </w:r>
     </w:p>
-    <w:bookmarkStart w:id="50" w:name="X26fd7edd3045b8a76e95745d23dedb33f2c164e"/>
+    <w:bookmarkStart w:id="51" w:name="X26fd7edd3045b8a76e95745d23dedb33f2c164e"/>
     <w:p>
       <w:pPr>
         <w:pStyle w:val="Heading2"/>
@@ -4389,15 +4416,7 @@
         <w:t xml:space="preserve"> </w:t>
       </w:r>
       <w:r>
-        <w:t xml:space="preserve">en el seno de la Administración Pública argentina.</w:t>
-      </w:r>
-    </w:p>
-    <w:p>
-      <w:pPr>
-        <w:pStyle w:val="BodyText"/>
-      </w:pPr>
-      <w:r>
-        <w:t xml:space="preserve">Para dotar a esta perspectiva de una rigurosa fundamentación epistemológica, resulta indispensable deslindar la base conceptual de la gobernanza tradicional respecto del modelo específico de</w:t>
+        <w:t xml:space="preserve">en el seno de la Administración Pública argentina. Para una tesis en Gestión de Recursos Humanos, estos enfoques no se presentan como abstracciones teóricas generales, sino como los</w:t>
       </w:r>
       <w:r>
         <w:t xml:space="preserve"> </w:t>
@@ -4407,10 +4426,13 @@
           <w:b/>
           <w:bCs/>
         </w:rPr>
-        <w:t xml:space="preserve">poligobernanza</w:t>
-      </w:r>
-      <w:r>
-        <w:t xml:space="preserve">, explicitando al mismo tiempo su resignificación como categoría analítica para la educación superior:</w:t>
+        <w:t xml:space="preserve">lentes analíticos situados</w:t>
+      </w:r>
+      <w:r>
+        <w:t xml:space="preserve"> </w:t>
+      </w:r>
+      <w:r>
+        <w:t xml:space="preserve">indispensables para determinar si un dispositivo evaluativo participativo resulta viable en el contexto institucional del CURZAS-UNCo.</w:t>
       </w:r>
     </w:p>
     <w:bookmarkStart w:id="42" w:name="X904b4c59cd073bbc56725f9d2ca28fe890cdfb7"/>
@@ -4466,6 +4488,16 @@
       </w:r>
       <w:r>
         <w:t xml:space="preserve">. Desde este enfoque, la gobernanza supera los esquemas jerárquicos y verticalistas de mando exclusivo del aparato estatal, reconociendo que la conducción de los asuntos públicos emana de la cooperación, la deliberación horizontal y la articulación en redes entre las estructuras de gobierno y una pluralidad de actores sociales.</w:t>
+      </w:r>
+      <w:r>
+        <w:t xml:space="preserve"> </w:t>
+      </w:r>
+      <w:r>
+        <w:rPr>
+          <w:i/>
+          <w:iCs/>
+        </w:rPr>
+        <w:t xml:space="preserve">En el ámbito del CURZAS-UNCo, esta dirección compartida implica que la evaluación del desempeño docente no puede decretarse como una directiva jerárquica vertical de la conducción, sino que exige la construcción de un pacto de cooperación pedagógica y confianza recíproca entre autoridades departamentales, equipos de cátedra y estudiantes.</w:t>
       </w:r>
     </w:p>
     <w:p>
@@ -4569,6 +4601,16 @@
       <w:r>
         <w:t xml:space="preserve">, caracterizado por estructuras horizontales, descentralizadas e interconectadas que coordinan, median y potencian la interacción entre la sociedad civil, las comunidades de práctica y los colectivos profesionales.</w:t>
       </w:r>
+      <w:r>
+        <w:t xml:space="preserve"> </w:t>
+      </w:r>
+      <w:r>
+        <w:rPr>
+          <w:i/>
+          <w:iCs/>
+        </w:rPr>
+        <w:t xml:space="preserve">Trasladada a la realidad del Departamento de Administración Pública del CURZAS, esta noción de plataforma ilumina la necesidad de interconectar a la sede central de Viedma con los Nodos Universitarios de la Línea Sur y la Costa Atlántica, concibiendo al dispositivo 360° no como una auditoría a distancia, sino como una red tecnológica horizontal que articula y acompaña la labor tutorial en entornos híbridos de enseñanza.</w:t>
+      </w:r>
     </w:p>
     <w:p>
       <w:pPr>
@@ -4616,6 +4658,16 @@
       <w:r>
         <w:t xml:space="preserve">.</w:t>
       </w:r>
+      <w:r>
+        <w:t xml:space="preserve"> </w:t>
+      </w:r>
+      <w:r>
+        <w:rPr>
+          <w:i/>
+          <w:iCs/>
+        </w:rPr>
+        <w:t xml:space="preserve">Frente a la heterogeneidad de realidades áulicas del CURZAS, gestionar la complejidad significa superar las encuestas estandarizadas rígidas que reducen la labor docente a un puntaje cuantitativo abstracto, habilitando mediante el 360° una retroalimentación formativa y situada que capte las dificultades reales de la práctica pedagógica.</w:t>
+      </w:r>
     </w:p>
     <w:bookmarkEnd w:id="42"/>
     <w:bookmarkStart w:id="43" w:name="X5eba19cee255a248a999c8a85ecb0baa9dac5e4"/>
@@ -4846,6 +4898,18 @@
         <w:t xml:space="preserve">La representación gremial docente, que resguarda las condiciones laborales, la estabilidad y la no punitividad en el marco del Convenio Colectivo de Trabajo (Decreto PEN N° 1246/2015).</w:t>
       </w:r>
     </w:p>
+    <w:p>
+      <w:pPr>
+        <w:pStyle w:val="FirstParagraph"/>
+      </w:pPr>
+      <w:r>
+        <w:rPr>
+          <w:i/>
+          <w:iCs/>
+        </w:rPr>
+        <w:t xml:space="preserve">Esta categorización multidimensional demuestra que la viabilidad del modelo 360° en el CURZAS no depende de un visto bueno burocrático aislado, sino de su capacidad para articular armónicamente las regulaciones estatutarias centrales con las exigencias pedagógicas territoriales y las garantías laborales docentes.</w:t>
+      </w:r>
+    </w:p>
     <w:bookmarkEnd w:id="43"/>
     <w:bookmarkStart w:id="45" w:name="X281e32bf6404acb5230f5a8292e7ee942fa28bd"/>
     <w:p>
@@ -4861,7 +4925,7 @@
         <w:pStyle w:val="FirstParagraph"/>
       </w:pPr>
       <w:r>
-        <w:t xml:space="preserve">Es precisamente al interior de este entramado de poligobernanza institucional donde convergen, de modo articulado y diferenciado, los aportes sustantivos de Carlos Matus y Oscar Oszlak:</w:t>
+        <w:t xml:space="preserve">Es precisamente al interior de este entramado de poligobernanza institucional donde convergen, de modo articulado y diferenciado, los aportes sustantivos de Carlos Matus y Oscar Oszlak como herramientas para evaluar la factibilidad en el CURZAS:</w:t>
       </w:r>
     </w:p>
     <w:p>
@@ -4936,6 +5000,16 @@
       <w:r>
         <w:t xml:space="preserve">).</w:t>
       </w:r>
+      <w:r>
+        <w:t xml:space="preserve"> </w:t>
+      </w:r>
+      <w:r>
+        <w:rPr>
+          <w:i/>
+          <w:iCs/>
+        </w:rPr>
+        <w:t xml:space="preserve">Para el CURZAS, la advertencia de Matus es contundente: el dispositivo 360° solo será viable si se consensúan con los representantes docentes y gremiales las reglas del juego evaluativo —especialmente la estricta voluntariedad, el anonimato y la desvinculación de los jurados de permanencia—, transformando un potencial foco de conflicto laboral en un proyecto compartido de perfeccionamiento pedagógico.</w:t>
+      </w:r>
     </w:p>
     <w:p>
       <w:pPr>
@@ -5008,6 +5082,16 @@
       <w:r>
         <w:t xml:space="preserve">.</w:t>
       </w:r>
+      <w:r>
+        <w:t xml:space="preserve"> </w:t>
+      </w:r>
+      <w:r>
+        <w:rPr>
+          <w:i/>
+          <w:iCs/>
+        </w:rPr>
+        <w:t xml:space="preserve">En términos de gestión de recursos humanos en el CURZAS, la mirada de Oszlak orienta a que la digitalización del modelo 360° en plataformas institucionales (SIU-Guaraní y Moodle) no se reduzca a una fría automatización informática, sino que construya capacidades institucionales reales en el Departamento para traducir las devoluciones en planes concretos de formación docente continua (Art. 76 del Estatuto UNCo).</w:t>
+      </w:r>
     </w:p>
     <w:p>
       <w:pPr>
@@ -5593,86 +5677,7 @@
     </w:p>
     <w:bookmarkEnd w:id="48"/>
     <w:bookmarkEnd w:id="49"/>
-    <w:bookmarkEnd w:id="50"/>
-    <w:bookmarkStart w:id="55" w:name="X77155299af2def8333549b16a82948e9810ead2"/>
-    <w:p>
-      <w:pPr>
-        <w:pStyle w:val="Heading2"/>
-        <w:keepNext/>
-        <w:spacing w:before="200" w:after="80" w:line="300" w:lineRule="auto"/>
-      </w:pPr>
-      <w:r>
-        <w:rPr>
-          <w:rFonts w:ascii="Arial" w:hAnsi="Arial"/>
-          <w:b/>
-          <w:sz w:val="24"/>
-        </w:rPr>
-        <w:t xml:space="preserve">Antecedentes: Estado del Arte de la Cuestión</w:t>
-      </w:r>
-    </w:p>
-    <w:p>
-      <w:pPr>
-        <w:pStyle w:val="FirstParagraph"/>
-      </w:pPr>
-      <w:r>
-        <w:t xml:space="preserve">De acuerdo con las pautas metodológicas de la cátedra y las recomendaciones de</w:t>
-      </w:r>
-      <w:r>
-        <w:t xml:space="preserve"> </w:t>
-      </w:r>
-      <w:r>
-        <w:t xml:space="preserve">Torraco (2016)</w:t>
-      </w:r>
-      <w:r>
-        <w:t xml:space="preserve"> </w:t>
-      </w:r>
-      <w:r>
-        <w:t xml:space="preserve">y</w:t>
-      </w:r>
-      <w:r>
-        <w:t xml:space="preserve"> </w:t>
-      </w:r>
-      <w:r>
-        <w:t xml:space="preserve">Jiménez Becerra (2008)</w:t>
-      </w:r>
-      <w:r>
-        <w:t xml:space="preserve">, la construcción de los antecedentes o Estado del Arte no consiste en una reseña acumulativa de lecturas ni en un resumen bibliográfico lineal. Representa un ejercicio analítico e integrador de</w:t>
-      </w:r>
-      <w:r>
-        <w:t xml:space="preserve"> </w:t>
-      </w:r>
-      <w:r>
-        <w:t xml:space="preserve">“investigación de la investigación”</w:t>
-      </w:r>
-      <w:r>
-        <w:t xml:space="preserve">, dirigido a sistematizar la evidencia empírica previa sobre el problema de estudio, identificar metodologías empleadas y precisar con rigurosidad la</w:t>
-      </w:r>
-      <w:r>
-        <w:t xml:space="preserve"> </w:t>
-      </w:r>
-      <w:r>
-        <w:rPr>
-          <w:b/>
-          <w:bCs/>
-        </w:rPr>
-        <w:t xml:space="preserve">vacancia de conocimiento</w:t>
-      </w:r>
-      <w:r>
-        <w:t xml:space="preserve"> </w:t>
-      </w:r>
-      <w:r>
-        <w:t xml:space="preserve">que justifica el desarrollo del presente proyecto.</w:t>
-      </w:r>
-    </w:p>
-    <w:p>
-      <w:pPr>
-        <w:pStyle w:val="BodyText"/>
-      </w:pPr>
-      <w:r>
-        <w:t xml:space="preserve">Para dar cumplimiento a la estructura exigida por el Seminario de Integración y Aplicación, los antecedentes se organizan jerárquicamente en tres niveles geográficos: internacional, nacional y regional/local.</w:t>
-      </w:r>
-    </w:p>
-    <w:bookmarkStart w:id="51" w:name="Xbd1777d47dd01cd8f84e658bc65d384db447afd"/>
+    <w:bookmarkStart w:id="50" w:name="X97f16b4fc03e31fa750a32f12a9ee91c3a08a47"/>
     <w:p>
       <w:pPr>
         <w:pStyle w:val="Heading3"/>
@@ -5686,7 +5691,7 @@
           <w:i/>
           <w:sz w:val="24"/>
         </w:rPr>
-        <w:t xml:space="preserve">Antecedentes Internacionales: Modelos 360° y Triangulación Evaluativa en la Educación Superior</w:t>
+        <w:t xml:space="preserve">Síntesis y Operacionalización del Marco Teórico: De las Categorías Conceptuales a las Variables del Trabajo de Campo</w:t>
       </w:r>
     </w:p>
     <w:p>
@@ -5694,7 +5699,7 @@
         <w:pStyle w:val="FirstParagraph"/>
       </w:pPr>
       <w:r>
-        <w:t xml:space="preserve">En el plano internacional, diversos estudios empíricos han examinado la aplicación y los efectos de los modelos de evaluación 360 grados en instituciones universitarias públicas y privadas:</w:t>
+        <w:t xml:space="preserve">Para asegurar la rigurosidad metodológica del proyecto y evitar una desconexión entre la teoría sustantiva y la indagación empírica, la siguiente síntesis articula los conceptos rectores del marco teórico con las variables y dimensiones que serán relevadas en el trabajo de campo en el CURZAS-UNCo:</w:t>
       </w:r>
     </w:p>
     <w:p>
@@ -5710,42 +5715,77 @@
           <w:b/>
           <w:bCs/>
         </w:rPr>
-        <w:t xml:space="preserve">Sifuentes Ocegueda et al. (2016)</w:t>
-      </w:r>
-      <w:r>
-        <w:t xml:space="preserve"> </w:t>
-      </w:r>
-      <w:r>
-        <w:t xml:space="preserve">desarrollaron una investigación empírica titulada</w:t>
-      </w:r>
-      <w:r>
-        <w:t xml:space="preserve"> </w:t>
-      </w:r>
-      <w:r>
-        <w:rPr>
-          <w:i/>
-          <w:iCs/>
-        </w:rPr>
-        <w:t xml:space="preserve">“La evaluación de 360° aplicada al personal docente de nivel superior”</w:t>
-      </w:r>
-      <w:r>
-        <w:t xml:space="preserve">, publicada en la</w:t>
-      </w:r>
-      <w:r>
-        <w:t xml:space="preserve"> </w:t>
-      </w:r>
-      <w:r>
-        <w:rPr>
-          <w:i/>
-          <w:iCs/>
-        </w:rPr>
-        <w:t xml:space="preserve">Revista de Investigación en Tecnologías de la Información (RITI)</w:t>
-      </w:r>
-      <w:r>
-        <w:t xml:space="preserve"> </w:t>
-      </w:r>
-      <w:r>
-        <w:t xml:space="preserve">(Dialnet). El objetivo del estudio consistió en diseñar y evaluar el grado de aceptación de un instrumento 360° para el profesorado universitario en México. Mediante una metodología descriptiva y transversal que abarcó encuestas estructuradas a docentes, directores y estudiantes, los autores concluyeron que el modelo 360° registra un índice de aceptación docente superior al 85% siempre que se respeten tres garantías operativas: el estricto anonimato de los participantes, la entrega de reportes diagnósticos individuales y la ausencia total de penalidades administrativas. Este antecedente aporta a nuestro proyecto una evidencia empírica directa sobre la viabilidad actitudinal del modelo en el contexto universitario iberoamericano.</w:t>
+        <w:t xml:space="preserve">El Esqueleto Estructural (Longo, 2006):</w:t>
+      </w:r>
+      <w:r>
+        <w:t xml:space="preserve"> </w:t>
+      </w:r>
+      <w:r>
+        <w:t xml:space="preserve">El subsistema de</w:t>
+      </w:r>
+      <w:r>
+        <w:t xml:space="preserve"> </w:t>
+      </w:r>
+      <w:r>
+        <w:rPr>
+          <w:i/>
+          <w:iCs/>
+        </w:rPr>
+        <w:t xml:space="preserve">gestión del rendimiento</w:t>
+      </w:r>
+      <w:r>
+        <w:t xml:space="preserve"> </w:t>
+      </w:r>
+      <w:r>
+        <w:t xml:space="preserve">se operacionaliza mediante la evaluación docente formativa, articulándose indisolublemente con la</w:t>
+      </w:r>
+      <w:r>
+        <w:t xml:space="preserve"> </w:t>
+      </w:r>
+      <w:r>
+        <w:rPr>
+          <w:i/>
+          <w:iCs/>
+        </w:rPr>
+        <w:t xml:space="preserve">organización del trabajo</w:t>
+      </w:r>
+      <w:r>
+        <w:t xml:space="preserve"> </w:t>
+      </w:r>
+      <w:r>
+        <w:t xml:space="preserve">(funciones docentes presenciales e híbridas en la Red de Nodos), la</w:t>
+      </w:r>
+      <w:r>
+        <w:t xml:space="preserve"> </w:t>
+      </w:r>
+      <w:r>
+        <w:rPr>
+          <w:i/>
+          <w:iCs/>
+        </w:rPr>
+        <w:t xml:space="preserve">gestión del desarrollo</w:t>
+      </w:r>
+      <w:r>
+        <w:t xml:space="preserve"> </w:t>
+      </w:r>
+      <w:r>
+        <w:t xml:space="preserve">(insumo diagnóstico para el Programa Anual de Capacitación del Art. 76) y la</w:t>
+      </w:r>
+      <w:r>
+        <w:t xml:space="preserve"> </w:t>
+      </w:r>
+      <w:r>
+        <w:rPr>
+          <w:i/>
+          <w:iCs/>
+        </w:rPr>
+        <w:t xml:space="preserve">gestión de las relaciones humanas</w:t>
+      </w:r>
+      <w:r>
+        <w:t xml:space="preserve"> </w:t>
+      </w:r>
+      <w:r>
+        <w:t xml:space="preserve">(acuerdos paritarios y clima de confianza).</w:t>
       </w:r>
     </w:p>
     <w:p>
@@ -5761,39 +5801,13 @@
           <w:b/>
           <w:bCs/>
         </w:rPr>
-        <w:t xml:space="preserve">Obando Freire et al. (2014)</w:t>
-      </w:r>
-      <w:r>
-        <w:t xml:space="preserve">, en su artículo</w:t>
-      </w:r>
-      <w:r>
-        <w:t xml:space="preserve"> </w:t>
-      </w:r>
-      <w:r>
-        <w:rPr>
-          <w:i/>
-          <w:iCs/>
-        </w:rPr>
-        <w:t xml:space="preserve">“Sistema de evaluación docente mediante el modelo 360 grados y el portafolio electrónico”</w:t>
-      </w:r>
-      <w:r>
-        <w:t xml:space="preserve">, publicado en la revista</w:t>
-      </w:r>
-      <w:r>
-        <w:t xml:space="preserve"> </w:t>
-      </w:r>
-      <w:r>
-        <w:rPr>
-          <w:i/>
-          <w:iCs/>
-        </w:rPr>
-        <w:t xml:space="preserve">Medisur</w:t>
-      </w:r>
-      <w:r>
-        <w:t xml:space="preserve"> </w:t>
-      </w:r>
-      <w:r>
-        <w:t xml:space="preserve">(SciELO), investigaron la implementación de una plataforma digital para la triangulación evaluativa en el nivel superior en Cuba. Su objetivo fue contrastar la efectividad de las encuestas unilaterales frente a un circuito multiactoral que combina autoevaluación, coevaluación de pares y heteroevaluación de alumnos y autoridades académicas. Entre sus principales hallazgos, demostraron que la evaluación circular mitiga los sesgos de complacencia o castigo inherentes a las encuestas estudiantiles aisladas y estimula en los docentes la autorreflexión sobre sus métodos didácticos. Su aporte a este TFG reside en documentar la factibilidad técnico-operativa de procesar evaluaciones multidireccionales mediante soportes informáticos.</w:t>
+        <w:t xml:space="preserve">El Objeto Técnico y Pedagógico (Modelo 360°):</w:t>
+      </w:r>
+      <w:r>
+        <w:t xml:space="preserve"> </w:t>
+      </w:r>
+      <w:r>
+        <w:t xml:space="preserve">Se operacionaliza a través de una matriz multiactoral que triangula cuatro miradas situadas: autoevaluación, coevaluación entre pares de cátedra, heteroevaluación estudiantil y apreciación de la dirección departamental, despojada de consecuencias sumativas punitivas.</w:t>
       </w:r>
     </w:p>
     <w:p>
@@ -5809,106 +5823,85 @@
           <w:b/>
           <w:bCs/>
         </w:rPr>
-        <w:t xml:space="preserve">Reyes &amp; Díaz (2020)</w:t>
-      </w:r>
-      <w:r>
-        <w:t xml:space="preserve"> </w:t>
-      </w:r>
-      <w:r>
-        <w:t xml:space="preserve">llevaron a cabo una investigación evaluativa titulada</w:t>
-      </w:r>
-      <w:r>
-        <w:t xml:space="preserve"> </w:t>
-      </w:r>
-      <w:r>
-        <w:rPr>
-          <w:i/>
-          <w:iCs/>
-        </w:rPr>
-        <w:t xml:space="preserve">“Metaevaluación del sistema de evaluación docente en una universidad pública”</w:t>
-      </w:r>
-      <w:r>
-        <w:t xml:space="preserve">, publicada en</w:t>
-      </w:r>
-      <w:r>
-        <w:t xml:space="preserve"> </w:t>
-      </w:r>
-      <w:r>
-        <w:rPr>
-          <w:i/>
-          <w:iCs/>
-        </w:rPr>
-        <w:t xml:space="preserve">Education Policy Analysis Archives (EPAA)</w:t>
-      </w:r>
-      <w:r>
-        <w:t xml:space="preserve">. Mediante un enfoque metodológico mixto que combinó análisis normativo-documental y entrevistas a profundidad a docentes y autoridades sindicales, los autores evaluaron el impacto institucional de los sistemas de evaluación vigentes en una universidad pública mexicana. Concluyeron que los esquemas evaluativos de corte sumativo producen desconfianza y un</w:t>
-      </w:r>
-      <w:r>
-        <w:t xml:space="preserve"> </w:t>
-      </w:r>
-      <w:r>
-        <w:t xml:space="preserve">“efecto cumplimiento formal”</w:t>
-      </w:r>
-      <w:r>
-        <w:t xml:space="preserve">, donde el docente cumple el trámite administrativo sin transformar su práctica pedagógica. Asimismo, advirtieron que para que una innovación evaluativa prospere en la universidad pública, resulta indispensable que el modelo se oriente al aprendizaje institucional y se encuentre legitimado por los órganos de representación laboral. Este antecedente fundamenta la centralidad de la dimensión de gobernanza en nuestra investigación.</w:t>
-      </w:r>
-    </w:p>
-    <w:p>
-      <w:pPr>
-        <w:pStyle w:val="Compact"/>
-        <w:numPr>
-          <w:ilvl w:val="0"/>
-          <w:numId w:val="1019"/>
-        </w:numPr>
-      </w:pPr>
+        <w:t xml:space="preserve">Los Lentes Institucionales Situados (Cao &amp; Blutman, Matus, Oszlak):</w:t>
+      </w:r>
+      <w:r>
+        <w:t xml:space="preserve"> </w:t>
+      </w:r>
+      <w:r>
+        <w:t xml:space="preserve">Condicionan la factibilidad política, técnica y cultural del dispositivo. La</w:t>
+      </w:r>
+      <w:r>
+        <w:t xml:space="preserve"> </w:t>
+      </w:r>
+      <w:r>
+        <w:rPr>
+          <w:i/>
+          <w:iCs/>
+        </w:rPr>
+        <w:t xml:space="preserve">poligobernanza</w:t>
+      </w:r>
+      <w:r>
+        <w:t xml:space="preserve"> </w:t>
+      </w:r>
+      <w:r>
+        <w:t xml:space="preserve">(Cao &amp; Blutman) y la gobernanza universitaria (Krotsch, Brunner) definen las variables de articulación multinivel y gestión de la complejidad en territorio; la</w:t>
+      </w:r>
+      <w:r>
+        <w:t xml:space="preserve"> </w:t>
+      </w:r>
+      <w:r>
+        <w:rPr>
+          <w:i/>
+          <w:iCs/>
+        </w:rPr>
+        <w:t xml:space="preserve">planificación en poder compartido</w:t>
+      </w:r>
+      <w:r>
+        <w:t xml:space="preserve"> </w:t>
+      </w:r>
+      <w:r>
+        <w:t xml:space="preserve">(Matus) establece las variables de negociación colegiada y paritaria; y las</w:t>
+      </w:r>
+      <w:r>
+        <w:t xml:space="preserve"> </w:t>
+      </w:r>
+      <w:r>
+        <w:rPr>
+          <w:i/>
+          <w:iCs/>
+        </w:rPr>
+        <w:t xml:space="preserve">capacidades estatales</w:t>
+      </w:r>
+      <w:r>
+        <w:t xml:space="preserve"> </w:t>
+      </w:r>
+      <w:r>
+        <w:t xml:space="preserve">(Oszlak) delimitan las variables de soporte tecnológico y anonimización de datos.</w:t>
+      </w:r>
+    </w:p>
+    <w:p>
+      <w:pPr>
+        <w:pStyle w:val="FirstParagraph"/>
+      </w:pPr>
+      <w:r>
+        <w:t xml:space="preserve">En su conjunto, esta arquitectura conceptual se traduce operativamente en las</w:t>
+      </w:r>
+      <w:r>
+        <w:t xml:space="preserve"> </w:t>
+      </w:r>
       <w:r>
         <w:rPr>
           <w:b/>
           <w:bCs/>
         </w:rPr>
-        <w:t xml:space="preserve">Alvarado &amp; Morales (2019)</w:t>
-      </w:r>
-      <w:r>
-        <w:t xml:space="preserve">, en su propuesta de diseño institucional</w:t>
-      </w:r>
-      <w:r>
-        <w:t xml:space="preserve"> </w:t>
-      </w:r>
-      <w:r>
-        <w:rPr>
-          <w:i/>
-          <w:iCs/>
-        </w:rPr>
-        <w:t xml:space="preserve">“Propuesta de evaluación del desempeño docente utilizando la metodología de 360º en educación superior pública”</w:t>
-      </w:r>
-      <w:r>
-        <w:t xml:space="preserve">, desarrollada en el marco de la Universidad Nacional Autónoma de México (UNAM), estructuraron una matriz de indicadores competenciales orientada a ponderar las funciones de docencia, tutoría y gestión institucional. Su estudio aporta criterios metodológicos e instrumentales específicos para operacionalizar cuestionarios de retroalimentación 360°, resguardando la pertinencia técnica del instrumento y su articulación con los planes de perfeccionamiento pedagógico continuo.</w:t>
-      </w:r>
-    </w:p>
-    <w:bookmarkEnd w:id="51"/>
-    <w:bookmarkStart w:id="52" w:name="X2c0b73cfd018cc54d6ee142a74b81e5b02c3616"/>
-    <w:p>
-      <w:pPr>
-        <w:pStyle w:val="Heading3"/>
-        <w:keepNext/>
-        <w:spacing w:before="160" w:after="40" w:line="300" w:lineRule="auto"/>
-      </w:pPr>
-      <w:r>
-        <w:rPr>
-          <w:rFonts w:ascii="Arial" w:hAnsi="Arial"/>
-          <w:b/>
-          <w:i/>
-          <w:sz w:val="24"/>
-        </w:rPr>
-        <w:t xml:space="preserve">Antecedentes Nacionales: Evaluación Docente y Carrera Académica en Universidades Públicas Argentinas</w:t>
-      </w:r>
-    </w:p>
-    <w:p>
-      <w:pPr>
-        <w:pStyle w:val="FirstParagraph"/>
-      </w:pPr>
-      <w:r>
-        <w:t xml:space="preserve">En el ámbito nacional argentino, la literatura científica ha indagado las tensiones inherentes a la profesión docente universitaria y sus mecanismos de valoración:</w:t>
+        <w:t xml:space="preserve">cinco dimensiones de factibilidad</w:t>
+      </w:r>
+      <w:r>
+        <w:t xml:space="preserve"> </w:t>
+      </w:r>
+      <w:r>
+        <w:t xml:space="preserve">que estructuran los instrumentos de recolección de datos (guías de entrevistas a autoridades y docentes, cuestionarios a estudiantes y matriz de análisis normativo-documental):</w:t>
       </w:r>
     </w:p>
     <w:p>
@@ -5921,39 +5914,16 @@
       </w:pPr>
       <w:r>
         <w:rPr>
-          <w:b/>
-          <w:bCs/>
-        </w:rPr>
-        <w:t xml:space="preserve">Marquina (2012)</w:t>
-      </w:r>
-      <w:r>
-        <w:t xml:space="preserve">, en su estudio empírico</w:t>
-      </w:r>
-      <w:r>
-        <w:t xml:space="preserve"> </w:t>
-      </w:r>
-      <w:r>
-        <w:rPr>
-          <w:i/>
-          <w:iCs/>
-        </w:rPr>
-        <w:t xml:space="preserve">“¿Hay un nuevo modelo de profesión académica en Argentina? Debates y tendencias en la universidad pública”</w:t>
-      </w:r>
-      <w:r>
-        <w:t xml:space="preserve">, publicado en</w:t>
-      </w:r>
-      <w:r>
-        <w:t xml:space="preserve"> </w:t>
-      </w:r>
-      <w:r>
-        <w:rPr>
-          <w:i/>
-          <w:iCs/>
-        </w:rPr>
-        <w:t xml:space="preserve">Pensamiento Universitario</w:t>
-      </w:r>
-      <w:r>
-        <w:t xml:space="preserve">, analizó las transformaciones en la labor de los profesores de las universidades nacionales a partir de las exigencias contrapuestas entre la docencia, la investigación y la gestión institucional. A través de un abordaje cualitativo apoyado en entrevistas a docentes y referentes gremiales de diversas universidades públicas, Marquina evidenció que los instrumentos tradicionales de evaluación docente (concursos y permanencias) suelen privilegiar la producción científica abstracta o la acumulación de posgrados por sobre la calidad didáctica en las aulas de grado. Este hallazgo resulta nodal para nuestro TFG, pues justifica la necesidad de generar dispositivos de retroalimentación centrados específicamente en la función formativa y de enseñanza del docente universitario.</w:t>
+          <w:i/>
+          <w:iCs/>
+        </w:rPr>
+        <w:t xml:space="preserve">Dimensión Normativa y Estatutaria:</w:t>
+      </w:r>
+      <w:r>
+        <w:t xml:space="preserve"> </w:t>
+      </w:r>
+      <w:r>
+        <w:t xml:space="preserve">Variables de armonización estatutaria, respeto al Convenio Colectivo de Trabajo y no sumatividad.</w:t>
       </w:r>
     </w:p>
     <w:p>
@@ -5966,49 +5936,189 @@
       </w:pPr>
       <w:r>
         <w:rPr>
+          <w:i/>
+          <w:iCs/>
+        </w:rPr>
+        <w:t xml:space="preserve">Dimensión Técnica e Instrumental:</w:t>
+      </w:r>
+      <w:r>
+        <w:t xml:space="preserve"> </w:t>
+      </w:r>
+      <w:r>
+        <w:t xml:space="preserve">Variables de usabilidad en SIU-Guaraní/Moodle, protección algorítmica del anonimato y mitigación de fatiga evaluativa.</w:t>
+      </w:r>
+    </w:p>
+    <w:p>
+      <w:pPr>
+        <w:pStyle w:val="Compact"/>
+        <w:numPr>
+          <w:ilvl w:val="0"/>
+          <w:numId w:val="1020"/>
+        </w:numPr>
+      </w:pPr>
+      <w:r>
+        <w:rPr>
+          <w:i/>
+          <w:iCs/>
+        </w:rPr>
+        <w:t xml:space="preserve">Dimensión Organizacional y Procedimental:</w:t>
+      </w:r>
+      <w:r>
+        <w:t xml:space="preserve"> </w:t>
+      </w:r>
+      <w:r>
+        <w:t xml:space="preserve">Variables de capacidad de gestión departamental, circuitos de devolución oportuna y articulación con planes de formación.</w:t>
+      </w:r>
+    </w:p>
+    <w:p>
+      <w:pPr>
+        <w:pStyle w:val="Compact"/>
+        <w:numPr>
+          <w:ilvl w:val="0"/>
+          <w:numId w:val="1020"/>
+        </w:numPr>
+      </w:pPr>
+      <w:r>
+        <w:rPr>
+          <w:i/>
+          <w:iCs/>
+        </w:rPr>
+        <w:t xml:space="preserve">Dimensión Cultural y Actitudinal:</w:t>
+      </w:r>
+      <w:r>
+        <w:t xml:space="preserve"> </w:t>
+      </w:r>
+      <w:r>
+        <w:t xml:space="preserve">Variables de confianza intersubjetiva, cultura de diálogo formativo y predisposición docente y estudiantil ante la coevaluación.</w:t>
+      </w:r>
+    </w:p>
+    <w:p>
+      <w:pPr>
+        <w:pStyle w:val="Compact"/>
+        <w:numPr>
+          <w:ilvl w:val="0"/>
+          <w:numId w:val="1020"/>
+        </w:numPr>
+      </w:pPr>
+      <w:r>
+        <w:rPr>
+          <w:i/>
+          <w:iCs/>
+        </w:rPr>
+        <w:t xml:space="preserve">Dimensión de Gobernanza y Diálogo Institucional:</w:t>
+      </w:r>
+      <w:r>
+        <w:t xml:space="preserve"> </w:t>
+      </w:r>
+      <w:r>
+        <w:t xml:space="preserve">Variables de legitimación en el cogobierno (Consejo Directivo y Superior) y concertación paritaria sobre variables de control compartido.</w:t>
+      </w:r>
+    </w:p>
+    <w:p>
+      <w:pPr>
+        <w:pStyle w:val="FirstParagraph"/>
+      </w:pPr>
+      <w:r>
+        <w:t xml:space="preserve">Habiendo precisado el marco teórico que fundamenta qué es el modelo 360°, bajo qué subsistemas de recursos humanos se inscribe y qué lentes institucionales condicionan su viabilidad en la universidad pública, resulta indispensable contrastar este aparato conceptual con la evidencia empírica acumulada en la literatura científica. A continuación, el</w:t>
+      </w:r>
+      <w:r>
+        <w:t xml:space="preserve"> </w:t>
+      </w:r>
+      <w:r>
+        <w:rPr>
           <w:b/>
           <w:bCs/>
         </w:rPr>
-        <w:t xml:space="preserve">Pérez et al. (2021)</w:t>
-      </w:r>
-      <w:r>
-        <w:t xml:space="preserve"> </w:t>
-      </w:r>
-      <w:r>
-        <w:t xml:space="preserve">publicaron el artículo de investigación empírica</w:t>
-      </w:r>
-      <w:r>
-        <w:t xml:space="preserve"> </w:t>
-      </w:r>
-      <w:r>
-        <w:rPr>
-          <w:i/>
-          <w:iCs/>
-        </w:rPr>
-        <w:t xml:space="preserve">“Evaluación 360° de las tutorías presenciales y en línea en universidades públicas”</w:t>
-      </w:r>
-      <w:r>
-        <w:t xml:space="preserve">, en la revista científica</w:t>
-      </w:r>
-      <w:r>
-        <w:t xml:space="preserve"> </w:t>
-      </w:r>
-      <w:r>
-        <w:rPr>
-          <w:i/>
-          <w:iCs/>
-        </w:rPr>
-        <w:t xml:space="preserve">Unaciencia</w:t>
-      </w:r>
-      <w:r>
-        <w:t xml:space="preserve"> </w:t>
-      </w:r>
-      <w:r>
-        <w:t xml:space="preserve">(Redalyc). El estudio evaluó la factibilidad de aplicar la metodología 360° para valorar el desempeño de docentes universitarios con funciones tutoriales presenciales y mediadas por tecnologías virtuales. Mediante un diseño metodológico descriptivo aplicado a estudiantes, docentes tutores y coordinadores, el trabajo concluyó que el modelo 360° demostró una capacidad significativamente superior para captar competencias pedagógicas blandas (comunicación asertiva, empatía, acompañamiento en entornos virtuales) en comparación con las rúbricas estandarizadas tradicionales. Este antecedente aporta un valor metodológico e instrumental directo para el CURZAS-UNCo, donde la docencia universitaria se despliega crecientemente de forma híbrida articulando la sede central con los Nodos Territoriales.</w:t>
-      </w:r>
-    </w:p>
-    <w:bookmarkEnd w:id="52"/>
-    <w:bookmarkStart w:id="53" w:name="X868ada8a3209befb2b1ff6a8414801be884be61"/>
+        <w:t xml:space="preserve">Estado del Arte</w:t>
+      </w:r>
+      <w:r>
+        <w:t xml:space="preserve"> </w:t>
+      </w:r>
+      <w:r>
+        <w:t xml:space="preserve">analiza los antecedentes internacionales, nacionales y regionales que han abordado innovaciones evaluativas similares, identificando lecciones aprendidas y delimitando con precisión la vacancia de conocimiento que justifica el presente estudio.</w:t>
+      </w:r>
+    </w:p>
+    <w:bookmarkEnd w:id="50"/>
+    <w:bookmarkEnd w:id="51"/>
+    <w:bookmarkStart w:id="56" w:name="X77155299af2def8333549b16a82948e9810ead2"/>
+    <w:p>
+      <w:pPr>
+        <w:pStyle w:val="Heading2"/>
+        <w:keepNext/>
+        <w:spacing w:before="200" w:after="80" w:line="300" w:lineRule="auto"/>
+      </w:pPr>
+      <w:r>
+        <w:rPr>
+          <w:rFonts w:ascii="Arial" w:hAnsi="Arial"/>
+          <w:b/>
+          <w:sz w:val="24"/>
+        </w:rPr>
+        <w:t xml:space="preserve">Antecedentes: Estado del Arte de la Cuestión</w:t>
+      </w:r>
+    </w:p>
+    <w:p>
+      <w:pPr>
+        <w:pStyle w:val="FirstParagraph"/>
+      </w:pPr>
+      <w:r>
+        <w:t xml:space="preserve">De acuerdo con las pautas metodológicas de la cátedra y las recomendaciones de</w:t>
+      </w:r>
+      <w:r>
+        <w:t xml:space="preserve"> </w:t>
+      </w:r>
+      <w:r>
+        <w:t xml:space="preserve">Torraco (2016)</w:t>
+      </w:r>
+      <w:r>
+        <w:t xml:space="preserve"> </w:t>
+      </w:r>
+      <w:r>
+        <w:t xml:space="preserve">y</w:t>
+      </w:r>
+      <w:r>
+        <w:t xml:space="preserve"> </w:t>
+      </w:r>
+      <w:r>
+        <w:t xml:space="preserve">Jiménez Becerra (2008)</w:t>
+      </w:r>
+      <w:r>
+        <w:t xml:space="preserve">, la construcción de los antecedentes o Estado del Arte no consiste en una reseña acumulativa de lecturas ni en un resumen bibliográfico lineal. Representa un ejercicio analítico e integrador de</w:t>
+      </w:r>
+      <w:r>
+        <w:t xml:space="preserve"> </w:t>
+      </w:r>
+      <w:r>
+        <w:t xml:space="preserve">“investigación de la investigación”</w:t>
+      </w:r>
+      <w:r>
+        <w:t xml:space="preserve">, dirigido a sistematizar la evidencia empírica previa sobre el problema de estudio, identificar metodologías empleadas y precisar con rigurosidad la</w:t>
+      </w:r>
+      <w:r>
+        <w:t xml:space="preserve"> </w:t>
+      </w:r>
+      <w:r>
+        <w:rPr>
+          <w:b/>
+          <w:bCs/>
+        </w:rPr>
+        <w:t xml:space="preserve">vacancia de conocimiento</w:t>
+      </w:r>
+      <w:r>
+        <w:t xml:space="preserve"> </w:t>
+      </w:r>
+      <w:r>
+        <w:t xml:space="preserve">que justifica el desarrollo del presente proyecto.</w:t>
+      </w:r>
+    </w:p>
+    <w:p>
+      <w:pPr>
+        <w:pStyle w:val="BodyText"/>
+      </w:pPr>
+      <w:r>
+        <w:t xml:space="preserve">Para dar cumplimiento a la estructura exigida por el Seminario de Integración y Aplicación, los antecedentes se organizan jerárquicamente en tres niveles geográficos: internacional, nacional y regional/local.</w:t>
+      </w:r>
+    </w:p>
+    <w:bookmarkStart w:id="52" w:name="Xbd1777d47dd01cd8f84e658bc65d384db447afd"/>
     <w:p>
       <w:pPr>
         <w:pStyle w:val="Heading3"/>
@@ -6022,7 +6132,7 @@
           <w:i/>
           <w:sz w:val="24"/>
         </w:rPr>
-        <w:t xml:space="preserve">Antecedentes Regionales y Locales: Prácticas de Evaluación y Contexto Institucional en la UNCo y el CURZAS</w:t>
+        <w:t xml:space="preserve">Antecedentes Internacionales: Modelos 360° y Triangulación Evaluativa en la Educación Superior</w:t>
       </w:r>
     </w:p>
     <w:p>
@@ -6030,7 +6140,7 @@
         <w:pStyle w:val="FirstParagraph"/>
       </w:pPr>
       <w:r>
-        <w:t xml:space="preserve">En el plano regional y local patagónico, los antecedentes normativos e institucionales vinculados a la Universidad Nacional del Comahue y al Complejo Universitario Regional Zona Atlántica y Sur (CURZAS) permiten delimitar con precisión empírica el estado de situación de partida:</w:t>
+        <w:t xml:space="preserve">En el plano internacional, diversos estudios empíricos han examinado la aplicación y los efectos de los modelos de evaluación 360 grados en instituciones universitarias públicas y privadas:</w:t>
       </w:r>
     </w:p>
     <w:p>
@@ -6046,72 +6156,42 @@
           <w:b/>
           <w:bCs/>
         </w:rPr>
-        <w:t xml:space="preserve">Marco Estatutario Consolidado (Ordenanza CS N° 0988/2025 — Estatuto UNCo):</w:t>
-      </w:r>
-      <w:r>
-        <w:t xml:space="preserve"> </w:t>
-      </w:r>
-      <w:r>
-        <w:t xml:space="preserve">Aprobado por la Asamblea Universitaria como texto ordenado del Estatuto de la Universidad Nacional del Comahue</w:t>
-      </w:r>
-      <w:r>
-        <w:t xml:space="preserve"> </w:t>
-      </w:r>
-      <w:r>
-        <w:t xml:space="preserve">(Universidad Nacional del Comahue, 2025)</w:t>
-      </w:r>
-      <w:r>
-        <w:t xml:space="preserve">, este cuerpo normativo jerarquiza y define formalmente al CURZAS como Complejo Universitario Regional (Art. 17 y Disposición Transitoria Cuarta). En su Título X (</w:t>
-      </w:r>
-      <w:r>
-        <w:t xml:space="preserve">“De la Carrera Docente”</w:t>
-      </w:r>
-      <w:r>
-        <w:t xml:space="preserve">, Arts. 65 a 76), el Estatuto consolida el régimen integral de permanencia académica, articulando dos dispositivos evaluativos estatutarios:</w:t>
-      </w:r>
-    </w:p>
-    <w:p>
-      <w:pPr>
-        <w:pStyle w:val="Compact"/>
-        <w:numPr>
-          <w:ilvl w:val="1"/>
-          <w:numId w:val="1022"/>
-        </w:numPr>
-      </w:pPr>
-      <w:r>
-        <w:rPr>
-          <w:i/>
-          <w:iCs/>
-        </w:rPr>
-        <w:t xml:space="preserve">Informes Anuales de Cátedra (Art. 74):</w:t>
-      </w:r>
-      <w:r>
-        <w:t xml:space="preserve"> </w:t>
-      </w:r>
-      <w:r>
-        <w:t xml:space="preserve">Que comprenden la memoria de actividades, el plan de avance pedagógico, la opinión fundada de la Dirección del Departamento y los resultados de las encuestas estudiantiles obligatorias.</w:t>
-      </w:r>
-    </w:p>
-    <w:p>
-      <w:pPr>
-        <w:pStyle w:val="Compact"/>
-        <w:numPr>
-          <w:ilvl w:val="1"/>
-          <w:numId w:val="1022"/>
-        </w:numPr>
-      </w:pPr>
-      <w:r>
-        <w:rPr>
-          <w:i/>
-          <w:iCs/>
-        </w:rPr>
-        <w:t xml:space="preserve">Evaluaciones Periódicas Cuatrienales de Permanencia (Art. 75):</w:t>
-      </w:r>
-      <w:r>
-        <w:t xml:space="preserve"> </w:t>
-      </w:r>
-      <w:r>
-        <w:t xml:space="preserve">Llevadas a cabo por tribunales integrados por dos evaluadores externos de la disciplina y un veedor con voz y voto del claustro estudiantil (inc. a). Asimismo, el Art. 76 instituye la obligación departamental de formular programas anuales de formación y perfeccionamiento de recursos humanos docentes.</w:t>
+        <w:t xml:space="preserve">Sifuentes Ocegueda et al. (2016)</w:t>
+      </w:r>
+      <w:r>
+        <w:t xml:space="preserve"> </w:t>
+      </w:r>
+      <w:r>
+        <w:t xml:space="preserve">desarrollaron una investigación empírica titulada</w:t>
+      </w:r>
+      <w:r>
+        <w:t xml:space="preserve"> </w:t>
+      </w:r>
+      <w:r>
+        <w:rPr>
+          <w:i/>
+          <w:iCs/>
+        </w:rPr>
+        <w:t xml:space="preserve">“La evaluación de 360° aplicada al personal docente de nivel superior”</w:t>
+      </w:r>
+      <w:r>
+        <w:t xml:space="preserve">, publicada en la</w:t>
+      </w:r>
+      <w:r>
+        <w:t xml:space="preserve"> </w:t>
+      </w:r>
+      <w:r>
+        <w:rPr>
+          <w:i/>
+          <w:iCs/>
+        </w:rPr>
+        <w:t xml:space="preserve">Revista de Investigación en Tecnologías de la Información (RITI)</w:t>
+      </w:r>
+      <w:r>
+        <w:t xml:space="preserve"> </w:t>
+      </w:r>
+      <w:r>
+        <w:t xml:space="preserve">(Dialnet). El objetivo del estudio consistió en diseñar y evaluar el grado de aceptación de un instrumento 360° para el profesorado universitario en México. Mediante una metodología descriptiva y transversal que abarcó encuestas estructuradas a docentes, directores y estudiantes, los autores concluyeron que el modelo 360° registra un índice de aceptación docente superior al 85% siempre que se respeten tres garantías operativas: el estricto anonimato de los participantes, la entrega de reportes diagnósticos individuales y la ausencia total de penalidades administrativas. Este antecedente aporta a nuestro proyecto una evidencia empírica directa sobre la viabilidad actitudinal del modelo en el contexto universitario iberoamericano.</w:t>
       </w:r>
     </w:p>
     <w:p>
@@ -6127,34 +6207,39 @@
           <w:b/>
           <w:bCs/>
         </w:rPr>
-        <w:t xml:space="preserve">Régimen General de Carrera Docente de la UNCo (Ordenanza CS N° 0910/1997 y modificatorias hasta la Ord. CS N° 0887/2021):</w:t>
-      </w:r>
-      <w:r>
-        <w:t xml:space="preserve"> </w:t>
-      </w:r>
-      <w:r>
-        <w:t xml:space="preserve">En el Digesto oficial de la universidad, el Reglamento de Carrera Docente</w:t>
-      </w:r>
-      <w:r>
-        <w:t xml:space="preserve"> </w:t>
-      </w:r>
-      <w:r>
-        <w:t xml:space="preserve">(Universidad Nacional del Comahue, 1997)</w:t>
-      </w:r>
-      <w:r>
-        <w:t xml:space="preserve"> </w:t>
-      </w:r>
-      <w:r>
-        <w:t xml:space="preserve">norma en su Capítulo III el procedimiento operativo para la presentación y valoración de informes docentes, encuestas estudiantiles y criterios de permanencia, en plena armonización con el Convenio Colectivo de Trabajo Docente Universitario (Decreto PEN N° 1246/2015)</w:t>
-      </w:r>
-      <w:r>
-        <w:t xml:space="preserve"> </w:t>
-      </w:r>
-      <w:r>
-        <w:t xml:space="preserve">(Decreto N° 1246/2015. Convenio Colectivo de Trabajo para los Docentes de las Instituciones Universitarias Nacionales, 2015)</w:t>
-      </w:r>
-      <w:r>
-        <w:t xml:space="preserve">. Los registros institucionales muestran que, si bien estos instrumentos garantizan con solidez jurídica el control administrativo y sumativo de la estabilidad laboral, se advierte entre los actores institucionales una demanda no resuelta y un área de vacancia analítica respecto al desarrollo de circuitos sistemáticos de retroalimentación formativa y confidencial que orienten la mejora continua del ejercicio docente.</w:t>
+        <w:t xml:space="preserve">Obando Freire et al. (2014)</w:t>
+      </w:r>
+      <w:r>
+        <w:t xml:space="preserve">, en su artículo</w:t>
+      </w:r>
+      <w:r>
+        <w:t xml:space="preserve"> </w:t>
+      </w:r>
+      <w:r>
+        <w:rPr>
+          <w:i/>
+          <w:iCs/>
+        </w:rPr>
+        <w:t xml:space="preserve">“Sistema de evaluación docente mediante el modelo 360 grados y el portafolio electrónico”</w:t>
+      </w:r>
+      <w:r>
+        <w:t xml:space="preserve">, publicado en la revista</w:t>
+      </w:r>
+      <w:r>
+        <w:t xml:space="preserve"> </w:t>
+      </w:r>
+      <w:r>
+        <w:rPr>
+          <w:i/>
+          <w:iCs/>
+        </w:rPr>
+        <w:t xml:space="preserve">Medisur</w:t>
+      </w:r>
+      <w:r>
+        <w:t xml:space="preserve"> </w:t>
+      </w:r>
+      <w:r>
+        <w:t xml:space="preserve">(SciELO), investigaron la implementación de una plataforma digital para la triangulación evaluativa en el nivel superior en Cuba. Su objetivo fue contrastar la efectividad de las encuestas unilaterales frente a un circuito multiactoral que combina autoevaluación, coevaluación de pares y heteroevaluación de alumnos y autoridades académicas. Entre sus principales hallazgos, demostraron que la evaluación circular mitiga los sesgos de complacencia o castigo inherentes a las encuestas estudiantiles aisladas y estimula en los docentes la autorreflexión sobre sus métodos didácticos. Su aporte a este TFG reside en documentar la factibilidad técnico-operativa de procesar evaluaciones multidireccionales mediante soportes informáticos.</w:t>
       </w:r>
     </w:p>
     <w:p>
@@ -6170,26 +6255,84 @@
           <w:b/>
           <w:bCs/>
         </w:rPr>
-        <w:t xml:space="preserve">Expansión Territorial y Docencia Híbrida en la Red de Nodos del CURZAS (Resolución CD-CURZA N° 196/2022 y SIED UNCo):</w:t>
-      </w:r>
-      <w:r>
-        <w:t xml:space="preserve"> </w:t>
-      </w:r>
-      <w:r>
-        <w:t xml:space="preserve">En la escala regional de Río Negro, el Departamento de Administración Pública ha expandido su oferta académica mediante la Red de Nodos Universitarios en localidades de la Línea Sur y la Costa Atlántica rionegrina (Sierra Grande, Valcheta, Los Menucos y Ramos Mexía)</w:t>
-      </w:r>
-      <w:r>
-        <w:t xml:space="preserve"> </w:t>
-      </w:r>
-      <w:r>
-        <w:t xml:space="preserve">(Consejo Directivo del CURZAS, 2022, 2023)</w:t>
-      </w:r>
-      <w:r>
-        <w:t xml:space="preserve">. Esta configuración territorial se encuentra respaldada por la Resolución CD-CURZA N° 196/2022, que valida normativamente las mediaciones tecnológicas, la presencialidad sincrónica remota y las modalidades de enseñanza híbridas, articuladas con las directrices del Sistema Institucional de Educación a Distancia (SIED UNCo). Dicho escenario impone a los equipos de cátedra competencias didácticas específicas (tutoría virtual, diseño de materiales asincrónicos y acompañamiento mediado por TIC) que actualmente no son ponderadas de forma formativa ni multidireccional por los instrumentos de evaluación tradicionales, planteando la conveniencia de indagar la pertinencia y factibilidad de un modelo 360° adaptado a las singularidades de dichos entornos híbridos.</w:t>
-      </w:r>
-    </w:p>
-    <w:bookmarkEnd w:id="53"/>
-    <w:bookmarkStart w:id="54" w:name="Xdd2f1928b167b346feb3db91e0e80e813fe5a54"/>
+        <w:t xml:space="preserve">Reyes &amp; Díaz (2020)</w:t>
+      </w:r>
+      <w:r>
+        <w:t xml:space="preserve"> </w:t>
+      </w:r>
+      <w:r>
+        <w:t xml:space="preserve">llevaron a cabo una investigación evaluativa titulada</w:t>
+      </w:r>
+      <w:r>
+        <w:t xml:space="preserve"> </w:t>
+      </w:r>
+      <w:r>
+        <w:rPr>
+          <w:i/>
+          <w:iCs/>
+        </w:rPr>
+        <w:t xml:space="preserve">“Metaevaluación del sistema de evaluación docente en una universidad pública”</w:t>
+      </w:r>
+      <w:r>
+        <w:t xml:space="preserve">, publicada en</w:t>
+      </w:r>
+      <w:r>
+        <w:t xml:space="preserve"> </w:t>
+      </w:r>
+      <w:r>
+        <w:rPr>
+          <w:i/>
+          <w:iCs/>
+        </w:rPr>
+        <w:t xml:space="preserve">Education Policy Analysis Archives (EPAA)</w:t>
+      </w:r>
+      <w:r>
+        <w:t xml:space="preserve">. Mediante un enfoque metodológico mixto que combinó análisis normativo-documental y entrevistas a profundidad a docentes y autoridades sindicales, los autores evaluaron el impacto institucional de los sistemas de evaluación vigentes en una universidad pública mexicana. Concluyeron que los esquemas evaluativos de corte sumativo producen desconfianza y un</w:t>
+      </w:r>
+      <w:r>
+        <w:t xml:space="preserve"> </w:t>
+      </w:r>
+      <w:r>
+        <w:t xml:space="preserve">“efecto cumplimiento formal”</w:t>
+      </w:r>
+      <w:r>
+        <w:t xml:space="preserve">, donde el docente cumple el trámite administrativo sin transformar su práctica pedagógica. Asimismo, advirtieron que para que una innovación evaluativa prospere en la universidad pública, resulta indispensable que el modelo se oriente al aprendizaje institucional y se encuentre legitimado por los órganos de representación laboral. Este antecedente fundamenta la centralidad de la dimensión de gobernanza en nuestra investigación.</w:t>
+      </w:r>
+    </w:p>
+    <w:p>
+      <w:pPr>
+        <w:pStyle w:val="Compact"/>
+        <w:numPr>
+          <w:ilvl w:val="0"/>
+          <w:numId w:val="1021"/>
+        </w:numPr>
+      </w:pPr>
+      <w:r>
+        <w:rPr>
+          <w:b/>
+          <w:bCs/>
+        </w:rPr>
+        <w:t xml:space="preserve">Alvarado &amp; Morales (2019)</w:t>
+      </w:r>
+      <w:r>
+        <w:t xml:space="preserve">, en su propuesta de diseño institucional</w:t>
+      </w:r>
+      <w:r>
+        <w:t xml:space="preserve"> </w:t>
+      </w:r>
+      <w:r>
+        <w:rPr>
+          <w:i/>
+          <w:iCs/>
+        </w:rPr>
+        <w:t xml:space="preserve">“Propuesta de evaluación del desempeño docente utilizando la metodología de 360º en educación superior pública”</w:t>
+      </w:r>
+      <w:r>
+        <w:t xml:space="preserve">, desarrollada en el marco de la Universidad Nacional Autónoma de México (UNAM), estructuraron una matriz de indicadores competenciales orientada a ponderar las funciones de docencia, tutoría y gestión institucional. Su estudio aporta criterios metodológicos e instrumentales específicos para operacionalizar cuestionarios de retroalimentación 360°, resguardando la pertinencia técnica del instrumento y su articulación con los planes de perfeccionamiento pedagógico continuo.</w:t>
+      </w:r>
+    </w:p>
+    <w:bookmarkEnd w:id="52"/>
+    <w:bookmarkStart w:id="53" w:name="X2c0b73cfd018cc54d6ee142a74b81e5b02c3616"/>
     <w:p>
       <w:pPr>
         <w:pStyle w:val="Heading3"/>
@@ -6203,6 +6346,309 @@
           <w:i/>
           <w:sz w:val="24"/>
         </w:rPr>
+        <w:t xml:space="preserve">Antecedentes Nacionales: Evaluación Docente y Carrera Académica en Universidades Públicas Argentinas</w:t>
+      </w:r>
+    </w:p>
+    <w:p>
+      <w:pPr>
+        <w:pStyle w:val="FirstParagraph"/>
+      </w:pPr>
+      <w:r>
+        <w:t xml:space="preserve">En el ámbito nacional argentino, la literatura científica ha indagado las tensiones inherentes a la profesión docente universitaria y sus mecanismos de valoración:</w:t>
+      </w:r>
+    </w:p>
+    <w:p>
+      <w:pPr>
+        <w:pStyle w:val="Compact"/>
+        <w:numPr>
+          <w:ilvl w:val="0"/>
+          <w:numId w:val="1022"/>
+        </w:numPr>
+      </w:pPr>
+      <w:r>
+        <w:rPr>
+          <w:b/>
+          <w:bCs/>
+        </w:rPr>
+        <w:t xml:space="preserve">Marquina (2012)</w:t>
+      </w:r>
+      <w:r>
+        <w:t xml:space="preserve">, en su estudio empírico</w:t>
+      </w:r>
+      <w:r>
+        <w:t xml:space="preserve"> </w:t>
+      </w:r>
+      <w:r>
+        <w:rPr>
+          <w:i/>
+          <w:iCs/>
+        </w:rPr>
+        <w:t xml:space="preserve">“¿Hay un nuevo modelo de profesión académica en Argentina? Debates y tendencias en la universidad pública”</w:t>
+      </w:r>
+      <w:r>
+        <w:t xml:space="preserve">, publicado en</w:t>
+      </w:r>
+      <w:r>
+        <w:t xml:space="preserve"> </w:t>
+      </w:r>
+      <w:r>
+        <w:rPr>
+          <w:i/>
+          <w:iCs/>
+        </w:rPr>
+        <w:t xml:space="preserve">Pensamiento Universitario</w:t>
+      </w:r>
+      <w:r>
+        <w:t xml:space="preserve">, analizó las transformaciones en la labor de los profesores de las universidades nacionales a partir de las exigencias contrapuestas entre la docencia, la investigación y la gestión institucional. A través de un abordaje cualitativo apoyado en entrevistas a docentes y referentes gremiales de diversas universidades públicas, Marquina evidenció que los instrumentos tradicionales de evaluación docente (concursos y permanencias) suelen privilegiar la producción científica abstracta o la acumulación de posgrados por sobre la calidad didáctica en las aulas de grado. Este hallazgo resulta nodal para nuestro TFG, pues justifica la necesidad de generar dispositivos de retroalimentación centrados específicamente en la función formativa y de enseñanza del docente universitario.</w:t>
+      </w:r>
+    </w:p>
+    <w:p>
+      <w:pPr>
+        <w:pStyle w:val="Compact"/>
+        <w:numPr>
+          <w:ilvl w:val="0"/>
+          <w:numId w:val="1022"/>
+        </w:numPr>
+      </w:pPr>
+      <w:r>
+        <w:rPr>
+          <w:b/>
+          <w:bCs/>
+        </w:rPr>
+        <w:t xml:space="preserve">Pérez et al. (2021)</w:t>
+      </w:r>
+      <w:r>
+        <w:t xml:space="preserve"> </w:t>
+      </w:r>
+      <w:r>
+        <w:t xml:space="preserve">publicaron el artículo de investigación empírica</w:t>
+      </w:r>
+      <w:r>
+        <w:t xml:space="preserve"> </w:t>
+      </w:r>
+      <w:r>
+        <w:rPr>
+          <w:i/>
+          <w:iCs/>
+        </w:rPr>
+        <w:t xml:space="preserve">“Evaluación 360° de las tutorías presenciales y en línea en universidades públicas”</w:t>
+      </w:r>
+      <w:r>
+        <w:t xml:space="preserve">, en la revista científica</w:t>
+      </w:r>
+      <w:r>
+        <w:t xml:space="preserve"> </w:t>
+      </w:r>
+      <w:r>
+        <w:rPr>
+          <w:i/>
+          <w:iCs/>
+        </w:rPr>
+        <w:t xml:space="preserve">Unaciencia</w:t>
+      </w:r>
+      <w:r>
+        <w:t xml:space="preserve"> </w:t>
+      </w:r>
+      <w:r>
+        <w:t xml:space="preserve">(Redalyc). El estudio evaluó la factibilidad de aplicar la metodología 360° para valorar el desempeño de docentes universitarios con funciones tutoriales presenciales y mediadas por tecnologías virtuales. Mediante un diseño metodológico descriptivo aplicado a estudiantes, docentes tutores y coordinadores, el trabajo concluyó que el modelo 360° demostró una capacidad significativamente superior para captar competencias pedagógicas blandas (comunicación asertiva, empatía, acompañamiento en entornos virtuales) en comparación con las rúbricas estandarizadas tradicionales. Este antecedente aporta un valor metodológico e instrumental directo para el CURZAS-UNCo, donde la docencia universitaria se despliega crecientemente de forma híbrida articulando la sede central con los Nodos Territoriales.</w:t>
+      </w:r>
+    </w:p>
+    <w:bookmarkEnd w:id="53"/>
+    <w:bookmarkStart w:id="54" w:name="X868ada8a3209befb2b1ff6a8414801be884be61"/>
+    <w:p>
+      <w:pPr>
+        <w:pStyle w:val="Heading3"/>
+        <w:keepNext/>
+        <w:spacing w:before="160" w:after="40" w:line="300" w:lineRule="auto"/>
+      </w:pPr>
+      <w:r>
+        <w:rPr>
+          <w:rFonts w:ascii="Arial" w:hAnsi="Arial"/>
+          <w:b/>
+          <w:i/>
+          <w:sz w:val="24"/>
+        </w:rPr>
+        <w:t xml:space="preserve">Antecedentes Regionales y Locales: Prácticas de Evaluación y Contexto Institucional en la UNCo y el CURZAS</w:t>
+      </w:r>
+    </w:p>
+    <w:p>
+      <w:pPr>
+        <w:pStyle w:val="FirstParagraph"/>
+      </w:pPr>
+      <w:r>
+        <w:t xml:space="preserve">En el plano regional y local patagónico, los antecedentes normativos e institucionales vinculados a la Universidad Nacional del Comahue y al Complejo Universitario Regional Zona Atlántica y Sur (CURZAS) permiten delimitar con precisión empírica el estado de situación de partida:</w:t>
+      </w:r>
+    </w:p>
+    <w:p>
+      <w:pPr>
+        <w:pStyle w:val="Compact"/>
+        <w:numPr>
+          <w:ilvl w:val="0"/>
+          <w:numId w:val="1023"/>
+        </w:numPr>
+      </w:pPr>
+      <w:r>
+        <w:rPr>
+          <w:b/>
+          <w:bCs/>
+        </w:rPr>
+        <w:t xml:space="preserve">Marco Estatutario Consolidado (Ordenanza CS N° 0988/2025 — Estatuto UNCo):</w:t>
+      </w:r>
+      <w:r>
+        <w:t xml:space="preserve"> </w:t>
+      </w:r>
+      <w:r>
+        <w:t xml:space="preserve">Aprobado por la Asamblea Universitaria como texto ordenado del Estatuto de la Universidad Nacional del Comahue</w:t>
+      </w:r>
+      <w:r>
+        <w:t xml:space="preserve"> </w:t>
+      </w:r>
+      <w:r>
+        <w:t xml:space="preserve">(Universidad Nacional del Comahue, 2025)</w:t>
+      </w:r>
+      <w:r>
+        <w:t xml:space="preserve">, este cuerpo normativo jerarquiza y define formalmente al CURZAS como Complejo Universitario Regional (Art. 17 y Disposición Transitoria Cuarta). En su Título X (</w:t>
+      </w:r>
+      <w:r>
+        <w:t xml:space="preserve">“De la Carrera Docente”</w:t>
+      </w:r>
+      <w:r>
+        <w:t xml:space="preserve">, Arts. 65 a 76), el Estatuto consolida el régimen integral de permanencia académica, articulando dos dispositivos evaluativos estatutarios:</w:t>
+      </w:r>
+    </w:p>
+    <w:p>
+      <w:pPr>
+        <w:pStyle w:val="Compact"/>
+        <w:numPr>
+          <w:ilvl w:val="1"/>
+          <w:numId w:val="1024"/>
+        </w:numPr>
+      </w:pPr>
+      <w:r>
+        <w:rPr>
+          <w:i/>
+          <w:iCs/>
+        </w:rPr>
+        <w:t xml:space="preserve">Informes Anuales de Cátedra (Art. 74):</w:t>
+      </w:r>
+      <w:r>
+        <w:t xml:space="preserve"> </w:t>
+      </w:r>
+      <w:r>
+        <w:t xml:space="preserve">Que comprenden la memoria de actividades, el plan de avance pedagógico, la opinión fundada de la Dirección del Departamento y los resultados de las encuestas estudiantiles obligatorias.</w:t>
+      </w:r>
+    </w:p>
+    <w:p>
+      <w:pPr>
+        <w:pStyle w:val="Compact"/>
+        <w:numPr>
+          <w:ilvl w:val="1"/>
+          <w:numId w:val="1024"/>
+        </w:numPr>
+      </w:pPr>
+      <w:r>
+        <w:rPr>
+          <w:i/>
+          <w:iCs/>
+        </w:rPr>
+        <w:t xml:space="preserve">Evaluaciones Periódicas Cuatrienales de Permanencia (Art. 75):</w:t>
+      </w:r>
+      <w:r>
+        <w:t xml:space="preserve"> </w:t>
+      </w:r>
+      <w:r>
+        <w:t xml:space="preserve">Llevadas a cabo por tribunales integrados por dos evaluadores externos de la disciplina y un veedor con voz y voto del claustro estudiantil (inc. a). Asimismo, el Art. 76 instituye la obligación departamental de formular programas anuales de formación y perfeccionamiento de recursos humanos docentes.</w:t>
+      </w:r>
+    </w:p>
+    <w:p>
+      <w:pPr>
+        <w:pStyle w:val="Compact"/>
+        <w:numPr>
+          <w:ilvl w:val="0"/>
+          <w:numId w:val="1023"/>
+        </w:numPr>
+      </w:pPr>
+      <w:r>
+        <w:rPr>
+          <w:b/>
+          <w:bCs/>
+        </w:rPr>
+        <w:t xml:space="preserve">Régimen General de Carrera Docente de la UNCo (Ordenanza CS N° 0910/1997 y modificatorias hasta la Ord. CS N° 0887/2021):</w:t>
+      </w:r>
+      <w:r>
+        <w:t xml:space="preserve"> </w:t>
+      </w:r>
+      <w:r>
+        <w:t xml:space="preserve">En el Digesto oficial de la universidad, el Reglamento de Carrera Docente</w:t>
+      </w:r>
+      <w:r>
+        <w:t xml:space="preserve"> </w:t>
+      </w:r>
+      <w:r>
+        <w:t xml:space="preserve">(Universidad Nacional del Comahue, 1997)</w:t>
+      </w:r>
+      <w:r>
+        <w:t xml:space="preserve"> </w:t>
+      </w:r>
+      <w:r>
+        <w:t xml:space="preserve">norma en su Capítulo III el procedimiento operativo para la presentación y valoración de informes docentes, encuestas estudiantiles y criterios de permanencia, en plena armonización con el Convenio Colectivo de Trabajo Docente Universitario (Decreto PEN N° 1246/2015)</w:t>
+      </w:r>
+      <w:r>
+        <w:t xml:space="preserve"> </w:t>
+      </w:r>
+      <w:r>
+        <w:t xml:space="preserve">(Decreto N° 1246/2015. Convenio Colectivo de Trabajo para los Docentes de las Instituciones Universitarias Nacionales, 2015)</w:t>
+      </w:r>
+      <w:r>
+        <w:t xml:space="preserve">. Los registros institucionales muestran que, si bien estos instrumentos garantizan con solidez jurídica el control administrativo y sumativo de la estabilidad laboral, se advierte entre los actores institucionales una demanda no resuelta y un área de vacancia analítica respecto al desarrollo de circuitos sistemáticos de retroalimentación formativa y confidencial que orienten la mejora continua del ejercicio docente.</w:t>
+      </w:r>
+    </w:p>
+    <w:p>
+      <w:pPr>
+        <w:pStyle w:val="Compact"/>
+        <w:numPr>
+          <w:ilvl w:val="0"/>
+          <w:numId w:val="1023"/>
+        </w:numPr>
+      </w:pPr>
+      <w:r>
+        <w:rPr>
+          <w:b/>
+          <w:bCs/>
+        </w:rPr>
+        <w:t xml:space="preserve">Expansión Territorial y Docencia Híbrida en la Red de Nodos del CURZAS (Resolución CD-CURZA N° 196/2022 y SIED UNCo):</w:t>
+      </w:r>
+      <w:r>
+        <w:t xml:space="preserve"> </w:t>
+      </w:r>
+      <w:r>
+        <w:t xml:space="preserve">En la escala regional de Río Negro, el Departamento de Administración Pública ha expandido su oferta académica mediante la Red de Nodos Universitarios en localidades de la Línea Sur y la Costa Atlántica rionegrina (Sierra Grande, Valcheta, Los Menucos y Ramos Mexía)</w:t>
+      </w:r>
+      <w:r>
+        <w:t xml:space="preserve"> </w:t>
+      </w:r>
+      <w:r>
+        <w:t xml:space="preserve">(Consejo Directivo del CURZAS, 2022, 2023)</w:t>
+      </w:r>
+      <w:r>
+        <w:t xml:space="preserve">. Esta configuración territorial se encuentra respaldada por la Resolución CD-CURZA N° 196/2022, que valida normativamente las mediaciones tecnológicas, la presencialidad sincrónica remota y las modalidades de enseñanza híbridas, articuladas con las directrices del Sistema Institucional de Educación a Distancia (SIED UNCo). Dicho escenario impone a los equipos de cátedra competencias didácticas específicas (tutoría virtual, diseño de materiales asincrónicos y acompañamiento mediado por TIC) que actualmente no son ponderadas de forma formativa ni multidireccional por los instrumentos de evaluación tradicionales, planteando la conveniencia de indagar la pertinencia y factibilidad de un modelo 360° adaptado a las singularidades de dichos entornos híbridos.</w:t>
+      </w:r>
+    </w:p>
+    <w:bookmarkEnd w:id="54"/>
+    <w:bookmarkStart w:id="55" w:name="Xdd2f1928b167b346feb3db91e0e80e813fe5a54"/>
+    <w:p>
+      <w:pPr>
+        <w:pStyle w:val="Heading3"/>
+        <w:keepNext/>
+        <w:spacing w:before="160" w:after="40" w:line="300" w:lineRule="auto"/>
+      </w:pPr>
+      <w:r>
+        <w:rPr>
+          <w:rFonts w:ascii="Arial" w:hAnsi="Arial"/>
+          <w:b/>
+          <w:i/>
+          <w:sz w:val="24"/>
+        </w:rPr>
         <w:t xml:space="preserve">Síntesis Integradora y Vacancia de la Investigación</w:t>
       </w:r>
     </w:p>
@@ -6282,10 +6728,10 @@
         <w:br w:type="page"/>
       </w:r>
     </w:p>
-    <w:bookmarkEnd w:id="54"/>
     <w:bookmarkEnd w:id="55"/>
     <w:bookmarkEnd w:id="56"/>
-    <w:bookmarkStart w:id="95" w:name="referencias-bibliográficas"/>
+    <w:bookmarkEnd w:id="57"/>
+    <w:bookmarkStart w:id="96" w:name="referencias-bibliográficas"/>
     <w:p>
       <w:pPr>
         <w:pStyle w:val="Heading1"/>
@@ -6302,8 +6748,8 @@
         <w:t xml:space="preserve">Referencias Bibliográficas</w:t>
       </w:r>
     </w:p>
-    <w:bookmarkStart w:id="94" w:name="refs"/>
-    <w:bookmarkStart w:id="57" w:name="ref-aguilar2006"/>
+    <w:bookmarkStart w:id="95" w:name="refs"/>
+    <w:bookmarkStart w:id="58" w:name="ref-aguilar2006"/>
     <w:p>
       <w:pPr>
         <w:pStyle w:val="Bibliography"/>
@@ -6328,8 +6774,8 @@
         <w:t xml:space="preserve">. Fondo de Cultura Económica.</w:t>
       </w:r>
     </w:p>
-    <w:bookmarkEnd w:id="57"/>
-    <w:bookmarkStart w:id="59" w:name="ref-alvarado2019"/>
+    <w:bookmarkEnd w:id="58"/>
+    <w:bookmarkStart w:id="60" w:name="ref-alvarado2019"/>
     <w:p>
       <w:pPr>
         <w:pStyle w:val="Bibliography"/>
@@ -6356,7 +6802,7 @@
       <w:r>
         <w:t xml:space="preserve"> </w:t>
       </w:r>
-      <w:hyperlink r:id="rId58">
+      <w:hyperlink r:id="rId59">
         <w:r>
           <w:rPr>
             <w:rStyle w:val="Hyperlink"/>
@@ -6365,8 +6811,8 @@
         </w:r>
       </w:hyperlink>
     </w:p>
-    <w:bookmarkEnd w:id="59"/>
-    <w:bookmarkStart w:id="60" w:name="ref-brunner2011"/>
+    <w:bookmarkEnd w:id="60"/>
+    <w:bookmarkStart w:id="61" w:name="ref-brunner2011"/>
     <w:p>
       <w:pPr>
         <w:pStyle w:val="Bibliography"/>
@@ -6391,8 +6837,8 @@
         <w:t xml:space="preserve">, (355), 137-159.</w:t>
       </w:r>
     </w:p>
-    <w:bookmarkEnd w:id="60"/>
-    <w:bookmarkStart w:id="61" w:name="ref-cao2021"/>
+    <w:bookmarkEnd w:id="61"/>
+    <w:bookmarkStart w:id="62" w:name="ref-cao2021"/>
     <w:p>
       <w:pPr>
         <w:pStyle w:val="Bibliography"/>
@@ -6417,8 +6863,8 @@
         <w:t xml:space="preserve">. Instituto Nacional de la Administración Pública (INAP).</w:t>
       </w:r>
     </w:p>
-    <w:bookmarkEnd w:id="61"/>
-    <w:bookmarkStart w:id="63" w:name="ref-cao2023"/>
+    <w:bookmarkEnd w:id="62"/>
+    <w:bookmarkStart w:id="64" w:name="ref-cao2023"/>
     <w:p>
       <w:pPr>
         <w:pStyle w:val="Bibliography"/>
@@ -6458,7 +6904,7 @@
       <w:r>
         <w:t xml:space="preserve"> </w:t>
       </w:r>
-      <w:hyperlink r:id="rId62">
+      <w:hyperlink r:id="rId63">
         <w:r>
           <w:rPr>
             <w:rStyle w:val="Hyperlink"/>
@@ -6467,8 +6913,8 @@
         </w:r>
       </w:hyperlink>
     </w:p>
-    <w:bookmarkEnd w:id="63"/>
-    <w:bookmarkStart w:id="64" w:name="ref-chiavenato2020"/>
+    <w:bookmarkEnd w:id="64"/>
+    <w:bookmarkStart w:id="65" w:name="ref-chiavenato2020"/>
     <w:p>
       <w:pPr>
         <w:pStyle w:val="Bibliography"/>
@@ -6496,8 +6942,8 @@
         <w:t xml:space="preserve">(5.ª ed.). McGraw-Hill Interamericana.</w:t>
       </w:r>
     </w:p>
-    <w:bookmarkEnd w:id="64"/>
-    <w:bookmarkStart w:id="66" w:name="ref-curza2022"/>
+    <w:bookmarkEnd w:id="65"/>
+    <w:bookmarkStart w:id="67" w:name="ref-curza2022"/>
     <w:p>
       <w:pPr>
         <w:pStyle w:val="Bibliography"/>
@@ -6524,7 +6970,7 @@
       <w:r>
         <w:t xml:space="preserve"> </w:t>
       </w:r>
-      <w:hyperlink r:id="rId65">
+      <w:hyperlink r:id="rId66">
         <w:r>
           <w:rPr>
             <w:rStyle w:val="Hyperlink"/>
@@ -6533,8 +6979,8 @@
         </w:r>
       </w:hyperlink>
     </w:p>
-    <w:bookmarkEnd w:id="66"/>
-    <w:bookmarkStart w:id="67" w:name="ref-uncocurzas2023"/>
+    <w:bookmarkEnd w:id="67"/>
+    <w:bookmarkStart w:id="68" w:name="ref-uncocurzas2023"/>
     <w:p>
       <w:pPr>
         <w:pStyle w:val="Bibliography"/>
@@ -6559,8 +7005,8 @@
         <w:t xml:space="preserve">. Universidad Nacional del Comahue.</w:t>
       </w:r>
     </w:p>
-    <w:bookmarkEnd w:id="67"/>
-    <w:bookmarkStart w:id="69" w:name="ref-delagarza2001"/>
+    <w:bookmarkEnd w:id="68"/>
+    <w:bookmarkStart w:id="70" w:name="ref-delagarza2001"/>
     <w:p>
       <w:pPr>
         <w:pStyle w:val="Bibliography"/>
@@ -6600,7 +7046,7 @@
       <w:r>
         <w:t xml:space="preserve"> </w:t>
       </w:r>
-      <w:hyperlink r:id="rId68">
+      <w:hyperlink r:id="rId69">
         <w:r>
           <w:rPr>
             <w:rStyle w:val="Hyperlink"/>
@@ -6609,8 +7055,8 @@
         </w:r>
       </w:hyperlink>
     </w:p>
-    <w:bookmarkEnd w:id="69"/>
-    <w:bookmarkStart w:id="70" w:name="ref-pen2015"/>
+    <w:bookmarkEnd w:id="70"/>
+    <w:bookmarkStart w:id="71" w:name="ref-pen2015"/>
     <w:p>
       <w:pPr>
         <w:pStyle w:val="Bibliography"/>
@@ -6622,8 +7068,8 @@
         <w:t xml:space="preserve">Decreto N° 1246/2015. Convenio Colectivo de Trabajo para los Docentes de las Instituciones Universitarias Nacionales (2015).</w:t>
       </w:r>
     </w:p>
-    <w:bookmarkEnd w:id="70"/>
-    <w:bookmarkStart w:id="71" w:name="ref-jimenez2008"/>
+    <w:bookmarkEnd w:id="71"/>
+    <w:bookmarkStart w:id="72" w:name="ref-jimenez2008"/>
     <w:p>
       <w:pPr>
         <w:pStyle w:val="Bibliography"/>
@@ -6651,8 +7097,8 @@
         <w:t xml:space="preserve">(pp. 27-42). Universidad Pedagógica Nacional / CLACSO.</w:t>
       </w:r>
     </w:p>
-    <w:bookmarkEnd w:id="71"/>
-    <w:bookmarkStart w:id="72" w:name="ref-krotsch2001"/>
+    <w:bookmarkEnd w:id="72"/>
+    <w:bookmarkStart w:id="73" w:name="ref-krotsch2001"/>
     <w:p>
       <w:pPr>
         <w:pStyle w:val="Bibliography"/>
@@ -6677,8 +7123,8 @@
         <w:t xml:space="preserve">. Universidad Nacional de Quilmes.</w:t>
       </w:r>
     </w:p>
-    <w:bookmarkEnd w:id="72"/>
-    <w:bookmarkStart w:id="73" w:name="ref-lepsinger2009"/>
+    <w:bookmarkEnd w:id="73"/>
+    <w:bookmarkStart w:id="74" w:name="ref-lepsinger2009"/>
     <w:p>
       <w:pPr>
         <w:pStyle w:val="Bibliography"/>
@@ -6706,8 +7152,8 @@
         <w:t xml:space="preserve">(2.ª ed.). Pfeiffer.</w:t>
       </w:r>
     </w:p>
-    <w:bookmarkEnd w:id="73"/>
-    <w:bookmarkStart w:id="74" w:name="ref-ministerio1995"/>
+    <w:bookmarkEnd w:id="74"/>
+    <w:bookmarkStart w:id="75" w:name="ref-ministerio1995"/>
     <w:p>
       <w:pPr>
         <w:pStyle w:val="Bibliography"/>
@@ -6719,8 +7165,8 @@
         <w:t xml:space="preserve">Ley N° 24.521 de Educación Superior (1995).</w:t>
       </w:r>
     </w:p>
-    <w:bookmarkEnd w:id="74"/>
-    <w:bookmarkStart w:id="75" w:name="ref-longo2006"/>
+    <w:bookmarkEnd w:id="75"/>
+    <w:bookmarkStart w:id="76" w:name="ref-longo2006"/>
     <w:p>
       <w:pPr>
         <w:pStyle w:val="Bibliography"/>
@@ -6745,8 +7191,8 @@
         <w:t xml:space="preserve">. Paidós.</w:t>
       </w:r>
     </w:p>
-    <w:bookmarkEnd w:id="75"/>
-    <w:bookmarkStart w:id="76" w:name="ref-marquina2012"/>
+    <w:bookmarkEnd w:id="76"/>
+    <w:bookmarkStart w:id="77" w:name="ref-marquina2012"/>
     <w:p>
       <w:pPr>
         <w:pStyle w:val="Bibliography"/>
@@ -6784,8 +7230,8 @@
         <w:t xml:space="preserve">(15), 35-48.</w:t>
       </w:r>
     </w:p>
-    <w:bookmarkEnd w:id="76"/>
-    <w:bookmarkStart w:id="77" w:name="ref-matus1993"/>
+    <w:bookmarkEnd w:id="77"/>
+    <w:bookmarkStart w:id="78" w:name="ref-matus1993"/>
     <w:p>
       <w:pPr>
         <w:pStyle w:val="Bibliography"/>
@@ -6810,8 +7256,8 @@
         <w:t xml:space="preserve">. Fundación ALTIDIR.</w:t>
       </w:r>
     </w:p>
-    <w:bookmarkEnd w:id="77"/>
-    <w:bookmarkStart w:id="79" w:name="ref-obando2014"/>
+    <w:bookmarkEnd w:id="78"/>
+    <w:bookmarkStart w:id="80" w:name="ref-obando2014"/>
     <w:p>
       <w:pPr>
         <w:pStyle w:val="Bibliography"/>
@@ -6851,7 +7297,7 @@
       <w:r>
         <w:t xml:space="preserve"> </w:t>
       </w:r>
-      <w:hyperlink r:id="rId78">
+      <w:hyperlink r:id="rId79">
         <w:r>
           <w:rPr>
             <w:rStyle w:val="Hyperlink"/>
@@ -6860,8 +7306,8 @@
         </w:r>
       </w:hyperlink>
     </w:p>
-    <w:bookmarkEnd w:id="79"/>
-    <w:bookmarkStart w:id="80" w:name="ref-oszlak2020"/>
+    <w:bookmarkEnd w:id="80"/>
+    <w:bookmarkStart w:id="81" w:name="ref-oszlak2020"/>
     <w:p>
       <w:pPr>
         <w:pStyle w:val="Bibliography"/>
@@ -6886,8 +7332,8 @@
         <w:t xml:space="preserve">. Instituto Nacional de la Administración Pública.</w:t>
       </w:r>
     </w:p>
-    <w:bookmarkEnd w:id="80"/>
-    <w:bookmarkStart w:id="81" w:name="ref-perez2021"/>
+    <w:bookmarkEnd w:id="81"/>
+    <w:bookmarkStart w:id="82" w:name="ref-perez2021"/>
     <w:p>
       <w:pPr>
         <w:pStyle w:val="Bibliography"/>
@@ -6925,8 +7371,8 @@
         <w:t xml:space="preserve">(26), 45-58.</w:t>
       </w:r>
     </w:p>
-    <w:bookmarkEnd w:id="81"/>
-    <w:bookmarkStart w:id="83" w:name="ref-reyes2020"/>
+    <w:bookmarkEnd w:id="82"/>
+    <w:bookmarkStart w:id="84" w:name="ref-reyes2020"/>
     <w:p>
       <w:pPr>
         <w:pStyle w:val="Bibliography"/>
@@ -6966,7 +7412,7 @@
       <w:r>
         <w:t xml:space="preserve"> </w:t>
       </w:r>
-      <w:hyperlink r:id="rId82">
+      <w:hyperlink r:id="rId83">
         <w:r>
           <w:rPr>
             <w:rStyle w:val="Hyperlink"/>
@@ -6975,8 +7421,8 @@
         </w:r>
       </w:hyperlink>
     </w:p>
-    <w:bookmarkEnd w:id="83"/>
-    <w:bookmarkStart w:id="84" w:name="ref-sautu2005"/>
+    <w:bookmarkEnd w:id="84"/>
+    <w:bookmarkStart w:id="85" w:name="ref-sautu2005"/>
     <w:p>
       <w:pPr>
         <w:pStyle w:val="Bibliography"/>
@@ -7001,8 +7447,8 @@
         <w:t xml:space="preserve">. Lumiere.</w:t>
       </w:r>
     </w:p>
-    <w:bookmarkEnd w:id="84"/>
-    <w:bookmarkStart w:id="86" w:name="ref-sifuentes2016"/>
+    <w:bookmarkEnd w:id="85"/>
+    <w:bookmarkStart w:id="87" w:name="ref-sifuentes2016"/>
     <w:p>
       <w:pPr>
         <w:pStyle w:val="Bibliography"/>
@@ -7042,7 +7488,7 @@
       <w:r>
         <w:t xml:space="preserve"> </w:t>
       </w:r>
-      <w:hyperlink r:id="rId85">
+      <w:hyperlink r:id="rId86">
         <w:r>
           <w:rPr>
             <w:rStyle w:val="Hyperlink"/>
@@ -7051,8 +7497,8 @@
         </w:r>
       </w:hyperlink>
     </w:p>
-    <w:bookmarkEnd w:id="86"/>
-    <w:bookmarkStart w:id="88" w:name="ref-torraco2016"/>
+    <w:bookmarkEnd w:id="87"/>
+    <w:bookmarkStart w:id="89" w:name="ref-torraco2016"/>
     <w:p>
       <w:pPr>
         <w:pStyle w:val="Bibliography"/>
@@ -7092,7 +7538,7 @@
       <w:r>
         <w:t xml:space="preserve"> </w:t>
       </w:r>
-      <w:hyperlink r:id="rId87">
+      <w:hyperlink r:id="rId88">
         <w:r>
           <w:rPr>
             <w:rStyle w:val="Hyperlink"/>
@@ -7101,8 +7547,8 @@
         </w:r>
       </w:hyperlink>
     </w:p>
-    <w:bookmarkEnd w:id="88"/>
-    <w:bookmarkStart w:id="90" w:name="ref-unco1997"/>
+    <w:bookmarkEnd w:id="89"/>
+    <w:bookmarkStart w:id="91" w:name="ref-unco1997"/>
     <w:p>
       <w:pPr>
         <w:pStyle w:val="Bibliography"/>
@@ -7129,7 +7575,7 @@
       <w:r>
         <w:t xml:space="preserve"> </w:t>
       </w:r>
-      <w:hyperlink r:id="rId89">
+      <w:hyperlink r:id="rId90">
         <w:r>
           <w:rPr>
             <w:rStyle w:val="Hyperlink"/>
@@ -7138,8 +7584,8 @@
         </w:r>
       </w:hyperlink>
     </w:p>
-    <w:bookmarkEnd w:id="90"/>
-    <w:bookmarkStart w:id="92" w:name="ref-unco2025"/>
+    <w:bookmarkEnd w:id="91"/>
+    <w:bookmarkStart w:id="93" w:name="ref-unco2025"/>
     <w:p>
       <w:pPr>
         <w:pStyle w:val="Bibliography"/>
@@ -7166,7 +7612,7 @@
       <w:r>
         <w:t xml:space="preserve"> </w:t>
       </w:r>
-      <w:hyperlink r:id="rId91">
+      <w:hyperlink r:id="rId92">
         <w:r>
           <w:rPr>
             <w:rStyle w:val="Hyperlink"/>
@@ -7175,8 +7621,8 @@
         </w:r>
       </w:hyperlink>
     </w:p>
-    <w:bookmarkEnd w:id="92"/>
-    <w:bookmarkStart w:id="93" w:name="ref-wainerman2011"/>
+    <w:bookmarkEnd w:id="93"/>
+    <w:bookmarkStart w:id="94" w:name="ref-wainerman2011"/>
     <w:p>
       <w:pPr>
         <w:pStyle w:val="Bibliography"/>
@@ -7204,9 +7650,9 @@
         <w:t xml:space="preserve">(4.ª ed.). Manantial.</w:t>
       </w:r>
     </w:p>
-    <w:bookmarkEnd w:id="93"/>
     <w:bookmarkEnd w:id="94"/>
     <w:bookmarkEnd w:id="95"/>
+    <w:bookmarkEnd w:id="96"/>
     <w:sectPr>
       <w:footerReference w:type="default" r:id="rId11"/>
       <w:footnotePr>
@@ -7874,7 +8320,34 @@
     </w:lvlOverride>
   </w:num>
   <w:num w:numId="1019">
-    <w:abstractNumId w:val="991"/>
+    <w:abstractNumId w:val="99411"/>
+    <w:lvlOverride w:ilvl="0">
+      <w:startOverride w:val="1"/>
+    </w:lvlOverride>
+    <w:lvlOverride w:ilvl="1">
+      <w:startOverride w:val="1"/>
+    </w:lvlOverride>
+    <w:lvlOverride w:ilvl="2">
+      <w:startOverride w:val="1"/>
+    </w:lvlOverride>
+    <w:lvlOverride w:ilvl="3">
+      <w:startOverride w:val="1"/>
+    </w:lvlOverride>
+    <w:lvlOverride w:ilvl="4">
+      <w:startOverride w:val="1"/>
+    </w:lvlOverride>
+    <w:lvlOverride w:ilvl="5">
+      <w:startOverride w:val="1"/>
+    </w:lvlOverride>
+    <w:lvlOverride w:ilvl="6">
+      <w:startOverride w:val="1"/>
+    </w:lvlOverride>
+    <w:lvlOverride w:ilvl="7">
+      <w:startOverride w:val="1"/>
+    </w:lvlOverride>
+    <w:lvlOverride w:ilvl="8">
+      <w:startOverride w:val="1"/>
+    </w:lvlOverride>
   </w:num>
   <w:num w:numId="1020">
     <w:abstractNumId w:val="991"/>
@@ -7883,6 +8356,12 @@
     <w:abstractNumId w:val="991"/>
   </w:num>
   <w:num w:numId="1022">
+    <w:abstractNumId w:val="991"/>
+  </w:num>
+  <w:num w:numId="1023">
+    <w:abstractNumId w:val="991"/>
+  </w:num>
+  <w:num w:numId="1024">
     <w:abstractNumId w:val="99411"/>
     <w:lvlOverride w:ilvl="0">
       <w:startOverride w:val="1"/>

</xml_diff>

<commit_message>
docs: add theoretical framework and background for TFG research project
</commit_message>
<xml_diff>
--- a/Entregas/Actividad 3/TP3_Ayarachi_Fuentes.docx
+++ b/Entregas/Actividad 3/TP3_Ayarachi_Fuentes.docx
@@ -1176,7 +1176,7 @@
           <w:rFonts w:ascii="Arial" w:hAnsi="Arial"/>
           <w:sz w:val="22"/>
         </w:rPr>
-        <w:t>23</w:t>
+        <w:t>24</w:t>
       </w:r>
     </w:p>
     <w:p>
@@ -1230,7 +1230,7 @@
           <w:rFonts w:ascii="Arial" w:hAnsi="Arial"/>
           <w:sz w:val="22"/>
         </w:rPr>
-        <w:t>25</w:t>
+        <w:t>26</w:t>
       </w:r>
     </w:p>
     <w:p>
@@ -5403,7 +5403,7 @@
           <w:i/>
           <w:iCs/>
         </w:rPr>
-        <w:t xml:space="preserve">actores y sujetos institucionales</w:t>
+        <w:t xml:space="preserve">sujetos y colectivos situados</w:t>
       </w:r>
       <w:r>
         <w:rPr>
@@ -5416,101 +5416,7 @@
         <w:t xml:space="preserve"> </w:t>
       </w:r>
       <w:r>
-        <w:t xml:space="preserve">Comprende a los</w:t>
-      </w:r>
-      <w:r>
-        <w:t xml:space="preserve"> </w:t>
-      </w:r>
-      <w:r>
-        <w:rPr>
-          <w:i/>
-          <w:iCs/>
-        </w:rPr>
-        <w:t xml:space="preserve">actores institucionales</w:t>
-      </w:r>
-      <w:r>
-        <w:t xml:space="preserve">,</w:t>
-      </w:r>
-      <w:r>
-        <w:t xml:space="preserve"> </w:t>
-      </w:r>
-      <w:r>
-        <w:rPr>
-          <w:i/>
-          <w:iCs/>
-        </w:rPr>
-        <w:t xml:space="preserve">colectivos universitarios</w:t>
-      </w:r>
-      <w:r>
-        <w:t xml:space="preserve">,</w:t>
-      </w:r>
-      <w:r>
-        <w:t xml:space="preserve"> </w:t>
-      </w:r>
-      <w:r>
-        <w:rPr>
-          <w:i/>
-          <w:iCs/>
-        </w:rPr>
-        <w:t xml:space="preserve">participantes</w:t>
-      </w:r>
-      <w:r>
-        <w:t xml:space="preserve">,</w:t>
-      </w:r>
-      <w:r>
-        <w:t xml:space="preserve"> </w:t>
-      </w:r>
-      <w:r>
-        <w:rPr>
-          <w:i/>
-          <w:iCs/>
-        </w:rPr>
-        <w:t xml:space="preserve">pares docentes</w:t>
-      </w:r>
-      <w:r>
-        <w:t xml:space="preserve">,</w:t>
-      </w:r>
-      <w:r>
-        <w:t xml:space="preserve"> </w:t>
-      </w:r>
-      <w:r>
-        <w:rPr>
-          <w:i/>
-          <w:iCs/>
-        </w:rPr>
-        <w:t xml:space="preserve">estudiantes</w:t>
-      </w:r>
-      <w:r>
-        <w:t xml:space="preserve">,</w:t>
-      </w:r>
-      <w:r>
-        <w:t xml:space="preserve"> </w:t>
-      </w:r>
-      <w:r>
-        <w:rPr>
-          <w:i/>
-          <w:iCs/>
-        </w:rPr>
-        <w:t xml:space="preserve">autoridades académicas</w:t>
-      </w:r>
-      <w:r>
-        <w:t xml:space="preserve"> </w:t>
-      </w:r>
-      <w:r>
-        <w:t xml:space="preserve">y</w:t>
-      </w:r>
-      <w:r>
-        <w:t xml:space="preserve"> </w:t>
-      </w:r>
-      <w:r>
-        <w:rPr>
-          <w:i/>
-          <w:iCs/>
-        </w:rPr>
-        <w:t xml:space="preserve">representantes gremiales</w:t>
-      </w:r>
-      <w:r>
-        <w:t xml:space="preserve">. Esta categoría analítica permite captar las prácticas concretas, las representaciones subjetivas, el clima relacional, la confianza intersubjetiva y las disposiciones cotidianas frente al trabajo pedagógico.</w:t>
+        <w:t xml:space="preserve">Permite superar la abstracción formal de los estamentos jurídicos para captar las prácticas pedagógicas concretas, las representaciones subjetivas, el clima relacional, la confianza intersubjetiva y las disposiciones cotidianas frente al trabajo académico y formativo.</w:t>
       </w:r>
     </w:p>
     <w:p>
@@ -5945,7 +5851,7 @@
         <w:t xml:space="preserve"> </w:t>
       </w:r>
       <w:r>
-        <w:t xml:space="preserve">Variables de usabilidad en SIU-Guaraní/Moodle, protección algorítmica del anonimato y mitigación de fatiga evaluativa.</w:t>
+        <w:t xml:space="preserve">Variables de usabilidad y parametrización en plataformas institucionales (SIU-Guaraní y Moodle), recolección digital mediante formularios seguros, protección algorítmica del anonimato y mitigación de fatiga evaluativa.</w:t>
       </w:r>
     </w:p>
     <w:p>
@@ -5967,7 +5873,7 @@
         <w:t xml:space="preserve"> </w:t>
       </w:r>
       <w:r>
-        <w:t xml:space="preserve">Variables de capacidad de gestión departamental, circuitos de devolución oportuna y articulación con planes de formación.</w:t>
+        <w:t xml:space="preserve">Variables de capacidad de gestión departamental, circuitos de devolución oportuna, implementación técnica de la matriz de agregación temática desvinculada de sumatividad y articulación con planes de formación docente continua (Art. 76).</w:t>
       </w:r>
     </w:p>
     <w:p>
@@ -7800,7 +7706,16 @@
         <w:t xml:space="preserve"> </w:t>
       </w:r>
       <w:r>
-        <w:t xml:space="preserve">La articulación entre el diagnóstico 360° y el Programa Anual de Formación (Art. 76) opera mediante una matriz de agregación temática departamental: las devoluciones individuales son de acceso confidencial exclusivo del profesorado evaluado, mientras que el Departamento recibe únicamente patrones agregados y anonimizados de demandas didácticas para planificar las capacitaciones (Longo, 2006).</w:t>
+        <w:t xml:space="preserve">En el plano técnico-metodológico, la articulación entre el diagnóstico formativo 360° y el Programa Anual de Formación (Art. 76) opera mediante una matriz digital de agregación temática implementada en un entorno estructurado de planilla de cálculo automatizada (o script de procesamiento de datos en el campus virtual Moodle/SIU). Este dispositivo procesa las respuestas cuantitativas y las demandas formativas cualitativas agrupándolas en ejes temáticos transversales (estrategias pedagógicas híbridas, evaluación de aprendizajes, uso de tecnologías en Nodos territoriales, dinámicas de tutoría). La matriz disocia de forma irreversible la identidad del docente evaluado —consolidando las frecuencias a nivel de área disciplinar o departamental global para impedir la trazabilidad individual incluso en asignaturas unipersonales—, garantizando que el Departamento de Administración Pública reciba exclusivamente patrones globales anonimizados de necesidades pedagógicas para planificar las capacitaciones institucionales, mientras que cada profesor/a accede en forma privada y confidencial a su propio reporte de retroalimentación reflexiva</w:t>
+      </w:r>
+      <w:r>
+        <w:t xml:space="preserve"> </w:t>
+      </w:r>
+      <w:r>
+        <w:t xml:space="preserve">(Longo, 2006)</w:t>
+      </w:r>
+      <w:r>
+        <w:t xml:space="preserve">.</w:t>
       </w:r>
     </w:p>
   </w:footnote>

</xml_diff>

<commit_message>
feat: add project research structure and bibliography for TP3 on teacher performance evaluation
</commit_message>
<xml_diff>
--- a/Entregas/Actividad 3/TP3_Ayarachi_Fuentes.docx
+++ b/Entregas/Actividad 3/TP3_Ayarachi_Fuentes.docx
@@ -1004,7 +1004,7 @@
           <w:rFonts w:ascii="Arial" w:hAnsi="Arial"/>
           <w:sz w:val="22"/>
         </w:rPr>
-        <w:t>La Poligobernanza Universitaria como Categoría Analítica de Elaboración Propia</w:t>
+        <w:t>Gobernanza Universitaria Multinivel y Niveles de Análisis: Operacionalización Analítica Propia</w:t>
       </w:r>
       <w:r>
         <w:tab/>
@@ -4670,13 +4670,13 @@
       </w:r>
     </w:p>
     <w:bookmarkEnd w:id="42"/>
-    <w:bookmarkStart w:id="43" w:name="X5eba19cee255a248a999c8a85ecb0baa9dac5e4"/>
+    <w:bookmarkStart w:id="43" w:name="Xa1df05e4217ed58886fc9776ef1479ed1dc3b29"/>
     <w:p>
       <w:pPr>
         <w:pStyle w:val="Heading4"/>
       </w:pPr>
       <w:r>
-        <w:t xml:space="preserve">La Poligobernanza Universitaria como Categoría Analítica de Elaboración Propia</w:t>
+        <w:t xml:space="preserve">Gobernanza Universitaria Multinivel y Niveles de Análisis: Operacionalización Analítica Propia</w:t>
       </w:r>
     </w:p>
     <w:p>
@@ -4705,7 +4705,70 @@
         <w:t xml:space="preserve">Cao &amp; Blutman (2023)</w:t>
       </w:r>
       <w:r>
-        <w:t xml:space="preserve">, en esta investigación se define a la</w:t>
+        <w:t xml:space="preserve">, resulta indispensable formular una precisión metodológica: la distinción entre niveles de agregación analítica no constituye una tipología taxativa de Cao y Blutman, dado que en sus obras sobre el sector público analizan los ámbitos jurisdiccionales del federalismo argentino</w:t>
+      </w:r>
+      <w:r>
+        <w:t xml:space="preserve"> </w:t>
+      </w:r>
+      <w:r>
+        <w:t xml:space="preserve">(Cao et al., 2007)</w:t>
+      </w:r>
+      <w:r>
+        <w:t xml:space="preserve">, sino que proviene de la sociología organizacional y de las matrices del Estado sistematizadas por Oscar</w:t>
+      </w:r>
+      <w:r>
+        <w:t xml:space="preserve"> </w:t>
+      </w:r>
+      <w:r>
+        <w:t xml:space="preserve">Oszlak (2011)</w:t>
+      </w:r>
+      <w:r>
+        <w:t xml:space="preserve"> </w:t>
+      </w:r>
+      <w:r>
+        <w:t xml:space="preserve">(Nivel Macro: relación Estado-sociedad y régimen general; Nivel Meso: organizaciones intermedias y estructuras de gestión; Nivel Micro: interacción cotidiana del agente estatal en la ventanilla y en el puesto de trabajo), en diálogo con la literatura de gobernanza universitaria multinivel</w:t>
+      </w:r>
+      <w:r>
+        <w:t xml:space="preserve"> </w:t>
+      </w:r>
+      <w:r>
+        <w:t xml:space="preserve">(Brunner, 2011; Krotsch, 2001; Marquina, 2012)</w:t>
+      </w:r>
+      <w:r>
+        <w:t xml:space="preserve">.</w:t>
+      </w:r>
+    </w:p>
+    <w:p>
+      <w:pPr>
+        <w:pStyle w:val="BodyText"/>
+      </w:pPr>
+      <w:r>
+        <w:t xml:space="preserve">Asimismo, la inclusión del plano sociolaboral colectivo responde al subsistema de</w:t>
+      </w:r>
+      <w:r>
+        <w:t xml:space="preserve"> </w:t>
+      </w:r>
+      <w:r>
+        <w:rPr>
+          <w:i/>
+          <w:iCs/>
+        </w:rPr>
+        <w:t xml:space="preserve">gestión de las relaciones humanas y sociales</w:t>
+      </w:r>
+      <w:r>
+        <w:t xml:space="preserve"> </w:t>
+      </w:r>
+      <w:r>
+        <w:t xml:space="preserve">de Francisco</w:t>
+      </w:r>
+      <w:r>
+        <w:t xml:space="preserve"> </w:t>
+      </w:r>
+      <w:r>
+        <w:t xml:space="preserve">Longo (2006)</w:t>
+      </w:r>
+      <w:r>
+        <w:t xml:space="preserve">, donde el interlocutor de la dirección deja de ser el empleado individual (micro) para pasar a ser el colectivo del personal y sus representaciones sindicales. A partir de estas fuentes doctrinarias, en esta investigación se define a la</w:t>
       </w:r>
       <w:r>
         <w:t xml:space="preserve"> </w:t>
@@ -4715,90 +4778,10 @@
           <w:b/>
           <w:bCs/>
         </w:rPr>
-        <w:t xml:space="preserve">poligobernanza institucional universitaria como una categoría analítica de elaboración propia</w:t>
-      </w:r>
-      <w:r>
-        <w:t xml:space="preserve">, formulada para interpretar las complejidades organizacionales de la educación superior en diálogo sistemático con la literatura especializada sobre</w:t>
-      </w:r>
-      <w:r>
-        <w:t xml:space="preserve"> </w:t>
-      </w:r>
-      <w:r>
-        <w:rPr>
-          <w:b/>
-          <w:bCs/>
-        </w:rPr>
-        <w:t xml:space="preserve">gobernanza universitaria multinivel</w:t>
-      </w:r>
-      <w:r>
-        <w:t xml:space="preserve"> </w:t>
-      </w:r>
-      <w:r>
-        <w:t xml:space="preserve">(Brunner, 2011; Krotsch, 2001; Marquina, 2012)</w:t>
-      </w:r>
-      <w:r>
-        <w:t xml:space="preserve">.</w:t>
-      </w:r>
-    </w:p>
-    <w:p>
-      <w:pPr>
-        <w:pStyle w:val="BodyText"/>
-      </w:pPr>
-      <w:r>
-        <w:t xml:space="preserve">En efecto, como han señalado</w:t>
-      </w:r>
-      <w:r>
-        <w:t xml:space="preserve"> </w:t>
-      </w:r>
-      <w:r>
-        <w:t xml:space="preserve">Krotsch (2001)</w:t>
-      </w:r>
-      <w:r>
-        <w:t xml:space="preserve"> </w:t>
-      </w:r>
-      <w:r>
-        <w:t xml:space="preserve">y</w:t>
-      </w:r>
-      <w:r>
-        <w:t xml:space="preserve"> </w:t>
-      </w:r>
-      <w:r>
-        <w:t xml:space="preserve">Brunner (2011)</w:t>
-      </w:r>
-      <w:r>
-        <w:t xml:space="preserve">, las universidades públicas argentinas y latinoamericanas constituyen instituciones con</w:t>
-      </w:r>
-      <w:r>
-        <w:t xml:space="preserve"> </w:t>
-      </w:r>
-      <w:r>
-        <w:rPr>
-          <w:b/>
-          <w:bCs/>
-        </w:rPr>
-        <w:t xml:space="preserve">poder fuertemente descentralizado, alta diferenciación funcional y coexistencia de legitimidades concurrentes</w:t>
-      </w:r>
-      <w:r>
-        <w:t xml:space="preserve"> </w:t>
-      </w:r>
-      <w:r>
-        <w:t xml:space="preserve">(políticas, colegiadas, académicas y disciplinares). En el contexto empírico del CURZAS-UNCo, esta categoría analítica de</w:t>
-      </w:r>
-      <w:r>
-        <w:t xml:space="preserve"> </w:t>
-      </w:r>
-      <w:r>
-        <w:rPr>
-          <w:b/>
-          <w:bCs/>
-        </w:rPr>
-        <w:t xml:space="preserve">poligobernanza institucional</w:t>
-      </w:r>
-      <w:r>
-        <w:t xml:space="preserve"> </w:t>
-      </w:r>
-      <w:r>
-        <w:t xml:space="preserve">permite conceptualizar la coexistencia articulada y tensionada de cuatro niveles y dimensiones de decisión interconectados:</w:t>
+        <w:t xml:space="preserve">poligobernanza institucional universitaria como una operacionalización analítica propia</w:t>
+      </w:r>
+      <w:r>
+        <w:t xml:space="preserve">, formulada para conceptualizar la articulación de cuatro planos de decisión en el CURZAS-UNCo:</w:t>
       </w:r>
     </w:p>
     <w:p>
@@ -4889,7 +4872,7 @@
           <w:i/>
           <w:iCs/>
         </w:rPr>
-        <w:t xml:space="preserve">Nivel Sociolaboral y Paritario:</w:t>
+        <w:t xml:space="preserve">Dimensión Transversal Sociolaboral y Paritaria (Longo, 2006):</w:t>
       </w:r>
       <w:r>
         <w:t xml:space="preserve"> </w:t>
@@ -6637,7 +6620,7 @@
     <w:bookmarkEnd w:id="55"/>
     <w:bookmarkEnd w:id="56"/>
     <w:bookmarkEnd w:id="57"/>
-    <w:bookmarkStart w:id="96" w:name="referencias-bibliográficas"/>
+    <w:bookmarkStart w:id="98" w:name="referencias-bibliográficas"/>
     <w:p>
       <w:pPr>
         <w:pStyle w:val="Heading1"/>
@@ -6654,7 +6637,7 @@
         <w:t xml:space="preserve">Referencias Bibliográficas</w:t>
       </w:r>
     </w:p>
-    <w:bookmarkStart w:id="95" w:name="refs"/>
+    <w:bookmarkStart w:id="97" w:name="refs"/>
     <w:bookmarkStart w:id="58" w:name="ref-aguilar2006"/>
     <w:p>
       <w:pPr>
@@ -6820,7 +6803,7 @@
       </w:hyperlink>
     </w:p>
     <w:bookmarkEnd w:id="64"/>
-    <w:bookmarkStart w:id="65" w:name="ref-chiavenato2020"/>
+    <w:bookmarkStart w:id="65" w:name="ref-cao2007"/>
     <w:p>
       <w:pPr>
         <w:pStyle w:val="Bibliography"/>
@@ -6829,27 +6812,80 @@
         <w:jc w:val="left"/>
       </w:pPr>
       <w:r>
-        <w:t xml:space="preserve">Chiavenato, I. (2020).</w:t>
-      </w:r>
-      <w:r>
-        <w:t xml:space="preserve"> </w:t>
-      </w:r>
-      <w:r>
-        <w:rPr>
-          <w:i/>
-          <w:iCs/>
-        </w:rPr>
-        <w:t xml:space="preserve">Gestión del talento humano: El nuevo papel de los recursos humanos en las organizaciones</w:t>
-      </w:r>
-      <w:r>
-        <w:t xml:space="preserve"> </w:t>
-      </w:r>
-      <w:r>
-        <w:t xml:space="preserve">(5.ª ed.). McGraw-Hill Interamericana.</w:t>
+        <w:t xml:space="preserve">Cao, H., Blutman, G., Estévez, A., &amp; Iturburu, M. (2007).</w:t>
+      </w:r>
+      <w:r>
+        <w:t xml:space="preserve"> </w:t>
+      </w:r>
+      <w:r>
+        <w:rPr>
+          <w:i/>
+          <w:iCs/>
+        </w:rPr>
+        <w:t xml:space="preserve">Introducci</w:t>
+      </w:r>
+      <w:r>
+        <w:rPr>
+          <w:i/>
+          <w:iCs/>
+        </w:rPr>
+        <w:t xml:space="preserve">ó</w:t>
+      </w:r>
+      <w:r>
+        <w:rPr>
+          <w:i/>
+          <w:iCs/>
+        </w:rPr>
+        <w:t xml:space="preserve">n a la Administraci</w:t>
+      </w:r>
+      <w:r>
+        <w:rPr>
+          <w:i/>
+          <w:iCs/>
+        </w:rPr>
+        <w:t xml:space="preserve">ó</w:t>
+      </w:r>
+      <w:r>
+        <w:rPr>
+          <w:i/>
+          <w:iCs/>
+        </w:rPr>
+        <w:t xml:space="preserve">n P</w:t>
+      </w:r>
+      <w:r>
+        <w:rPr>
+          <w:i/>
+          <w:iCs/>
+        </w:rPr>
+        <w:t xml:space="preserve">ú</w:t>
+      </w:r>
+      <w:r>
+        <w:rPr>
+          <w:i/>
+          <w:iCs/>
+        </w:rPr>
+        <w:t xml:space="preserve">blica Argentina: Naci</w:t>
+      </w:r>
+      <w:r>
+        <w:rPr>
+          <w:i/>
+          <w:iCs/>
+        </w:rPr>
+        <w:t xml:space="preserve">ó</w:t>
+      </w:r>
+      <w:r>
+        <w:rPr>
+          <w:i/>
+          <w:iCs/>
+        </w:rPr>
+        <w:t xml:space="preserve">n, Provincias y Municipios</w:t>
+      </w:r>
+      <w:r>
+        <w:t xml:space="preserve">. Editorial Biblos.</w:t>
       </w:r>
     </w:p>
     <w:bookmarkEnd w:id="65"/>
-    <w:bookmarkStart w:id="67" w:name="ref-curza2022"/>
+    <w:bookmarkStart w:id="66" w:name="ref-chiavenato2020"/>
     <w:p>
       <w:pPr>
         <w:pStyle w:val="Bibliography"/>
@@ -6858,6 +6894,35 @@
         <w:jc w:val="left"/>
       </w:pPr>
       <w:r>
+        <w:t xml:space="preserve">Chiavenato, I. (2020).</w:t>
+      </w:r>
+      <w:r>
+        <w:t xml:space="preserve"> </w:t>
+      </w:r>
+      <w:r>
+        <w:rPr>
+          <w:i/>
+          <w:iCs/>
+        </w:rPr>
+        <w:t xml:space="preserve">Gestión del talento humano: El nuevo papel de los recursos humanos en las organizaciones</w:t>
+      </w:r>
+      <w:r>
+        <w:t xml:space="preserve"> </w:t>
+      </w:r>
+      <w:r>
+        <w:t xml:space="preserve">(5.ª ed.). McGraw-Hill Interamericana.</w:t>
+      </w:r>
+    </w:p>
+    <w:bookmarkEnd w:id="66"/>
+    <w:bookmarkStart w:id="68" w:name="ref-curza2022"/>
+    <w:p>
+      <w:pPr>
+        <w:pStyle w:val="Bibliography"/>
+        <w:spacing w:after="120"/>
+        <w:ind w:left="720" w:hanging="720"/>
+        <w:jc w:val="left"/>
+      </w:pPr>
+      <w:r>
         <w:t xml:space="preserve">Consejo Directivo del CURZAS. (2022).</w:t>
       </w:r>
       <w:r>
@@ -6876,7 +6941,7 @@
       <w:r>
         <w:t xml:space="preserve"> </w:t>
       </w:r>
-      <w:hyperlink r:id="rId66">
+      <w:hyperlink r:id="rId67">
         <w:r>
           <w:rPr>
             <w:rStyle w:val="Hyperlink"/>
@@ -6885,8 +6950,8 @@
         </w:r>
       </w:hyperlink>
     </w:p>
-    <w:bookmarkEnd w:id="67"/>
-    <w:bookmarkStart w:id="68" w:name="ref-uncocurzas2023"/>
+    <w:bookmarkEnd w:id="68"/>
+    <w:bookmarkStart w:id="69" w:name="ref-uncocurzas2023"/>
     <w:p>
       <w:pPr>
         <w:pStyle w:val="Bibliography"/>
@@ -6911,8 +6976,8 @@
         <w:t xml:space="preserve">. Universidad Nacional del Comahue.</w:t>
       </w:r>
     </w:p>
-    <w:bookmarkEnd w:id="68"/>
-    <w:bookmarkStart w:id="70" w:name="ref-delagarza2001"/>
+    <w:bookmarkEnd w:id="69"/>
+    <w:bookmarkStart w:id="71" w:name="ref-delagarza2001"/>
     <w:p>
       <w:pPr>
         <w:pStyle w:val="Bibliography"/>
@@ -6952,7 +7017,7 @@
       <w:r>
         <w:t xml:space="preserve"> </w:t>
       </w:r>
-      <w:hyperlink r:id="rId69">
+      <w:hyperlink r:id="rId70">
         <w:r>
           <w:rPr>
             <w:rStyle w:val="Hyperlink"/>
@@ -6961,8 +7026,8 @@
         </w:r>
       </w:hyperlink>
     </w:p>
-    <w:bookmarkEnd w:id="70"/>
-    <w:bookmarkStart w:id="71" w:name="ref-pen2015"/>
+    <w:bookmarkEnd w:id="71"/>
+    <w:bookmarkStart w:id="72" w:name="ref-pen2015"/>
     <w:p>
       <w:pPr>
         <w:pStyle w:val="Bibliography"/>
@@ -6974,8 +7039,8 @@
         <w:t xml:space="preserve">Decreto N° 1246/2015. Convenio Colectivo de Trabajo para los Docentes de las Instituciones Universitarias Nacionales (2015).</w:t>
       </w:r>
     </w:p>
-    <w:bookmarkEnd w:id="71"/>
-    <w:bookmarkStart w:id="72" w:name="ref-jimenez2008"/>
+    <w:bookmarkEnd w:id="72"/>
+    <w:bookmarkStart w:id="73" w:name="ref-jimenez2008"/>
     <w:p>
       <w:pPr>
         <w:pStyle w:val="Bibliography"/>
@@ -7003,8 +7068,8 @@
         <w:t xml:space="preserve">(pp. 27-42). Universidad Pedagógica Nacional / CLACSO.</w:t>
       </w:r>
     </w:p>
-    <w:bookmarkEnd w:id="72"/>
-    <w:bookmarkStart w:id="73" w:name="ref-krotsch2001"/>
+    <w:bookmarkEnd w:id="73"/>
+    <w:bookmarkStart w:id="74" w:name="ref-krotsch2001"/>
     <w:p>
       <w:pPr>
         <w:pStyle w:val="Bibliography"/>
@@ -7029,8 +7094,8 @@
         <w:t xml:space="preserve">. Universidad Nacional de Quilmes.</w:t>
       </w:r>
     </w:p>
-    <w:bookmarkEnd w:id="73"/>
-    <w:bookmarkStart w:id="74" w:name="ref-lepsinger2009"/>
+    <w:bookmarkEnd w:id="74"/>
+    <w:bookmarkStart w:id="75" w:name="ref-lepsinger2009"/>
     <w:p>
       <w:pPr>
         <w:pStyle w:val="Bibliography"/>
@@ -7058,8 +7123,8 @@
         <w:t xml:space="preserve">(2.ª ed.). Pfeiffer.</w:t>
       </w:r>
     </w:p>
-    <w:bookmarkEnd w:id="74"/>
-    <w:bookmarkStart w:id="75" w:name="ref-ministerio1995"/>
+    <w:bookmarkEnd w:id="75"/>
+    <w:bookmarkStart w:id="76" w:name="ref-ministerio1995"/>
     <w:p>
       <w:pPr>
         <w:pStyle w:val="Bibliography"/>
@@ -7071,8 +7136,8 @@
         <w:t xml:space="preserve">Ley N° 24.521 de Educación Superior (1995).</w:t>
       </w:r>
     </w:p>
-    <w:bookmarkEnd w:id="75"/>
-    <w:bookmarkStart w:id="76" w:name="ref-longo2006"/>
+    <w:bookmarkEnd w:id="76"/>
+    <w:bookmarkStart w:id="77" w:name="ref-longo2006"/>
     <w:p>
       <w:pPr>
         <w:pStyle w:val="Bibliography"/>
@@ -7097,8 +7162,8 @@
         <w:t xml:space="preserve">. Paidós.</w:t>
       </w:r>
     </w:p>
-    <w:bookmarkEnd w:id="76"/>
-    <w:bookmarkStart w:id="77" w:name="ref-marquina2012"/>
+    <w:bookmarkEnd w:id="77"/>
+    <w:bookmarkStart w:id="78" w:name="ref-marquina2012"/>
     <w:p>
       <w:pPr>
         <w:pStyle w:val="Bibliography"/>
@@ -7136,8 +7201,8 @@
         <w:t xml:space="preserve">(15), 35-48.</w:t>
       </w:r>
     </w:p>
-    <w:bookmarkEnd w:id="77"/>
-    <w:bookmarkStart w:id="78" w:name="ref-matus1993"/>
+    <w:bookmarkEnd w:id="78"/>
+    <w:bookmarkStart w:id="79" w:name="ref-matus1993"/>
     <w:p>
       <w:pPr>
         <w:pStyle w:val="Bibliography"/>
@@ -7162,8 +7227,8 @@
         <w:t xml:space="preserve">. Fundación ALTIDIR.</w:t>
       </w:r>
     </w:p>
-    <w:bookmarkEnd w:id="78"/>
-    <w:bookmarkStart w:id="80" w:name="ref-obando2014"/>
+    <w:bookmarkEnd w:id="79"/>
+    <w:bookmarkStart w:id="81" w:name="ref-obando2014"/>
     <w:p>
       <w:pPr>
         <w:pStyle w:val="Bibliography"/>
@@ -7203,7 +7268,7 @@
       <w:r>
         <w:t xml:space="preserve"> </w:t>
       </w:r>
-      <w:hyperlink r:id="rId79">
+      <w:hyperlink r:id="rId80">
         <w:r>
           <w:rPr>
             <w:rStyle w:val="Hyperlink"/>
@@ -7212,8 +7277,8 @@
         </w:r>
       </w:hyperlink>
     </w:p>
-    <w:bookmarkEnd w:id="80"/>
-    <w:bookmarkStart w:id="81" w:name="ref-oszlak2020"/>
+    <w:bookmarkEnd w:id="81"/>
+    <w:bookmarkStart w:id="82" w:name="ref-oszlak2011"/>
     <w:p>
       <w:pPr>
         <w:pStyle w:val="Bibliography"/>
@@ -7222,24 +7287,24 @@
         <w:jc w:val="left"/>
       </w:pPr>
       <w:r>
-        <w:t xml:space="preserve">Oszlak, O. (2020).</w:t>
-      </w:r>
-      <w:r>
-        <w:t xml:space="preserve"> </w:t>
-      </w:r>
-      <w:r>
-        <w:rPr>
-          <w:i/>
-          <w:iCs/>
-        </w:rPr>
-        <w:t xml:space="preserve">El Estado en la era exponencial</w:t>
-      </w:r>
-      <w:r>
-        <w:t xml:space="preserve">. Instituto Nacional de la Administración Pública.</w:t>
-      </w:r>
-    </w:p>
-    <w:bookmarkEnd w:id="81"/>
-    <w:bookmarkStart w:id="82" w:name="ref-perez2021"/>
+        <w:t xml:space="preserve">Oszlak, O. (2011). El rol del Estado: micro, meso, macro.</w:t>
+      </w:r>
+      <w:r>
+        <w:t xml:space="preserve"> </w:t>
+      </w:r>
+      <w:r>
+        <w:rPr>
+          <w:i/>
+          <w:iCs/>
+        </w:rPr>
+        <w:t xml:space="preserve">VI Congreso Argentino de Administración Pública</w:t>
+      </w:r>
+      <w:r>
+        <w:t xml:space="preserve">.</w:t>
+      </w:r>
+    </w:p>
+    <w:bookmarkEnd w:id="82"/>
+    <w:bookmarkStart w:id="83" w:name="ref-oszlak2020"/>
     <w:p>
       <w:pPr>
         <w:pStyle w:val="Bibliography"/>
@@ -7248,37 +7313,24 @@
         <w:jc w:val="left"/>
       </w:pPr>
       <w:r>
-        <w:t xml:space="preserve">Pérez, M., González, J., &amp; Castro, L. (2021). Evaluación 360° de las tutorías presenciales y en línea en universidades públicas.</w:t>
-      </w:r>
-      <w:r>
-        <w:t xml:space="preserve"> </w:t>
-      </w:r>
-      <w:r>
-        <w:rPr>
-          <w:i/>
-          <w:iCs/>
-        </w:rPr>
-        <w:t xml:space="preserve">Unaciencia: Revista de Estudios e Investigaciones</w:t>
-      </w:r>
-      <w:r>
-        <w:t xml:space="preserve">,</w:t>
-      </w:r>
-      <w:r>
-        <w:t xml:space="preserve"> </w:t>
-      </w:r>
-      <w:r>
-        <w:rPr>
-          <w:i/>
-          <w:iCs/>
-        </w:rPr>
-        <w:t xml:space="preserve">14</w:t>
-      </w:r>
-      <w:r>
-        <w:t xml:space="preserve">(26), 45-58.</w:t>
-      </w:r>
-    </w:p>
-    <w:bookmarkEnd w:id="82"/>
-    <w:bookmarkStart w:id="84" w:name="ref-reyes2020"/>
+        <w:t xml:space="preserve">Oszlak, O. (2020).</w:t>
+      </w:r>
+      <w:r>
+        <w:t xml:space="preserve"> </w:t>
+      </w:r>
+      <w:r>
+        <w:rPr>
+          <w:i/>
+          <w:iCs/>
+        </w:rPr>
+        <w:t xml:space="preserve">El Estado en la era exponencial</w:t>
+      </w:r>
+      <w:r>
+        <w:t xml:space="preserve">. Instituto Nacional de la Administración Pública.</w:t>
+      </w:r>
+    </w:p>
+    <w:bookmarkEnd w:id="83"/>
+    <w:bookmarkStart w:id="84" w:name="ref-perez2021"/>
     <w:p>
       <w:pPr>
         <w:pStyle w:val="Bibliography"/>
@@ -7287,6 +7339,45 @@
         <w:jc w:val="left"/>
       </w:pPr>
       <w:r>
+        <w:t xml:space="preserve">Pérez, M., González, J., &amp; Castro, L. (2021). Evaluación 360° de las tutorías presenciales y en línea en universidades públicas.</w:t>
+      </w:r>
+      <w:r>
+        <w:t xml:space="preserve"> </w:t>
+      </w:r>
+      <w:r>
+        <w:rPr>
+          <w:i/>
+          <w:iCs/>
+        </w:rPr>
+        <w:t xml:space="preserve">Unaciencia: Revista de Estudios e Investigaciones</w:t>
+      </w:r>
+      <w:r>
+        <w:t xml:space="preserve">,</w:t>
+      </w:r>
+      <w:r>
+        <w:t xml:space="preserve"> </w:t>
+      </w:r>
+      <w:r>
+        <w:rPr>
+          <w:i/>
+          <w:iCs/>
+        </w:rPr>
+        <w:t xml:space="preserve">14</w:t>
+      </w:r>
+      <w:r>
+        <w:t xml:space="preserve">(26), 45-58.</w:t>
+      </w:r>
+    </w:p>
+    <w:bookmarkEnd w:id="84"/>
+    <w:bookmarkStart w:id="86" w:name="ref-reyes2020"/>
+    <w:p>
+      <w:pPr>
+        <w:pStyle w:val="Bibliography"/>
+        <w:spacing w:after="120"/>
+        <w:ind w:left="720" w:hanging="720"/>
+        <w:jc w:val="left"/>
+      </w:pPr>
+      <w:r>
         <w:t xml:space="preserve">Reyes, C., &amp; Díaz, Á. (2020). Metaevaluación del sistema de evaluación docente en una universidad pública.</w:t>
       </w:r>
       <w:r>
@@ -7318,7 +7409,7 @@
       <w:r>
         <w:t xml:space="preserve"> </w:t>
       </w:r>
-      <w:hyperlink r:id="rId83">
+      <w:hyperlink r:id="rId85">
         <w:r>
           <w:rPr>
             <w:rStyle w:val="Hyperlink"/>
@@ -7327,8 +7418,8 @@
         </w:r>
       </w:hyperlink>
     </w:p>
-    <w:bookmarkEnd w:id="84"/>
-    <w:bookmarkStart w:id="85" w:name="ref-sautu2005"/>
+    <w:bookmarkEnd w:id="86"/>
+    <w:bookmarkStart w:id="87" w:name="ref-sautu2005"/>
     <w:p>
       <w:pPr>
         <w:pStyle w:val="Bibliography"/>
@@ -7353,8 +7444,8 @@
         <w:t xml:space="preserve">. Lumiere.</w:t>
       </w:r>
     </w:p>
-    <w:bookmarkEnd w:id="85"/>
-    <w:bookmarkStart w:id="87" w:name="ref-sifuentes2016"/>
+    <w:bookmarkEnd w:id="87"/>
+    <w:bookmarkStart w:id="89" w:name="ref-sifuentes2016"/>
     <w:p>
       <w:pPr>
         <w:pStyle w:val="Bibliography"/>
@@ -7394,7 +7485,7 @@
       <w:r>
         <w:t xml:space="preserve"> </w:t>
       </w:r>
-      <w:hyperlink r:id="rId86">
+      <w:hyperlink r:id="rId88">
         <w:r>
           <w:rPr>
             <w:rStyle w:val="Hyperlink"/>
@@ -7403,8 +7494,8 @@
         </w:r>
       </w:hyperlink>
     </w:p>
-    <w:bookmarkEnd w:id="87"/>
-    <w:bookmarkStart w:id="89" w:name="ref-torraco2016"/>
+    <w:bookmarkEnd w:id="89"/>
+    <w:bookmarkStart w:id="91" w:name="ref-torraco2016"/>
     <w:p>
       <w:pPr>
         <w:pStyle w:val="Bibliography"/>
@@ -7444,7 +7535,7 @@
       <w:r>
         <w:t xml:space="preserve"> </w:t>
       </w:r>
-      <w:hyperlink r:id="rId88">
+      <w:hyperlink r:id="rId90">
         <w:r>
           <w:rPr>
             <w:rStyle w:val="Hyperlink"/>
@@ -7453,8 +7544,8 @@
         </w:r>
       </w:hyperlink>
     </w:p>
-    <w:bookmarkEnd w:id="89"/>
-    <w:bookmarkStart w:id="91" w:name="ref-unco1997"/>
+    <w:bookmarkEnd w:id="91"/>
+    <w:bookmarkStart w:id="93" w:name="ref-unco1997"/>
     <w:p>
       <w:pPr>
         <w:pStyle w:val="Bibliography"/>
@@ -7481,7 +7572,7 @@
       <w:r>
         <w:t xml:space="preserve"> </w:t>
       </w:r>
-      <w:hyperlink r:id="rId90">
+      <w:hyperlink r:id="rId92">
         <w:r>
           <w:rPr>
             <w:rStyle w:val="Hyperlink"/>
@@ -7490,8 +7581,8 @@
         </w:r>
       </w:hyperlink>
     </w:p>
-    <w:bookmarkEnd w:id="91"/>
-    <w:bookmarkStart w:id="93" w:name="ref-unco2025"/>
+    <w:bookmarkEnd w:id="93"/>
+    <w:bookmarkStart w:id="95" w:name="ref-unco2025"/>
     <w:p>
       <w:pPr>
         <w:pStyle w:val="Bibliography"/>
@@ -7518,7 +7609,7 @@
       <w:r>
         <w:t xml:space="preserve"> </w:t>
       </w:r>
-      <w:hyperlink r:id="rId92">
+      <w:hyperlink r:id="rId94">
         <w:r>
           <w:rPr>
             <w:rStyle w:val="Hyperlink"/>
@@ -7527,8 +7618,8 @@
         </w:r>
       </w:hyperlink>
     </w:p>
-    <w:bookmarkEnd w:id="93"/>
-    <w:bookmarkStart w:id="94" w:name="ref-wainerman2011"/>
+    <w:bookmarkEnd w:id="95"/>
+    <w:bookmarkStart w:id="96" w:name="ref-wainerman2011"/>
     <w:p>
       <w:pPr>
         <w:pStyle w:val="Bibliography"/>
@@ -7556,9 +7647,9 @@
         <w:t xml:space="preserve">(4.ª ed.). Manantial.</w:t>
       </w:r>
     </w:p>
-    <w:bookmarkEnd w:id="94"/>
-    <w:bookmarkEnd w:id="95"/>
     <w:bookmarkEnd w:id="96"/>
+    <w:bookmarkEnd w:id="97"/>
+    <w:bookmarkEnd w:id="98"/>
     <w:sectPr>
       <w:footerReference w:type="default" r:id="rId11"/>
       <w:footnotePr>

</xml_diff>